<commit_message>
Update SCW17 MSE workshop report
</commit_message>
<xml_diff>
--- a/docs/SCW17-MSE-Workshop-report.docx
+++ b/docs/SCW17-MSE-Workshop-report.docx
@@ -15,7 +15,7 @@
         <w:pStyle w:val="Date"/>
       </w:pPr>
       <w:r>
-        <w:t xml:space="preserve">2026-06-18</w:t>
+        <w:t xml:space="preserve">2026-06-19</w:t>
       </w:r>
     </w:p>
     <w:p>
@@ -139,29 +139,13 @@
           <w:b/>
           <w:bCs/>
         </w:rPr>
-        <w:t xml:space="preserve">Status:</w:t>
+        <w:t xml:space="preserve">Updated:</w:t>
       </w:r>
       <w:r>
         <w:t xml:space="preserve"> </w:t>
       </w:r>
       <w:r>
-        <w:t xml:space="preserve">Draft, Days 1-2</w:t>
-      </w:r>
-      <w:r>
-        <w:br/>
-      </w:r>
-      <w:r>
-        <w:rPr>
-          <w:b/>
-          <w:bCs/>
-        </w:rPr>
-        <w:t xml:space="preserve">Updated:</w:t>
-      </w:r>
-      <w:r>
-        <w:t xml:space="preserve"> </w:t>
-      </w:r>
-      <w:r>
-        <w:t xml:space="preserve">18 June 2026</w:t>
+        <w:t xml:space="preserve">19 June 2026 12:27 CEST</w:t>
       </w:r>
     </w:p>
     <w:tbl>
@@ -280,7 +264,7 @@
         </w:tc>
       </w:tr>
     </w:tbl>
-    <w:bookmarkStart w:id="14" w:name="summary"/>
+    <w:bookmarkStart w:id="15" w:name="summary"/>
     <w:p>
       <w:pPr>
         <w:pStyle w:val="Heading1"/>
@@ -398,7 +382,7 @@
         </w:numPr>
       </w:pPr>
       <w:r>
-        <w:t xml:space="preserve">CMP discussions emphasized simple, interpretable index-based rules, including piecewise-linear harvest-control rules, TAC-change constraints, smoothing choices, and alternative index combinations. The report records that Members and participants should nominate CMPs for Scientific Committee consideration, after which redundant or materially overlapping CMPs should be eliminated so that review can focus on a concise set of distinct alternatives.</w:t>
+        <w:t xml:space="preserve">CMP discussions emphasized simple, interpretable index-based rules, including piecewise-linear harvest-control rules, TAC-change constraints, smoothing choices, and alternative index combinations. The CMPs examined during the workshop were trial designs used to learn about behavior, tuning, and trade-offs rather than final recommendations. The report records that Members and participants should nominate CMPs for Scientific Committee consideration, after which redundant or materially overlapping CMPs should be eliminated so that review can focus on a concise set of distinct alternatives.</w:t>
       </w:r>
     </w:p>
     <w:p>
@@ -410,6 +394,198 @@
       </w:pPr>
       <w:r>
         <w:t xml:space="preserve">Exceptional circumstances were also discussed as a core implementation issue. The group considered the potential use of the ECP software framework to identify data patterns associated with poor CMP performance, compare type I and type II error rates, and support a transparent process for determining whether observations fall outside the range of conditions represented in the MSE.</w:t>
+      </w:r>
+    </w:p>
+    <w:bookmarkStart w:id="14" w:name="recommendations-and-conclusions"/>
+    <w:p>
+      <w:pPr>
+        <w:pStyle w:val="Heading2"/>
+      </w:pPr>
+      <w:r>
+        <w:t xml:space="preserve">Recommendations and Conclusions</w:t>
+      </w:r>
+    </w:p>
+    <w:p>
+      <w:pPr>
+        <w:pStyle w:val="FirstParagraph"/>
+      </w:pPr>
+      <w:r>
+        <w:t xml:space="preserve">The following recommendations and conclusions were identified for the summary of events:</w:t>
+      </w:r>
+    </w:p>
+    <w:p>
+      <w:pPr>
+        <w:pStyle w:val="Compact"/>
+        <w:numPr>
+          <w:ilvl w:val="0"/>
+          <w:numId w:val="1002"/>
+        </w:numPr>
+      </w:pPr>
+      <w:r>
+        <w:rPr>
+          <w:b/>
+          <w:bCs/>
+        </w:rPr>
+        <w:t xml:space="preserve">OM basis:</w:t>
+      </w:r>
+      <w:r>
+        <w:t xml:space="preserve"> </w:t>
+      </w:r>
+      <w:r>
+        <w:t xml:space="preserve">The group used benchmark model h1_0.16 for all CMP testing. The benchmark h2_0.16 model was used to evaluate CMPs tuned on the h1_0.16 OM, with CMPs expected to perform acceptably under h2_0.16 in terms of Kobe-green probability. Model 1.14 from SC12 was retained as a robustness test. The 0.65 steepness OM and 0.8 steepness OM were weighted equally in the final performance statistics.</w:t>
+      </w:r>
+    </w:p>
+    <w:p>
+      <w:pPr>
+        <w:pStyle w:val="Compact"/>
+        <w:numPr>
+          <w:ilvl w:val="0"/>
+          <w:numId w:val="1002"/>
+        </w:numPr>
+      </w:pPr>
+      <w:r>
+        <w:rPr>
+          <w:b/>
+          <w:bCs/>
+        </w:rPr>
+        <w:t xml:space="preserve">OM conditioning:</w:t>
+      </w:r>
+      <w:r>
+        <w:t xml:space="preserve"> </w:t>
+      </w:r>
+      <w:r>
+        <w:t xml:space="preserve">The group included autocorrelation in recruitment deviations and cross-correlation between index deviations. A maximum effort of three times current effort levels was considered plausible.</w:t>
+      </w:r>
+    </w:p>
+    <w:p>
+      <w:pPr>
+        <w:pStyle w:val="Compact"/>
+        <w:numPr>
+          <w:ilvl w:val="0"/>
+          <w:numId w:val="1002"/>
+        </w:numPr>
+      </w:pPr>
+      <w:r>
+        <w:rPr>
+          <w:b/>
+          <w:bCs/>
+        </w:rPr>
+        <w:t xml:space="preserve">Reference points:</w:t>
+      </w:r>
+      <w:r>
+        <w:t xml:space="preserve"> </w:t>
+      </w:r>
+      <w:r>
+        <w:t xml:space="preserve">F</w:t>
+      </w:r>
+      <w:r>
+        <w:rPr>
+          <w:vertAlign w:val="subscript"/>
+        </w:rPr>
+        <w:t xml:space="preserve">MSY</w:t>
+      </w:r>
+      <w:r>
+        <w:t xml:space="preserve"> </w:t>
+      </w:r>
+      <w:r>
+        <w:t xml:space="preserve">was defined on the basis of OM constant-F forecasts. Biomass status was defined as biomass relative to dynamic B</w:t>
+      </w:r>
+      <w:r>
+        <w:rPr>
+          <w:vertAlign w:val="subscript"/>
+        </w:rPr>
+        <w:t xml:space="preserve">0</w:t>
+      </w:r>
+      <w:r>
+        <w:t xml:space="preserve">.</w:t>
+      </w:r>
+    </w:p>
+    <w:p>
+      <w:pPr>
+        <w:pStyle w:val="Compact"/>
+        <w:numPr>
+          <w:ilvl w:val="0"/>
+          <w:numId w:val="1002"/>
+        </w:numPr>
+      </w:pPr>
+      <w:r>
+        <w:rPr>
+          <w:b/>
+          <w:bCs/>
+        </w:rPr>
+        <w:t xml:space="preserve">HCR design:</w:t>
+      </w:r>
+      <w:r>
+        <w:t xml:space="preserve"> </w:t>
+      </w:r>
+      <w:r>
+        <w:t xml:space="preserve">The group recommended focusing on simple HCRs, starting with simple slope or piecewise-linear rules. More elaborate designs could be explored when time allowed. Minimum catch expectations were accounted for through performance statistics on catches below 270 thousand tonnes per year. TAC caps of -15% and +20% were tested, with mirrored scenarios also included. Banking and borrowing was identified as a sensitivity for the final CMP set rather than a feature that should feed back into the HCR itself.</w:t>
+      </w:r>
+    </w:p>
+    <w:p>
+      <w:pPr>
+        <w:pStyle w:val="Compact"/>
+        <w:numPr>
+          <w:ilvl w:val="0"/>
+          <w:numId w:val="1002"/>
+        </w:numPr>
+      </w:pPr>
+      <w:r>
+        <w:rPr>
+          <w:b/>
+          <w:bCs/>
+        </w:rPr>
+        <w:t xml:space="preserve">Inclusion of climate effects:</w:t>
+      </w:r>
+      <w:r>
+        <w:t xml:space="preserve"> </w:t>
+      </w:r>
+      <w:r>
+        <w:t xml:space="preserve">The current robustness-simulation set includes scenarios with large recruitment impacts and was considered sufficient for addressing ENSO-related impacts on the stock at this stage.</w:t>
+      </w:r>
+    </w:p>
+    <w:p>
+      <w:pPr>
+        <w:pStyle w:val="Compact"/>
+        <w:numPr>
+          <w:ilvl w:val="0"/>
+          <w:numId w:val="1002"/>
+        </w:numPr>
+      </w:pPr>
+      <w:r>
+        <w:rPr>
+          <w:b/>
+          <w:bCs/>
+        </w:rPr>
+        <w:t xml:space="preserve">Exceptional circumstances:</w:t>
+      </w:r>
+      <w:r>
+        <w:t xml:space="preserve"> </w:t>
+      </w:r>
+      <w:r>
+        <w:t xml:space="preserve">Exceptional-circumstances protocols were recognized as an important implementation issue, but the detailed specification was identified as further work once the CMP selection process is more advanced.</w:t>
+      </w:r>
+    </w:p>
+    <w:p>
+      <w:pPr>
+        <w:pStyle w:val="Compact"/>
+        <w:numPr>
+          <w:ilvl w:val="0"/>
+          <w:numId w:val="1002"/>
+        </w:numPr>
+      </w:pPr>
+      <w:r>
+        <w:rPr>
+          <w:b/>
+          <w:bCs/>
+        </w:rPr>
+        <w:t xml:space="preserve">Performance statistics:</w:t>
+      </w:r>
+      <w:r>
+        <w:t xml:space="preserve"> </w:t>
+      </w:r>
+      <w:r>
+        <w:t xml:space="preserve">A broad list of performance statistics was agreed, covering safety, yield, and stability across time periods. The group had not yet selected a smaller set of priority statistics.</w:t>
       </w:r>
     </w:p>
     <w:tbl>
@@ -533,7 +709,7 @@
         <w:pStyle w:val="Compact"/>
         <w:numPr>
           <w:ilvl w:val="0"/>
-          <w:numId w:val="1002"/>
+          <w:numId w:val="1003"/>
         </w:numPr>
       </w:pPr>
       <w:r>
@@ -553,7 +729,8 @@
       </w:r>
     </w:p>
     <w:bookmarkEnd w:id="14"/>
-    <w:bookmarkStart w:id="15" w:name="introduction"/>
+    <w:bookmarkEnd w:id="15"/>
+    <w:bookmarkStart w:id="16" w:name="introduction"/>
     <w:p>
       <w:pPr>
         <w:pStyle w:val="Heading1"/>
@@ -566,7 +743,7 @@
       <w:pPr>
         <w:numPr>
           <w:ilvl w:val="0"/>
-          <w:numId w:val="1003"/>
+          <w:numId w:val="1004"/>
         </w:numPr>
       </w:pPr>
       <w:r>
@@ -577,7 +754,7 @@
       <w:pPr>
         <w:numPr>
           <w:ilvl w:val="0"/>
-          <w:numId w:val="1003"/>
+          <w:numId w:val="1004"/>
         </w:numPr>
       </w:pPr>
       <w:r>
@@ -588,7 +765,7 @@
       <w:pPr>
         <w:numPr>
           <w:ilvl w:val="0"/>
-          <w:numId w:val="1003"/>
+          <w:numId w:val="1004"/>
         </w:numPr>
       </w:pPr>
       <w:r>
@@ -599,7 +776,7 @@
       <w:pPr>
         <w:numPr>
           <w:ilvl w:val="0"/>
-          <w:numId w:val="1003"/>
+          <w:numId w:val="1004"/>
         </w:numPr>
       </w:pPr>
       <w:r>
@@ -610,7 +787,7 @@
       <w:pPr>
         <w:numPr>
           <w:ilvl w:val="0"/>
-          <w:numId w:val="1003"/>
+          <w:numId w:val="1004"/>
         </w:numPr>
       </w:pPr>
       <w:r>
@@ -621,7 +798,7 @@
       <w:pPr>
         <w:numPr>
           <w:ilvl w:val="0"/>
-          <w:numId w:val="1003"/>
+          <w:numId w:val="1004"/>
         </w:numPr>
       </w:pPr>
       <w:r>
@@ -653,7 +830,7 @@
       <w:pPr>
         <w:numPr>
           <w:ilvl w:val="0"/>
-          <w:numId w:val="1003"/>
+          <w:numId w:val="1004"/>
         </w:numPr>
       </w:pPr>
       <w:r>
@@ -664,7 +841,7 @@
       <w:pPr>
         <w:numPr>
           <w:ilvl w:val="0"/>
-          <w:numId w:val="1003"/>
+          <w:numId w:val="1004"/>
         </w:numPr>
       </w:pPr>
       <w:r>
@@ -675,7 +852,7 @@
       <w:pPr>
         <w:numPr>
           <w:ilvl w:val="0"/>
-          <w:numId w:val="1003"/>
+          <w:numId w:val="1004"/>
         </w:numPr>
       </w:pPr>
       <w:r>
@@ -687,7 +864,7 @@
         <w:pStyle w:val="Compact"/>
         <w:numPr>
           <w:ilvl w:val="1"/>
-          <w:numId w:val="1004"/>
+          <w:numId w:val="1005"/>
         </w:numPr>
       </w:pPr>
       <w:r>
@@ -699,7 +876,7 @@
         <w:pStyle w:val="Compact"/>
         <w:numPr>
           <w:ilvl w:val="1"/>
-          <w:numId w:val="1004"/>
+          <w:numId w:val="1005"/>
         </w:numPr>
       </w:pPr>
       <w:r>
@@ -711,7 +888,7 @@
         <w:pStyle w:val="Compact"/>
         <w:numPr>
           <w:ilvl w:val="1"/>
-          <w:numId w:val="1004"/>
+          <w:numId w:val="1005"/>
         </w:numPr>
       </w:pPr>
       <w:r>
@@ -723,7 +900,7 @@
         <w:pStyle w:val="Compact"/>
         <w:numPr>
           <w:ilvl w:val="1"/>
-          <w:numId w:val="1004"/>
+          <w:numId w:val="1005"/>
         </w:numPr>
       </w:pPr>
       <w:r>
@@ -735,73 +912,30 @@
         <w:pStyle w:val="Compact"/>
         <w:numPr>
           <w:ilvl w:val="1"/>
-          <w:numId w:val="1004"/>
-        </w:numPr>
-      </w:pPr>
-      <w:r>
-        <w:t xml:space="preserve">Record decisions, issues requiring further work, and follow-up tasks for the workshop report to SC14.</w:t>
-      </w:r>
-    </w:p>
-    <w:bookmarkEnd w:id="15"/>
-    <w:bookmarkStart w:id="18" w:name="developments-since-the-benchmark"/>
-    <w:p>
-      <w:pPr>
-        <w:pStyle w:val="Heading1"/>
-      </w:pPr>
-      <w:r>
-        <w:t xml:space="preserve">Developments Since the Benchmark</w:t>
-      </w:r>
-    </w:p>
-    <w:bookmarkStart w:id="16" w:name="Xeeed3d519cc312d972037247414cb7d11e44166"/>
-    <w:p>
-      <w:pPr>
-        <w:pStyle w:val="Heading2"/>
-      </w:pPr>
-      <w:r>
-        <w:t xml:space="preserve">Assessment, Operating Models, and MSE Approach</w:t>
-      </w:r>
-    </w:p>
-    <w:p>
-      <w:pPr>
-        <w:numPr>
-          <w:ilvl w:val="0"/>
           <w:numId w:val="1005"/>
         </w:numPr>
       </w:pPr>
       <w:r>
-        <w:t xml:space="preserve">The group distinguished the annual assessment from the OM used in the MSE. The assessment will continue to support Scientific Committee advice, whereas OM conditioning is a broader exercise intended to represent plausible system dynamics for testing CMPs. Participants cautioned against treating the OM reference set as a single best assessment.</w:t>
-      </w:r>
-    </w:p>
-    <w:p>
-      <w:pPr>
-        <w:numPr>
-          <w:ilvl w:val="0"/>
-          <w:numId w:val="1005"/>
-        </w:numPr>
-      </w:pPr>
-      <w:r>
-        <w:t xml:space="preserve">The group discussed empirical and assessment-based CMPs. Participants noted that complex assessment-based CMPs can be difficult to simulate faithfully, slow to run, and hard to reproduce if the assessment is repeatedly adjusted. The prevailing view favored simple, locked-in empirical rules tested through MSE, with assessments and legal requirements used as external checks alongside the core automated rule.</w:t>
-      </w:r>
-    </w:p>
-    <w:p>
-      <w:pPr>
-        <w:numPr>
-          <w:ilvl w:val="0"/>
-          <w:numId w:val="1005"/>
-        </w:numPr>
-      </w:pPr>
-      <w:r>
-        <w:t xml:space="preserve">Exceptional circumstances were introduced as a key design issue. The group noted that a full assessment is one possible response, while indicator-based monitoring could also be used. The Scientific Committee would use the best available information to judge whether exceptional circumstances should be declared, with the detailed response to be developed later in the week.</w:t>
+        <w:t xml:space="preserve">Record decisions, issues requiring further work, and follow-up tasks for the workshop report to SC14.</w:t>
       </w:r>
     </w:p>
     <w:bookmarkEnd w:id="16"/>
-    <w:bookmarkStart w:id="17" w:name="model-developments-since-the-benchmark"/>
+    <w:bookmarkStart w:id="19" w:name="developments-since-the-benchmark"/>
     <w:p>
       <w:pPr>
+        <w:pStyle w:val="Heading1"/>
+      </w:pPr>
+      <w:r>
+        <w:t xml:space="preserve">Developments Since the Benchmark</w:t>
+      </w:r>
+    </w:p>
+    <w:bookmarkStart w:id="17" w:name="Xeeed3d519cc312d972037247414cb7d11e44166"/>
+    <w:p>
+      <w:pPr>
         <w:pStyle w:val="Heading2"/>
       </w:pPr>
       <w:r>
-        <w:t xml:space="preserve">Model Developments Since the Benchmark</w:t>
+        <w:t xml:space="preserve">Assessment, Operating Models, and MSE Approach</w:t>
       </w:r>
     </w:p>
     <w:p>
@@ -812,7 +946,7 @@
         </w:numPr>
       </w:pPr>
       <w:r>
-        <w:t xml:space="preserve">Paper 01 summarized post-benchmark work, including corrections to the Peruvian industrial CPUE series and revised selectivity treatment. A CPUE scaling error was corrected: the effort-creep factor had been applied by multiplication rather than division. Correcting the error lowered the end of the industrial CPUE series, while the artisanal series was unchanged.</w:t>
+        <w:t xml:space="preserve">The group distinguished the annual assessment from the OM used in the MSE. The assessment will continue to support Scientific Committee advice, whereas OM conditioning is a broader exercise intended to represent plausible system dynamics for testing CMPs. Participants cautioned against treating the OM reference set as a single best assessment.</w:t>
       </w:r>
     </w:p>
     <w:p>
@@ -823,7 +957,7 @@
         </w:numPr>
       </w:pPr>
       <w:r>
-        <w:t xml:space="preserve">A reduced-parameter selectivity formulation was presented for the Peruvian fleet. The revised block-based selectivity reduced the number of parameters substantially while producing little change in the length-frequency negative log-likelihood. The group considered the reduced formulation and final-F handling more plausible for OM conditioning.</w:t>
+        <w:t xml:space="preserve">The group discussed empirical and assessment-based CMPs. Participants noted that complex assessment-based CMPs can be difficult to simulate faithfully, slow to run, and hard to reproduce if the assessment is repeatedly adjusted. The prevailing view favored simple, locked-in empirical rules tested through MSE, with assessments and legal requirements used as external checks alongside the core automated rule.</w:t>
       </w:r>
     </w:p>
     <w:p>
@@ -834,82 +968,17 @@
         </w:numPr>
       </w:pPr>
       <w:r>
-        <w:t xml:space="preserve">A differentiable penalty was added to discourage mean fishing mortality over ages 2-5 from exceeding high values in implausible solutions. The penalty was described as a regularizing device to help the solver, with converged estimates of biomass and recruitment expected to remain effectively unchanged.</w:t>
-      </w:r>
-    </w:p>
-    <w:p>
-      <w:pPr>
-        <w:numPr>
-          <w:ilvl w:val="0"/>
-          <w:numId w:val="1006"/>
-        </w:numPr>
-      </w:pPr>
-      <w:r>
-        <w:t xml:space="preserve">The group compared several benchmark-derived model variants, including the SC13-era model 0.00/1.14 and the post-benchmark sequence 0.14, 0.15, and 0.16. Model 0.16 was treated as the primary reference for OM conditioning during the workshop. Model 0.00 was retained as an explicitly flagged alternative and robustness test.</w:t>
-      </w:r>
-    </w:p>
-    <w:p>
-      <w:pPr>
-        <w:numPr>
-          <w:ilvl w:val="0"/>
-          <w:numId w:val="1006"/>
-        </w:numPr>
-      </w:pPr>
-      <w:r>
-        <w:t xml:space="preserve">Participants noted that the differences among model variants were driven substantially by the revised Peruvian inputs and effort-creep treatment. Critiques of model 0.16 were recorded as concerns about its characteristics, while model 0.00 was treated as an alternative for labelled comparison rather than as a preferred biological interpretation.</w:t>
-      </w:r>
-    </w:p>
-    <w:p>
-      <w:pPr>
-        <w:numPr>
-          <w:ilvl w:val="0"/>
-          <w:numId w:val="1006"/>
-        </w:numPr>
-      </w:pPr>
-      <w:r>
-        <w:t xml:space="preserve">Diagnostic outputs included one-step-ahead residuals, length-data residuals, retrospective patterns, and MCMC comparisons of posterior and asymptotic estimates. Overall diagnostics were considered adequate for OM conditioning, while retrospective bias, slow-mixing parameters, and dynamic reference-point volatility remained areas for further review.</w:t>
-      </w:r>
-    </w:p>
-    <w:p>
-      <w:pPr>
-        <w:numPr>
-          <w:ilvl w:val="0"/>
-          <w:numId w:val="1006"/>
-        </w:numPr>
-      </w:pPr>
-      <w:r>
-        <w:t xml:space="preserve">The group reviewed differences between single-stock and two-stock estimates. Splitting the population into two stocks produced a lower combined biomass estimate than the single-stock model. Participants discussed how optimistic and pessimistic indices are redistributed between components and noted that naive merging of components should be avoided.</w:t>
-      </w:r>
-    </w:p>
-    <w:p>
-      <w:pPr>
-        <w:numPr>
-          <w:ilvl w:val="0"/>
-          <w:numId w:val="1006"/>
-        </w:numPr>
-      </w:pPr>
-      <w:r>
-        <w:t xml:space="preserve">The two-stock configurations showed somewhat different MCMC behaviour but remained usable for comparison. The group noted that structurally divergent OMs are harder to tune jointly and require careful communication if they are included in the reference or robustness set.</w:t>
+        <w:t xml:space="preserve">Exceptional circumstances were introduced as a key design issue. The group noted that a full assessment is one possible response, while indicator-based monitoring could also be used. The Scientific Committee would use the best available information to judge whether exceptional circumstances should be declared, with the detailed response to be developed later in the week.</w:t>
       </w:r>
     </w:p>
     <w:bookmarkEnd w:id="17"/>
-    <w:bookmarkEnd w:id="18"/>
-    <w:bookmarkStart w:id="24" w:name="operating-model-specifications"/>
+    <w:bookmarkStart w:id="18" w:name="model-developments-since-the-benchmark"/>
     <w:p>
       <w:pPr>
-        <w:pStyle w:val="Heading1"/>
-      </w:pPr>
-      <w:r>
-        <w:t xml:space="preserve">Operating-Model Specifications</w:t>
-      </w:r>
-    </w:p>
-    <w:bookmarkStart w:id="19" w:name="X36c329a4bda5f6739a3672fe8bf246085b683ee"/>
-    <w:p>
-      <w:pPr>
         <w:pStyle w:val="Heading2"/>
       </w:pPr>
       <w:r>
-        <w:t xml:space="preserve">Simulating Indices for Management Procedures</w:t>
+        <w:t xml:space="preserve">Model Developments Since the Benchmark</w:t>
       </w:r>
     </w:p>
     <w:p>
@@ -920,7 +989,7 @@
         </w:numPr>
       </w:pPr>
       <w:r>
-        <w:t xml:space="preserve">The group discussed how to simulate future observations for indices that may track stock biomass differently through time. This is central to the availability and El Nino robustness issues raised at SCW15.</w:t>
+        <w:t xml:space="preserve">Paper 01 summarized post-benchmark work, including corrections to the Peruvian industrial CPUE series and revised selectivity treatment. A CPUE scaling error was corrected: the effort-creep factor had been applied by multiplication rather than division. Correcting the error lowered the end of the industrial CPUE series, while the artisanal series was unchanged.</w:t>
       </w:r>
     </w:p>
     <w:p>
@@ -931,7 +1000,7 @@
         </w:numPr>
       </w:pPr>
       <w:r>
-        <w:t xml:space="preserve">Participants agreed that a practical forward-projection representation of standardized indices should use a simpler structure, such as autocorrelation plus observation error, rather than attempting to reproduce the full GLM, GAMM, or spatio-temporal standardization procedures. Routine checks should compare simulated index behaviour with historical variability and observed index-stock correlations.</w:t>
+        <w:t xml:space="preserve">A reduced-parameter selectivity formulation was presented for the Peruvian fleet. The revised block-based selectivity reduced the number of parameters substantially while producing little change in the length-frequency negative log-likelihood. The group considered the reduced formulation and final-F handling more plausible for OM conditioning.</w:t>
       </w:r>
     </w:p>
     <w:p>
@@ -942,17 +1011,82 @@
         </w:numPr>
       </w:pPr>
       <w:r>
-        <w:t xml:space="preserve">On combining multiple indices in empirical rules, the group agreed that weighting by representativity was more appropriate than weighting by catch.</w:t>
+        <w:t xml:space="preserve">A differentiable penalty was added to discourage mean fishing mortality over ages 2-5 from exceeding high values in implausible solutions. The penalty was described as a regularizing device to help the solver, with converged estimates of biomass and recruitment expected to remain effectively unchanged.</w:t>
       </w:r>
     </w:p>
+    <w:p>
+      <w:pPr>
+        <w:numPr>
+          <w:ilvl w:val="0"/>
+          <w:numId w:val="1007"/>
+        </w:numPr>
+      </w:pPr>
+      <w:r>
+        <w:t xml:space="preserve">The group compared several benchmark-derived model variants, including the SC13-era model 0.00/1.14 and the post-benchmark sequence 0.14, 0.15, and 0.16. Model 0.16 was treated as the primary reference for OM conditioning during the workshop. Model 0.00 was retained as an explicitly flagged alternative and robustness test.</w:t>
+      </w:r>
+    </w:p>
+    <w:p>
+      <w:pPr>
+        <w:numPr>
+          <w:ilvl w:val="0"/>
+          <w:numId w:val="1007"/>
+        </w:numPr>
+      </w:pPr>
+      <w:r>
+        <w:t xml:space="preserve">Participants noted that the differences among model variants were driven substantially by the revised Peruvian inputs and effort-creep treatment. Critiques of model 0.16 were recorded as concerns about its characteristics, while model 0.00 was treated as an alternative for labelled comparison rather than as a preferred biological interpretation.</w:t>
+      </w:r>
+    </w:p>
+    <w:p>
+      <w:pPr>
+        <w:numPr>
+          <w:ilvl w:val="0"/>
+          <w:numId w:val="1007"/>
+        </w:numPr>
+      </w:pPr>
+      <w:r>
+        <w:t xml:space="preserve">Diagnostic outputs included one-step-ahead residuals, length-data residuals, retrospective patterns, and MCMC comparisons of posterior and asymptotic estimates. Overall diagnostics were considered adequate for OM conditioning, while retrospective bias, slow-mixing parameters, and dynamic reference-point volatility remained areas for further review.</w:t>
+      </w:r>
+    </w:p>
+    <w:p>
+      <w:pPr>
+        <w:numPr>
+          <w:ilvl w:val="0"/>
+          <w:numId w:val="1007"/>
+        </w:numPr>
+      </w:pPr>
+      <w:r>
+        <w:t xml:space="preserve">The group reviewed differences between single-stock and two-stock estimates. Splitting the population into two stocks produced a lower combined biomass estimate than the single-stock model. Participants discussed how optimistic and pessimistic indices are redistributed between components and noted that naive merging of components should be avoided.</w:t>
+      </w:r>
+    </w:p>
+    <w:p>
+      <w:pPr>
+        <w:numPr>
+          <w:ilvl w:val="0"/>
+          <w:numId w:val="1007"/>
+        </w:numPr>
+      </w:pPr>
+      <w:r>
+        <w:t xml:space="preserve">The two-stock configurations showed somewhat different MCMC behaviour but remained usable for comparison. The group noted that structurally divergent OMs are harder to tune jointly and require careful communication if they are included in the reference or robustness set.</w:t>
+      </w:r>
+    </w:p>
+    <w:bookmarkEnd w:id="18"/>
     <w:bookmarkEnd w:id="19"/>
-    <w:bookmarkStart w:id="20" w:name="operating-model-reference-set"/>
+    <w:bookmarkStart w:id="25" w:name="operating-model-specifications"/>
     <w:p>
       <w:pPr>
+        <w:pStyle w:val="Heading1"/>
+      </w:pPr>
+      <w:r>
+        <w:t xml:space="preserve">Operating-Model Specifications</w:t>
+      </w:r>
+    </w:p>
+    <w:bookmarkStart w:id="20" w:name="X36c329a4bda5f6739a3672fe8bf246085b683ee"/>
+    <w:p>
+      <w:pPr>
         <w:pStyle w:val="Heading2"/>
       </w:pPr>
       <w:r>
-        <w:t xml:space="preserve">Operating-Model Reference Set</w:t>
+        <w:t xml:space="preserve">Simulating Indices for Management Procedures</w:t>
       </w:r>
     </w:p>
     <w:p>
@@ -963,7 +1097,7 @@
         </w:numPr>
       </w:pPr>
       <w:r>
-        <w:t xml:space="preserve">The composition of the OM reference set was debated, including the implications of model 0.00 as an optimistic high-biomass, low-exploitation outcome that could affect CMP tuning and communication. The practical approach was to focus immediate tuning work on model 0.16, while retaining model 0.00 and the SC13-era configuration as clearly labelled alternatives or robustness tests. The final reference-set decision was identified for further discussion and Scientific Committee review, alongside related work on future recruitment and index simulation, ENSO and broader climate effects, OM-set composition and naming, reference-point proxies, and projection-scenario definitions.</w:t>
+        <w:t xml:space="preserve">The group discussed how to simulate future observations for indices that may track stock biomass differently through time. This is central to the availability and El Nino robustness issues raised at SCW15.</w:t>
       </w:r>
     </w:p>
     <w:p>
@@ -974,7 +1108,7 @@
         </w:numPr>
       </w:pPr>
       <w:r>
-        <w:t xml:space="preserve">The group discussed using cross-correlation among indices to simulate future recruitment deviations. Participants noted that historical correlations are approximate because the series include changes in catchability and selectivity, whereas the projection settings use the more recent period. Residual autocorrelation should also be represented where possible.</w:t>
+        <w:t xml:space="preserve">Participants agreed that a practical forward-projection representation of standardized indices should use a simpler structure, such as autocorrelation plus observation error, rather than attempting to reproduce the full GLM, GAMM, or spatio-temporal standardization procedures. Routine checks should compare simulated index behaviour with historical variability and observed index-stock correlations.</w:t>
       </w:r>
     </w:p>
     <w:p>
@@ -985,17 +1119,17 @@
         </w:numPr>
       </w:pPr>
       <w:r>
-        <w:t xml:space="preserve">The group agreed to implement an approximate treatment rather than attempting a fully specified multivariate autocorrelated time-series model. The practical check is whether simulated deviations are consistent with the historical period and suitable for testing CMPs.</w:t>
+        <w:t xml:space="preserve">On combining multiple indices in empirical rules, the group agreed that weighting by representativity was more appropriate than weighting by catch.</w:t>
       </w:r>
     </w:p>
     <w:bookmarkEnd w:id="20"/>
-    <w:bookmarkStart w:id="21" w:name="enso-regimes-and-climate-effects"/>
+    <w:bookmarkStart w:id="21" w:name="operating-model-reference-set"/>
     <w:p>
       <w:pPr>
         <w:pStyle w:val="Heading2"/>
       </w:pPr>
       <w:r>
-        <w:t xml:space="preserve">ENSO, Regimes, and Climate Effects</w:t>
+        <w:t xml:space="preserve">Operating-Model Reference Set</w:t>
       </w:r>
     </w:p>
     <w:p>
@@ -1006,7 +1140,7 @@
         </w:numPr>
       </w:pPr>
       <w:r>
-        <w:t xml:space="preserve">The Chair reviewed earlier El Nino work, including catchability drift and the possibility of changing the offshore versus inshore catch distribution in projections. Participants noted that the main practical handle for representing availability effects in the current setup is through recruitment or productivity.</w:t>
+        <w:t xml:space="preserve">The composition of the OM reference set was debated, including the implications of model 0.00 as an optimistic high-biomass, low-exploitation outcome that could affect CMP tuning and communication. The practical approach was to focus immediate tuning work on model 0.16, while retaining model 0.00 and the SC13-era configuration as clearly labelled alternatives or robustness tests. The final reference-set decision was identified for further discussion and Scientific Committee review, alongside related work on future recruitment and index simulation, ENSO and broader climate effects, OM-set composition and naming, reference-point proxies, and projection-scenario definitions.</w:t>
       </w:r>
     </w:p>
     <w:p>
@@ -1017,7 +1151,7 @@
         </w:numPr>
       </w:pPr>
       <w:r>
-        <w:t xml:space="preserve">The group discussed whether ENSO or regime behaviour should be represented in the core simulations. Earlier ENSO checks provided limited recruitment signal, and each El Nino event may differ in spatial and biological effect. The group agreed to treat regime/ENSO behaviour as a robustness issue, potentially through resampling high- and low-productivity historical periods, rather than as an integral component of the reference simulations.</w:t>
+        <w:t xml:space="preserve">The group discussed using cross-correlation among indices to simulate future recruitment deviations. Participants noted that historical correlations are approximate because the series include changes in catchability and selectivity, whereas the projection settings use the more recent period. Residual autocorrelation should also be represented where possible.</w:t>
       </w:r>
     </w:p>
     <w:p>
@@ -1028,39 +1162,17 @@
         </w:numPr>
       </w:pPr>
       <w:r>
-        <w:t xml:space="preserve">Dr. Tom Carruthers presented options for treating climate effects within MSE, drawing on recent ICCAT climate-test work on robustness trials and climate-robustness performance metrics [Carruthers 2024a, 2024b]. His presentation emphasized that climate effects on single-species dynamics can be reduced to a limited set of impact types: increased natural mortality, reduced somatic growth, reduced condition factor, reduced recruitment strength, spatial redistribution or range contraction, and reduced carrying capacity.</w:t>
-      </w:r>
-    </w:p>
-    <w:p>
-      <w:pPr>
-        <w:numPr>
-          <w:ilvl w:val="0"/>
-          <w:numId w:val="1009"/>
-        </w:numPr>
-      </w:pPr>
-      <w:r>
-        <w:t xml:space="preserve">The presentation argued that uncertain climate forecasts still allow progress on robust fishery management. Rather than constructing many climate-specific operating models with uncertain credibility, climate robustness can be reported as an attribute of each CMP. Under this framing, CMPs are tested against directional stressors and assigned robustness metrics according to the level of impact they can absorb before breaching a defined threshold. This is consistent with the ICCAT proof-of-concept approach, which shifted the emphasis from defensible forecasts of exact future climate impacts to comparable performance metrics for CMPs.</w:t>
-      </w:r>
-    </w:p>
-    <w:p>
-      <w:pPr>
-        <w:numPr>
-          <w:ilvl w:val="0"/>
-          <w:numId w:val="1009"/>
-        </w:numPr>
-      </w:pPr>
-      <w:r>
-        <w:t xml:space="preserve">The demonstration used empirical CMPs and climate stress tests for natural mortality, recruitment, growth, and condition factor. It showed how different CMP archetypes can differ in climate robustness, and how the result can be expressed in practical terms for tactical advice. The Working Group expressed its gratitude to Dr. Carruthers for contributing this presentation and for helping frame climate robustness in a form that can support Scientific Committee and Commission discussion.</w:t>
+        <w:t xml:space="preserve">The group agreed to implement an approximate treatment rather than attempting a fully specified multivariate autocorrelated time-series model. The practical check is whether simulated deviations are consistent with the historical period and suitable for testing CMPs.</w:t>
       </w:r>
     </w:p>
     <w:bookmarkEnd w:id="21"/>
-    <w:bookmarkStart w:id="23" w:name="operating-model-set-and-naming"/>
+    <w:bookmarkStart w:id="22" w:name="enso-regimes-and-climate-effects"/>
     <w:p>
       <w:pPr>
         <w:pStyle w:val="Heading2"/>
       </w:pPr>
       <w:r>
-        <w:t xml:space="preserve">Operating-Model Set and Naming</w:t>
+        <w:t xml:space="preserve">ENSO, Regimes, and Climate Effects</w:t>
       </w:r>
     </w:p>
     <w:p>
@@ -1071,7 +1183,7 @@
         </w:numPr>
       </w:pPr>
       <w:r>
-        <w:t xml:space="preserve">The group worked through the OM list and naming conventions. The agreed set included one-stock versus two-stock configurations, model 0.16 versus model 1.14, movement variants, and a selectivity-change variant. The reference set would be conditioned and tuned on the one-stock model, with additional two-stock conditioning; the two-stock 1.14 configuration would serve as a robustness test and must perform acceptably.</w:t>
+        <w:t xml:space="preserve">The Chair reviewed earlier El Nino work, including catchability drift and the possibility of changing the offshore versus inshore catch distribution in projections. Participants noted that the main practical handle for representing availability effects in the current setup is through recruitment or productivity.</w:t>
       </w:r>
     </w:p>
     <w:p>
@@ -1082,7 +1194,72 @@
         </w:numPr>
       </w:pPr>
       <w:r>
-        <w:t xml:space="preserve">Movement would be smoothed from 2026 toward the average of the last ten years to avoid an abrupt discontinuity. The selectivity-change robustness test compares a 2005-2015 average with the 2015-2025 recent pattern. Autocorrelation in recruitment deviations provides the current representation of ENSO-related recruitment persistence.</w:t>
+        <w:t xml:space="preserve">The group discussed whether ENSO or regime behaviour should be represented in the core simulations. Earlier ENSO checks provided limited recruitment signal, and each El Nino event may differ in spatial and biological effect. The group agreed to treat regime/ENSO behaviour as a robustness issue, potentially through resampling high- and low-productivity historical periods, rather than as an integral component of the reference simulations.</w:t>
+      </w:r>
+    </w:p>
+    <w:p>
+      <w:pPr>
+        <w:numPr>
+          <w:ilvl w:val="0"/>
+          <w:numId w:val="1010"/>
+        </w:numPr>
+      </w:pPr>
+      <w:r>
+        <w:t xml:space="preserve">Dr. Tom Carruthers presented options for treating climate effects within MSE, drawing on recent ICCAT climate-test work on robustness trials and climate-robustness performance metrics [Carruthers 2024a, 2024b]. His presentation emphasized that climate effects on single-species dynamics can be reduced to a limited set of impact types: increased natural mortality, reduced somatic growth, reduced condition factor, reduced recruitment strength, spatial redistribution or range contraction, and reduced carrying capacity.</w:t>
+      </w:r>
+    </w:p>
+    <w:p>
+      <w:pPr>
+        <w:numPr>
+          <w:ilvl w:val="0"/>
+          <w:numId w:val="1010"/>
+        </w:numPr>
+      </w:pPr>
+      <w:r>
+        <w:t xml:space="preserve">The presentation argued that uncertain climate forecasts still allow progress on robust fishery management. Rather than constructing many climate-specific operating models with uncertain credibility, climate robustness can be reported as an attribute of each CMP. Under this framing, CMPs are tested against directional stressors and assigned robustness metrics according to the level of impact they can absorb before breaching a defined threshold. This is consistent with the ICCAT proof-of-concept approach, which shifted the emphasis from defensible forecasts of exact future climate impacts to comparable performance metrics for CMPs.</w:t>
+      </w:r>
+    </w:p>
+    <w:p>
+      <w:pPr>
+        <w:numPr>
+          <w:ilvl w:val="0"/>
+          <w:numId w:val="1010"/>
+        </w:numPr>
+      </w:pPr>
+      <w:r>
+        <w:t xml:space="preserve">The demonstration used empirical CMPs and climate stress tests for natural mortality, recruitment, growth, and condition factor. It showed how different CMP archetypes can differ in climate robustness, and how the result can be expressed in practical terms for tactical advice. The Working Group expressed its gratitude to Dr. Carruthers for contributing this presentation and for helping frame climate robustness in a form that can support Scientific Committee and Commission discussion.</w:t>
+      </w:r>
+    </w:p>
+    <w:bookmarkEnd w:id="22"/>
+    <w:bookmarkStart w:id="24" w:name="operating-model-set-and-naming"/>
+    <w:p>
+      <w:pPr>
+        <w:pStyle w:val="Heading2"/>
+      </w:pPr>
+      <w:r>
+        <w:t xml:space="preserve">Operating-Model Set and Naming</w:t>
+      </w:r>
+    </w:p>
+    <w:p>
+      <w:pPr>
+        <w:numPr>
+          <w:ilvl w:val="0"/>
+          <w:numId w:val="1011"/>
+        </w:numPr>
+      </w:pPr>
+      <w:r>
+        <w:t xml:space="preserve">The group worked through the OM list and naming conventions as a trial set for learning about model behaviour and the characteristics of alternative projection assumptions. The trial set included one-stock versus two-stock configurations, model 0.16 versus model 1.14, movement variants, and a selectivity-change variant. The purpose was to understand how these dimensions affected CMP tuning, robustness, and interpretation before finalizing the operating-model set for Scientific Committee review.</w:t>
+      </w:r>
+    </w:p>
+    <w:p>
+      <w:pPr>
+        <w:numPr>
+          <w:ilvl w:val="0"/>
+          <w:numId w:val="1011"/>
+        </w:numPr>
+      </w:pPr>
+      <w:r>
+        <w:t xml:space="preserve">Movement smoothing, selectivity-window changes, and recruitment-deviation variants were treated as trial contrasts rather than final conclusions. Movement would be smoothed from 2026 toward the average of the last ten years to avoid an abrupt discontinuity. The selectivity-change contrast compares a 2005-2015 average with the 2015-2025 recent pattern. Autocorrelation in recruitment deviations provides the current representation of ENSO-related recruitment persistence.</w:t>
       </w:r>
     </w:p>
     <w:tbl>
@@ -1098,7 +1275,7 @@
       <w:tr>
         <w:tc>
           <w:tcPr/>
-          <w:bookmarkStart w:id="22" w:name="tbl-day2-om-set"/>
+          <w:bookmarkStart w:id="23" w:name="tbl-day2-om-set"/>
           <w:p>
             <w:pPr>
               <w:jc w:val="center"/>
@@ -1109,7 +1286,7 @@
               <w:pStyle w:val="ImageCaption"/>
             </w:pPr>
             <w:r>
-              <w:t xml:space="preserve">Table 1: Day 2 operating-model and projection set.</w:t>
+              <w:t xml:space="preserve">Table 1: Trial operating-model and projection set used to explore behaviour and characteristics.</w:t>
             </w:r>
           </w:p>
           <w:tbl xmlns:w="http://schemas.openxmlformats.org/wordprocessingml/2006/main" xmlns:wp="http://schemas.openxmlformats.org/drawingml/2006/wordprocessingDrawing" xmlns:r="http://schemas.openxmlformats.org/officeDocument/2006/relationships" xmlns:w14="http://schemas.microsoft.com/office/word/2010/wordml">
@@ -3279,13 +3456,13 @@
               </w:tc>
             </w:tr>
           </w:tbl>
-          <w:bookmarkEnd w:id="22"/>
+          <w:bookmarkEnd w:id="23"/>
         </w:tc>
       </w:tr>
     </w:tbl>
-    <w:bookmarkEnd w:id="23"/>
     <w:bookmarkEnd w:id="24"/>
-    <w:bookmarkStart w:id="31" w:name="management-procedures"/>
+    <w:bookmarkEnd w:id="25"/>
+    <w:bookmarkStart w:id="37" w:name="management-procedures"/>
     <w:p>
       <w:pPr>
         <w:pStyle w:val="Heading1"/>
@@ -3298,18 +3475,18 @@
       <w:pPr>
         <w:numPr>
           <w:ilvl w:val="0"/>
-          <w:numId w:val="1011"/>
+          <w:numId w:val="1012"/>
         </w:numPr>
       </w:pPr>
       <w:r>
-        <w:t xml:space="preserve">Management procedures require careful consideration because their design choices determine how scientific indicators are translated into catch advice and how expected outcomes are communicated. The group therefore considered both the form of CMPs and the practical implications of their performance, including responsiveness to changing stock indicators, robustness to operating-model uncertainty, stability of catch advice, and interpretability for Scientific Committee and Commission review.</w:t>
+        <w:t xml:space="preserve">Management procedures require careful consideration because their design choices determine how scientific indicators are translated into catch advice and how expected outcomes are communicated. The group therefore considered both the form of CMPs and the practical implications of their performance, including responsiveness to changing stock indicators, robustness to operating-model uncertainty, stability of catch advice, and interpretability for Scientific Committee and Commission review. The CMPs examined during the workshop were treated as trial designs to learn about behavior, tuning, and trade-offs; they were not intended to represent a final design grid.</w:t>
       </w:r>
     </w:p>
     <w:p>
       <w:pPr>
         <w:numPr>
           <w:ilvl w:val="0"/>
-          <w:numId w:val="1011"/>
+          <w:numId w:val="1012"/>
         </w:numPr>
       </w:pPr>
       <w:r>
@@ -3320,7 +3497,7 @@
       <w:pPr>
         <w:numPr>
           <w:ilvl w:val="0"/>
-          <w:numId w:val="1011"/>
+          <w:numId w:val="1012"/>
         </w:numPr>
       </w:pPr>
       <w:r>
@@ -3364,18 +3541,18 @@
       <w:pPr>
         <w:numPr>
           <w:ilvl w:val="0"/>
-          <w:numId w:val="1011"/>
+          <w:numId w:val="1012"/>
         </w:numPr>
       </w:pPr>
       <w:r>
-        <w:t xml:space="preserve">CMP and HCR discussions emphasized starting with simple, interpretable rules. The group discussed index-based rules in which catch responds to changes in one or more abundance indices, rather than relying on constant catch. Several design handles were identified for testing: whether the rule passes through the origin, whether it includes a minimum catch or flat low-index segment, upper catch limits, trigger points, smoothing windows, polynomial smoothing, and TAC-change constraints. The group specifically discussed testing constraints such as 20% increases and 15% decreases, and evaluating whether these constraints still allow the CMP to respond quickly enough to low-recruitment events.</w:t>
+        <w:t xml:space="preserve">CMP and HCR discussions emphasized starting with simple, interpretable rules. The group discussed index-based rules in which catch responds to changes in one or more abundance indices, rather than relying on constant catch. Several design handles were identified for testing: whether the rule passes through the origin, whether it includes a minimum catch or flat low-index segment, upper catch limits, trigger points, smoothing windows, polynomial smoothing, and TAC-change constraints. The group specifically discussed testing constraints such as 20% increases and 15% decreases, and evaluating whether these constraints still allow the CMP to respond quickly enough to low-recruitment events. The group favored piecewise-linear terminology for these rules, while retaining existing code labels where needed.</w:t>
       </w:r>
     </w:p>
     <w:p>
       <w:pPr>
         <w:numPr>
           <w:ilvl w:val="0"/>
-          <w:numId w:val="1011"/>
+          <w:numId w:val="1012"/>
         </w:numPr>
       </w:pPr>
       <w:r>
@@ -3386,95 +3563,20 @@
       <w:pPr>
         <w:numPr>
           <w:ilvl w:val="0"/>
-          <w:numId w:val="1011"/>
+          <w:numId w:val="1012"/>
         </w:numPr>
       </w:pPr>
       <w:r>
-        <w:t xml:space="preserve">Tuning and performance summaries were discussed as a practical next step. The group planned to run grids of HCR/CMP configurations and summarize results using compact performance tables and diagnostic plots showing biomass, yield, and yield variability. The aim was to identify broad trade-off behavior rather than over-interpret early individual runs.</w:t>
-      </w:r>
-    </w:p>
-    <w:p>
-      <w:pPr>
-        <w:numPr>
-          <w:ilvl w:val="0"/>
-          <w:numId w:val="1011"/>
-        </w:numPr>
-      </w:pPr>
-      <w:r>
-        <w:t xml:space="preserve">A substantial part of the Day 3 discussion addressed exceptional circumstances protocols. Tom Carruthers demonstrated the ECP approach, emphasizing that exceptional circumstances should not be based only on whether an observation falls outside a projected range. Instead, robustness simulations can be used to identify data patterns associated with poor CMP performance, and then evaluate type I and type II error rates for detecting those problematic states. The group discussed applying this framework to jack mackerel MSE outputs, including recent concerns about fishing conditions, recruitment, stock indicators, and the possibility that current observations may imply conditions outside the reference simulations.</w:t>
-      </w:r>
-    </w:p>
-    <w:p>
-      <w:pPr>
-        <w:numPr>
-          <w:ilvl w:val="0"/>
-          <w:numId w:val="1011"/>
-        </w:numPr>
-      </w:pPr>
-      <w:r>
-        <w:t xml:space="preserve">A further point was that fishery behavior and effort constraints may matter. Participants noted that a TAC may be theoretically catchable in the model but not economically or operationally achievable if vessels cannot find fish or if fishing conditions deteriorate. There was interest in whether effort or fleet-behavior constraints could be represented in future scenarios or diagnostics, while recognizing that doing so would require additional assumptions and data.</w:t>
-      </w:r>
-    </w:p>
-    <w:p>
-      <w:pPr>
-        <w:numPr>
-          <w:ilvl w:val="0"/>
-          <w:numId w:val="1011"/>
-        </w:numPr>
-      </w:pPr>
-      <w:r>
-        <w:t xml:space="preserve">CMPs based on piecewise-linear harvest-control rules can be summarized by the threshold metric at which the rule begins to increase catch, the target catch reached above the trigger, and any inter-annual TAC-change constraints. Part of the SCW17 process is for Members and participants to nominate CMPs for Scientific Committee consideration, after which redundant or materially overlapping CMPs should be eliminated so that the Scientific Committee can focus on a concise set of distinct alternatives.</w:t>
-      </w:r>
-      <w:r>
-        <w:t xml:space="preserve"> </w:t>
-      </w:r>
-      <w:hyperlink w:anchor="tbl-hcr-candidates">
-        <w:r>
-          <w:rPr>
-            <w:rStyle w:val="Hyperlink"/>
-          </w:rPr>
-          <w:t xml:space="preserve">Table 2</w:t>
-        </w:r>
-      </w:hyperlink>
-      <w:r>
-        <w:t xml:space="preserve"> </w:t>
-      </w:r>
-      <w:r>
-        <w:t xml:space="preserve">records the parameters used for the illustrative CMP set.</w:t>
-      </w:r>
-      <w:r>
-        <w:t xml:space="preserve"> </w:t>
-      </w:r>
-      <w:hyperlink w:anchor="fig-hcr-faceted">
-        <w:r>
-          <w:rPr>
-            <w:rStyle w:val="Hyperlink"/>
-          </w:rPr>
-          <w:t xml:space="preserve">Figure 1</w:t>
-        </w:r>
-      </w:hyperlink>
-      <w:r>
-        <w:t xml:space="preserve"> </w:t>
-      </w:r>
-      <w:r>
-        <w:t xml:space="preserve">shows the static HCR shape for each row; smoothing choices and index selection affect the metric passed into the HCR and are omitted from the curve. The quadrant colors in</w:t>
-      </w:r>
-      <w:r>
-        <w:t xml:space="preserve"> </w:t>
-      </w:r>
-      <w:hyperlink w:anchor="fig-hcr-faceted">
-        <w:r>
-          <w:rPr>
-            <w:rStyle w:val="Hyperlink"/>
-          </w:rPr>
-          <w:t xml:space="preserve">Figure 1</w:t>
-        </w:r>
-      </w:hyperlink>
-      <w:r>
-        <w:t xml:space="preserve"> </w:t>
-      </w:r>
-      <w:r>
-        <w:t xml:space="preserve">are included only to enhance visualization of differences among HCR shapes and do not indicate stock-status concerns.</w:t>
+        <w:t xml:space="preserve">Tuning and performance summaries were discussed as a practical next step. The group planned to run grids of HCR/CMP configurations and summarize results using compact performance tables and diagnostic plots showing biomass, yield, and yield variability. The aim was to identify broad trade-off behavior rather than over-interpret early individual runs. Because many trial CMPs were tuned to the same P(Green) target, P(Green) alone was not considered sufficient for ranking among tuned CMPs; interpretation also required catch, spawning biomass, F/F</w:t>
+      </w:r>
+      <w:r>
+        <w:rPr>
+          <w:vertAlign w:val="subscript"/>
+        </w:rPr>
+        <w:t xml:space="preserve">MSY</w:t>
+      </w:r>
+      <w:r>
+        <w:t xml:space="preserve">, inter-annual catch variability, low-catch probabilities, and indicators of fishery feasibility.</w:t>
       </w:r>
     </w:p>
     <w:tbl>
@@ -3490,7 +3592,238 @@
       <w:tr>
         <w:tc>
           <w:tcPr/>
-          <w:bookmarkStart w:id="25" w:name="tbl-hcr-candidates"/>
+          <w:bookmarkStart w:id="29" w:name="fig-cmp-reference-base-tuning"/>
+          <w:p>
+            <w:pPr>
+              <w:pStyle w:val="Compact"/>
+              <w:jc w:val="center"/>
+            </w:pPr>
+            <w:r>
+              <w:drawing>
+                <wp:inline>
+                  <wp:extent cx="5334000" cy="3048000"/>
+                  <wp:effectExtent b="0" l="0" r="0" t="0"/>
+                  <wp:docPr descr="" title="" id="27" name="Picture"/>
+                  <a:graphic>
+                    <a:graphicData uri="http://schemas.openxmlformats.org/drawingml/2006/picture">
+                      <pic:pic>
+                        <pic:nvPicPr>
+                          <pic:cNvPr descr="figures/cmp-reference-base-tuning.png" id="28" name="Picture"/>
+                          <pic:cNvPicPr>
+                            <a:picLocks noChangeArrowheads="1" noChangeAspect="1"/>
+                          </pic:cNvPicPr>
+                        </pic:nvPicPr>
+                        <pic:blipFill>
+                          <a:blip r:embed="rId26"/>
+                          <a:stretch>
+                            <a:fillRect/>
+                          </a:stretch>
+                        </pic:blipFill>
+                        <pic:spPr bwMode="auto">
+                          <a:xfrm>
+                            <a:off x="0" y="0"/>
+                            <a:ext cx="5334000" cy="3048000"/>
+                          </a:xfrm>
+                          <a:prstGeom prst="rect">
+                            <a:avLst/>
+                          </a:prstGeom>
+                          <a:noFill/>
+                          <a:ln w="9525">
+                            <a:noFill/>
+                            <a:headEnd/>
+                            <a:tailEnd/>
+                          </a:ln>
+                        </pic:spPr>
+                      </pic:pic>
+                    </a:graphicData>
+                  </a:graphic>
+                </wp:inline>
+              </w:drawing>
+            </w:r>
+          </w:p>
+          <w:p>
+            <w:pPr>
+              <w:jc w:val="center"/>
+            </w:pPr>
+            <w:pPr>
+              <w:jc w:val="left"/>
+              <w:spacing w:before="200"/>
+              <w:pStyle w:val="ImageCaption"/>
+            </w:pPr>
+            <w:r>
+              <w:t xml:space="preserve">Figure 1: Long-term performance summaries for a set of CMP tuning runs against the reference base model. Panels show catch, P(Green), inter-annual catch variability, spawning biomass, shutdown probability, and F relative to F</w:t>
+            </w:r>
+            <w:r>
+              <w:rPr>
+                <w:vertAlign w:val="subscript"/>
+              </w:rPr>
+              <w:t xml:space="preserve">MSY</w:t>
+            </w:r>
+            <w:r>
+              <w:t xml:space="preserve"> </w:t>
+            </w:r>
+            <w:r>
+              <w:t xml:space="preserve">for runs 15a-15e.</w:t>
+            </w:r>
+          </w:p>
+          <w:bookmarkEnd w:id="29"/>
+        </w:tc>
+      </w:tr>
+    </w:tbl>
+    <w:p>
+      <w:pPr>
+        <w:numPr>
+          <w:ilvl w:val="0"/>
+          <w:numId w:val="1013"/>
+        </w:numPr>
+      </w:pPr>
+      <w:hyperlink w:anchor="fig-cmp-reference-base-tuning">
+        <w:r>
+          <w:rPr>
+            <w:rStyle w:val="Hyperlink"/>
+          </w:rPr>
+          <w:t xml:space="preserve">Figure 1</w:t>
+        </w:r>
+      </w:hyperlink>
+      <w:r>
+        <w:t xml:space="preserve"> </w:t>
+      </w:r>
+      <w:r>
+        <w:t xml:space="preserve">illustrates that, for the reference base model, tuning to P(kg) was straightforward. The tested runs showed a clear increase in P(Green) across tuning levels, with associated changes in catch, spawning biomass, inter-annual catch variability, shutdown probability, and F/F</w:t>
+      </w:r>
+      <w:r>
+        <w:rPr>
+          <w:vertAlign w:val="subscript"/>
+        </w:rPr>
+        <w:t xml:space="preserve">MSY</w:t>
+      </w:r>
+      <w:r>
+        <w:t xml:space="preserve"> </w:t>
+      </w:r>
+      <w:r>
+        <w:t xml:space="preserve">that could be interpreted directly in the CMP discussion. The figure was therefore useful for learning how the trial rules behaved, but it was not treated as a final comparison of CMP recommendations.</w:t>
+      </w:r>
+    </w:p>
+    <w:p>
+      <w:pPr>
+        <w:numPr>
+          <w:ilvl w:val="0"/>
+          <w:numId w:val="1013"/>
+        </w:numPr>
+      </w:pPr>
+      <w:r>
+        <w:t xml:space="preserve">The Thursday morning discussion used results from the initial fourteen-run exploratory CMP set to narrow the next round of tests. The group noted that the TAC-change constraints considered in the initial runs did not appear to be strongly limiting, while a low upper catch cap could make the CMP behave close to a constant-catch rule and reduce its usefulness for exploring trade-offs. Participants also discussed the need to separate effects of the catch level from effects of the HCR slope: a higher target catch can increase short-term catch, but if the slope is too steep it can reduce long-term performance or increase the probability of being outside the green zone. The group therefore focused the second set on a smaller number of interpretable changes, including tuned triggers for target catches of 2.0, 3.5, and 5.0 million tonnes, Chile-requested variants with a 270 thousand tonne minimum catch, an asymmetric TAC-change constraint, and a special Chile-shape variant (</w:t>
+      </w:r>
+      <w:hyperlink w:anchor="tbl-cmp-second-set">
+        <w:r>
+          <w:rPr>
+            <w:rStyle w:val="Hyperlink"/>
+          </w:rPr>
+          <w:t xml:space="preserve">Table 3</w:t>
+        </w:r>
+      </w:hyperlink>
+      <w:r>
+        <w:t xml:space="preserve">). This was intended as a stepwise screening process: remove options that provide little marginal information, retain variants that clarify trade-offs, and identify the smaller set of CMPs to carry into fuller performance and robustness summaries. The narrowed set was selected because it spanned useful trade-offs, not because each row represented a final recommended CMP.</w:t>
+      </w:r>
+    </w:p>
+    <w:p>
+      <w:pPr>
+        <w:numPr>
+          <w:ilvl w:val="0"/>
+          <w:numId w:val="1013"/>
+        </w:numPr>
+      </w:pPr>
+      <w:r>
+        <w:t xml:space="preserve">A substantial part of the discussion addressed exceptional circumstances protocols. Tom Carruthers demonstrated the ECP approach, emphasizing that exceptional circumstances should not be based only on whether an observation falls outside a projected range. Instead, robustness simulations can be used to identify data patterns associated with poor CMP performance, and then evaluate type I and type II error rates for detecting those problematic states. The group discussed applying this framework to jack mackerel MSE outputs, including recent concerns about fishing conditions, recruitment, stock indicators, and the possibility that current observations may imply conditions outside the reference simulations.</w:t>
+      </w:r>
+    </w:p>
+    <w:p>
+      <w:pPr>
+        <w:numPr>
+          <w:ilvl w:val="0"/>
+          <w:numId w:val="1013"/>
+        </w:numPr>
+      </w:pPr>
+      <w:r>
+        <w:t xml:space="preserve">A further point was that fishery behavior and effort constraints may matter. Participants noted that a TAC may be theoretically catchable in the model but not economically or operationally achievable if vessels cannot find fish or if fishing conditions deteriorate. There was interest in whether effort or fleet-behavior constraints could be represented in future scenarios or diagnostics, while recognizing that doing so would require additional assumptions and data. Catch outcomes below 270 thousand tonnes, catch-rate proxies, and effort limits such as a multiple of current effort were identified as useful supplementary diagnostics for interpreting fishery feasibility.</w:t>
+      </w:r>
+    </w:p>
+    <w:p>
+      <w:pPr>
+        <w:numPr>
+          <w:ilvl w:val="0"/>
+          <w:numId w:val="1013"/>
+        </w:numPr>
+      </w:pPr>
+      <w:r>
+        <w:t xml:space="preserve">CMPs based on piecewise-linear harvest-control rules can be summarized by the threshold metric at which the rule begins to increase catch, the target catch reached above the trigger, and any inter-annual TAC-change constraints. Part of the SCW17 process is for Members and participants to nominate CMPs for Scientific Committee consideration, after which redundant or materially overlapping CMPs should be eliminated so that the Scientific Committee can focus on a concise set of distinct alternatives.</w:t>
+      </w:r>
+      <w:r>
+        <w:t xml:space="preserve"> </w:t>
+      </w:r>
+      <w:hyperlink w:anchor="tbl-hcr-candidates">
+        <w:r>
+          <w:rPr>
+            <w:rStyle w:val="Hyperlink"/>
+          </w:rPr>
+          <w:t xml:space="preserve">Table 2</w:t>
+        </w:r>
+      </w:hyperlink>
+      <w:r>
+        <w:t xml:space="preserve"> </w:t>
+      </w:r>
+      <w:r>
+        <w:t xml:space="preserve">records the parameters used for the illustrative CMP set.</w:t>
+      </w:r>
+      <w:r>
+        <w:t xml:space="preserve"> </w:t>
+      </w:r>
+      <w:hyperlink w:anchor="fig-hcr-faceted">
+        <w:r>
+          <w:rPr>
+            <w:rStyle w:val="Hyperlink"/>
+          </w:rPr>
+          <w:t xml:space="preserve">Figure 2</w:t>
+        </w:r>
+      </w:hyperlink>
+      <w:r>
+        <w:t xml:space="preserve"> </w:t>
+      </w:r>
+      <w:r>
+        <w:t xml:space="preserve">shows the static HCR shape for each row; smoothing choices and index selection affect the metric passed into the HCR and are omitted from the curve. The quadrant colors in</w:t>
+      </w:r>
+      <w:r>
+        <w:t xml:space="preserve"> </w:t>
+      </w:r>
+      <w:hyperlink w:anchor="fig-hcr-faceted">
+        <w:r>
+          <w:rPr>
+            <w:rStyle w:val="Hyperlink"/>
+          </w:rPr>
+          <w:t xml:space="preserve">Figure 2</w:t>
+        </w:r>
+      </w:hyperlink>
+      <w:r>
+        <w:t xml:space="preserve"> </w:t>
+      </w:r>
+      <w:r>
+        <w:t xml:space="preserve">are included only to enhance visualization of differences among HCR shapes and do not indicate stock-status concerns.</w:t>
+      </w:r>
+    </w:p>
+    <w:tbl>
+      <w:tblPr>
+        <w:tblStyle w:val="Table"/>
+        <w:tblW w:type="pct" w:w="5000"/>
+        <w:tblLayout w:type="fixed"/>
+        <w:tblLook w:firstRow="0" w:lastRow="0" w:firstColumn="0" w:lastColumn="0" w:noHBand="0" w:noVBand="0" w:val="0000"/>
+      </w:tblPr>
+      <w:tblGrid>
+        <w:gridCol w:w="7920"/>
+      </w:tblGrid>
+      <w:tr>
+        <w:tc>
+          <w:tcPr/>
+          <w:bookmarkStart w:id="30" w:name="tbl-hcr-candidates"/>
           <w:p>
             <w:pPr>
               <w:jc w:val="center"/>
@@ -7420,7 +7753,2247 @@
               </w:tc>
             </w:tr>
           </w:tbl>
-          <w:bookmarkEnd w:id="25"/>
+          <w:bookmarkEnd w:id="30"/>
+        </w:tc>
+      </w:tr>
+    </w:tbl>
+    <w:p>
+      <w:pPr>
+        <w:pStyle w:val="BodyText"/>
+      </w:pPr>
+      <w:r>
+        <w:t xml:space="preserve"> </w:t>
+      </w:r>
+    </w:p>
+    <w:tbl>
+      <w:tblPr>
+        <w:tblStyle w:val="Table"/>
+        <w:tblW w:type="pct" w:w="5000"/>
+        <w:tblLayout w:type="fixed"/>
+        <w:tblLook w:firstRow="0" w:lastRow="0" w:firstColumn="0" w:lastColumn="0" w:noHBand="0" w:noVBand="0" w:val="0000"/>
+      </w:tblPr>
+      <w:tblGrid>
+        <w:gridCol w:w="7920"/>
+      </w:tblGrid>
+      <w:tr>
+        <w:tc>
+          <w:tcPr/>
+          <w:bookmarkStart w:id="31" w:name="tbl-cmp-second-set"/>
+          <w:p>
+            <w:pPr>
+              <w:jc w:val="center"/>
+            </w:pPr>
+            <w:pPr>
+              <w:jc w:val="left"/>
+              <w:spacing w:before="200"/>
+              <w:pStyle w:val="ImageCaption"/>
+            </w:pPr>
+            <w:r>
+              <w:t xml:space="preserve">Table 3: Second trial CMP set developed from the Thursday morning narrowing of the initial fourteen-run exploratory set to learn about tuning, target catch, minimum catch treatment, and TAC-change constraints.</w:t>
+            </w:r>
+          </w:p>
+          <w:tbl xmlns:w="http://schemas.openxmlformats.org/wordprocessingml/2006/main" xmlns:wp="http://schemas.openxmlformats.org/drawingml/2006/wordprocessingDrawing" xmlns:r="http://schemas.openxmlformats.org/officeDocument/2006/relationships" xmlns:w14="http://schemas.microsoft.com/office/word/2010/wordml">
+            <w:tblPr>
+              <w:tblCellMar>
+                <w:top w:w="0" w:type="dxa"/>
+                <w:bottom w:w="0" w:type="dxa"/>
+                <w:start w:w="60" w:type="dxa"/>
+                <w:end w:w="60" w:type="dxa"/>
+              </w:tblCellMar>
+              <w:tblW w:type="auto" w:w="0"/>
+              <w:tblLook w:firstRow="0" w:lastRow="0" w:firstColumn="0" w:lastColumn="0" w:noHBand="0" w:noVBand="0"/>
+              <w:jc w:val="center"/>
+            </w:tblPr>
+            <w:tr>
+              <w:trPr>
+                <w:cantSplit/>
+                <w:tblHeader/>
+              </w:trPr>
+              <w:tc>
+                <w:tcPr>
+                  <w:tcBorders>
+                    <w:top w:val="single" w:sz="16" w:space="0" w:color="D3D3D3"/>
+                    <w:bottom w:val="single" w:sz="16" w:space="0" w:color="D3D3D3"/>
+                    <w:start w:val="single" w:space="0" w:color="D3D3D3"/>
+                  </w:tcBorders>
+                </w:tcPr>
+                <w:p>
+                  <w:pPr>
+                    <w:spacing w:before="0" w:after="60"/>
+                    <w:keepNext/>
+                    <w:jc w:val="start"/>
+                  </w:pPr>
+                  <w:r>
+                    <w:rPr>
+                      <w:rFonts w:ascii="Calibri" w:hAnsi="Calibri"/>
+                      <w:sz w:val="20"/>
+                    </w:rPr>
+                    <w:t xml:space="default">run</w:t>
+                  </w:r>
+                </w:p>
+              </w:tc>
+              <w:tc>
+                <w:tcPr>
+                  <w:tcBorders>
+                    <w:top w:val="single" w:sz="16" w:space="0" w:color="D3D3D3"/>
+                    <w:bottom w:val="single" w:sz="16" w:space="0" w:color="D3D3D3"/>
+                  </w:tcBorders>
+                </w:tcPr>
+                <w:p>
+                  <w:pPr>
+                    <w:spacing w:before="0" w:after="60"/>
+                    <w:keepNext/>
+                    <w:jc w:val="start"/>
+                  </w:pPr>
+                  <w:r>
+                    <w:rPr>
+                      <w:rFonts w:ascii="Calibri" w:hAnsi="Calibri"/>
+                      <w:sz w:val="20"/>
+                    </w:rPr>
+                    <w:t xml:space="default">CMP name</w:t>
+                  </w:r>
+                </w:p>
+              </w:tc>
+              <w:tc>
+                <w:tcPr>
+                  <w:tcBorders>
+                    <w:top w:val="single" w:sz="16" w:space="0" w:color="D3D3D3"/>
+                    <w:bottom w:val="single" w:sz="16" w:space="0" w:color="D3D3D3"/>
+                  </w:tcBorders>
+                </w:tcPr>
+                <w:p>
+                  <w:pPr>
+                    <w:spacing w:before="0" w:after="60"/>
+                    <w:keepNext/>
+                    <w:jc w:val="end"/>
+                  </w:pPr>
+                  <w:r>
+                    <w:rPr>
+                      <w:rFonts w:ascii="Calibri" w:hAnsi="Calibri"/>
+                      <w:sz w:val="20"/>
+                    </w:rPr>
+                    <w:t xml:space="default">min</w:t>
+                  </w:r>
+                </w:p>
+              </w:tc>
+              <w:tc>
+                <w:tcPr>
+                  <w:tcBorders>
+                    <w:top w:val="single" w:sz="16" w:space="0" w:color="D3D3D3"/>
+                    <w:bottom w:val="single" w:sz="16" w:space="0" w:color="D3D3D3"/>
+                  </w:tcBorders>
+                </w:tcPr>
+                <w:p>
+                  <w:pPr>
+                    <w:spacing w:before="0" w:after="60"/>
+                    <w:keepNext/>
+                    <w:jc w:val="end"/>
+                  </w:pPr>
+                  <w:r>
+                    <w:rPr>
+                      <w:rFonts w:ascii="Calibri" w:hAnsi="Calibri"/>
+                      <w:sz w:val="20"/>
+                    </w:rPr>
+                    <w:t xml:space="default">lim</w:t>
+                  </w:r>
+                </w:p>
+              </w:tc>
+              <w:tc>
+                <w:tcPr>
+                  <w:tcBorders>
+                    <w:top w:val="single" w:sz="16" w:space="0" w:color="D3D3D3"/>
+                    <w:bottom w:val="single" w:sz="16" w:space="0" w:color="D3D3D3"/>
+                  </w:tcBorders>
+                </w:tcPr>
+                <w:p>
+                  <w:pPr>
+                    <w:spacing w:before="0" w:after="60"/>
+                    <w:keepNext/>
+                    <w:jc w:val="start"/>
+                  </w:pPr>
+                  <w:r>
+                    <w:rPr>
+                      <w:rFonts w:ascii="Calibri" w:hAnsi="Calibri"/>
+                      <w:sz w:val="20"/>
+                    </w:rPr>
+                    <w:t xml:space="default">trigger</w:t>
+                  </w:r>
+                </w:p>
+              </w:tc>
+              <w:tc>
+                <w:tcPr>
+                  <w:tcBorders>
+                    <w:top w:val="single" w:sz="16" w:space="0" w:color="D3D3D3"/>
+                    <w:bottom w:val="single" w:sz="16" w:space="0" w:color="D3D3D3"/>
+                  </w:tcBorders>
+                </w:tcPr>
+                <w:p>
+                  <w:pPr>
+                    <w:spacing w:before="0" w:after="60"/>
+                    <w:keepNext/>
+                    <w:jc w:val="end"/>
+                  </w:pPr>
+                  <w:r>
+                    <w:rPr>
+                      <w:rFonts w:ascii="Calibri" w:hAnsi="Calibri"/>
+                      <w:sz w:val="20"/>
+                    </w:rPr>
+                    <w:t xml:space="default">target</w:t>
+                  </w:r>
+                </w:p>
+              </w:tc>
+              <w:tc>
+                <w:tcPr>
+                  <w:tcBorders>
+                    <w:top w:val="single" w:sz="16" w:space="0" w:color="D3D3D3"/>
+                    <w:bottom w:val="single" w:sz="16" w:space="0" w:color="D3D3D3"/>
+                  </w:tcBorders>
+                </w:tcPr>
+                <w:p>
+                  <w:pPr>
+                    <w:spacing w:before="0" w:after="60"/>
+                    <w:keepNext/>
+                    <w:jc w:val="end"/>
+                  </w:pPr>
+                  <w:r>
+                    <w:rPr>
+                      <w:rFonts w:ascii="Calibri" w:hAnsi="Calibri"/>
+                      <w:sz w:val="20"/>
+                    </w:rPr>
+                    <w:t xml:space="default">dlow</w:t>
+                  </w:r>
+                </w:p>
+              </w:tc>
+              <w:tc>
+                <w:tcPr>
+                  <w:tcBorders>
+                    <w:top w:val="single" w:sz="16" w:space="0" w:color="D3D3D3"/>
+                    <w:bottom w:val="single" w:sz="16" w:space="0" w:color="D3D3D3"/>
+                  </w:tcBorders>
+                </w:tcPr>
+                <w:p>
+                  <w:pPr>
+                    <w:spacing w:before="0" w:after="60"/>
+                    <w:keepNext/>
+                    <w:jc w:val="end"/>
+                  </w:pPr>
+                  <w:r>
+                    <w:rPr>
+                      <w:rFonts w:ascii="Calibri" w:hAnsi="Calibri"/>
+                      <w:sz w:val="20"/>
+                    </w:rPr>
+                    <w:t xml:space="default">dupp</w:t>
+                  </w:r>
+                </w:p>
+              </w:tc>
+              <w:tc>
+                <w:tcPr>
+                  <w:tcBorders>
+                    <w:top w:val="single" w:sz="16" w:space="0" w:color="D3D3D3"/>
+                    <w:bottom w:val="single" w:sz="16" w:space="0" w:color="D3D3D3"/>
+                  </w:tcBorders>
+                </w:tcPr>
+                <w:p>
+                  <w:pPr>
+                    <w:spacing w:before="0" w:after="60"/>
+                    <w:keepNext/>
+                    <w:jc w:val="start"/>
+                  </w:pPr>
+                  <w:r>
+                    <w:rPr>
+                      <w:rFonts w:ascii="Calibri" w:hAnsi="Calibri"/>
+                      <w:sz w:val="20"/>
+                    </w:rPr>
+                    <w:t xml:space="default">smooth</w:t>
+                  </w:r>
+                </w:p>
+              </w:tc>
+              <w:tc>
+                <w:tcPr>
+                  <w:tcBorders>
+                    <w:top w:val="single" w:sz="16" w:space="0" w:color="D3D3D3"/>
+                    <w:bottom w:val="single" w:sz="16" w:space="0" w:color="D3D3D3"/>
+                    <w:end w:val="single" w:space="0" w:color="D3D3D3"/>
+                  </w:tcBorders>
+                </w:tcPr>
+                <w:p>
+                  <w:pPr>
+                    <w:spacing w:before="0" w:after="60"/>
+                    <w:keepNext/>
+                    <w:jc w:val="start"/>
+                  </w:pPr>
+                  <w:r>
+                    <w:rPr>
+                      <w:rFonts w:ascii="Calibri" w:hAnsi="Calibri"/>
+                      <w:sz w:val="20"/>
+                    </w:rPr>
+                    <w:t xml:space="default">indices</w:t>
+                  </w:r>
+                </w:p>
+              </w:tc>
+            </w:tr>
+            <w:tr>
+              <w:trPr>
+                <w:cantSplit/>
+              </w:trPr>
+              <w:tc>
+                <w:tcPr>
+                  <w:tcBorders>
+                    <w:top w:val="single" w:space="0" w:color="D3D3D3"/>
+                    <w:bottom w:val="single" w:space="0" w:color="D3D3D3"/>
+                    <w:start w:val="single" w:space="0" w:color="D3D3D3"/>
+                    <w:end w:val="single" w:space="0" w:color="D3D3D3"/>
+                  </w:tcBorders>
+                </w:tcPr>
+                <w:p>
+                  <w:pPr>
+                    <w:spacing w:before="0" w:after="60"/>
+                    <w:keepNext/>
+                    <w:jc w:val="start"/>
+                  </w:pPr>
+                  <w:r>
+                    <w:rPr>
+                      <w:rFonts w:ascii="Calibri" w:hAnsi="Calibri"/>
+                      <w:sz w:val="20"/>
+                    </w:rPr>
+                    <w:t xml:space="default">run15</w:t>
+                  </w:r>
+                </w:p>
+              </w:tc>
+              <w:tc>
+                <w:tcPr>
+                  <w:tcBorders>
+                    <w:top w:val="single" w:space="0" w:color="D3D3D3"/>
+                    <w:bottom w:val="single" w:space="0" w:color="D3D3D3"/>
+                    <w:start w:val="single" w:space="0" w:color="D3D3D3"/>
+                    <w:end w:val="single" w:space="0" w:color="D3D3D3"/>
+                  </w:tcBorders>
+                </w:tcPr>
+                <w:p>
+                  <w:pPr>
+                    <w:spacing w:before="0" w:after="60"/>
+                    <w:keepNext/>
+                    <w:jc w:val="start"/>
+                  </w:pPr>
+                  <w:r>
+                    <w:rPr>
+                      <w:rFonts w:ascii="Calibri" w:hAnsi="Calibri"/>
+                      <w:sz w:val="20"/>
+                    </w:rPr>
+                    <w:t xml:space="default">Base Test</w:t>
+                  </w:r>
+                </w:p>
+              </w:tc>
+              <w:tc>
+                <w:tcPr>
+                  <w:tcBorders>
+                    <w:top w:val="single" w:space="0" w:color="D3D3D3"/>
+                    <w:bottom w:val="single" w:space="0" w:color="D3D3D3"/>
+                    <w:start w:val="single" w:space="0" w:color="D3D3D3"/>
+                    <w:end w:val="single" w:space="0" w:color="D3D3D3"/>
+                  </w:tcBorders>
+                </w:tcPr>
+                <w:p>
+                  <w:pPr>
+                    <w:spacing w:before="0" w:after="60"/>
+                    <w:keepNext/>
+                    <w:jc w:val="end"/>
+                  </w:pPr>
+                  <w:r>
+                    <w:rPr>
+                      <w:rFonts w:ascii="Calibri" w:hAnsi="Calibri"/>
+                      <w:sz w:val="20"/>
+                    </w:rPr>
+                    <w:t xml:space="default">0</w:t>
+                  </w:r>
+                </w:p>
+              </w:tc>
+              <w:tc>
+                <w:tcPr>
+                  <w:tcBorders>
+                    <w:top w:val="single" w:space="0" w:color="D3D3D3"/>
+                    <w:bottom w:val="single" w:space="0" w:color="D3D3D3"/>
+                    <w:start w:val="single" w:space="0" w:color="D3D3D3"/>
+                    <w:end w:val="single" w:space="0" w:color="D3D3D3"/>
+                  </w:tcBorders>
+                </w:tcPr>
+                <w:p>
+                  <w:pPr>
+                    <w:spacing w:before="0" w:after="60"/>
+                    <w:keepNext/>
+                    <w:jc w:val="end"/>
+                  </w:pPr>
+                  <w:r>
+                    <w:rPr>
+                      <w:rFonts w:ascii="Calibri" w:hAnsi="Calibri"/>
+                      <w:sz w:val="20"/>
+                    </w:rPr>
+                    <w:t xml:space="default">0</w:t>
+                  </w:r>
+                </w:p>
+              </w:tc>
+              <w:tc>
+                <w:tcPr>
+                  <w:tcBorders>
+                    <w:top w:val="single" w:space="0" w:color="D3D3D3"/>
+                    <w:bottom w:val="single" w:space="0" w:color="D3D3D3"/>
+                    <w:start w:val="single" w:space="0" w:color="D3D3D3"/>
+                    <w:end w:val="single" w:space="0" w:color="D3D3D3"/>
+                  </w:tcBorders>
+                </w:tcPr>
+                <w:p>
+                  <w:pPr>
+                    <w:spacing w:before="0" w:after="60"/>
+                    <w:keepNext/>
+                    <w:jc w:val="start"/>
+                  </w:pPr>
+                  <w:r>
+                    <w:rPr>
+                      <w:rFonts w:ascii="Calibri" w:hAnsi="Calibri"/>
+                      <w:sz w:val="20"/>
+                    </w:rPr>
+                    <w:t xml:space="default">2.25-3</w:t>
+                  </w:r>
+                </w:p>
+              </w:tc>
+              <w:tc>
+                <w:tcPr>
+                  <w:tcBorders>
+                    <w:top w:val="single" w:space="0" w:color="D3D3D3"/>
+                    <w:bottom w:val="single" w:space="0" w:color="D3D3D3"/>
+                    <w:start w:val="single" w:space="0" w:color="D3D3D3"/>
+                    <w:end w:val="single" w:space="0" w:color="D3D3D3"/>
+                  </w:tcBorders>
+                </w:tcPr>
+                <w:p>
+                  <w:pPr>
+                    <w:spacing w:before="0" w:after="60"/>
+                    <w:keepNext/>
+                    <w:jc w:val="end"/>
+                  </w:pPr>
+                  <w:r>
+                    <w:rPr>
+                      <w:rFonts w:ascii="Calibri" w:hAnsi="Calibri"/>
+                      <w:sz w:val="20"/>
+                    </w:rPr>
+                    <w:t xml:space="default">2,000</w:t>
+                  </w:r>
+                </w:p>
+              </w:tc>
+              <w:tc>
+                <w:tcPr>
+                  <w:tcBorders>
+                    <w:top w:val="single" w:space="0" w:color="D3D3D3"/>
+                    <w:bottom w:val="single" w:space="0" w:color="D3D3D3"/>
+                    <w:start w:val="single" w:space="0" w:color="D3D3D3"/>
+                    <w:end w:val="single" w:space="0" w:color="D3D3D3"/>
+                  </w:tcBorders>
+                </w:tcPr>
+                <w:p>
+                  <w:pPr>
+                    <w:spacing w:before="0" w:after="60"/>
+                    <w:keepNext/>
+                    <w:jc w:val="end"/>
+                  </w:pPr>
+                  <w:r>
+                    <w:rPr>
+                      <w:rFonts w:ascii="Calibri" w:hAnsi="Calibri"/>
+                      <w:sz w:val="20"/>
+                    </w:rPr>
+                    <w:t xml:space="default">0.85</w:t>
+                  </w:r>
+                </w:p>
+              </w:tc>
+              <w:tc>
+                <w:tcPr>
+                  <w:tcBorders>
+                    <w:top w:val="single" w:space="0" w:color="D3D3D3"/>
+                    <w:bottom w:val="single" w:space="0" w:color="D3D3D3"/>
+                    <w:start w:val="single" w:space="0" w:color="D3D3D3"/>
+                    <w:end w:val="single" w:space="0" w:color="D3D3D3"/>
+                  </w:tcBorders>
+                </w:tcPr>
+                <w:p>
+                  <w:pPr>
+                    <w:spacing w:before="0" w:after="60"/>
+                    <w:keepNext/>
+                    <w:jc w:val="end"/>
+                  </w:pPr>
+                  <w:r>
+                    <w:rPr>
+                      <w:rFonts w:ascii="Calibri" w:hAnsi="Calibri"/>
+                      <w:sz w:val="20"/>
+                    </w:rPr>
+                    <w:t xml:space="default">1.2</w:t>
+                  </w:r>
+                </w:p>
+              </w:tc>
+              <w:tc>
+                <w:tcPr>
+                  <w:tcBorders>
+                    <w:top w:val="single" w:space="0" w:color="D3D3D3"/>
+                    <w:bottom w:val="single" w:space="0" w:color="D3D3D3"/>
+                    <w:start w:val="single" w:space="0" w:color="D3D3D3"/>
+                    <w:end w:val="single" w:space="0" w:color="D3D3D3"/>
+                  </w:tcBorders>
+                </w:tcPr>
+                <w:p>
+                  <w:pPr>
+                    <w:spacing w:before="0" w:after="60"/>
+                    <w:keepNext/>
+                    <w:jc w:val="start"/>
+                  </w:pPr>
+                  <w:r>
+                    <w:rPr>
+                      <w:rFonts w:ascii="Calibri" w:hAnsi="Calibri"/>
+                      <w:sz w:val="20"/>
+                    </w:rPr>
+                    <w:t xml:space="default">3 years</w:t>
+                  </w:r>
+                </w:p>
+              </w:tc>
+              <w:tc>
+                <w:tcPr>
+                  <w:tcBorders>
+                    <w:top w:val="single" w:space="0" w:color="D3D3D3"/>
+                    <w:bottom w:val="single" w:space="0" w:color="D3D3D3"/>
+                    <w:start w:val="single" w:space="0" w:color="D3D3D3"/>
+                    <w:end w:val="single" w:space="0" w:color="D3D3D3"/>
+                  </w:tcBorders>
+                </w:tcPr>
+                <w:p>
+                  <w:pPr>
+                    <w:spacing w:before="0" w:after="60"/>
+                    <w:keepNext/>
+                    <w:jc w:val="start"/>
+                  </w:pPr>
+                  <w:r>
+                    <w:rPr>
+                      <w:rFonts w:ascii="Calibri" w:hAnsi="Calibri"/>
+                      <w:sz w:val="20"/>
+                    </w:rPr>
+                    <w:t xml:space="default">All</w:t>
+                  </w:r>
+                </w:p>
+              </w:tc>
+            </w:tr>
+            <w:tr>
+              <w:trPr>
+                <w:cantSplit/>
+              </w:trPr>
+              <w:tc>
+                <w:tcPr>
+                  <w:tcBorders>
+                    <w:top w:val="single" w:space="0" w:color="D3D3D3"/>
+                    <w:bottom w:val="single" w:space="0" w:color="D3D3D3"/>
+                    <w:start w:val="single" w:space="0" w:color="D3D3D3"/>
+                    <w:end w:val="single" w:space="0" w:color="D3D3D3"/>
+                  </w:tcBorders>
+                </w:tcPr>
+                <w:p>
+                  <w:pPr>
+                    <w:spacing w:before="0" w:after="60"/>
+                    <w:keepNext/>
+                    <w:jc w:val="start"/>
+                  </w:pPr>
+                  <w:r>
+                    <w:rPr>
+                      <w:rFonts w:ascii="Calibri" w:hAnsi="Calibri"/>
+                      <w:sz w:val="20"/>
+                    </w:rPr>
+                    <w:t xml:space="default">run16</w:t>
+                  </w:r>
+                </w:p>
+              </w:tc>
+              <w:tc>
+                <w:tcPr>
+                  <w:tcBorders>
+                    <w:top w:val="single" w:space="0" w:color="D3D3D3"/>
+                    <w:bottom w:val="single" w:space="0" w:color="D3D3D3"/>
+                    <w:start w:val="single" w:space="0" w:color="D3D3D3"/>
+                    <w:end w:val="single" w:space="0" w:color="D3D3D3"/>
+                  </w:tcBorders>
+                </w:tcPr>
+                <w:p>
+                  <w:pPr>
+                    <w:spacing w:before="0" w:after="60"/>
+                    <w:keepNext/>
+                    <w:jc w:val="start"/>
+                  </w:pPr>
+                  <w:r>
+                    <w:rPr>
+                      <w:rFonts w:ascii="Calibri" w:hAnsi="Calibri"/>
+                      <w:sz w:val="20"/>
+                    </w:rPr>
+                    <w:t xml:space="default">Base</w:t>
+                  </w:r>
+                </w:p>
+              </w:tc>
+              <w:tc>
+                <w:tcPr>
+                  <w:tcBorders>
+                    <w:top w:val="single" w:space="0" w:color="D3D3D3"/>
+                    <w:bottom w:val="single" w:space="0" w:color="D3D3D3"/>
+                    <w:start w:val="single" w:space="0" w:color="D3D3D3"/>
+                    <w:end w:val="single" w:space="0" w:color="D3D3D3"/>
+                  </w:tcBorders>
+                </w:tcPr>
+                <w:p>
+                  <w:pPr>
+                    <w:spacing w:before="0" w:after="60"/>
+                    <w:keepNext/>
+                    <w:jc w:val="end"/>
+                  </w:pPr>
+                  <w:r>
+                    <w:rPr>
+                      <w:rFonts w:ascii="Calibri" w:hAnsi="Calibri"/>
+                      <w:sz w:val="20"/>
+                    </w:rPr>
+                    <w:t xml:space="default">0</w:t>
+                  </w:r>
+                </w:p>
+              </w:tc>
+              <w:tc>
+                <w:tcPr>
+                  <w:tcBorders>
+                    <w:top w:val="single" w:space="0" w:color="D3D3D3"/>
+                    <w:bottom w:val="single" w:space="0" w:color="D3D3D3"/>
+                    <w:start w:val="single" w:space="0" w:color="D3D3D3"/>
+                    <w:end w:val="single" w:space="0" w:color="D3D3D3"/>
+                  </w:tcBorders>
+                </w:tcPr>
+                <w:p>
+                  <w:pPr>
+                    <w:spacing w:before="0" w:after="60"/>
+                    <w:keepNext/>
+                    <w:jc w:val="end"/>
+                  </w:pPr>
+                  <w:r>
+                    <w:rPr>
+                      <w:rFonts w:ascii="Calibri" w:hAnsi="Calibri"/>
+                      <w:sz w:val="20"/>
+                    </w:rPr>
+                    <w:t xml:space="default">0</w:t>
+                  </w:r>
+                </w:p>
+              </w:tc>
+              <w:tc>
+                <w:tcPr>
+                  <w:tcBorders>
+                    <w:top w:val="single" w:space="0" w:color="D3D3D3"/>
+                    <w:bottom w:val="single" w:space="0" w:color="D3D3D3"/>
+                    <w:start w:val="single" w:space="0" w:color="D3D3D3"/>
+                    <w:end w:val="single" w:space="0" w:color="D3D3D3"/>
+                  </w:tcBorders>
+                </w:tcPr>
+                <w:p>
+                  <w:pPr>
+                    <w:spacing w:before="0" w:after="60"/>
+                    <w:keepNext/>
+                    <w:jc w:val="start"/>
+                  </w:pPr>
+                  <w:r>
+                    <w:rPr>
+                      <w:rFonts w:ascii="Calibri" w:hAnsi="Calibri"/>
+                      <w:sz w:val="20"/>
+                    </w:rPr>
+                    <w:t xml:space="default">Tuned</w:t>
+                  </w:r>
+                </w:p>
+              </w:tc>
+              <w:tc>
+                <w:tcPr>
+                  <w:tcBorders>
+                    <w:top w:val="single" w:space="0" w:color="D3D3D3"/>
+                    <w:bottom w:val="single" w:space="0" w:color="D3D3D3"/>
+                    <w:start w:val="single" w:space="0" w:color="D3D3D3"/>
+                    <w:end w:val="single" w:space="0" w:color="D3D3D3"/>
+                  </w:tcBorders>
+                </w:tcPr>
+                <w:p>
+                  <w:pPr>
+                    <w:spacing w:before="0" w:after="60"/>
+                    <w:keepNext/>
+                    <w:jc w:val="end"/>
+                  </w:pPr>
+                  <w:r>
+                    <w:rPr>
+                      <w:rFonts w:ascii="Calibri" w:hAnsi="Calibri"/>
+                      <w:sz w:val="20"/>
+                    </w:rPr>
+                    <w:t xml:space="default">2,000</w:t>
+                  </w:r>
+                </w:p>
+              </w:tc>
+              <w:tc>
+                <w:tcPr>
+                  <w:tcBorders>
+                    <w:top w:val="single" w:space="0" w:color="D3D3D3"/>
+                    <w:bottom w:val="single" w:space="0" w:color="D3D3D3"/>
+                    <w:start w:val="single" w:space="0" w:color="D3D3D3"/>
+                    <w:end w:val="single" w:space="0" w:color="D3D3D3"/>
+                  </w:tcBorders>
+                </w:tcPr>
+                <w:p>
+                  <w:pPr>
+                    <w:spacing w:before="0" w:after="60"/>
+                    <w:keepNext/>
+                    <w:jc w:val="end"/>
+                  </w:pPr>
+                  <w:r>
+                    <w:rPr>
+                      <w:rFonts w:ascii="Calibri" w:hAnsi="Calibri"/>
+                      <w:sz w:val="20"/>
+                    </w:rPr>
+                    <w:t xml:space="default">0.85</w:t>
+                  </w:r>
+                </w:p>
+              </w:tc>
+              <w:tc>
+                <w:tcPr>
+                  <w:tcBorders>
+                    <w:top w:val="single" w:space="0" w:color="D3D3D3"/>
+                    <w:bottom w:val="single" w:space="0" w:color="D3D3D3"/>
+                    <w:start w:val="single" w:space="0" w:color="D3D3D3"/>
+                    <w:end w:val="single" w:space="0" w:color="D3D3D3"/>
+                  </w:tcBorders>
+                </w:tcPr>
+                <w:p>
+                  <w:pPr>
+                    <w:spacing w:before="0" w:after="60"/>
+                    <w:keepNext/>
+                    <w:jc w:val="end"/>
+                  </w:pPr>
+                  <w:r>
+                    <w:rPr>
+                      <w:rFonts w:ascii="Calibri" w:hAnsi="Calibri"/>
+                      <w:sz w:val="20"/>
+                    </w:rPr>
+                    <w:t xml:space="default">1.2</w:t>
+                  </w:r>
+                </w:p>
+              </w:tc>
+              <w:tc>
+                <w:tcPr>
+                  <w:tcBorders>
+                    <w:top w:val="single" w:space="0" w:color="D3D3D3"/>
+                    <w:bottom w:val="single" w:space="0" w:color="D3D3D3"/>
+                    <w:start w:val="single" w:space="0" w:color="D3D3D3"/>
+                    <w:end w:val="single" w:space="0" w:color="D3D3D3"/>
+                  </w:tcBorders>
+                </w:tcPr>
+                <w:p>
+                  <w:pPr>
+                    <w:spacing w:before="0" w:after="60"/>
+                    <w:keepNext/>
+                    <w:jc w:val="start"/>
+                  </w:pPr>
+                  <w:r>
+                    <w:rPr>
+                      <w:rFonts w:ascii="Calibri" w:hAnsi="Calibri"/>
+                      <w:sz w:val="20"/>
+                    </w:rPr>
+                    <w:t xml:space="default">3 years</w:t>
+                  </w:r>
+                </w:p>
+              </w:tc>
+              <w:tc>
+                <w:tcPr>
+                  <w:tcBorders>
+                    <w:top w:val="single" w:space="0" w:color="D3D3D3"/>
+                    <w:bottom w:val="single" w:space="0" w:color="D3D3D3"/>
+                    <w:start w:val="single" w:space="0" w:color="D3D3D3"/>
+                    <w:end w:val="single" w:space="0" w:color="D3D3D3"/>
+                  </w:tcBorders>
+                </w:tcPr>
+                <w:p>
+                  <w:pPr>
+                    <w:spacing w:before="0" w:after="60"/>
+                    <w:keepNext/>
+                    <w:jc w:val="start"/>
+                  </w:pPr>
+                  <w:r>
+                    <w:rPr>
+                      <w:rFonts w:ascii="Calibri" w:hAnsi="Calibri"/>
+                      <w:sz w:val="20"/>
+                    </w:rPr>
+                    <w:t xml:space="default">All</w:t>
+                  </w:r>
+                </w:p>
+              </w:tc>
+            </w:tr>
+            <w:tr>
+              <w:trPr>
+                <w:cantSplit/>
+              </w:trPr>
+              <w:tc>
+                <w:tcPr>
+                  <w:tcBorders>
+                    <w:top w:val="single" w:space="0" w:color="D3D3D3"/>
+                    <w:bottom w:val="single" w:space="0" w:color="D3D3D3"/>
+                    <w:start w:val="single" w:space="0" w:color="D3D3D3"/>
+                    <w:end w:val="single" w:space="0" w:color="D3D3D3"/>
+                  </w:tcBorders>
+                </w:tcPr>
+                <w:p>
+                  <w:pPr>
+                    <w:spacing w:before="0" w:after="60"/>
+                    <w:keepNext/>
+                    <w:jc w:val="start"/>
+                  </w:pPr>
+                  <w:r>
+                    <w:rPr>
+                      <w:rFonts w:ascii="Calibri" w:hAnsi="Calibri"/>
+                      <w:sz w:val="20"/>
+                    </w:rPr>
+                    <w:t xml:space="default">run17</w:t>
+                  </w:r>
+                </w:p>
+              </w:tc>
+              <w:tc>
+                <w:tcPr>
+                  <w:tcBorders>
+                    <w:top w:val="single" w:space="0" w:color="D3D3D3"/>
+                    <w:bottom w:val="single" w:space="0" w:color="D3D3D3"/>
+                    <w:start w:val="single" w:space="0" w:color="D3D3D3"/>
+                    <w:end w:val="single" w:space="0" w:color="D3D3D3"/>
+                  </w:tcBorders>
+                </w:tcPr>
+                <w:p>
+                  <w:pPr>
+                    <w:spacing w:before="0" w:after="60"/>
+                    <w:keepNext/>
+                    <w:jc w:val="start"/>
+                  </w:pPr>
+                  <w:r>
+                    <w:rPr>
+                      <w:rFonts w:ascii="Calibri" w:hAnsi="Calibri"/>
+                      <w:sz w:val="20"/>
+                    </w:rPr>
+                    <w:t xml:space="default">Base+</w:t>
+                  </w:r>
+                </w:p>
+              </w:tc>
+              <w:tc>
+                <w:tcPr>
+                  <w:tcBorders>
+                    <w:top w:val="single" w:space="0" w:color="D3D3D3"/>
+                    <w:bottom w:val="single" w:space="0" w:color="D3D3D3"/>
+                    <w:start w:val="single" w:space="0" w:color="D3D3D3"/>
+                    <w:end w:val="single" w:space="0" w:color="D3D3D3"/>
+                  </w:tcBorders>
+                </w:tcPr>
+                <w:p>
+                  <w:pPr>
+                    <w:spacing w:before="0" w:after="60"/>
+                    <w:keepNext/>
+                    <w:jc w:val="end"/>
+                  </w:pPr>
+                  <w:r>
+                    <w:rPr>
+                      <w:rFonts w:ascii="Calibri" w:hAnsi="Calibri"/>
+                      <w:sz w:val="20"/>
+                    </w:rPr>
+                    <w:t xml:space="default">0</w:t>
+                  </w:r>
+                </w:p>
+              </w:tc>
+              <w:tc>
+                <w:tcPr>
+                  <w:tcBorders>
+                    <w:top w:val="single" w:space="0" w:color="D3D3D3"/>
+                    <w:bottom w:val="single" w:space="0" w:color="D3D3D3"/>
+                    <w:start w:val="single" w:space="0" w:color="D3D3D3"/>
+                    <w:end w:val="single" w:space="0" w:color="D3D3D3"/>
+                  </w:tcBorders>
+                </w:tcPr>
+                <w:p>
+                  <w:pPr>
+                    <w:spacing w:before="0" w:after="60"/>
+                    <w:keepNext/>
+                    <w:jc w:val="end"/>
+                  </w:pPr>
+                  <w:r>
+                    <w:rPr>
+                      <w:rFonts w:ascii="Calibri" w:hAnsi="Calibri"/>
+                      <w:sz w:val="20"/>
+                    </w:rPr>
+                    <w:t xml:space="default">0</w:t>
+                  </w:r>
+                </w:p>
+              </w:tc>
+              <w:tc>
+                <w:tcPr>
+                  <w:tcBorders>
+                    <w:top w:val="single" w:space="0" w:color="D3D3D3"/>
+                    <w:bottom w:val="single" w:space="0" w:color="D3D3D3"/>
+                    <w:start w:val="single" w:space="0" w:color="D3D3D3"/>
+                    <w:end w:val="single" w:space="0" w:color="D3D3D3"/>
+                  </w:tcBorders>
+                </w:tcPr>
+                <w:p>
+                  <w:pPr>
+                    <w:spacing w:before="0" w:after="60"/>
+                    <w:keepNext/>
+                    <w:jc w:val="start"/>
+                  </w:pPr>
+                  <w:r>
+                    <w:rPr>
+                      <w:rFonts w:ascii="Calibri" w:hAnsi="Calibri"/>
+                      <w:sz w:val="20"/>
+                    </w:rPr>
+                    <w:t xml:space="default">Tuned</w:t>
+                  </w:r>
+                </w:p>
+              </w:tc>
+              <w:tc>
+                <w:tcPr>
+                  <w:tcBorders>
+                    <w:top w:val="single" w:space="0" w:color="D3D3D3"/>
+                    <w:bottom w:val="single" w:space="0" w:color="D3D3D3"/>
+                    <w:start w:val="single" w:space="0" w:color="D3D3D3"/>
+                    <w:end w:val="single" w:space="0" w:color="D3D3D3"/>
+                  </w:tcBorders>
+                </w:tcPr>
+                <w:p>
+                  <w:pPr>
+                    <w:spacing w:before="0" w:after="60"/>
+                    <w:keepNext/>
+                    <w:jc w:val="end"/>
+                  </w:pPr>
+                  <w:r>
+                    <w:rPr>
+                      <w:rFonts w:ascii="Calibri" w:hAnsi="Calibri"/>
+                      <w:sz w:val="20"/>
+                    </w:rPr>
+                    <w:t xml:space="default">3,500</w:t>
+                  </w:r>
+                </w:p>
+              </w:tc>
+              <w:tc>
+                <w:tcPr>
+                  <w:tcBorders>
+                    <w:top w:val="single" w:space="0" w:color="D3D3D3"/>
+                    <w:bottom w:val="single" w:space="0" w:color="D3D3D3"/>
+                    <w:start w:val="single" w:space="0" w:color="D3D3D3"/>
+                    <w:end w:val="single" w:space="0" w:color="D3D3D3"/>
+                  </w:tcBorders>
+                </w:tcPr>
+                <w:p>
+                  <w:pPr>
+                    <w:spacing w:before="0" w:after="60"/>
+                    <w:keepNext/>
+                    <w:jc w:val="end"/>
+                  </w:pPr>
+                  <w:r>
+                    <w:rPr>
+                      <w:rFonts w:ascii="Calibri" w:hAnsi="Calibri"/>
+                      <w:sz w:val="20"/>
+                    </w:rPr>
+                    <w:t xml:space="default">0.85</w:t>
+                  </w:r>
+                </w:p>
+              </w:tc>
+              <w:tc>
+                <w:tcPr>
+                  <w:tcBorders>
+                    <w:top w:val="single" w:space="0" w:color="D3D3D3"/>
+                    <w:bottom w:val="single" w:space="0" w:color="D3D3D3"/>
+                    <w:start w:val="single" w:space="0" w:color="D3D3D3"/>
+                    <w:end w:val="single" w:space="0" w:color="D3D3D3"/>
+                  </w:tcBorders>
+                </w:tcPr>
+                <w:p>
+                  <w:pPr>
+                    <w:spacing w:before="0" w:after="60"/>
+                    <w:keepNext/>
+                    <w:jc w:val="end"/>
+                  </w:pPr>
+                  <w:r>
+                    <w:rPr>
+                      <w:rFonts w:ascii="Calibri" w:hAnsi="Calibri"/>
+                      <w:sz w:val="20"/>
+                    </w:rPr>
+                    <w:t xml:space="default">1.2</w:t>
+                  </w:r>
+                </w:p>
+              </w:tc>
+              <w:tc>
+                <w:tcPr>
+                  <w:tcBorders>
+                    <w:top w:val="single" w:space="0" w:color="D3D3D3"/>
+                    <w:bottom w:val="single" w:space="0" w:color="D3D3D3"/>
+                    <w:start w:val="single" w:space="0" w:color="D3D3D3"/>
+                    <w:end w:val="single" w:space="0" w:color="D3D3D3"/>
+                  </w:tcBorders>
+                </w:tcPr>
+                <w:p>
+                  <w:pPr>
+                    <w:spacing w:before="0" w:after="60"/>
+                    <w:keepNext/>
+                    <w:jc w:val="start"/>
+                  </w:pPr>
+                  <w:r>
+                    <w:rPr>
+                      <w:rFonts w:ascii="Calibri" w:hAnsi="Calibri"/>
+                      <w:sz w:val="20"/>
+                    </w:rPr>
+                    <w:t xml:space="default">3 years</w:t>
+                  </w:r>
+                </w:p>
+              </w:tc>
+              <w:tc>
+                <w:tcPr>
+                  <w:tcBorders>
+                    <w:top w:val="single" w:space="0" w:color="D3D3D3"/>
+                    <w:bottom w:val="single" w:space="0" w:color="D3D3D3"/>
+                    <w:start w:val="single" w:space="0" w:color="D3D3D3"/>
+                    <w:end w:val="single" w:space="0" w:color="D3D3D3"/>
+                  </w:tcBorders>
+                </w:tcPr>
+                <w:p>
+                  <w:pPr>
+                    <w:spacing w:before="0" w:after="60"/>
+                    <w:keepNext/>
+                    <w:jc w:val="start"/>
+                  </w:pPr>
+                  <w:r>
+                    <w:rPr>
+                      <w:rFonts w:ascii="Calibri" w:hAnsi="Calibri"/>
+                      <w:sz w:val="20"/>
+                    </w:rPr>
+                    <w:t xml:space="default">All</w:t>
+                  </w:r>
+                </w:p>
+              </w:tc>
+            </w:tr>
+            <w:tr>
+              <w:trPr>
+                <w:cantSplit/>
+              </w:trPr>
+              <w:tc>
+                <w:tcPr>
+                  <w:tcBorders>
+                    <w:top w:val="single" w:space="0" w:color="D3D3D3"/>
+                    <w:bottom w:val="single" w:space="0" w:color="D3D3D3"/>
+                    <w:start w:val="single" w:space="0" w:color="D3D3D3"/>
+                    <w:end w:val="single" w:space="0" w:color="D3D3D3"/>
+                  </w:tcBorders>
+                </w:tcPr>
+                <w:p>
+                  <w:pPr>
+                    <w:spacing w:before="0" w:after="60"/>
+                    <w:keepNext/>
+                    <w:jc w:val="start"/>
+                  </w:pPr>
+                  <w:r>
+                    <w:rPr>
+                      <w:rFonts w:ascii="Calibri" w:hAnsi="Calibri"/>
+                      <w:sz w:val="20"/>
+                    </w:rPr>
+                    <w:t xml:space="default">run18</w:t>
+                  </w:r>
+                </w:p>
+              </w:tc>
+              <w:tc>
+                <w:tcPr>
+                  <w:tcBorders>
+                    <w:top w:val="single" w:space="0" w:color="D3D3D3"/>
+                    <w:bottom w:val="single" w:space="0" w:color="D3D3D3"/>
+                    <w:start w:val="single" w:space="0" w:color="D3D3D3"/>
+                    <w:end w:val="single" w:space="0" w:color="D3D3D3"/>
+                  </w:tcBorders>
+                </w:tcPr>
+                <w:p>
+                  <w:pPr>
+                    <w:spacing w:before="0" w:after="60"/>
+                    <w:keepNext/>
+                    <w:jc w:val="start"/>
+                  </w:pPr>
+                  <w:r>
+                    <w:rPr>
+                      <w:rFonts w:ascii="Calibri" w:hAnsi="Calibri"/>
+                      <w:sz w:val="20"/>
+                    </w:rPr>
+                    <w:t xml:space="default">Base++</w:t>
+                  </w:r>
+                </w:p>
+              </w:tc>
+              <w:tc>
+                <w:tcPr>
+                  <w:tcBorders>
+                    <w:top w:val="single" w:space="0" w:color="D3D3D3"/>
+                    <w:bottom w:val="single" w:space="0" w:color="D3D3D3"/>
+                    <w:start w:val="single" w:space="0" w:color="D3D3D3"/>
+                    <w:end w:val="single" w:space="0" w:color="D3D3D3"/>
+                  </w:tcBorders>
+                </w:tcPr>
+                <w:p>
+                  <w:pPr>
+                    <w:spacing w:before="0" w:after="60"/>
+                    <w:keepNext/>
+                    <w:jc w:val="end"/>
+                  </w:pPr>
+                  <w:r>
+                    <w:rPr>
+                      <w:rFonts w:ascii="Calibri" w:hAnsi="Calibri"/>
+                      <w:sz w:val="20"/>
+                    </w:rPr>
+                    <w:t xml:space="default">0</w:t>
+                  </w:r>
+                </w:p>
+              </w:tc>
+              <w:tc>
+                <w:tcPr>
+                  <w:tcBorders>
+                    <w:top w:val="single" w:space="0" w:color="D3D3D3"/>
+                    <w:bottom w:val="single" w:space="0" w:color="D3D3D3"/>
+                    <w:start w:val="single" w:space="0" w:color="D3D3D3"/>
+                    <w:end w:val="single" w:space="0" w:color="D3D3D3"/>
+                  </w:tcBorders>
+                </w:tcPr>
+                <w:p>
+                  <w:pPr>
+                    <w:spacing w:before="0" w:after="60"/>
+                    <w:keepNext/>
+                    <w:jc w:val="end"/>
+                  </w:pPr>
+                  <w:r>
+                    <w:rPr>
+                      <w:rFonts w:ascii="Calibri" w:hAnsi="Calibri"/>
+                      <w:sz w:val="20"/>
+                    </w:rPr>
+                    <w:t xml:space="default">0</w:t>
+                  </w:r>
+                </w:p>
+              </w:tc>
+              <w:tc>
+                <w:tcPr>
+                  <w:tcBorders>
+                    <w:top w:val="single" w:space="0" w:color="D3D3D3"/>
+                    <w:bottom w:val="single" w:space="0" w:color="D3D3D3"/>
+                    <w:start w:val="single" w:space="0" w:color="D3D3D3"/>
+                    <w:end w:val="single" w:space="0" w:color="D3D3D3"/>
+                  </w:tcBorders>
+                </w:tcPr>
+                <w:p>
+                  <w:pPr>
+                    <w:spacing w:before="0" w:after="60"/>
+                    <w:keepNext/>
+                    <w:jc w:val="start"/>
+                  </w:pPr>
+                  <w:r>
+                    <w:rPr>
+                      <w:rFonts w:ascii="Calibri" w:hAnsi="Calibri"/>
+                      <w:sz w:val="20"/>
+                    </w:rPr>
+                    <w:t xml:space="default">Tuned</w:t>
+                  </w:r>
+                </w:p>
+              </w:tc>
+              <w:tc>
+                <w:tcPr>
+                  <w:tcBorders>
+                    <w:top w:val="single" w:space="0" w:color="D3D3D3"/>
+                    <w:bottom w:val="single" w:space="0" w:color="D3D3D3"/>
+                    <w:start w:val="single" w:space="0" w:color="D3D3D3"/>
+                    <w:end w:val="single" w:space="0" w:color="D3D3D3"/>
+                  </w:tcBorders>
+                </w:tcPr>
+                <w:p>
+                  <w:pPr>
+                    <w:spacing w:before="0" w:after="60"/>
+                    <w:keepNext/>
+                    <w:jc w:val="end"/>
+                  </w:pPr>
+                  <w:r>
+                    <w:rPr>
+                      <w:rFonts w:ascii="Calibri" w:hAnsi="Calibri"/>
+                      <w:sz w:val="20"/>
+                    </w:rPr>
+                    <w:t xml:space="default">5,000</w:t>
+                  </w:r>
+                </w:p>
+              </w:tc>
+              <w:tc>
+                <w:tcPr>
+                  <w:tcBorders>
+                    <w:top w:val="single" w:space="0" w:color="D3D3D3"/>
+                    <w:bottom w:val="single" w:space="0" w:color="D3D3D3"/>
+                    <w:start w:val="single" w:space="0" w:color="D3D3D3"/>
+                    <w:end w:val="single" w:space="0" w:color="D3D3D3"/>
+                  </w:tcBorders>
+                </w:tcPr>
+                <w:p>
+                  <w:pPr>
+                    <w:spacing w:before="0" w:after="60"/>
+                    <w:keepNext/>
+                    <w:jc w:val="end"/>
+                  </w:pPr>
+                  <w:r>
+                    <w:rPr>
+                      <w:rFonts w:ascii="Calibri" w:hAnsi="Calibri"/>
+                      <w:sz w:val="20"/>
+                    </w:rPr>
+                    <w:t xml:space="default">0.85</w:t>
+                  </w:r>
+                </w:p>
+              </w:tc>
+              <w:tc>
+                <w:tcPr>
+                  <w:tcBorders>
+                    <w:top w:val="single" w:space="0" w:color="D3D3D3"/>
+                    <w:bottom w:val="single" w:space="0" w:color="D3D3D3"/>
+                    <w:start w:val="single" w:space="0" w:color="D3D3D3"/>
+                    <w:end w:val="single" w:space="0" w:color="D3D3D3"/>
+                  </w:tcBorders>
+                </w:tcPr>
+                <w:p>
+                  <w:pPr>
+                    <w:spacing w:before="0" w:after="60"/>
+                    <w:keepNext/>
+                    <w:jc w:val="end"/>
+                  </w:pPr>
+                  <w:r>
+                    <w:rPr>
+                      <w:rFonts w:ascii="Calibri" w:hAnsi="Calibri"/>
+                      <w:sz w:val="20"/>
+                    </w:rPr>
+                    <w:t xml:space="default">1.2</w:t>
+                  </w:r>
+                </w:p>
+              </w:tc>
+              <w:tc>
+                <w:tcPr>
+                  <w:tcBorders>
+                    <w:top w:val="single" w:space="0" w:color="D3D3D3"/>
+                    <w:bottom w:val="single" w:space="0" w:color="D3D3D3"/>
+                    <w:start w:val="single" w:space="0" w:color="D3D3D3"/>
+                    <w:end w:val="single" w:space="0" w:color="D3D3D3"/>
+                  </w:tcBorders>
+                </w:tcPr>
+                <w:p>
+                  <w:pPr>
+                    <w:spacing w:before="0" w:after="60"/>
+                    <w:keepNext/>
+                    <w:jc w:val="start"/>
+                  </w:pPr>
+                  <w:r>
+                    <w:rPr>
+                      <w:rFonts w:ascii="Calibri" w:hAnsi="Calibri"/>
+                      <w:sz w:val="20"/>
+                    </w:rPr>
+                    <w:t xml:space="default">3 years</w:t>
+                  </w:r>
+                </w:p>
+              </w:tc>
+              <w:tc>
+                <w:tcPr>
+                  <w:tcBorders>
+                    <w:top w:val="single" w:space="0" w:color="D3D3D3"/>
+                    <w:bottom w:val="single" w:space="0" w:color="D3D3D3"/>
+                    <w:start w:val="single" w:space="0" w:color="D3D3D3"/>
+                    <w:end w:val="single" w:space="0" w:color="D3D3D3"/>
+                  </w:tcBorders>
+                </w:tcPr>
+                <w:p>
+                  <w:pPr>
+                    <w:spacing w:before="0" w:after="60"/>
+                    <w:keepNext/>
+                    <w:jc w:val="start"/>
+                  </w:pPr>
+                  <w:r>
+                    <w:rPr>
+                      <w:rFonts w:ascii="Calibri" w:hAnsi="Calibri"/>
+                      <w:sz w:val="20"/>
+                    </w:rPr>
+                    <w:t xml:space="default">All</w:t>
+                  </w:r>
+                </w:p>
+              </w:tc>
+            </w:tr>
+            <w:tr>
+              <w:trPr>
+                <w:cantSplit/>
+              </w:trPr>
+              <w:tc>
+                <w:tcPr>
+                  <w:tcBorders>
+                    <w:top w:val="single" w:space="0" w:color="D3D3D3"/>
+                    <w:bottom w:val="single" w:space="0" w:color="D3D3D3"/>
+                    <w:start w:val="single" w:space="0" w:color="D3D3D3"/>
+                    <w:end w:val="single" w:space="0" w:color="D3D3D3"/>
+                  </w:tcBorders>
+                </w:tcPr>
+                <w:p>
+                  <w:pPr>
+                    <w:spacing w:before="0" w:after="60"/>
+                    <w:keepNext/>
+                    <w:jc w:val="start"/>
+                  </w:pPr>
+                  <w:r>
+                    <w:rPr>
+                      <w:rFonts w:ascii="Calibri" w:hAnsi="Calibri"/>
+                      <w:sz w:val="20"/>
+                    </w:rPr>
+                    <w:t xml:space="default">run19</w:t>
+                  </w:r>
+                </w:p>
+              </w:tc>
+              <w:tc>
+                <w:tcPr>
+                  <w:tcBorders>
+                    <w:top w:val="single" w:space="0" w:color="D3D3D3"/>
+                    <w:bottom w:val="single" w:space="0" w:color="D3D3D3"/>
+                    <w:start w:val="single" w:space="0" w:color="D3D3D3"/>
+                    <w:end w:val="single" w:space="0" w:color="D3D3D3"/>
+                  </w:tcBorders>
+                </w:tcPr>
+                <w:p>
+                  <w:pPr>
+                    <w:spacing w:before="0" w:after="60"/>
+                    <w:keepNext/>
+                    <w:jc w:val="start"/>
+                  </w:pPr>
+                  <w:r>
+                    <w:rPr>
+                      <w:rFonts w:ascii="Calibri" w:hAnsi="Calibri"/>
+                      <w:sz w:val="20"/>
+                    </w:rPr>
+                    <w:t xml:space="default">Chile</w:t>
+                  </w:r>
+                </w:p>
+              </w:tc>
+              <w:tc>
+                <w:tcPr>
+                  <w:tcBorders>
+                    <w:top w:val="single" w:space="0" w:color="D3D3D3"/>
+                    <w:bottom w:val="single" w:space="0" w:color="D3D3D3"/>
+                    <w:start w:val="single" w:space="0" w:color="D3D3D3"/>
+                    <w:end w:val="single" w:space="0" w:color="D3D3D3"/>
+                  </w:tcBorders>
+                </w:tcPr>
+                <w:p>
+                  <w:pPr>
+                    <w:spacing w:before="0" w:after="60"/>
+                    <w:keepNext/>
+                    <w:jc w:val="end"/>
+                  </w:pPr>
+                  <w:r>
+                    <w:rPr>
+                      <w:rFonts w:ascii="Calibri" w:hAnsi="Calibri"/>
+                      <w:sz w:val="20"/>
+                    </w:rPr>
+                    <w:t xml:space="default">270</w:t>
+                  </w:r>
+                </w:p>
+              </w:tc>
+              <w:tc>
+                <w:tcPr>
+                  <w:tcBorders>
+                    <w:top w:val="single" w:space="0" w:color="D3D3D3"/>
+                    <w:bottom w:val="single" w:space="0" w:color="D3D3D3"/>
+                    <w:start w:val="single" w:space="0" w:color="D3D3D3"/>
+                    <w:end w:val="single" w:space="0" w:color="D3D3D3"/>
+                  </w:tcBorders>
+                </w:tcPr>
+                <w:p>
+                  <w:pPr>
+                    <w:spacing w:before="0" w:after="60"/>
+                    <w:keepNext/>
+                    <w:jc w:val="end"/>
+                  </w:pPr>
+                  <w:r>
+                    <w:rPr>
+                      <w:rFonts w:ascii="Calibri" w:hAnsi="Calibri"/>
+                      <w:sz w:val="20"/>
+                    </w:rPr>
+                    <w:t xml:space="default">0.1</w:t>
+                  </w:r>
+                </w:p>
+              </w:tc>
+              <w:tc>
+                <w:tcPr>
+                  <w:tcBorders>
+                    <w:top w:val="single" w:space="0" w:color="D3D3D3"/>
+                    <w:bottom w:val="single" w:space="0" w:color="D3D3D3"/>
+                    <w:start w:val="single" w:space="0" w:color="D3D3D3"/>
+                    <w:end w:val="single" w:space="0" w:color="D3D3D3"/>
+                  </w:tcBorders>
+                </w:tcPr>
+                <w:p>
+                  <w:pPr>
+                    <w:spacing w:before="0" w:after="60"/>
+                    <w:keepNext/>
+                    <w:jc w:val="start"/>
+                  </w:pPr>
+                  <w:r>
+                    <w:rPr>
+                      <w:rFonts w:ascii="Calibri" w:hAnsi="Calibri"/>
+                      <w:sz w:val="20"/>
+                    </w:rPr>
+                    <w:t xml:space="default">Tuned</w:t>
+                  </w:r>
+                </w:p>
+              </w:tc>
+              <w:tc>
+                <w:tcPr>
+                  <w:tcBorders>
+                    <w:top w:val="single" w:space="0" w:color="D3D3D3"/>
+                    <w:bottom w:val="single" w:space="0" w:color="D3D3D3"/>
+                    <w:start w:val="single" w:space="0" w:color="D3D3D3"/>
+                    <w:end w:val="single" w:space="0" w:color="D3D3D3"/>
+                  </w:tcBorders>
+                </w:tcPr>
+                <w:p>
+                  <w:pPr>
+                    <w:spacing w:before="0" w:after="60"/>
+                    <w:keepNext/>
+                    <w:jc w:val="end"/>
+                  </w:pPr>
+                  <w:r>
+                    <w:rPr>
+                      <w:rFonts w:ascii="Calibri" w:hAnsi="Calibri"/>
+                      <w:sz w:val="20"/>
+                    </w:rPr>
+                    <w:t xml:space="default">1,500</w:t>
+                  </w:r>
+                </w:p>
+              </w:tc>
+              <w:tc>
+                <w:tcPr>
+                  <w:tcBorders>
+                    <w:top w:val="single" w:space="0" w:color="D3D3D3"/>
+                    <w:bottom w:val="single" w:space="0" w:color="D3D3D3"/>
+                    <w:start w:val="single" w:space="0" w:color="D3D3D3"/>
+                    <w:end w:val="single" w:space="0" w:color="D3D3D3"/>
+                  </w:tcBorders>
+                </w:tcPr>
+                <w:p>
+                  <w:pPr>
+                    <w:spacing w:before="0" w:after="60"/>
+                    <w:keepNext/>
+                    <w:jc w:val="end"/>
+                  </w:pPr>
+                  <w:r>
+                    <w:rPr>
+                      <w:rFonts w:ascii="Calibri" w:hAnsi="Calibri"/>
+                      <w:sz w:val="20"/>
+                    </w:rPr>
+                    <w:t xml:space="default">0.85</w:t>
+                  </w:r>
+                </w:p>
+              </w:tc>
+              <w:tc>
+                <w:tcPr>
+                  <w:tcBorders>
+                    <w:top w:val="single" w:space="0" w:color="D3D3D3"/>
+                    <w:bottom w:val="single" w:space="0" w:color="D3D3D3"/>
+                    <w:start w:val="single" w:space="0" w:color="D3D3D3"/>
+                    <w:end w:val="single" w:space="0" w:color="D3D3D3"/>
+                  </w:tcBorders>
+                </w:tcPr>
+                <w:p>
+                  <w:pPr>
+                    <w:spacing w:before="0" w:after="60"/>
+                    <w:keepNext/>
+                    <w:jc w:val="end"/>
+                  </w:pPr>
+                  <w:r>
+                    <w:rPr>
+                      <w:rFonts w:ascii="Calibri" w:hAnsi="Calibri"/>
+                      <w:sz w:val="20"/>
+                    </w:rPr>
+                    <w:t xml:space="default">1.2</w:t>
+                  </w:r>
+                </w:p>
+              </w:tc>
+              <w:tc>
+                <w:tcPr>
+                  <w:tcBorders>
+                    <w:top w:val="single" w:space="0" w:color="D3D3D3"/>
+                    <w:bottom w:val="single" w:space="0" w:color="D3D3D3"/>
+                    <w:start w:val="single" w:space="0" w:color="D3D3D3"/>
+                    <w:end w:val="single" w:space="0" w:color="D3D3D3"/>
+                  </w:tcBorders>
+                </w:tcPr>
+                <w:p>
+                  <w:pPr>
+                    <w:spacing w:before="0" w:after="60"/>
+                    <w:keepNext/>
+                    <w:jc w:val="start"/>
+                  </w:pPr>
+                  <w:r>
+                    <w:rPr>
+                      <w:rFonts w:ascii="Calibri" w:hAnsi="Calibri"/>
+                      <w:sz w:val="20"/>
+                    </w:rPr>
+                    <w:t xml:space="default">3 years</w:t>
+                  </w:r>
+                </w:p>
+              </w:tc>
+              <w:tc>
+                <w:tcPr>
+                  <w:tcBorders>
+                    <w:top w:val="single" w:space="0" w:color="D3D3D3"/>
+                    <w:bottom w:val="single" w:space="0" w:color="D3D3D3"/>
+                    <w:start w:val="single" w:space="0" w:color="D3D3D3"/>
+                    <w:end w:val="single" w:space="0" w:color="D3D3D3"/>
+                  </w:tcBorders>
+                </w:tcPr>
+                <w:p>
+                  <w:pPr>
+                    <w:spacing w:before="0" w:after="60"/>
+                    <w:keepNext/>
+                    <w:jc w:val="start"/>
+                  </w:pPr>
+                  <w:r>
+                    <w:rPr>
+                      <w:rFonts w:ascii="Calibri" w:hAnsi="Calibri"/>
+                      <w:sz w:val="20"/>
+                    </w:rPr>
+                    <w:t xml:space="default">All</w:t>
+                  </w:r>
+                </w:p>
+              </w:tc>
+            </w:tr>
+            <w:tr>
+              <w:trPr>
+                <w:cantSplit/>
+              </w:trPr>
+              <w:tc>
+                <w:tcPr>
+                  <w:tcBorders>
+                    <w:top w:val="single" w:space="0" w:color="D3D3D3"/>
+                    <w:bottom w:val="single" w:space="0" w:color="D3D3D3"/>
+                    <w:start w:val="single" w:space="0" w:color="D3D3D3"/>
+                    <w:end w:val="single" w:space="0" w:color="D3D3D3"/>
+                  </w:tcBorders>
+                </w:tcPr>
+                <w:p>
+                  <w:pPr>
+                    <w:spacing w:before="0" w:after="60"/>
+                    <w:keepNext/>
+                    <w:jc w:val="start"/>
+                  </w:pPr>
+                  <w:r>
+                    <w:rPr>
+                      <w:rFonts w:ascii="Calibri" w:hAnsi="Calibri"/>
+                      <w:sz w:val="20"/>
+                    </w:rPr>
+                    <w:t xml:space="default">run20</w:t>
+                  </w:r>
+                </w:p>
+              </w:tc>
+              <w:tc>
+                <w:tcPr>
+                  <w:tcBorders>
+                    <w:top w:val="single" w:space="0" w:color="D3D3D3"/>
+                    <w:bottom w:val="single" w:space="0" w:color="D3D3D3"/>
+                    <w:start w:val="single" w:space="0" w:color="D3D3D3"/>
+                    <w:end w:val="single" w:space="0" w:color="D3D3D3"/>
+                  </w:tcBorders>
+                </w:tcPr>
+                <w:p>
+                  <w:pPr>
+                    <w:spacing w:before="0" w:after="60"/>
+                    <w:keepNext/>
+                    <w:jc w:val="start"/>
+                  </w:pPr>
+                  <w:r>
+                    <w:rPr>
+                      <w:rFonts w:ascii="Calibri" w:hAnsi="Calibri"/>
+                      <w:sz w:val="20"/>
+                    </w:rPr>
+                    <w:t xml:space="default">Chile</w:t>
+                  </w:r>
+                </w:p>
+              </w:tc>
+              <w:tc>
+                <w:tcPr>
+                  <w:tcBorders>
+                    <w:top w:val="single" w:space="0" w:color="D3D3D3"/>
+                    <w:bottom w:val="single" w:space="0" w:color="D3D3D3"/>
+                    <w:start w:val="single" w:space="0" w:color="D3D3D3"/>
+                    <w:end w:val="single" w:space="0" w:color="D3D3D3"/>
+                  </w:tcBorders>
+                </w:tcPr>
+                <w:p>
+                  <w:pPr>
+                    <w:spacing w:before="0" w:after="60"/>
+                    <w:keepNext/>
+                    <w:jc w:val="end"/>
+                  </w:pPr>
+                  <w:r>
+                    <w:rPr>
+                      <w:rFonts w:ascii="Calibri" w:hAnsi="Calibri"/>
+                      <w:sz w:val="20"/>
+                    </w:rPr>
+                    <w:t xml:space="default">270</w:t>
+                  </w:r>
+                </w:p>
+              </w:tc>
+              <w:tc>
+                <w:tcPr>
+                  <w:tcBorders>
+                    <w:top w:val="single" w:space="0" w:color="D3D3D3"/>
+                    <w:bottom w:val="single" w:space="0" w:color="D3D3D3"/>
+                    <w:start w:val="single" w:space="0" w:color="D3D3D3"/>
+                    <w:end w:val="single" w:space="0" w:color="D3D3D3"/>
+                  </w:tcBorders>
+                </w:tcPr>
+                <w:p>
+                  <w:pPr>
+                    <w:spacing w:before="0" w:after="60"/>
+                    <w:keepNext/>
+                    <w:jc w:val="end"/>
+                  </w:pPr>
+                  <w:r>
+                    <w:rPr>
+                      <w:rFonts w:ascii="Calibri" w:hAnsi="Calibri"/>
+                      <w:sz w:val="20"/>
+                    </w:rPr>
+                    <w:t xml:space="default">0.2</w:t>
+                  </w:r>
+                </w:p>
+              </w:tc>
+              <w:tc>
+                <w:tcPr>
+                  <w:tcBorders>
+                    <w:top w:val="single" w:space="0" w:color="D3D3D3"/>
+                    <w:bottom w:val="single" w:space="0" w:color="D3D3D3"/>
+                    <w:start w:val="single" w:space="0" w:color="D3D3D3"/>
+                    <w:end w:val="single" w:space="0" w:color="D3D3D3"/>
+                  </w:tcBorders>
+                </w:tcPr>
+                <w:p>
+                  <w:pPr>
+                    <w:spacing w:before="0" w:after="60"/>
+                    <w:keepNext/>
+                    <w:jc w:val="start"/>
+                  </w:pPr>
+                  <w:r>
+                    <w:rPr>
+                      <w:rFonts w:ascii="Calibri" w:hAnsi="Calibri"/>
+                      <w:sz w:val="20"/>
+                    </w:rPr>
+                    <w:t xml:space="default">Tuned</w:t>
+                  </w:r>
+                </w:p>
+              </w:tc>
+              <w:tc>
+                <w:tcPr>
+                  <w:tcBorders>
+                    <w:top w:val="single" w:space="0" w:color="D3D3D3"/>
+                    <w:bottom w:val="single" w:space="0" w:color="D3D3D3"/>
+                    <w:start w:val="single" w:space="0" w:color="D3D3D3"/>
+                    <w:end w:val="single" w:space="0" w:color="D3D3D3"/>
+                  </w:tcBorders>
+                </w:tcPr>
+                <w:p>
+                  <w:pPr>
+                    <w:spacing w:before="0" w:after="60"/>
+                    <w:keepNext/>
+                    <w:jc w:val="end"/>
+                  </w:pPr>
+                  <w:r>
+                    <w:rPr>
+                      <w:rFonts w:ascii="Calibri" w:hAnsi="Calibri"/>
+                      <w:sz w:val="20"/>
+                    </w:rPr>
+                    <w:t xml:space="default">1,500</w:t>
+                  </w:r>
+                </w:p>
+              </w:tc>
+              <w:tc>
+                <w:tcPr>
+                  <w:tcBorders>
+                    <w:top w:val="single" w:space="0" w:color="D3D3D3"/>
+                    <w:bottom w:val="single" w:space="0" w:color="D3D3D3"/>
+                    <w:start w:val="single" w:space="0" w:color="D3D3D3"/>
+                    <w:end w:val="single" w:space="0" w:color="D3D3D3"/>
+                  </w:tcBorders>
+                </w:tcPr>
+                <w:p>
+                  <w:pPr>
+                    <w:spacing w:before="0" w:after="60"/>
+                    <w:keepNext/>
+                    <w:jc w:val="end"/>
+                  </w:pPr>
+                  <w:r>
+                    <w:rPr>
+                      <w:rFonts w:ascii="Calibri" w:hAnsi="Calibri"/>
+                      <w:sz w:val="20"/>
+                    </w:rPr>
+                    <w:t xml:space="default">0.85</w:t>
+                  </w:r>
+                </w:p>
+              </w:tc>
+              <w:tc>
+                <w:tcPr>
+                  <w:tcBorders>
+                    <w:top w:val="single" w:space="0" w:color="D3D3D3"/>
+                    <w:bottom w:val="single" w:space="0" w:color="D3D3D3"/>
+                    <w:start w:val="single" w:space="0" w:color="D3D3D3"/>
+                    <w:end w:val="single" w:space="0" w:color="D3D3D3"/>
+                  </w:tcBorders>
+                </w:tcPr>
+                <w:p>
+                  <w:pPr>
+                    <w:spacing w:before="0" w:after="60"/>
+                    <w:keepNext/>
+                    <w:jc w:val="end"/>
+                  </w:pPr>
+                  <w:r>
+                    <w:rPr>
+                      <w:rFonts w:ascii="Calibri" w:hAnsi="Calibri"/>
+                      <w:sz w:val="20"/>
+                    </w:rPr>
+                    <w:t xml:space="default">1.2</w:t>
+                  </w:r>
+                </w:p>
+              </w:tc>
+              <w:tc>
+                <w:tcPr>
+                  <w:tcBorders>
+                    <w:top w:val="single" w:space="0" w:color="D3D3D3"/>
+                    <w:bottom w:val="single" w:space="0" w:color="D3D3D3"/>
+                    <w:start w:val="single" w:space="0" w:color="D3D3D3"/>
+                    <w:end w:val="single" w:space="0" w:color="D3D3D3"/>
+                  </w:tcBorders>
+                </w:tcPr>
+                <w:p>
+                  <w:pPr>
+                    <w:spacing w:before="0" w:after="60"/>
+                    <w:keepNext/>
+                    <w:jc w:val="start"/>
+                  </w:pPr>
+                  <w:r>
+                    <w:rPr>
+                      <w:rFonts w:ascii="Calibri" w:hAnsi="Calibri"/>
+                      <w:sz w:val="20"/>
+                    </w:rPr>
+                    <w:t xml:space="default">3 years</w:t>
+                  </w:r>
+                </w:p>
+              </w:tc>
+              <w:tc>
+                <w:tcPr>
+                  <w:tcBorders>
+                    <w:top w:val="single" w:space="0" w:color="D3D3D3"/>
+                    <w:bottom w:val="single" w:space="0" w:color="D3D3D3"/>
+                    <w:start w:val="single" w:space="0" w:color="D3D3D3"/>
+                    <w:end w:val="single" w:space="0" w:color="D3D3D3"/>
+                  </w:tcBorders>
+                </w:tcPr>
+                <w:p>
+                  <w:pPr>
+                    <w:spacing w:before="0" w:after="60"/>
+                    <w:keepNext/>
+                    <w:jc w:val="start"/>
+                  </w:pPr>
+                  <w:r>
+                    <w:rPr>
+                      <w:rFonts w:ascii="Calibri" w:hAnsi="Calibri"/>
+                      <w:sz w:val="20"/>
+                    </w:rPr>
+                    <w:t xml:space="default">All</w:t>
+                  </w:r>
+                </w:p>
+              </w:tc>
+            </w:tr>
+            <w:tr>
+              <w:trPr>
+                <w:cantSplit/>
+              </w:trPr>
+              <w:tc>
+                <w:tcPr>
+                  <w:tcBorders>
+                    <w:top w:val="single" w:space="0" w:color="D3D3D3"/>
+                    <w:bottom w:val="single" w:space="0" w:color="D3D3D3"/>
+                    <w:start w:val="single" w:space="0" w:color="D3D3D3"/>
+                    <w:end w:val="single" w:space="0" w:color="D3D3D3"/>
+                  </w:tcBorders>
+                </w:tcPr>
+                <w:p>
+                  <w:pPr>
+                    <w:spacing w:before="0" w:after="60"/>
+                    <w:keepNext/>
+                    <w:jc w:val="start"/>
+                  </w:pPr>
+                  <w:r>
+                    <w:rPr>
+                      <w:rFonts w:ascii="Calibri" w:hAnsi="Calibri"/>
+                      <w:sz w:val="20"/>
+                    </w:rPr>
+                    <w:t xml:space="default">run21</w:t>
+                  </w:r>
+                </w:p>
+              </w:tc>
+              <w:tc>
+                <w:tcPr>
+                  <w:tcBorders>
+                    <w:top w:val="single" w:space="0" w:color="D3D3D3"/>
+                    <w:bottom w:val="single" w:space="0" w:color="D3D3D3"/>
+                    <w:start w:val="single" w:space="0" w:color="D3D3D3"/>
+                    <w:end w:val="single" w:space="0" w:color="D3D3D3"/>
+                  </w:tcBorders>
+                </w:tcPr>
+                <w:p>
+                  <w:pPr>
+                    <w:spacing w:before="0" w:after="60"/>
+                    <w:keepNext/>
+                    <w:jc w:val="start"/>
+                  </w:pPr>
+                  <w:r>
+                    <w:rPr>
+                      <w:rFonts w:ascii="Calibri" w:hAnsi="Calibri"/>
+                      <w:sz w:val="20"/>
+                    </w:rPr>
+                    <w:t xml:space="default">Base asym+</w:t>
+                  </w:r>
+                </w:p>
+              </w:tc>
+              <w:tc>
+                <w:tcPr>
+                  <w:tcBorders>
+                    <w:top w:val="single" w:space="0" w:color="D3D3D3"/>
+                    <w:bottom w:val="single" w:space="0" w:color="D3D3D3"/>
+                    <w:start w:val="single" w:space="0" w:color="D3D3D3"/>
+                    <w:end w:val="single" w:space="0" w:color="D3D3D3"/>
+                  </w:tcBorders>
+                </w:tcPr>
+                <w:p>
+                  <w:pPr>
+                    <w:spacing w:before="0" w:after="60"/>
+                    <w:keepNext/>
+                    <w:jc w:val="end"/>
+                  </w:pPr>
+                  <w:r>
+                    <w:rPr>
+                      <w:rFonts w:ascii="Calibri" w:hAnsi="Calibri"/>
+                      <w:sz w:val="20"/>
+                    </w:rPr>
+                    <w:t xml:space="default">0</w:t>
+                  </w:r>
+                </w:p>
+              </w:tc>
+              <w:tc>
+                <w:tcPr>
+                  <w:tcBorders>
+                    <w:top w:val="single" w:space="0" w:color="D3D3D3"/>
+                    <w:bottom w:val="single" w:space="0" w:color="D3D3D3"/>
+                    <w:start w:val="single" w:space="0" w:color="D3D3D3"/>
+                    <w:end w:val="single" w:space="0" w:color="D3D3D3"/>
+                  </w:tcBorders>
+                </w:tcPr>
+                <w:p>
+                  <w:pPr>
+                    <w:spacing w:before="0" w:after="60"/>
+                    <w:keepNext/>
+                    <w:jc w:val="end"/>
+                  </w:pPr>
+                  <w:r>
+                    <w:rPr>
+                      <w:rFonts w:ascii="Calibri" w:hAnsi="Calibri"/>
+                      <w:sz w:val="20"/>
+                    </w:rPr>
+                    <w:t xml:space="default">0</w:t>
+                  </w:r>
+                </w:p>
+              </w:tc>
+              <w:tc>
+                <w:tcPr>
+                  <w:tcBorders>
+                    <w:top w:val="single" w:space="0" w:color="D3D3D3"/>
+                    <w:bottom w:val="single" w:space="0" w:color="D3D3D3"/>
+                    <w:start w:val="single" w:space="0" w:color="D3D3D3"/>
+                    <w:end w:val="single" w:space="0" w:color="D3D3D3"/>
+                  </w:tcBorders>
+                </w:tcPr>
+                <w:p>
+                  <w:pPr>
+                    <w:spacing w:before="0" w:after="60"/>
+                    <w:keepNext/>
+                    <w:jc w:val="start"/>
+                  </w:pPr>
+                  <w:r>
+                    <w:rPr>
+                      <w:rFonts w:ascii="Calibri" w:hAnsi="Calibri"/>
+                      <w:sz w:val="20"/>
+                    </w:rPr>
+                    <w:t xml:space="default">Tuned</w:t>
+                  </w:r>
+                </w:p>
+              </w:tc>
+              <w:tc>
+                <w:tcPr>
+                  <w:tcBorders>
+                    <w:top w:val="single" w:space="0" w:color="D3D3D3"/>
+                    <w:bottom w:val="single" w:space="0" w:color="D3D3D3"/>
+                    <w:start w:val="single" w:space="0" w:color="D3D3D3"/>
+                    <w:end w:val="single" w:space="0" w:color="D3D3D3"/>
+                  </w:tcBorders>
+                </w:tcPr>
+                <w:p>
+                  <w:pPr>
+                    <w:spacing w:before="0" w:after="60"/>
+                    <w:keepNext/>
+                    <w:jc w:val="end"/>
+                  </w:pPr>
+                  <w:r>
+                    <w:rPr>
+                      <w:rFonts w:ascii="Calibri" w:hAnsi="Calibri"/>
+                      <w:sz w:val="20"/>
+                    </w:rPr>
+                    <w:t xml:space="default">2,000</w:t>
+                  </w:r>
+                </w:p>
+              </w:tc>
+              <w:tc>
+                <w:tcPr>
+                  <w:tcBorders>
+                    <w:top w:val="single" w:space="0" w:color="D3D3D3"/>
+                    <w:bottom w:val="single" w:space="0" w:color="D3D3D3"/>
+                    <w:start w:val="single" w:space="0" w:color="D3D3D3"/>
+                    <w:end w:val="single" w:space="0" w:color="D3D3D3"/>
+                  </w:tcBorders>
+                </w:tcPr>
+                <w:p>
+                  <w:pPr>
+                    <w:spacing w:before="0" w:after="60"/>
+                    <w:keepNext/>
+                    <w:jc w:val="end"/>
+                  </w:pPr>
+                  <w:r>
+                    <w:rPr>
+                      <w:rFonts w:ascii="Calibri" w:hAnsi="Calibri"/>
+                      <w:sz w:val="20"/>
+                    </w:rPr>
+                    <w:t xml:space="default">0.8</w:t>
+                  </w:r>
+                </w:p>
+              </w:tc>
+              <w:tc>
+                <w:tcPr>
+                  <w:tcBorders>
+                    <w:top w:val="single" w:space="0" w:color="D3D3D3"/>
+                    <w:bottom w:val="single" w:space="0" w:color="D3D3D3"/>
+                    <w:start w:val="single" w:space="0" w:color="D3D3D3"/>
+                    <w:end w:val="single" w:space="0" w:color="D3D3D3"/>
+                  </w:tcBorders>
+                </w:tcPr>
+                <w:p>
+                  <w:pPr>
+                    <w:spacing w:before="0" w:after="60"/>
+                    <w:keepNext/>
+                    <w:jc w:val="end"/>
+                  </w:pPr>
+                  <w:r>
+                    <w:rPr>
+                      <w:rFonts w:ascii="Calibri" w:hAnsi="Calibri"/>
+                      <w:sz w:val="20"/>
+                    </w:rPr>
+                    <w:t xml:space="default">1.15</w:t>
+                  </w:r>
+                </w:p>
+              </w:tc>
+              <w:tc>
+                <w:tcPr>
+                  <w:tcBorders>
+                    <w:top w:val="single" w:space="0" w:color="D3D3D3"/>
+                    <w:bottom w:val="single" w:space="0" w:color="D3D3D3"/>
+                    <w:start w:val="single" w:space="0" w:color="D3D3D3"/>
+                    <w:end w:val="single" w:space="0" w:color="D3D3D3"/>
+                  </w:tcBorders>
+                </w:tcPr>
+                <w:p>
+                  <w:pPr>
+                    <w:spacing w:before="0" w:after="60"/>
+                    <w:keepNext/>
+                    <w:jc w:val="start"/>
+                  </w:pPr>
+                  <w:r>
+                    <w:rPr>
+                      <w:rFonts w:ascii="Calibri" w:hAnsi="Calibri"/>
+                      <w:sz w:val="20"/>
+                    </w:rPr>
+                    <w:t xml:space="default">3 years</w:t>
+                  </w:r>
+                </w:p>
+              </w:tc>
+              <w:tc>
+                <w:tcPr>
+                  <w:tcBorders>
+                    <w:top w:val="single" w:space="0" w:color="D3D3D3"/>
+                    <w:bottom w:val="single" w:space="0" w:color="D3D3D3"/>
+                    <w:start w:val="single" w:space="0" w:color="D3D3D3"/>
+                    <w:end w:val="single" w:space="0" w:color="D3D3D3"/>
+                  </w:tcBorders>
+                </w:tcPr>
+                <w:p>
+                  <w:pPr>
+                    <w:spacing w:before="0" w:after="60"/>
+                    <w:keepNext/>
+                    <w:jc w:val="start"/>
+                  </w:pPr>
+                  <w:r>
+                    <w:rPr>
+                      <w:rFonts w:ascii="Calibri" w:hAnsi="Calibri"/>
+                      <w:sz w:val="20"/>
+                    </w:rPr>
+                    <w:t xml:space="default">All</w:t>
+                  </w:r>
+                </w:p>
+              </w:tc>
+            </w:tr>
+            <w:tr>
+              <w:trPr>
+                <w:cantSplit/>
+              </w:trPr>
+              <w:tc>
+                <w:tcPr>
+                  <w:tcBorders>
+                    <w:top w:val="single" w:space="0" w:color="D3D3D3"/>
+                    <w:bottom w:val="single" w:space="0" w:color="D3D3D3"/>
+                    <w:start w:val="single" w:space="0" w:color="D3D3D3"/>
+                    <w:end w:val="single" w:space="0" w:color="D3D3D3"/>
+                  </w:tcBorders>
+                </w:tcPr>
+                <w:p>
+                  <w:pPr>
+                    <w:spacing w:before="0" w:after="60"/>
+                    <w:keepNext/>
+                    <w:jc w:val="start"/>
+                  </w:pPr>
+                  <w:r>
+                    <w:rPr>
+                      <w:rFonts w:ascii="Calibri" w:hAnsi="Calibri"/>
+                      <w:sz w:val="20"/>
+                    </w:rPr>
+                    <w:t xml:space="default">run22</w:t>
+                  </w:r>
+                </w:p>
+              </w:tc>
+              <w:tc>
+                <w:tcPr>
+                  <w:tcBorders>
+                    <w:top w:val="single" w:space="0" w:color="D3D3D3"/>
+                    <w:bottom w:val="single" w:space="0" w:color="D3D3D3"/>
+                    <w:start w:val="single" w:space="0" w:color="D3D3D3"/>
+                    <w:end w:val="single" w:space="0" w:color="D3D3D3"/>
+                  </w:tcBorders>
+                </w:tcPr>
+                <w:p>
+                  <w:pPr>
+                    <w:spacing w:before="0" w:after="60"/>
+                    <w:keepNext/>
+                    <w:jc w:val="start"/>
+                  </w:pPr>
+                  <w:r>
+                    <w:rPr>
+                      <w:rFonts w:ascii="Calibri" w:hAnsi="Calibri"/>
+                      <w:sz w:val="20"/>
+                    </w:rPr>
+                    <w:t xml:space="default">Chile special shape</w:t>
+                  </w:r>
+                </w:p>
+              </w:tc>
+              <w:tc>
+                <w:tcPr>
+                  <w:tcBorders>
+                    <w:top w:val="single" w:space="0" w:color="D3D3D3"/>
+                    <w:bottom w:val="single" w:space="0" w:color="D3D3D3"/>
+                    <w:start w:val="single" w:space="0" w:color="D3D3D3"/>
+                    <w:end w:val="single" w:space="0" w:color="D3D3D3"/>
+                  </w:tcBorders>
+                </w:tcPr>
+                <w:p>
+                  <w:pPr>
+                    <w:spacing w:before="0" w:after="60"/>
+                    <w:keepNext/>
+                    <w:jc w:val="end"/>
+                  </w:pPr>
+                  <w:r>
+                    <w:rPr>
+                      <w:rFonts w:ascii="Calibri" w:hAnsi="Calibri"/>
+                      <w:sz w:val="20"/>
+                    </w:rPr>
+                    <w:t xml:space="default">270</w:t>
+                  </w:r>
+                </w:p>
+              </w:tc>
+              <w:tc>
+                <w:tcPr>
+                  <w:tcBorders>
+                    <w:top w:val="single" w:space="0" w:color="D3D3D3"/>
+                    <w:bottom w:val="single" w:space="0" w:color="D3D3D3"/>
+                    <w:start w:val="single" w:space="0" w:color="D3D3D3"/>
+                    <w:end w:val="single" w:space="0" w:color="D3D3D3"/>
+                  </w:tcBorders>
+                </w:tcPr>
+                <w:p>
+                  <w:pPr>
+                    <w:spacing w:before="0" w:after="60"/>
+                    <w:keepNext/>
+                    <w:jc w:val="end"/>
+                  </w:pPr>
+                  <w:r>
+                    <w:rPr>
+                      <w:rFonts w:ascii="Calibri" w:hAnsi="Calibri"/>
+                      <w:sz w:val="20"/>
+                    </w:rPr>
+                    <w:t xml:space="default">0.2</w:t>
+                  </w:r>
+                </w:p>
+              </w:tc>
+              <w:tc>
+                <w:tcPr>
+                  <w:tcBorders>
+                    <w:top w:val="single" w:space="0" w:color="D3D3D3"/>
+                    <w:bottom w:val="single" w:space="0" w:color="D3D3D3"/>
+                    <w:start w:val="single" w:space="0" w:color="D3D3D3"/>
+                    <w:end w:val="single" w:space="0" w:color="D3D3D3"/>
+                  </w:tcBorders>
+                </w:tcPr>
+                <w:p>
+                  <w:pPr>
+                    <w:spacing w:before="0" w:after="60"/>
+                    <w:keepNext/>
+                    <w:jc w:val="start"/>
+                  </w:pPr>
+                  <w:r>
+                    <w:rPr>
+                      <w:rFonts w:ascii="Calibri" w:hAnsi="Calibri"/>
+                      <w:sz w:val="20"/>
+                    </w:rPr>
+                    <w:t xml:space="default">Tuned</w:t>
+                  </w:r>
+                </w:p>
+              </w:tc>
+              <w:tc>
+                <w:tcPr>
+                  <w:tcBorders>
+                    <w:top w:val="single" w:space="0" w:color="D3D3D3"/>
+                    <w:bottom w:val="single" w:space="0" w:color="D3D3D3"/>
+                    <w:start w:val="single" w:space="0" w:color="D3D3D3"/>
+                    <w:end w:val="single" w:space="0" w:color="D3D3D3"/>
+                  </w:tcBorders>
+                </w:tcPr>
+                <w:p>
+                  <w:pPr>
+                    <w:spacing w:before="0" w:after="60"/>
+                    <w:keepNext/>
+                    <w:jc w:val="end"/>
+                  </w:pPr>
+                  <w:r>
+                    <w:rPr>
+                      <w:rFonts w:ascii="Calibri" w:hAnsi="Calibri"/>
+                      <w:sz w:val="20"/>
+                    </w:rPr>
+                    <w:t xml:space="default">1,500</w:t>
+                  </w:r>
+                </w:p>
+              </w:tc>
+              <w:tc>
+                <w:tcPr>
+                  <w:tcBorders>
+                    <w:top w:val="single" w:space="0" w:color="D3D3D3"/>
+                    <w:bottom w:val="single" w:space="0" w:color="D3D3D3"/>
+                    <w:start w:val="single" w:space="0" w:color="D3D3D3"/>
+                    <w:end w:val="single" w:space="0" w:color="D3D3D3"/>
+                  </w:tcBorders>
+                </w:tcPr>
+                <w:p>
+                  <w:pPr>
+                    <w:spacing w:before="0" w:after="60"/>
+                    <w:keepNext/>
+                    <w:jc w:val="end"/>
+                  </w:pPr>
+                  <w:r>
+                    <w:rPr>
+                      <w:rFonts w:ascii="Calibri" w:hAnsi="Calibri"/>
+                      <w:sz w:val="20"/>
+                    </w:rPr>
+                    <w:t xml:space="default">0.85</w:t>
+                  </w:r>
+                </w:p>
+              </w:tc>
+              <w:tc>
+                <w:tcPr>
+                  <w:tcBorders>
+                    <w:top w:val="single" w:space="0" w:color="D3D3D3"/>
+                    <w:bottom w:val="single" w:space="0" w:color="D3D3D3"/>
+                    <w:start w:val="single" w:space="0" w:color="D3D3D3"/>
+                    <w:end w:val="single" w:space="0" w:color="D3D3D3"/>
+                  </w:tcBorders>
+                </w:tcPr>
+                <w:p>
+                  <w:pPr>
+                    <w:spacing w:before="0" w:after="60"/>
+                    <w:keepNext/>
+                    <w:jc w:val="end"/>
+                  </w:pPr>
+                  <w:r>
+                    <w:rPr>
+                      <w:rFonts w:ascii="Calibri" w:hAnsi="Calibri"/>
+                      <w:sz w:val="20"/>
+                    </w:rPr>
+                    <w:t xml:space="default">1.2</w:t>
+                  </w:r>
+                </w:p>
+              </w:tc>
+              <w:tc>
+                <w:tcPr>
+                  <w:tcBorders>
+                    <w:top w:val="single" w:space="0" w:color="D3D3D3"/>
+                    <w:bottom w:val="single" w:space="0" w:color="D3D3D3"/>
+                    <w:start w:val="single" w:space="0" w:color="D3D3D3"/>
+                    <w:end w:val="single" w:space="0" w:color="D3D3D3"/>
+                  </w:tcBorders>
+                </w:tcPr>
+                <w:p>
+                  <w:pPr>
+                    <w:spacing w:before="0" w:after="60"/>
+                    <w:keepNext/>
+                    <w:jc w:val="start"/>
+                  </w:pPr>
+                  <w:r>
+                    <w:rPr>
+                      <w:rFonts w:ascii="Calibri" w:hAnsi="Calibri"/>
+                      <w:sz w:val="20"/>
+                    </w:rPr>
+                    <w:t xml:space="default">3 years</w:t>
+                  </w:r>
+                </w:p>
+              </w:tc>
+              <w:tc>
+                <w:tcPr>
+                  <w:tcBorders>
+                    <w:top w:val="single" w:space="0" w:color="D3D3D3"/>
+                    <w:bottom w:val="single" w:space="0" w:color="D3D3D3"/>
+                    <w:start w:val="single" w:space="0" w:color="D3D3D3"/>
+                    <w:end w:val="single" w:space="0" w:color="D3D3D3"/>
+                  </w:tcBorders>
+                </w:tcPr>
+                <w:p>
+                  <w:pPr>
+                    <w:spacing w:before="0" w:after="60"/>
+                    <w:keepNext/>
+                    <w:jc w:val="start"/>
+                  </w:pPr>
+                  <w:r>
+                    <w:rPr>
+                      <w:rFonts w:ascii="Calibri" w:hAnsi="Calibri"/>
+                      <w:sz w:val="20"/>
+                    </w:rPr>
+                    <w:t xml:space="default">All</w:t>
+                  </w:r>
+                </w:p>
+              </w:tc>
+            </w:tr>
+          </w:tbl>
+          <w:bookmarkEnd w:id="31"/>
         </w:tc>
       </w:tr>
     </w:tbl>
@@ -7437,7 +10010,7 @@
       <w:tr>
         <w:tc>
           <w:tcPr/>
-          <w:bookmarkStart w:id="29" w:name="fig-hcr-faceted"/>
+          <w:bookmarkStart w:id="35" w:name="fig-hcr-faceted"/>
           <w:p>
             <w:pPr>
               <w:pStyle w:val="Compact"/>
@@ -7448,18 +10021,18 @@
                 <wp:inline>
                   <wp:extent cx="5334000" cy="4267200"/>
                   <wp:effectExtent b="0" l="0" r="0" t="0"/>
-                  <wp:docPr descr="" title="" id="27" name="Picture"/>
+                  <wp:docPr descr="" title="" id="33" name="Picture"/>
                   <a:graphic>
                     <a:graphicData uri="http://schemas.openxmlformats.org/drawingml/2006/picture">
                       <pic:pic>
                         <pic:nvPicPr>
-                          <pic:cNvPr descr="SCW17-MSE-Workshop-report_files/figure-docx/fig-hcr-faceted-1.png" id="28" name="Picture"/>
+                          <pic:cNvPr descr="SCW17-MSE-Workshop-report_files/figure-docx/fig-hcr-faceted-1.png" id="34" name="Picture"/>
                           <pic:cNvPicPr>
                             <a:picLocks noChangeArrowheads="1" noChangeAspect="1"/>
                           </pic:cNvPicPr>
                         </pic:nvPicPr>
                         <pic:blipFill>
-                          <a:blip r:embed="rId26"/>
+                          <a:blip r:embed="rId32"/>
                           <a:stretch>
                             <a:fillRect/>
                           </a:stretch>
@@ -7496,7 +10069,7 @@
               <w:pStyle w:val="ImageCaption"/>
             </w:pPr>
             <w:r>
-              <w:t xml:space="preserve">Figure 1: Draft CMP piecewise-linear harvest-control-rule shapes. Output =</w:t>
+              <w:t xml:space="preserve">Figure 2: Draft CMP piecewise-linear harvest-control-rule shapes. Output =</w:t>
             </w:r>
             <w:r>
               <w:t xml:space="preserve"> </w:t>
@@ -7508,7 +10081,7 @@
               <w:t xml:space="preserve">; dashed vertical lines show trigger values, dotted vertical lines show limits, and horizontal lines show minimum and target catch. Quadrant colors are used only to enhance visualization of HCR-shape differences and do not indicate stock-status concerns.</w:t>
             </w:r>
           </w:p>
-          <w:bookmarkEnd w:id="29"/>
+          <w:bookmarkEnd w:id="35"/>
         </w:tc>
       </w:tr>
     </w:tbl>
@@ -7517,7 +10090,7 @@
         <w:pStyle w:val="Compact"/>
         <w:numPr>
           <w:ilvl w:val="0"/>
-          <w:numId w:val="1012"/>
+          <w:numId w:val="1014"/>
         </w:numPr>
       </w:pPr>
       <w:r>
@@ -7541,7 +10114,7 @@
       <w:r>
         <w:t xml:space="preserve"> </w:t>
       </w:r>
-      <w:hyperlink r:id="rId30">
+      <w:hyperlink r:id="rId36">
         <w:r>
           <w:rPr>
             <w:rStyle w:val="Hyperlink"/>
@@ -7553,8 +10126,8 @@
         <w:t xml:space="preserve">.</w:t>
       </w:r>
     </w:p>
-    <w:bookmarkEnd w:id="31"/>
-    <w:bookmarkStart w:id="40" w:name="Xf14104c8b0128a6d0b4aafde13bfb9db0923d6b"/>
+    <w:bookmarkEnd w:id="37"/>
+    <w:bookmarkStart w:id="49" w:name="Xf14104c8b0128a6d0b4aafde13bfb9db0923d6b"/>
     <w:p>
       <w:pPr>
         <w:pStyle w:val="Heading1"/>
@@ -7563,7 +10136,7 @@
         <w:t xml:space="preserve">Trade-offs, Robustness, and Performance Metrics</w:t>
       </w:r>
     </w:p>
-    <w:bookmarkStart w:id="33" w:name="reference-points-and-kobe-plot-summaries"/>
+    <w:bookmarkStart w:id="39" w:name="reference-points-and-kobe-plot-summaries"/>
     <w:p>
       <w:pPr>
         <w:pStyle w:val="Heading2"/>
@@ -7576,7 +10149,7 @@
       <w:pPr>
         <w:numPr>
           <w:ilvl w:val="0"/>
-          <w:numId w:val="1013"/>
+          <w:numId w:val="1015"/>
         </w:numPr>
       </w:pPr>
       <w:r>
@@ -7620,7 +10193,7 @@
       <w:pPr>
         <w:numPr>
           <w:ilvl w:val="0"/>
-          <w:numId w:val="1013"/>
+          <w:numId w:val="1015"/>
         </w:numPr>
       </w:pPr>
       <w:r>
@@ -7653,7 +10226,7 @@
       <w:r>
         <w:t xml:space="preserve"> </w:t>
       </w:r>
-      <w:hyperlink r:id="rId32">
+      <w:hyperlink r:id="rId38">
         <w:r>
           <w:rPr>
             <w:rStyle w:val="Hyperlink"/>
@@ -7672,7 +10245,7 @@
       <w:pPr>
         <w:numPr>
           <w:ilvl w:val="0"/>
-          <w:numId w:val="1013"/>
+          <w:numId w:val="1015"/>
         </w:numPr>
       </w:pPr>
       <w:r>
@@ -7737,7 +10310,7 @@
       <w:pPr>
         <w:numPr>
           <w:ilvl w:val="0"/>
-          <w:numId w:val="1013"/>
+          <w:numId w:val="1015"/>
         </w:numPr>
       </w:pPr>
       <w:r>
@@ -7757,7 +10330,7 @@
       <w:pPr>
         <w:numPr>
           <w:ilvl w:val="0"/>
-          <w:numId w:val="1013"/>
+          <w:numId w:val="1015"/>
         </w:numPr>
       </w:pPr>
       <w:r>
@@ -7768,7 +10341,7 @@
       <w:pPr>
         <w:numPr>
           <w:ilvl w:val="0"/>
-          <w:numId w:val="1013"/>
+          <w:numId w:val="1015"/>
         </w:numPr>
       </w:pPr>
       <w:r>
@@ -7830,7 +10403,7 @@
       <w:pPr>
         <w:numPr>
           <w:ilvl w:val="0"/>
-          <w:numId w:val="1013"/>
+          <w:numId w:val="1015"/>
         </w:numPr>
       </w:pPr>
       <w:r>
@@ -7898,8 +10471,8 @@
         <w:t xml:space="preserve">as the Kobe-plot and reference-point trace. This approach better reflects autocorrelated environmental recruitment variability while focusing CMP evaluation on the management effect on fishing and stock status.</w:t>
       </w:r>
     </w:p>
-    <w:bookmarkEnd w:id="33"/>
-    <w:bookmarkStart w:id="34" w:name="tuning-and-robustness"/>
+    <w:bookmarkEnd w:id="39"/>
+    <w:bookmarkStart w:id="40" w:name="tuning-and-robustness"/>
     <w:p>
       <w:pPr>
         <w:pStyle w:val="Heading2"/>
@@ -7912,7 +10485,7 @@
       <w:pPr>
         <w:numPr>
           <w:ilvl w:val="0"/>
-          <w:numId w:val="1014"/>
+          <w:numId w:val="1016"/>
         </w:numPr>
       </w:pPr>
       <w:r>
@@ -7923,7 +10496,7 @@
       <w:pPr>
         <w:numPr>
           <w:ilvl w:val="0"/>
-          <w:numId w:val="1014"/>
+          <w:numId w:val="1016"/>
         </w:numPr>
       </w:pPr>
       <w:r>
@@ -7934,39 +10507,109 @@
       <w:pPr>
         <w:numPr>
           <w:ilvl w:val="0"/>
-          <w:numId w:val="1014"/>
+          <w:numId w:val="1016"/>
         </w:numPr>
       </w:pPr>
       <w:r>
         <w:t xml:space="preserve">The group agreed to use 0.65 steepness as the base case and move 0.8 steepness to robustness testing. Iago Mosqueira also presented recruitment-deviation scenarios to be run with the one-stock reference OM; detailed specifications should be checked against the working documents.</w:t>
-      </w:r>
-    </w:p>
-    <w:bookmarkEnd w:id="34"/>
-    <w:bookmarkStart w:id="39" w:name="X5f137827b8bd88e9c3847b4fe2a0dde844646b2"/>
-    <w:p>
-      <w:pPr>
-        <w:pStyle w:val="Heading2"/>
-      </w:pPr>
-      <w:r>
-        <w:t xml:space="preserve">Consideration of Exceptional Circumstances</w:t>
       </w:r>
     </w:p>
     <w:p>
       <w:pPr>
         <w:numPr>
           <w:ilvl w:val="0"/>
-          <w:numId w:val="1015"/>
+          <w:numId w:val="1016"/>
         </w:numPr>
       </w:pPr>
       <w:r>
-        <w:t xml:space="preserve">Dr. Tom Carruthers gave a presentation on exceptional-circumstances protocols and the ECP software application, which provides a Shiny interface for examining whether new observations remain consistent with the conditions under which an adopted management procedure was tested [Blue Matter Science 2026]. The group discussed this issue in the jack mackerel MSE context, recognizing that initial exceptional circumstances may need to be considered given current fishing conditions and other stock-condition indicators being substantially below previous assessments.</w:t>
+        <w:t xml:space="preserve">The group noted that tuned CMPs should be interpreted through a suite of performance metrics rather than a single target. Since P(Green) was used as a tuning objective in several trial runs, it was most informative when paired with catch, spawning biomass, F/F</w:t>
+      </w:r>
+      <w:r>
+        <w:rPr>
+          <w:vertAlign w:val="subscript"/>
+        </w:rPr>
+        <w:t xml:space="preserve">MSY</w:t>
+      </w:r>
+      <w:r>
+        <w:t xml:space="preserve">, inter-annual catch variability, probabilities of low catch or shutdown-like outcomes, and diagnostics that separate biomass status from overfishing status.</w:t>
+      </w:r>
+    </w:p>
+    <w:bookmarkEnd w:id="40"/>
+    <w:bookmarkStart w:id="43" w:name="omcmp-display-software"/>
+    <w:p>
+      <w:pPr>
+        <w:pStyle w:val="Heading2"/>
+      </w:pPr>
+      <w:r>
+        <w:t xml:space="preserve">OM/CMP Display Software</w:t>
       </w:r>
     </w:p>
     <w:p>
       <w:pPr>
+        <w:pStyle w:val="Compact"/>
         <w:numPr>
           <w:ilvl w:val="0"/>
-          <w:numId w:val="1015"/>
+          <w:numId w:val="1017"/>
+        </w:numPr>
+      </w:pPr>
+      <w:r>
+        <w:t xml:space="preserve">A preliminary set of jack mackerel MSE outputs was prepared for display in Slick format and is available in the report source as</w:t>
+      </w:r>
+      <w:r>
+        <w:t xml:space="preserve"> </w:t>
+      </w:r>
+      <w:hyperlink r:id="rId41">
+        <w:r>
+          <w:rPr>
+            <w:rStyle w:val="VerbatimChar"/>
+          </w:rPr>
+          <w:t xml:space="preserve">doc/data/jmMSE_retuns.slick</w:t>
+        </w:r>
+      </w:hyperlink>
+      <w:r>
+        <w:t xml:space="preserve">. Slick is an R package and interactive application for visualizing and exploring MSE results contained in a standardized Slick data object [Blue Matter Science 2026b]. It allows users to compare performance metrics, filter results interactively, examine uncertainty across states of nature, and explore robustness and trade-offs among CMPs. The group discussed Slick as a useful review and communication tool because it can show time-series outputs, summary trade-off plots, and individual simulations while allowing primary metrics to be highlighted and secondary diagnostics to remain available for detailed review. The online Slick application can be loaded at</w:t>
+      </w:r>
+      <w:r>
+        <w:t xml:space="preserve"> </w:t>
+      </w:r>
+      <w:hyperlink r:id="rId42">
+        <w:r>
+          <w:rPr>
+            <w:rStyle w:val="Hyperlink"/>
+          </w:rPr>
+          <w:t xml:space="preserve">https://shiny.bluematterscience.com/app/slick</w:t>
+        </w:r>
+      </w:hyperlink>
+      <w:r>
+        <w:t xml:space="preserve">; the preliminary jack mackerel Slick object can be uploaded there for interactive review.</w:t>
+      </w:r>
+    </w:p>
+    <w:bookmarkEnd w:id="43"/>
+    <w:bookmarkStart w:id="48" w:name="X5f137827b8bd88e9c3847b4fe2a0dde844646b2"/>
+    <w:p>
+      <w:pPr>
+        <w:pStyle w:val="Heading2"/>
+      </w:pPr>
+      <w:r>
+        <w:t xml:space="preserve">Consideration of Exceptional Circumstances</w:t>
+      </w:r>
+    </w:p>
+    <w:p>
+      <w:pPr>
+        <w:numPr>
+          <w:ilvl w:val="0"/>
+          <w:numId w:val="1018"/>
+        </w:numPr>
+      </w:pPr>
+      <w:r>
+        <w:t xml:space="preserve">Dr. Tom Carruthers gave a presentation on exceptional-circumstances protocols and the ECP software application, which provides a Shiny interface for examining whether new observations remain consistent with the conditions under which an adopted management procedure was tested [Blue Matter Science 2026a]. The group discussed this issue in the jack mackerel MSE context, recognizing that initial exceptional circumstances may need to be considered given current fishing conditions and other stock-condition indicators being substantially below previous assessments. The workshop application was treated as a proof of concept rather than a completed exceptional-circumstances protocol, because the full ECP workflow would normally be specified once the CMP selection process is more advanced.</w:t>
+      </w:r>
+    </w:p>
+    <w:p>
+      <w:pPr>
+        <w:numPr>
+          <w:ilvl w:val="0"/>
+          <w:numId w:val="1018"/>
         </w:numPr>
       </w:pPr>
       <w:r>
@@ -7980,7 +10623,7 @@
         <w:t xml:space="preserve"> </w:t>
       </w:r>
       <w:r>
-        <w:t xml:space="preserve">The Working Group recommended investigating the potential use of the ECP software for this MSE application. As a proof of concept, the chair demonstrated that current MSE output could be slotted readily into the type of input structure used by the ECP software.</w:t>
+        <w:t xml:space="preserve">The Working Group recommended investigating the potential use of the ECP software for this MSE application. As a proof of concept, the chair demonstrated that current MSE output could be slotted readily into the type of input structure used by the ECP software. Further work should identify the adopted or shortlisted CMP context, the relevant observations, and the type I and type II error trade-offs before the protocol is finalized.</w:t>
       </w:r>
     </w:p>
     <w:p>
@@ -7992,7 +10635,7 @@
           <w:rPr>
             <w:rStyle w:val="Hyperlink"/>
           </w:rPr>
-          <w:t xml:space="preserve">Figure 2</w:t>
+          <w:t xml:space="preserve">Figure 3</w:t>
         </w:r>
       </w:hyperlink>
       <w:r>
@@ -8015,7 +10658,7 @@
       <w:tr>
         <w:tc>
           <w:tcPr/>
-          <w:bookmarkStart w:id="38" w:name="fig-ecp-preliminary"/>
+          <w:bookmarkStart w:id="47" w:name="fig-ecp-preliminary"/>
           <w:p>
             <w:pPr>
               <w:pStyle w:val="Compact"/>
@@ -8026,18 +10669,18 @@
                 <wp:inline>
                   <wp:extent cx="5334000" cy="3012578"/>
                   <wp:effectExtent b="0" l="0" r="0" t="0"/>
-                  <wp:docPr descr="" title="" id="36" name="Picture"/>
+                  <wp:docPr descr="" title="" id="45" name="Picture"/>
                   <a:graphic>
                     <a:graphicData uri="http://schemas.openxmlformats.org/drawingml/2006/picture">
                       <pic:pic>
                         <pic:nvPicPr>
-                          <pic:cNvPr descr="figures/ecp-preliminary-screenshot.png" id="37" name="Picture"/>
+                          <pic:cNvPr descr="figures/ecp-preliminary-screenshot.png" id="46" name="Picture"/>
                           <pic:cNvPicPr>
                             <a:picLocks noChangeArrowheads="1" noChangeAspect="1"/>
                           </pic:cNvPicPr>
                         </pic:nvPicPr>
                         <pic:blipFill>
-                          <a:blip r:embed="rId35"/>
+                          <a:blip r:embed="rId44"/>
                           <a:stretch>
                             <a:fillRect/>
                           </a:stretch>
@@ -8074,16 +10717,16 @@
               <w:pStyle w:val="ImageCaption"/>
             </w:pPr>
             <w:r>
-              <w:t xml:space="preserve">Figure 2: Partial screenshot of a preliminary application of the ECP application to SPRFMO jack mackerel MSE work.</w:t>
+              <w:t xml:space="preserve">Figure 3: Partial screenshot of a preliminary application of the ECP application to SPRFMO jack mackerel MSE work.</w:t>
             </w:r>
           </w:p>
-          <w:bookmarkEnd w:id="38"/>
+          <w:bookmarkEnd w:id="47"/>
         </w:tc>
       </w:tr>
     </w:tbl>
-    <w:bookmarkEnd w:id="39"/>
-    <w:bookmarkEnd w:id="40"/>
-    <w:bookmarkStart w:id="43" w:name="planning-for-sc14-and-next-steps"/>
+    <w:bookmarkEnd w:id="48"/>
+    <w:bookmarkEnd w:id="49"/>
+    <w:bookmarkStart w:id="52" w:name="planning-for-sc14-and-next-steps"/>
     <w:p>
       <w:pPr>
         <w:pStyle w:val="Heading1"/>
@@ -8133,12 +10776,12 @@
                 <wp:inline>
                   <wp:extent cx="152400" cy="152400"/>
                   <wp:effectExtent b="0" l="0" r="0" t="0"/>
-                  <wp:docPr descr="" title="" id="41" name="Picture"/>
+                  <wp:docPr descr="" title="" id="50" name="Picture"/>
                   <a:graphic>
                     <a:graphicData uri="http://schemas.openxmlformats.org/drawingml/2006/picture">
                       <pic:pic>
                         <pic:nvPicPr>
-                          <pic:cNvPr descr="/Applications/quarto/share/formats/docx/note.png" id="42" name="Picture"/>
+                          <pic:cNvPr descr="/Applications/quarto/share/formats/docx/note.png" id="51" name="Picture"/>
                           <pic:cNvPicPr>
                             <a:picLocks noChangeArrowheads="1" noChangeAspect="1"/>
                           </pic:cNvPicPr>
@@ -8208,7 +10851,7 @@
             <w:pPr>
               <w:numPr>
                 <w:ilvl w:val="0"/>
-                <w:numId w:val="1016"/>
+                <w:numId w:val="1019"/>
               </w:numPr>
             </w:pPr>
             <w:r>
@@ -8258,7 +10901,29 @@
             <w:pPr>
               <w:numPr>
                 <w:ilvl w:val="0"/>
-                <w:numId w:val="1016"/>
+                <w:numId w:val="1019"/>
+              </w:numPr>
+            </w:pPr>
+            <w:r>
+              <w:t xml:space="preserve">The group suggested 24 July 2026 as a potential date for a technical meeting before SC14. The purpose would be to review updated CMP performance summaries, robustness-test results, and any remaining implementation issues before materials are finalized for Scientific Committee consideration. The meeting should be a technical review of the narrowed CMP set, diagnostics, and suitability of the results rather than a reopening of the CMP design process.</w:t>
+            </w:r>
+          </w:p>
+          <w:p>
+            <w:pPr>
+              <w:numPr>
+                <w:ilvl w:val="0"/>
+                <w:numId w:val="1019"/>
+              </w:numPr>
+            </w:pPr>
+            <w:r>
+              <w:t xml:space="preserve">The group noted that the tasks identified as needing to be completed during this workshop were completed. A second set of items was identified as material the group wished to see included in the MSE report to SC14, including the final CMP run list, updated CMP performance summaries, robustness-test results, documentation of recruitment and index simulation assumptions, documentation of remaining implementation choices, and clear presentation of the rationale for the CMP shortlist.</w:t>
+            </w:r>
+          </w:p>
+          <w:p>
+            <w:pPr>
+              <w:numPr>
+                <w:ilvl w:val="0"/>
+                <w:numId w:val="1019"/>
               </w:numPr>
             </w:pPr>
             <w:r>
@@ -8270,7 +10935,7 @@
               <w:pStyle w:val="Compact"/>
               <w:numPr>
                 <w:ilvl w:val="0"/>
-                <w:numId w:val="1017"/>
+                <w:numId w:val="1020"/>
               </w:numPr>
             </w:pPr>
             <w:r>
@@ -8282,7 +10947,7 @@
               <w:pStyle w:val="Compact"/>
               <w:numPr>
                 <w:ilvl w:val="0"/>
-                <w:numId w:val="1017"/>
+                <w:numId w:val="1020"/>
               </w:numPr>
             </w:pPr>
             <w:r>
@@ -8294,7 +10959,7 @@
               <w:pStyle w:val="Compact"/>
               <w:numPr>
                 <w:ilvl w:val="0"/>
-                <w:numId w:val="1017"/>
+                <w:numId w:val="1020"/>
               </w:numPr>
             </w:pPr>
             <w:r>
@@ -8306,7 +10971,7 @@
               <w:pStyle w:val="Compact"/>
               <w:numPr>
                 <w:ilvl w:val="0"/>
-                <w:numId w:val="1017"/>
+                <w:numId w:val="1020"/>
               </w:numPr>
             </w:pPr>
             <w:r>
@@ -8318,7 +10983,7 @@
               <w:pStyle w:val="Compact"/>
               <w:numPr>
                 <w:ilvl w:val="0"/>
-                <w:numId w:val="1017"/>
+                <w:numId w:val="1020"/>
               </w:numPr>
             </w:pPr>
             <w:r>
@@ -8330,7 +10995,7 @@
               <w:pStyle w:val="Compact"/>
               <w:numPr>
                 <w:ilvl w:val="0"/>
-                <w:numId w:val="1018"/>
+                <w:numId w:val="1021"/>
               </w:numPr>
             </w:pPr>
             <w:r>
@@ -8342,7 +11007,7 @@
               <w:pStyle w:val="Compact"/>
               <w:numPr>
                 <w:ilvl w:val="0"/>
-                <w:numId w:val="1019"/>
+                <w:numId w:val="1022"/>
               </w:numPr>
             </w:pPr>
             <w:r>
@@ -8354,7 +11019,7 @@
               <w:pStyle w:val="Compact"/>
               <w:numPr>
                 <w:ilvl w:val="0"/>
-                <w:numId w:val="1019"/>
+                <w:numId w:val="1022"/>
               </w:numPr>
             </w:pPr>
             <w:r>
@@ -8366,7 +11031,7 @@
               <w:pStyle w:val="Compact"/>
               <w:numPr>
                 <w:ilvl w:val="0"/>
-                <w:numId w:val="1019"/>
+                <w:numId w:val="1022"/>
               </w:numPr>
             </w:pPr>
             <w:r>
@@ -8390,7 +11055,7 @@
               <w:pStyle w:val="Compact"/>
               <w:numPr>
                 <w:ilvl w:val="0"/>
-                <w:numId w:val="1019"/>
+                <w:numId w:val="1022"/>
               </w:numPr>
             </w:pPr>
             <w:r>
@@ -8402,7 +11067,7 @@
               <w:pStyle w:val="Compact"/>
               <w:numPr>
                 <w:ilvl w:val="0"/>
-                <w:numId w:val="1019"/>
+                <w:numId w:val="1022"/>
               </w:numPr>
             </w:pPr>
             <w:r>
@@ -8414,7 +11079,7 @@
               <w:pStyle w:val="Compact"/>
               <w:numPr>
                 <w:ilvl w:val="0"/>
-                <w:numId w:val="1020"/>
+                <w:numId w:val="1023"/>
               </w:numPr>
             </w:pPr>
             <w:r>
@@ -8437,8 +11102,8 @@
         </w:tc>
       </w:tr>
     </w:tbl>
-    <w:bookmarkEnd w:id="43"/>
-    <w:bookmarkStart w:id="50" w:name="references"/>
+    <w:bookmarkEnd w:id="52"/>
+    <w:bookmarkStart w:id="60" w:name="references"/>
     <w:p>
       <w:pPr>
         <w:pStyle w:val="Heading1"/>
@@ -8452,7 +11117,7 @@
         <w:pStyle w:val="Compact"/>
         <w:numPr>
           <w:ilvl w:val="0"/>
-          <w:numId w:val="1021"/>
+          <w:numId w:val="1024"/>
         </w:numPr>
       </w:pPr>
       <w:r>
@@ -8461,7 +11126,7 @@
       <w:r>
         <w:t xml:space="preserve"> </w:t>
       </w:r>
-      <w:hyperlink r:id="rId44">
+      <w:hyperlink r:id="rId53">
         <w:r>
           <w:rPr>
             <w:rStyle w:val="Hyperlink"/>
@@ -8475,7 +11140,7 @@
         <w:pStyle w:val="Compact"/>
         <w:numPr>
           <w:ilvl w:val="0"/>
-          <w:numId w:val="1021"/>
+          <w:numId w:val="1024"/>
         </w:numPr>
       </w:pPr>
       <w:r>
@@ -8484,7 +11149,7 @@
       <w:r>
         <w:t xml:space="preserve"> </w:t>
       </w:r>
-      <w:hyperlink r:id="rId45">
+      <w:hyperlink r:id="rId54">
         <w:r>
           <w:rPr>
             <w:rStyle w:val="Hyperlink"/>
@@ -8498,7 +11163,7 @@
         <w:pStyle w:val="Compact"/>
         <w:numPr>
           <w:ilvl w:val="0"/>
-          <w:numId w:val="1021"/>
+          <w:numId w:val="1024"/>
         </w:numPr>
       </w:pPr>
       <w:r>
@@ -8507,7 +11172,7 @@
       <w:r>
         <w:t xml:space="preserve"> </w:t>
       </w:r>
-      <w:hyperlink r:id="rId46">
+      <w:hyperlink r:id="rId55">
         <w:r>
           <w:rPr>
             <w:rStyle w:val="Hyperlink"/>
@@ -8521,7 +11186,7 @@
         <w:pStyle w:val="Compact"/>
         <w:numPr>
           <w:ilvl w:val="0"/>
-          <w:numId w:val="1021"/>
+          <w:numId w:val="1024"/>
         </w:numPr>
       </w:pPr>
       <w:r>
@@ -8530,7 +11195,7 @@
       <w:r>
         <w:t xml:space="preserve"> </w:t>
       </w:r>
-      <w:hyperlink r:id="rId47">
+      <w:hyperlink r:id="rId56">
         <w:r>
           <w:rPr>
             <w:rStyle w:val="Hyperlink"/>
@@ -8544,7 +11209,7 @@
         <w:pStyle w:val="Compact"/>
         <w:numPr>
           <w:ilvl w:val="0"/>
-          <w:numId w:val="1021"/>
+          <w:numId w:val="1024"/>
         </w:numPr>
       </w:pPr>
       <w:r>
@@ -8553,7 +11218,7 @@
       <w:r>
         <w:t xml:space="preserve"> </w:t>
       </w:r>
-      <w:hyperlink r:id="rId48">
+      <w:hyperlink r:id="rId57">
         <w:r>
           <w:rPr>
             <w:rStyle w:val="Hyperlink"/>
@@ -8567,7 +11232,7 @@
         <w:pStyle w:val="Compact"/>
         <w:numPr>
           <w:ilvl w:val="0"/>
-          <w:numId w:val="1021"/>
+          <w:numId w:val="1024"/>
         </w:numPr>
       </w:pPr>
       <w:r>
@@ -8579,16 +11244,16 @@
         <w:pStyle w:val="Compact"/>
         <w:numPr>
           <w:ilvl w:val="0"/>
-          <w:numId w:val="1021"/>
+          <w:numId w:val="1024"/>
         </w:numPr>
       </w:pPr>
       <w:r>
-        <w:t xml:space="preserve">Blue Matter Science. 2026. ECP: Exceptional Circumstances Protocols for Adopted Management Procedures. R Shiny application.</w:t>
+        <w:t xml:space="preserve">Blue Matter Science. 2026a. ECP: Exceptional Circumstances Protocols for Adopted Management Procedures. R Shiny application.</w:t>
       </w:r>
       <w:r>
         <w:t xml:space="preserve"> </w:t>
       </w:r>
-      <w:hyperlink r:id="rId49">
+      <w:hyperlink r:id="rId58">
         <w:r>
           <w:rPr>
             <w:rStyle w:val="Hyperlink"/>
@@ -8602,15 +11267,38 @@
         <w:pStyle w:val="Compact"/>
         <w:numPr>
           <w:ilvl w:val="0"/>
-          <w:numId w:val="1021"/>
+          <w:numId w:val="1024"/>
         </w:numPr>
       </w:pPr>
       <w:r>
+        <w:t xml:space="preserve">Blue Matter Science. 2026b. Slick: Interactive Visualization of MSE Results. R package and Shiny application.</w:t>
+      </w:r>
+      <w:r>
+        <w:t xml:space="preserve"> </w:t>
+      </w:r>
+      <w:hyperlink r:id="rId59">
+        <w:r>
+          <w:rPr>
+            <w:rStyle w:val="Hyperlink"/>
+          </w:rPr>
+          <w:t xml:space="preserve">https://slick.bluematterscience.com/</w:t>
+        </w:r>
+      </w:hyperlink>
+    </w:p>
+    <w:p>
+      <w:pPr>
+        <w:pStyle w:val="Compact"/>
+        <w:numPr>
+          <w:ilvl w:val="0"/>
+          <w:numId w:val="1024"/>
+        </w:numPr>
+      </w:pPr>
+      <w:r>
         <w:t xml:space="preserve">Annex K. Original jack mackerel management procedure.</w:t>
       </w:r>
     </w:p>
-    <w:bookmarkEnd w:id="50"/>
-    <w:bookmarkStart w:id="54" w:name="appendix-a.-participants"/>
+    <w:bookmarkEnd w:id="60"/>
+    <w:bookmarkStart w:id="64" w:name="appendix-a.-participants"/>
     <w:p>
       <w:pPr>
         <w:pStyle w:val="Heading1"/>
@@ -8660,18 +11348,18 @@
                 <wp:inline>
                   <wp:extent cx="152400" cy="152400"/>
                   <wp:effectExtent b="0" l="0" r="0" t="0"/>
-                  <wp:docPr descr="" title="" id="52" name="Picture"/>
+                  <wp:docPr descr="" title="" id="62" name="Picture"/>
                   <a:graphic>
                     <a:graphicData uri="http://schemas.openxmlformats.org/drawingml/2006/picture">
                       <pic:pic>
                         <pic:nvPicPr>
-                          <pic:cNvPr descr="/Applications/quarto/share/formats/docx/warning.png" id="53" name="Picture"/>
+                          <pic:cNvPr descr="/Applications/quarto/share/formats/docx/warning.png" id="63" name="Picture"/>
                           <pic:cNvPicPr>
                             <a:picLocks noChangeArrowheads="1" noChangeAspect="1"/>
                           </pic:cNvPicPr>
                         </pic:nvPicPr>
                         <pic:blipFill>
-                          <a:blip r:embed="rId51"/>
+                          <a:blip r:embed="rId61"/>
                           <a:stretch>
                             <a:fillRect/>
                           </a:stretch>
@@ -9311,8 +11999,8 @@
         </w:tc>
       </w:tr>
     </w:tbl>
-    <w:bookmarkEnd w:id="54"/>
-    <w:bookmarkStart w:id="55" w:name="appendix-b.-workshop-schedule-and-agenda"/>
+    <w:bookmarkEnd w:id="64"/>
+    <w:bookmarkStart w:id="65" w:name="appendix-b.-workshop-schedule-and-agenda"/>
     <w:p>
       <w:pPr>
         <w:pStyle w:val="Heading1"/>
@@ -9334,7 +12022,7 @@
         <w:pStyle w:val="Compact"/>
         <w:numPr>
           <w:ilvl w:val="0"/>
-          <w:numId w:val="1022"/>
+          <w:numId w:val="1025"/>
         </w:numPr>
       </w:pPr>
       <w:r>
@@ -9346,7 +12034,7 @@
         <w:pStyle w:val="Compact"/>
         <w:numPr>
           <w:ilvl w:val="0"/>
-          <w:numId w:val="1022"/>
+          <w:numId w:val="1025"/>
         </w:numPr>
       </w:pPr>
       <w:r>
@@ -9358,7 +12046,7 @@
         <w:pStyle w:val="Compact"/>
         <w:numPr>
           <w:ilvl w:val="0"/>
-          <w:numId w:val="1022"/>
+          <w:numId w:val="1025"/>
         </w:numPr>
       </w:pPr>
       <w:r>
@@ -9370,7 +12058,7 @@
         <w:pStyle w:val="Compact"/>
         <w:numPr>
           <w:ilvl w:val="0"/>
-          <w:numId w:val="1022"/>
+          <w:numId w:val="1025"/>
         </w:numPr>
       </w:pPr>
       <w:r>
@@ -9382,7 +12070,7 @@
         <w:pStyle w:val="Compact"/>
         <w:numPr>
           <w:ilvl w:val="0"/>
-          <w:numId w:val="1022"/>
+          <w:numId w:val="1025"/>
         </w:numPr>
       </w:pPr>
       <w:r>
@@ -9615,8 +12303,8 @@
         </w:tc>
       </w:tr>
     </w:tbl>
-    <w:bookmarkEnd w:id="55"/>
-    <w:bookmarkStart w:id="65" w:name="appendix-c.-scw17-working-documents"/>
+    <w:bookmarkEnd w:id="65"/>
+    <w:bookmarkStart w:id="75" w:name="appendix-c.-scw17-working-documents"/>
     <w:p>
       <w:pPr>
         <w:pStyle w:val="Heading1"/>
@@ -9670,7 +12358,7 @@
             <w:pPr>
               <w:pStyle w:val="Compact"/>
             </w:pPr>
-            <w:hyperlink r:id="rId56">
+            <w:hyperlink r:id="rId66">
               <w:r>
                 <w:rPr>
                   <w:rStyle w:val="Hyperlink"/>
@@ -9699,7 +12387,7 @@
             <w:pPr>
               <w:pStyle w:val="Compact"/>
             </w:pPr>
-            <w:hyperlink r:id="rId57">
+            <w:hyperlink r:id="rId67">
               <w:r>
                 <w:rPr>
                   <w:rStyle w:val="Hyperlink"/>
@@ -9728,7 +12416,7 @@
             <w:pPr>
               <w:pStyle w:val="Compact"/>
             </w:pPr>
-            <w:hyperlink r:id="rId58">
+            <w:hyperlink r:id="rId68">
               <w:r>
                 <w:rPr>
                   <w:rStyle w:val="Hyperlink"/>
@@ -9757,7 +12445,7 @@
             <w:pPr>
               <w:pStyle w:val="Compact"/>
             </w:pPr>
-            <w:hyperlink r:id="rId59">
+            <w:hyperlink r:id="rId69">
               <w:r>
                 <w:rPr>
                   <w:rStyle w:val="Hyperlink"/>
@@ -9786,7 +12474,7 @@
             <w:pPr>
               <w:pStyle w:val="Compact"/>
             </w:pPr>
-            <w:hyperlink r:id="rId60">
+            <w:hyperlink r:id="rId70">
               <w:r>
                 <w:rPr>
                   <w:rStyle w:val="Hyperlink"/>
@@ -9815,7 +12503,7 @@
             <w:pPr>
               <w:pStyle w:val="Compact"/>
             </w:pPr>
-            <w:hyperlink r:id="rId61">
+            <w:hyperlink r:id="rId71">
               <w:r>
                 <w:rPr>
                   <w:rStyle w:val="Hyperlink"/>
@@ -9844,7 +12532,7 @@
             <w:pPr>
               <w:pStyle w:val="Compact"/>
             </w:pPr>
-            <w:hyperlink r:id="rId62">
+            <w:hyperlink r:id="rId72">
               <w:r>
                 <w:rPr>
                   <w:rStyle w:val="Hyperlink"/>
@@ -9873,7 +12561,7 @@
             <w:pPr>
               <w:pStyle w:val="Compact"/>
             </w:pPr>
-            <w:hyperlink r:id="rId63">
+            <w:hyperlink r:id="rId73">
               <w:r>
                 <w:rPr>
                   <w:rStyle w:val="Hyperlink"/>
@@ -9902,7 +12590,7 @@
             <w:pPr>
               <w:pStyle w:val="Compact"/>
             </w:pPr>
-            <w:hyperlink r:id="rId64">
+            <w:hyperlink r:id="rId74">
               <w:r>
                 <w:rPr>
                   <w:rStyle w:val="Hyperlink"/>
@@ -9925,6 +12613,57 @@
         </w:tc>
       </w:tr>
     </w:tbl>
+    <w:bookmarkEnd w:id="75"/>
+    <w:bookmarkStart w:id="77" w:name="Xb9aa851defa400ff4d28650dfe7d983101a6615"/>
+    <w:p>
+      <w:pPr>
+        <w:pStyle w:val="Heading1"/>
+      </w:pPr>
+      <w:r>
+        <w:t xml:space="preserve">Appendix D. Comments from External Experts</w:t>
+      </w:r>
+    </w:p>
+    <w:bookmarkStart w:id="76" w:name="tom-carruthers"/>
+    <w:p>
+      <w:pPr>
+        <w:pStyle w:val="Heading2"/>
+      </w:pPr>
+      <w:r>
+        <w:t xml:space="preserve">Tom Carruthers</w:t>
+      </w:r>
+    </w:p>
+    <w:p>
+      <w:pPr>
+        <w:pStyle w:val="FirstParagraph"/>
+      </w:pPr>
+      <w:r>
+        <w:t xml:space="preserve">The MSE framework is now suitable for the testing of candidate management procedures (CMPs): the group established a defensible reference operating model for the tuning of candidate management procedures based closely on the most recent benchmark stock assessment; the robustness set of operating models comprehensively captures alternative plausible dynamics, some of which provide a challenging test of CMPs.</w:t>
+      </w:r>
+    </w:p>
+    <w:p>
+      <w:pPr>
+        <w:pStyle w:val="BodyText"/>
+      </w:pPr>
+      <w:r>
+        <w:t xml:space="preserve">A wide range of performance metrics were identified that encompass safety, yield, and stability over various time periods. The majority of these metrics are consistent with MSE reporting in other settings.</w:t>
+      </w:r>
+    </w:p>
+    <w:p>
+      <w:pPr>
+        <w:pStyle w:val="BodyText"/>
+      </w:pPr>
+      <w:r>
+        <w:t xml:space="preserve">Empirical index-ratio CMPs were developed that are comparable to those adopted in various fisheries, for example Atlantic bluefin tuna, swordfish, and skipjack tuna. These CMPs spanned a range of management performance while meeting minimum performance requirements, specifically tuning to a probability of green Kobe of 60%.</w:t>
+      </w:r>
+    </w:p>
+    <w:p>
+      <w:pPr>
+        <w:pStyle w:val="BodyText"/>
+      </w:pPr>
+      <w:r>
+        <w:t xml:space="preserve">In the context of MSE as an ongoing, iterative, scientific approach to adopting and refining robust management advice, the current stage of MSE development sufficiently supports the shortlisting of defensible CMPs for presentation to the Scientific Committee. As in all scientific processes, improvements can be identified. At this stage of jack mackerel MSE development, these are not sufficiently impactful to delay the process of adopting a robust management procedure. After an MP is adopted and in use, improvements can be considered for a later revision to the MSE framework.</w:t>
+      </w:r>
+    </w:p>
     <w:p>
       <w:pPr>
         <w:pStyle w:val="BodyText"/>
@@ -9937,7 +12676,8 @@
         <w:t xml:space="preserve">Draft working report - Day 1 of the SCW17 MSE workshop, 15 June 2026. Prepared for review and correction by participants before submission to the SPRFMO Scientific Committee.</w:t>
       </w:r>
     </w:p>
-    <w:bookmarkEnd w:id="65"/>
+    <w:bookmarkEnd w:id="76"/>
+    <w:bookmarkEnd w:id="77"/>
     <w:sectPr>
       <w:footnotePr>
         <w:numRestart w:val="eachSect"/>
@@ -10270,34 +13010,7 @@
     </w:lvlOverride>
   </w:num>
   <w:num w:numId="1002">
-    <w:abstractNumId w:val="99411"/>
-    <w:lvlOverride w:ilvl="0">
-      <w:startOverride w:val="1"/>
-    </w:lvlOverride>
-    <w:lvlOverride w:ilvl="1">
-      <w:startOverride w:val="1"/>
-    </w:lvlOverride>
-    <w:lvlOverride w:ilvl="2">
-      <w:startOverride w:val="1"/>
-    </w:lvlOverride>
-    <w:lvlOverride w:ilvl="3">
-      <w:startOverride w:val="1"/>
-    </w:lvlOverride>
-    <w:lvlOverride w:ilvl="4">
-      <w:startOverride w:val="1"/>
-    </w:lvlOverride>
-    <w:lvlOverride w:ilvl="5">
-      <w:startOverride w:val="1"/>
-    </w:lvlOverride>
-    <w:lvlOverride w:ilvl="6">
-      <w:startOverride w:val="1"/>
-    </w:lvlOverride>
-    <w:lvlOverride w:ilvl="7">
-      <w:startOverride w:val="1"/>
-    </w:lvlOverride>
-    <w:lvlOverride w:ilvl="8">
-      <w:startOverride w:val="1"/>
-    </w:lvlOverride>
+    <w:abstractNumId w:val="991"/>
   </w:num>
   <w:num w:numId="1003">
     <w:abstractNumId w:val="99411"/>
@@ -10330,37 +13043,37 @@
     </w:lvlOverride>
   </w:num>
   <w:num w:numId="1004">
-    <w:abstractNumId w:val="991"/>
+    <w:abstractNumId w:val="99411"/>
+    <w:lvlOverride w:ilvl="0">
+      <w:startOverride w:val="1"/>
+    </w:lvlOverride>
+    <w:lvlOverride w:ilvl="1">
+      <w:startOverride w:val="1"/>
+    </w:lvlOverride>
+    <w:lvlOverride w:ilvl="2">
+      <w:startOverride w:val="1"/>
+    </w:lvlOverride>
+    <w:lvlOverride w:ilvl="3">
+      <w:startOverride w:val="1"/>
+    </w:lvlOverride>
+    <w:lvlOverride w:ilvl="4">
+      <w:startOverride w:val="1"/>
+    </w:lvlOverride>
+    <w:lvlOverride w:ilvl="5">
+      <w:startOverride w:val="1"/>
+    </w:lvlOverride>
+    <w:lvlOverride w:ilvl="6">
+      <w:startOverride w:val="1"/>
+    </w:lvlOverride>
+    <w:lvlOverride w:ilvl="7">
+      <w:startOverride w:val="1"/>
+    </w:lvlOverride>
+    <w:lvlOverride w:ilvl="8">
+      <w:startOverride w:val="1"/>
+    </w:lvlOverride>
   </w:num>
   <w:num w:numId="1005">
-    <w:abstractNumId w:val="99411"/>
-    <w:lvlOverride w:ilvl="0">
-      <w:startOverride w:val="1"/>
-    </w:lvlOverride>
-    <w:lvlOverride w:ilvl="1">
-      <w:startOverride w:val="1"/>
-    </w:lvlOverride>
-    <w:lvlOverride w:ilvl="2">
-      <w:startOverride w:val="1"/>
-    </w:lvlOverride>
-    <w:lvlOverride w:ilvl="3">
-      <w:startOverride w:val="1"/>
-    </w:lvlOverride>
-    <w:lvlOverride w:ilvl="4">
-      <w:startOverride w:val="1"/>
-    </w:lvlOverride>
-    <w:lvlOverride w:ilvl="5">
-      <w:startOverride w:val="1"/>
-    </w:lvlOverride>
-    <w:lvlOverride w:ilvl="6">
-      <w:startOverride w:val="1"/>
-    </w:lvlOverride>
-    <w:lvlOverride w:ilvl="7">
-      <w:startOverride w:val="1"/>
-    </w:lvlOverride>
-    <w:lvlOverride w:ilvl="8">
-      <w:startOverride w:val="1"/>
-    </w:lvlOverride>
+    <w:abstractNumId w:val="991"/>
   </w:num>
   <w:num w:numId="1006">
     <w:abstractNumId w:val="99411"/>
@@ -10693,7 +13406,34 @@
     </w:lvlOverride>
   </w:num>
   <w:num w:numId="1017">
-    <w:abstractNumId w:val="991"/>
+    <w:abstractNumId w:val="99411"/>
+    <w:lvlOverride w:ilvl="0">
+      <w:startOverride w:val="1"/>
+    </w:lvlOverride>
+    <w:lvlOverride w:ilvl="1">
+      <w:startOverride w:val="1"/>
+    </w:lvlOverride>
+    <w:lvlOverride w:ilvl="2">
+      <w:startOverride w:val="1"/>
+    </w:lvlOverride>
+    <w:lvlOverride w:ilvl="3">
+      <w:startOverride w:val="1"/>
+    </w:lvlOverride>
+    <w:lvlOverride w:ilvl="4">
+      <w:startOverride w:val="1"/>
+    </w:lvlOverride>
+    <w:lvlOverride w:ilvl="5">
+      <w:startOverride w:val="1"/>
+    </w:lvlOverride>
+    <w:lvlOverride w:ilvl="6">
+      <w:startOverride w:val="1"/>
+    </w:lvlOverride>
+    <w:lvlOverride w:ilvl="7">
+      <w:startOverride w:val="1"/>
+    </w:lvlOverride>
+    <w:lvlOverride w:ilvl="8">
+      <w:startOverride w:val="1"/>
+    </w:lvlOverride>
   </w:num>
   <w:num w:numId="1018">
     <w:abstractNumId w:val="99411"/>
@@ -10726,9 +13466,39 @@
     </w:lvlOverride>
   </w:num>
   <w:num w:numId="1019">
+    <w:abstractNumId w:val="99411"/>
+    <w:lvlOverride w:ilvl="0">
+      <w:startOverride w:val="1"/>
+    </w:lvlOverride>
+    <w:lvlOverride w:ilvl="1">
+      <w:startOverride w:val="1"/>
+    </w:lvlOverride>
+    <w:lvlOverride w:ilvl="2">
+      <w:startOverride w:val="1"/>
+    </w:lvlOverride>
+    <w:lvlOverride w:ilvl="3">
+      <w:startOverride w:val="1"/>
+    </w:lvlOverride>
+    <w:lvlOverride w:ilvl="4">
+      <w:startOverride w:val="1"/>
+    </w:lvlOverride>
+    <w:lvlOverride w:ilvl="5">
+      <w:startOverride w:val="1"/>
+    </w:lvlOverride>
+    <w:lvlOverride w:ilvl="6">
+      <w:startOverride w:val="1"/>
+    </w:lvlOverride>
+    <w:lvlOverride w:ilvl="7">
+      <w:startOverride w:val="1"/>
+    </w:lvlOverride>
+    <w:lvlOverride w:ilvl="8">
+      <w:startOverride w:val="1"/>
+    </w:lvlOverride>
+  </w:num>
+  <w:num w:numId="1020">
     <w:abstractNumId w:val="991"/>
   </w:num>
-  <w:num w:numId="1020">
+  <w:num w:numId="1021">
     <w:abstractNumId w:val="99411"/>
     <w:lvlOverride w:ilvl="0">
       <w:startOverride w:val="1"/>
@@ -10758,10 +13528,43 @@
       <w:startOverride w:val="1"/>
     </w:lvlOverride>
   </w:num>
-  <w:num w:numId="1021">
+  <w:num w:numId="1022">
     <w:abstractNumId w:val="991"/>
   </w:num>
-  <w:num w:numId="1022">
+  <w:num w:numId="1023">
+    <w:abstractNumId w:val="99411"/>
+    <w:lvlOverride w:ilvl="0">
+      <w:startOverride w:val="1"/>
+    </w:lvlOverride>
+    <w:lvlOverride w:ilvl="1">
+      <w:startOverride w:val="1"/>
+    </w:lvlOverride>
+    <w:lvlOverride w:ilvl="2">
+      <w:startOverride w:val="1"/>
+    </w:lvlOverride>
+    <w:lvlOverride w:ilvl="3">
+      <w:startOverride w:val="1"/>
+    </w:lvlOverride>
+    <w:lvlOverride w:ilvl="4">
+      <w:startOverride w:val="1"/>
+    </w:lvlOverride>
+    <w:lvlOverride w:ilvl="5">
+      <w:startOverride w:val="1"/>
+    </w:lvlOverride>
+    <w:lvlOverride w:ilvl="6">
+      <w:startOverride w:val="1"/>
+    </w:lvlOverride>
+    <w:lvlOverride w:ilvl="7">
+      <w:startOverride w:val="1"/>
+    </w:lvlOverride>
+    <w:lvlOverride w:ilvl="8">
+      <w:startOverride w:val="1"/>
+    </w:lvlOverride>
+  </w:num>
+  <w:num w:numId="1024">
+    <w:abstractNumId w:val="991"/>
+  </w:num>
+  <w:num w:numId="1025">
     <w:abstractNumId w:val="99411"/>
     <w:lvlOverride w:ilvl="0">
       <w:startOverride w:val="1"/>

</xml_diff>

<commit_message>
Update SCW17 report planning section
</commit_message>
<xml_diff>
--- a/docs/SCW17-MSE-Workshop-report.docx
+++ b/docs/SCW17-MSE-Workshop-report.docx
@@ -145,7 +145,7 @@
         <w:t xml:space="preserve"> </w:t>
       </w:r>
       <w:r>
-        <w:t xml:space="preserve">19 June 2026 12:27 CEST</w:t>
+        <w:t xml:space="preserve">19 June 2026 12:48 CEST</w:t>
       </w:r>
     </w:p>
     <w:tbl>
@@ -10726,7 +10726,7 @@
     </w:tbl>
     <w:bookmarkEnd w:id="48"/>
     <w:bookmarkEnd w:id="49"/>
-    <w:bookmarkStart w:id="52" w:name="planning-for-sc14-and-next-steps"/>
+    <w:bookmarkStart w:id="51" w:name="planning-for-sc14-and-next-steps"/>
     <w:p>
       <w:pPr>
         <w:pStyle w:val="Heading1"/>
@@ -10735,381 +10735,2677 @@
         <w:t xml:space="preserve">Planning for SC14 and Next Steps</w:t>
       </w:r>
     </w:p>
+    <w:p>
+      <w:pPr>
+        <w:numPr>
+          <w:ilvl w:val="0"/>
+          <w:numId w:val="1019"/>
+        </w:numPr>
+      </w:pPr>
+      <w:r>
+        <w:t xml:space="preserve">The discussions produced several practical directions for the next round of work. Future recruitment deviations should be simulated with an approximate cross-correlation and autocorrelation treatment, followed by comparison with the historical period. ENSO and regime behaviour should be treated as robustness tests rather than integral core-simulation components, although the timing of that work remains to be confirmed. Climate treatment should be framed through robustness or stress testing and presented clearly to the Scientific Committee. The OM set should retain the one- versus two-stock contrast, model 0.16 versus 1.14, movement variants, and a selectivity-change variant, with the 2026 movement transition smoothed to the 10-year average. Reference-point work should continue to focus on proxies for poorly defined F</w:t>
+      </w:r>
+      <w:r>
+        <w:rPr>
+          <w:vertAlign w:val="subscript"/>
+        </w:rPr>
+        <w:t xml:space="preserve">MSY</w:t>
+      </w:r>
+      <w:r>
+        <w:t xml:space="preserve">, including 35% dynamic B</w:t>
+      </w:r>
+      <w:r>
+        <w:rPr>
+          <w:vertAlign w:val="subscript"/>
+        </w:rPr>
+        <w:t xml:space="preserve">0</w:t>
+      </w:r>
+      <w:r>
+        <w:t xml:space="preserve"> </w:t>
+      </w:r>
+      <w:r>
+        <w:t xml:space="preserve">with F</w:t>
+      </w:r>
+      <w:r>
+        <w:rPr>
+          <w:vertAlign w:val="subscript"/>
+        </w:rPr>
+        <w:t xml:space="preserve">35%</w:t>
+      </w:r>
+      <w:r>
+        <w:t xml:space="preserve">, U/U</w:t>
+      </w:r>
+      <w:r>
+        <w:rPr>
+          <w:vertAlign w:val="subscript"/>
+        </w:rPr>
+        <w:t xml:space="preserve">MSY</w:t>
+      </w:r>
+      <w:r>
+        <w:t xml:space="preserve">, and/or constant-F yield-curve calculations.</w:t>
+      </w:r>
+    </w:p>
+    <w:p>
+      <w:pPr>
+        <w:numPr>
+          <w:ilvl w:val="0"/>
+          <w:numId w:val="1019"/>
+        </w:numPr>
+      </w:pPr>
+      <w:r>
+        <w:t xml:space="preserve">The group completed the principal tasks identified for the workshop and developed a more focused set of CMPs for subsequent robustness testing and reporting to SC14. The narrowed set was developed from the Day 4 trial CMPs in</w:t>
+      </w:r>
+      <w:r>
+        <w:t xml:space="preserve"> </w:t>
+      </w:r>
+      <w:hyperlink w:anchor="tbl-day4-cmp-robustness">
+        <w:r>
+          <w:rPr>
+            <w:rStyle w:val="Hyperlink"/>
+          </w:rPr>
+          <w:t xml:space="preserve">Table 4</w:t>
+        </w:r>
+      </w:hyperlink>
+      <w:r>
+        <w:t xml:space="preserve">. The group examined the behavior of the full set and identified</w:t>
+      </w:r>
+      <w:r>
+        <w:t xml:space="preserve"> </w:t>
+      </w:r>
+      <w:r>
+        <w:rPr>
+          <w:rStyle w:val="VerbatimChar"/>
+        </w:rPr>
+        <w:t xml:space="preserve">run18</w:t>
+      </w:r>
+      <w:r>
+        <w:t xml:space="preserve">,</w:t>
+      </w:r>
+      <w:r>
+        <w:t xml:space="preserve"> </w:t>
+      </w:r>
+      <w:r>
+        <w:rPr>
+          <w:rStyle w:val="VerbatimChar"/>
+        </w:rPr>
+        <w:t xml:space="preserve">run20</w:t>
+      </w:r>
+      <w:r>
+        <w:t xml:space="preserve">, and</w:t>
+      </w:r>
+      <w:r>
+        <w:t xml:space="preserve"> </w:t>
+      </w:r>
+      <w:r>
+        <w:rPr>
+          <w:rStyle w:val="VerbatimChar"/>
+        </w:rPr>
+        <w:t xml:space="preserve">run22</w:t>
+      </w:r>
+      <w:r>
+        <w:t xml:space="preserve"> </w:t>
+      </w:r>
+      <w:r>
+        <w:t xml:space="preserve">as the subset to carry forward for robustness testing. These CMPs were selected to span the main trade-offs considered during the workshop, including higher target catch behavior, minimum catch treatment, and the Chile special-shape variant.</w:t>
+      </w:r>
+    </w:p>
     <w:tbl>
       <w:tblPr>
         <w:tblStyle w:val="Table"/>
-        <w:tblLook w:firstRow="0" w:lastRow="0" w:firstColumn="0" w:lastColumn="0" w:noHBand="0" w:noVBand="0" w:val="0000"/>
-        <w:tblBorders>
-          <w:top w:val="single" w:sz="4" w:space="0" w:color="0758E5"/>
-          <w:left w:val="single" w:sz="24" w:space="0" w:color="0758E5"/>
-          <w:bottom w:val="single" w:sz="4" w:space="0" w:color="0758E5"/>
-          <w:right w:val="single" w:sz="4" w:space="0" w:color="0758E5"/>
-        </w:tblBorders>
-        <w:tblCellMar>
-          <w:left w:w="144" w:type="dxa"/>
-          <w:right w:w="144" w:type="dxa"/>
-        </w:tblCellMar>
+        <w:tblW w:type="pct" w:w="5000"/>
+        <w:tblLayout w:type="fixed"/>
         <w:tblLook w:firstRow="0" w:lastRow="0" w:firstColumn="0" w:lastColumn="0" w:noHBand="0" w:noVBand="0" w:val="0000"/>
       </w:tblPr>
+      <w:tblGrid>
+        <w:gridCol w:w="7920"/>
+      </w:tblGrid>
       <w:tr>
-        <w:trPr>
-          <w:cantSplit/>
-        </w:trPr>
         <w:tc>
-          <w:tcPr>
-            <w:shd w:color="auto" w:fill="dae6fb" w:val="clear"/>
-            <w:tcMar>
-              <w:top w:w="92" w:type="dxa"/>
-              <w:bottom w:w="92" w:type="dxa"/>
-            </w:tcMar>
-          </w:tcPr>
+          <w:tcPr/>
+          <w:bookmarkStart w:id="50" w:name="tbl-day4-cmp-robustness"/>
           <w:p>
             <w:pPr>
-              <w:pStyle w:val="FirstParagraph"/>
+              <w:jc w:val="center"/>
             </w:pPr>
             <w:pPr>
-              <w:spacing w:before="0" w:after="0"/>
-              <w:textAlignment w:val="center"/>
+              <w:jc w:val="left"/>
+              <w:spacing w:before="200"/>
+              <w:pStyle w:val="ImageCaption"/>
             </w:pPr>
             <w:r>
-              <w:drawing>
-                <wp:inline>
-                  <wp:extent cx="152400" cy="152400"/>
-                  <wp:effectExtent b="0" l="0" r="0" t="0"/>
-                  <wp:docPr descr="" title="" id="50" name="Picture"/>
-                  <a:graphic>
-                    <a:graphicData uri="http://schemas.openxmlformats.org/drawingml/2006/picture">
-                      <pic:pic>
-                        <pic:nvPicPr>
-                          <pic:cNvPr descr="/Applications/quarto/share/formats/docx/note.png" id="51" name="Picture"/>
-                          <pic:cNvPicPr>
-                            <a:picLocks noChangeArrowheads="1" noChangeAspect="1"/>
-                          </pic:cNvPicPr>
-                        </pic:nvPicPr>
-                        <pic:blipFill>
-                          <a:blip r:embed="rId9"/>
-                          <a:stretch>
-                            <a:fillRect/>
-                          </a:stretch>
-                        </pic:blipFill>
-                        <pic:spPr bwMode="auto">
-                          <a:xfrm>
-                            <a:off x="0" y="0"/>
-                            <a:ext cx="152400" cy="152400"/>
-                          </a:xfrm>
-                          <a:prstGeom prst="rect">
-                            <a:avLst/>
-                          </a:prstGeom>
-                          <a:noFill/>
-                          <a:ln w="9525">
-                            <a:noFill/>
-                            <a:headEnd/>
-                            <a:tailEnd/>
-                          </a:ln>
-                        </pic:spPr>
-                      </pic:pic>
-                    </a:graphicData>
-                  </a:graphic>
-                </wp:inline>
-              </w:drawing>
-            </w:r>
-            <w:r>
-              <w:t xml:space="preserve"> </w:t>
-            </w:r>
-            <w:r>
-              <w:t xml:space="preserve"> </w:t>
-            </w:r>
-            <w:r>
-              <w:t xml:space="preserve">Preliminary note</w:t>
+              <w:t xml:space="preserve">Table 4: Day 4 trial CMPs examined by the group; runs selected for robustness testing are indicated.</w:t>
             </w:r>
           </w:p>
-        </w:tc>
-      </w:tr>
-      <w:tr>
-        <w:trPr>
-          <w:cantSplit/>
-        </w:trPr>
-        <w:tc>
-          <w:tcPr>
-            <w:tcMar>
-              <w:top w:w="108" w:type="dxa"/>
-              <w:bottom w:w="108" w:type="dxa"/>
-            </w:tcMar>
-          </w:tcPr>
-          <w:p>
-            <w:pPr>
-              <w:pStyle w:val="BodyText"/>
-            </w:pPr>
-            <w:pPr>
-              <w:spacing w:before="16"/>
-            </w:pPr>
-            <w:r>
-              <w:t xml:space="preserve">The following planning notes are preliminary and will likely be deleted or stated elsewhere in the final workshop report.</w:t>
-            </w:r>
-          </w:p>
-          <w:p>
-            <w:pPr>
-              <w:numPr>
-                <w:ilvl w:val="0"/>
-                <w:numId w:val="1019"/>
-              </w:numPr>
-            </w:pPr>
-            <w:r>
-              <w:t xml:space="preserve">The Day 2 discussions produced several practical directions for the next round of work. Future recruitment deviations should be simulated with an approximate cross-correlation and autocorrelation treatment, followed by comparison with the historical period. ENSO and regime behaviour should be treated as robustness tests rather than integral core-simulation components, although the timing of that work remains to be confirmed. Climate treatment should be framed through robustness or stress testing and presented clearly to the Scientific Committee. The OM set should retain the one- versus two-stock contrast, model 0.16 versus 1.14, movement variants, and a selectivity-change variant, with the 2026 movement transition smoothed to the 10-year average. Reference-point work should continue to focus on proxies for poorly defined F</w:t>
-            </w:r>
-            <w:r>
-              <w:rPr>
-                <w:vertAlign w:val="subscript"/>
-              </w:rPr>
-              <w:t xml:space="preserve">MSY</w:t>
-            </w:r>
-            <w:r>
-              <w:t xml:space="preserve">, including 35% dynamic B</w:t>
-            </w:r>
-            <w:r>
-              <w:rPr>
-                <w:vertAlign w:val="subscript"/>
-              </w:rPr>
-              <w:t xml:space="preserve">0</w:t>
-            </w:r>
-            <w:r>
-              <w:t xml:space="preserve"> </w:t>
-            </w:r>
-            <w:r>
-              <w:t xml:space="preserve">with F</w:t>
-            </w:r>
-            <w:r>
-              <w:rPr>
-                <w:vertAlign w:val="subscript"/>
-              </w:rPr>
-              <w:t xml:space="preserve">35%</w:t>
-            </w:r>
-            <w:r>
-              <w:t xml:space="preserve">, U/U</w:t>
-            </w:r>
-            <w:r>
-              <w:rPr>
-                <w:vertAlign w:val="subscript"/>
-              </w:rPr>
-              <w:t xml:space="preserve">MSY</w:t>
-            </w:r>
-            <w:r>
-              <w:t xml:space="preserve">, and/or constant-F yield-curve calculations.</w:t>
-            </w:r>
-          </w:p>
-          <w:p>
-            <w:pPr>
-              <w:numPr>
-                <w:ilvl w:val="0"/>
-                <w:numId w:val="1019"/>
-              </w:numPr>
-            </w:pPr>
-            <w:r>
-              <w:t xml:space="preserve">The group suggested 24 July 2026 as a potential date for a technical meeting before SC14. The purpose would be to review updated CMP performance summaries, robustness-test results, and any remaining implementation issues before materials are finalized for Scientific Committee consideration. The meeting should be a technical review of the narrowed CMP set, diagnostics, and suitability of the results rather than a reopening of the CMP design process.</w:t>
-            </w:r>
-          </w:p>
-          <w:p>
-            <w:pPr>
-              <w:numPr>
-                <w:ilvl w:val="0"/>
-                <w:numId w:val="1019"/>
-              </w:numPr>
-            </w:pPr>
-            <w:r>
-              <w:t xml:space="preserve">The group noted that the tasks identified as needing to be completed during this workshop were completed. A second set of items was identified as material the group wished to see included in the MSE report to SC14, including the final CMP run list, updated CMP performance summaries, robustness-test results, documentation of recruitment and index simulation assumptions, documentation of remaining implementation choices, and clear presentation of the rationale for the CMP shortlist.</w:t>
-            </w:r>
-          </w:p>
-          <w:p>
-            <w:pPr>
-              <w:numPr>
-                <w:ilvl w:val="0"/>
-                <w:numId w:val="1019"/>
-              </w:numPr>
-            </w:pPr>
-            <w:r>
-              <w:t xml:space="preserve">Follow-up actions from Day 1 included:</w:t>
-            </w:r>
-          </w:p>
-          <w:p>
-            <w:pPr>
-              <w:pStyle w:val="Compact"/>
-              <w:numPr>
-                <w:ilvl w:val="0"/>
-                <w:numId w:val="1020"/>
-              </w:numPr>
-            </w:pPr>
-            <w:r>
-              <w:t xml:space="preserve">The assessment team will provide model 0.16 diagnostics for comparison with other variants, reintroduce explicit effort constraints to limit implausible inter-annual effort spikes for Peru artisanal fisheries, display the previously submitted document on the Peru two-regime hypothesis, and add an F~35%-based comparison figure with documented selectivity assumptions and averaging windows.</w:t>
-            </w:r>
-          </w:p>
-          <w:p>
-            <w:pPr>
-              <w:pStyle w:val="Compact"/>
-              <w:numPr>
-                <w:ilvl w:val="0"/>
-                <w:numId w:val="1020"/>
-              </w:numPr>
-            </w:pPr>
-            <w:r>
-              <w:t xml:space="preserve">I. Paya will confirm whether model 0.00 matches the previous year’s spawning-biomass estimates.</w:t>
-            </w:r>
-          </w:p>
-          <w:p>
-            <w:pPr>
-              <w:pStyle w:val="Compact"/>
-              <w:numPr>
-                <w:ilvl w:val="0"/>
-                <w:numId w:val="1020"/>
-              </w:numPr>
-            </w:pPr>
-            <w:r>
-              <w:t xml:space="preserve">The Working Group will decide whether to freeze current data inputs and proceed with OM conditioning, and compare model configurations to assess robustness and the effect of Peruvian CPUE changes.</w:t>
-            </w:r>
-          </w:p>
-          <w:p>
-            <w:pPr>
-              <w:pStyle w:val="Compact"/>
-              <w:numPr>
-                <w:ilvl w:val="0"/>
-                <w:numId w:val="1020"/>
-              </w:numPr>
-            </w:pPr>
-            <w:r>
-              <w:t xml:space="preserve">Analysts will focus immediate CMP tuning work on model 0.16 and present model 0.00 as a labelled alternative.</w:t>
-            </w:r>
-          </w:p>
-          <w:p>
-            <w:pPr>
-              <w:pStyle w:val="Compact"/>
-              <w:numPr>
-                <w:ilvl w:val="0"/>
-                <w:numId w:val="1020"/>
-              </w:numPr>
-            </w:pPr>
-            <w:r>
-              <w:t xml:space="preserve">Workshop organizers will prepare final Paper 01 and the workshop report for Scientific Committee submission.</w:t>
-            </w:r>
-          </w:p>
-          <w:p>
-            <w:pPr>
-              <w:pStyle w:val="Compact"/>
-              <w:numPr>
-                <w:ilvl w:val="0"/>
-                <w:numId w:val="1021"/>
-              </w:numPr>
-            </w:pPr>
-            <w:r>
-              <w:t xml:space="preserve">Follow-up actions from Day 2 included:</w:t>
-            </w:r>
-          </w:p>
-          <w:p>
-            <w:pPr>
-              <w:pStyle w:val="Compact"/>
-              <w:numPr>
-                <w:ilvl w:val="0"/>
-                <w:numId w:val="1022"/>
-              </w:numPr>
-            </w:pPr>
-            <w:r>
-              <w:t xml:space="preserve">I. Mosqueira and team will implement approximate recruitment-deviation simulation with autocorrelation, compare simulations against the historical period, finalize and distribute the agreed OM set and naming conventions, and run the recruitment-deviation scenarios with the reference OM.</w:t>
-            </w:r>
-          </w:p>
-          <w:p>
-            <w:pPr>
-              <w:pStyle w:val="Compact"/>
-              <w:numPr>
-                <w:ilvl w:val="0"/>
-                <w:numId w:val="1022"/>
-              </w:numPr>
-            </w:pPr>
-            <w:r>
-              <w:t xml:space="preserve">The assessment team will clarify and fix the anomalous F forecast identified in the OM set.</w:t>
-            </w:r>
-          </w:p>
-          <w:p>
-            <w:pPr>
-              <w:pStyle w:val="Compact"/>
-              <w:numPr>
-                <w:ilvl w:val="0"/>
-                <w:numId w:val="1022"/>
-              </w:numPr>
-            </w:pPr>
-            <w:r>
-              <w:t xml:space="preserve">The Working Group will resolve how the northern stock can be handled by defining an appropriate F</w:t>
-            </w:r>
-            <w:r>
-              <w:rPr>
-                <w:vertAlign w:val="subscript"/>
-              </w:rPr>
-              <w:t xml:space="preserve">MSY</w:t>
-            </w:r>
-            <w:r>
-              <w:t xml:space="preserve"> </w:t>
-            </w:r>
-            <w:r>
-              <w:t xml:space="preserve">treatment inside the CMP.</w:t>
-            </w:r>
-          </w:p>
-          <w:p>
-            <w:pPr>
-              <w:pStyle w:val="Compact"/>
-              <w:numPr>
-                <w:ilvl w:val="0"/>
-                <w:numId w:val="1022"/>
-              </w:numPr>
-            </w:pPr>
-            <w:r>
-              <w:t xml:space="preserve">J. Ianelli and T. Carruthers will prepare a Scientific Committee presentation on climate treatment in the MSE.</w:t>
-            </w:r>
-          </w:p>
-          <w:p>
-            <w:pPr>
-              <w:pStyle w:val="Compact"/>
-              <w:numPr>
-                <w:ilvl w:val="0"/>
-                <w:numId w:val="1022"/>
-              </w:numPr>
-            </w:pPr>
-            <w:r>
-              <w:t xml:space="preserve">J. Ianelli and the assessment team will produce proxy-based Kobe plots and constant-F yield-curve reference-point calculations.</w:t>
-            </w:r>
-          </w:p>
-          <w:p>
-            <w:pPr>
-              <w:pStyle w:val="Compact"/>
-              <w:numPr>
-                <w:ilvl w:val="0"/>
-                <w:numId w:val="1023"/>
-              </w:numPr>
-            </w:pPr>
-            <w:r>
-              <w:t xml:space="preserve">Issues identified for further work during the remainder of SCW17 included the final composition and weighting of the OM reference set; the relative influence of Peruvian CPUE changes, effort-creep treatment, and alternative biological interpretations on model 0.16; how to simulate standardized CPUE and other indices in forward projections; whether structurally divergent OMs should be tuned jointly or treated separately; instability in dynamic reference points and apical-F metrics; the choice of running-average window for reference-point calculations; the effect of including optimistic alternatives on probability-of-green-zone tuning and Commission communication; the operational definition and response process for exceptional circumstances; the approximate nature of autocorrelated, multivariate recruitment simulation; the Scientific Committee framing of climate effects; the anomalous F forecast; the northern-stock F</w:t>
-            </w:r>
-            <w:r>
-              <w:rPr>
-                <w:vertAlign w:val="subscript"/>
-              </w:rPr>
-              <w:t xml:space="preserve">MSY</w:t>
-            </w:r>
-            <w:r>
-              <w:t xml:space="preserve"> </w:t>
-            </w:r>
-            <w:r>
-              <w:t xml:space="preserve">definition inside the CMP; and the total OM count and associated computational load.</w:t>
-            </w:r>
-          </w:p>
-          <w:p/>
+          <w:tbl xmlns:w="http://schemas.openxmlformats.org/wordprocessingml/2006/main" xmlns:wp="http://schemas.openxmlformats.org/drawingml/2006/wordprocessingDrawing" xmlns:r="http://schemas.openxmlformats.org/officeDocument/2006/relationships" xmlns:w14="http://schemas.microsoft.com/office/word/2010/wordml">
+            <w:tblPr>
+              <w:tblCellMar>
+                <w:top w:w="0" w:type="dxa"/>
+                <w:bottom w:w="0" w:type="dxa"/>
+                <w:start w:w="60" w:type="dxa"/>
+                <w:end w:w="60" w:type="dxa"/>
+              </w:tblCellMar>
+              <w:tblW w:type="auto" w:w="0"/>
+              <w:tblLook w:firstRow="0" w:lastRow="0" w:firstColumn="0" w:lastColumn="0" w:noHBand="0" w:noVBand="0"/>
+              <w:jc w:val="center"/>
+            </w:tblPr>
+            <w:tr>
+              <w:trPr>
+                <w:cantSplit/>
+                <w:tblHeader/>
+              </w:trPr>
+              <w:tc>
+                <w:tcPr>
+                  <w:tcBorders>
+                    <w:top w:val="single" w:sz="16" w:space="0" w:color="D3D3D3"/>
+                    <w:bottom w:val="single" w:sz="16" w:space="0" w:color="D3D3D3"/>
+                    <w:start w:val="single" w:space="0" w:color="D3D3D3"/>
+                  </w:tcBorders>
+                </w:tcPr>
+                <w:p>
+                  <w:pPr>
+                    <w:spacing w:before="0" w:after="60"/>
+                    <w:keepNext/>
+                    <w:jc w:val="start"/>
+                  </w:pPr>
+                  <w:r>
+                    <w:rPr>
+                      <w:rFonts w:ascii="Calibri" w:hAnsi="Calibri"/>
+                      <w:sz w:val="20"/>
+                    </w:rPr>
+                    <w:t xml:space="default">Day 4</w:t>
+                  </w:r>
+                </w:p>
+              </w:tc>
+              <w:tc>
+                <w:tcPr>
+                  <w:tcBorders>
+                    <w:top w:val="single" w:sz="16" w:space="0" w:color="D3D3D3"/>
+                    <w:bottom w:val="single" w:sz="16" w:space="0" w:color="D3D3D3"/>
+                  </w:tcBorders>
+                </w:tcPr>
+                <w:p>
+                  <w:pPr>
+                    <w:spacing w:before="0" w:after="60"/>
+                    <w:keepNext/>
+                    <w:jc w:val="start"/>
+                  </w:pPr>
+                  <w:r>
+                    <w:rPr>
+                      <w:rFonts w:ascii="Calibri" w:hAnsi="Calibri"/>
+                      <w:sz w:val="20"/>
+                    </w:rPr>
+                    <w:t xml:space="default">CMP name</w:t>
+                  </w:r>
+                </w:p>
+              </w:tc>
+              <w:tc>
+                <w:tcPr>
+                  <w:tcBorders>
+                    <w:top w:val="single" w:sz="16" w:space="0" w:color="D3D3D3"/>
+                    <w:bottom w:val="single" w:sz="16" w:space="0" w:color="D3D3D3"/>
+                  </w:tcBorders>
+                </w:tcPr>
+                <w:p>
+                  <w:pPr>
+                    <w:spacing w:before="0" w:after="60"/>
+                    <w:keepNext/>
+                    <w:jc w:val="end"/>
+                  </w:pPr>
+                  <w:r>
+                    <w:rPr>
+                      <w:rFonts w:ascii="Calibri" w:hAnsi="Calibri"/>
+                      <w:sz w:val="20"/>
+                    </w:rPr>
+                    <w:t xml:space="default">min</w:t>
+                  </w:r>
+                </w:p>
+              </w:tc>
+              <w:tc>
+                <w:tcPr>
+                  <w:tcBorders>
+                    <w:top w:val="single" w:sz="16" w:space="0" w:color="D3D3D3"/>
+                    <w:bottom w:val="single" w:sz="16" w:space="0" w:color="D3D3D3"/>
+                  </w:tcBorders>
+                </w:tcPr>
+                <w:p>
+                  <w:pPr>
+                    <w:spacing w:before="0" w:after="60"/>
+                    <w:keepNext/>
+                    <w:jc w:val="end"/>
+                  </w:pPr>
+                  <w:r>
+                    <w:rPr>
+                      <w:rFonts w:ascii="Calibri" w:hAnsi="Calibri"/>
+                      <w:sz w:val="20"/>
+                    </w:rPr>
+                    <w:t xml:space="default">lim</w:t>
+                  </w:r>
+                </w:p>
+              </w:tc>
+              <w:tc>
+                <w:tcPr>
+                  <w:tcBorders>
+                    <w:top w:val="single" w:sz="16" w:space="0" w:color="D3D3D3"/>
+                    <w:bottom w:val="single" w:sz="16" w:space="0" w:color="D3D3D3"/>
+                  </w:tcBorders>
+                </w:tcPr>
+                <w:p>
+                  <w:pPr>
+                    <w:spacing w:before="0" w:after="60"/>
+                    <w:keepNext/>
+                    <w:jc w:val="start"/>
+                  </w:pPr>
+                  <w:r>
+                    <w:rPr>
+                      <w:rFonts w:ascii="Calibri" w:hAnsi="Calibri"/>
+                      <w:sz w:val="20"/>
+                    </w:rPr>
+                    <w:t xml:space="default">trigger</w:t>
+                  </w:r>
+                </w:p>
+              </w:tc>
+              <w:tc>
+                <w:tcPr>
+                  <w:tcBorders>
+                    <w:top w:val="single" w:sz="16" w:space="0" w:color="D3D3D3"/>
+                    <w:bottom w:val="single" w:sz="16" w:space="0" w:color="D3D3D3"/>
+                  </w:tcBorders>
+                </w:tcPr>
+                <w:p>
+                  <w:pPr>
+                    <w:spacing w:before="0" w:after="60"/>
+                    <w:keepNext/>
+                    <w:jc w:val="end"/>
+                  </w:pPr>
+                  <w:r>
+                    <w:rPr>
+                      <w:rFonts w:ascii="Calibri" w:hAnsi="Calibri"/>
+                      <w:sz w:val="20"/>
+                    </w:rPr>
+                    <w:t xml:space="default">target</w:t>
+                  </w:r>
+                </w:p>
+              </w:tc>
+              <w:tc>
+                <w:tcPr>
+                  <w:tcBorders>
+                    <w:top w:val="single" w:sz="16" w:space="0" w:color="D3D3D3"/>
+                    <w:bottom w:val="single" w:sz="16" w:space="0" w:color="D3D3D3"/>
+                  </w:tcBorders>
+                </w:tcPr>
+                <w:p>
+                  <w:pPr>
+                    <w:spacing w:before="0" w:after="60"/>
+                    <w:keepNext/>
+                    <w:jc w:val="end"/>
+                  </w:pPr>
+                  <w:r>
+                    <w:rPr>
+                      <w:rFonts w:ascii="Calibri" w:hAnsi="Calibri"/>
+                      <w:sz w:val="20"/>
+                    </w:rPr>
+                    <w:t xml:space="default">dlow</w:t>
+                  </w:r>
+                </w:p>
+              </w:tc>
+              <w:tc>
+                <w:tcPr>
+                  <w:tcBorders>
+                    <w:top w:val="single" w:sz="16" w:space="0" w:color="D3D3D3"/>
+                    <w:bottom w:val="single" w:sz="16" w:space="0" w:color="D3D3D3"/>
+                  </w:tcBorders>
+                </w:tcPr>
+                <w:p>
+                  <w:pPr>
+                    <w:spacing w:before="0" w:after="60"/>
+                    <w:keepNext/>
+                    <w:jc w:val="end"/>
+                  </w:pPr>
+                  <w:r>
+                    <w:rPr>
+                      <w:rFonts w:ascii="Calibri" w:hAnsi="Calibri"/>
+                      <w:sz w:val="20"/>
+                    </w:rPr>
+                    <w:t xml:space="default">dupp</w:t>
+                  </w:r>
+                </w:p>
+              </w:tc>
+              <w:tc>
+                <w:tcPr>
+                  <w:tcBorders>
+                    <w:top w:val="single" w:sz="16" w:space="0" w:color="D3D3D3"/>
+                    <w:bottom w:val="single" w:sz="16" w:space="0" w:color="D3D3D3"/>
+                  </w:tcBorders>
+                </w:tcPr>
+                <w:p>
+                  <w:pPr>
+                    <w:spacing w:before="0" w:after="60"/>
+                    <w:keepNext/>
+                    <w:jc w:val="start"/>
+                  </w:pPr>
+                  <w:r>
+                    <w:rPr>
+                      <w:rFonts w:ascii="Calibri" w:hAnsi="Calibri"/>
+                      <w:sz w:val="20"/>
+                    </w:rPr>
+                    <w:t xml:space="default">smooth</w:t>
+                  </w:r>
+                </w:p>
+              </w:tc>
+              <w:tc>
+                <w:tcPr>
+                  <w:tcBorders>
+                    <w:top w:val="single" w:sz="16" w:space="0" w:color="D3D3D3"/>
+                    <w:bottom w:val="single" w:sz="16" w:space="0" w:color="D3D3D3"/>
+                  </w:tcBorders>
+                </w:tcPr>
+                <w:p>
+                  <w:pPr>
+                    <w:spacing w:before="0" w:after="60"/>
+                    <w:keepNext/>
+                    <w:jc w:val="start"/>
+                  </w:pPr>
+                  <w:r>
+                    <w:rPr>
+                      <w:rFonts w:ascii="Calibri" w:hAnsi="Calibri"/>
+                      <w:sz w:val="20"/>
+                    </w:rPr>
+                    <w:t xml:space="default">indices</w:t>
+                  </w:r>
+                </w:p>
+              </w:tc>
+              <w:tc>
+                <w:tcPr>
+                  <w:tcBorders>
+                    <w:top w:val="single" w:sz="16" w:space="0" w:color="D3D3D3"/>
+                    <w:bottom w:val="single" w:sz="16" w:space="0" w:color="D3D3D3"/>
+                    <w:end w:val="single" w:space="0" w:color="D3D3D3"/>
+                  </w:tcBorders>
+                </w:tcPr>
+                <w:p>
+                  <w:pPr>
+                    <w:spacing w:before="0" w:after="60"/>
+                    <w:keepNext/>
+                    <w:jc w:val="start"/>
+                  </w:pPr>
+                  <w:r>
+                    <w:rPr>
+                      <w:rFonts w:ascii="Calibri" w:hAnsi="Calibri"/>
+                      <w:sz w:val="20"/>
+                    </w:rPr>
+                    <w:t xml:space="default">robustness subset</w:t>
+                  </w:r>
+                </w:p>
+              </w:tc>
+            </w:tr>
+            <w:tr>
+              <w:trPr>
+                <w:cantSplit/>
+              </w:trPr>
+              <w:tc>
+                <w:tcPr>
+                  <w:tcBorders>
+                    <w:top w:val="single" w:space="0" w:color="D3D3D3"/>
+                    <w:bottom w:val="single" w:space="0" w:color="D3D3D3"/>
+                    <w:start w:val="single" w:space="0" w:color="D3D3D3"/>
+                    <w:end w:val="single" w:space="0" w:color="D3D3D3"/>
+                  </w:tcBorders>
+                </w:tcPr>
+                <w:p>
+                  <w:pPr>
+                    <w:spacing w:before="0" w:after="60"/>
+                    <w:keepNext/>
+                    <w:jc w:val="start"/>
+                  </w:pPr>
+                  <w:r>
+                    <w:rPr>
+                      <w:rFonts w:ascii="Calibri" w:hAnsi="Calibri"/>
+                      <w:sz w:val="20"/>
+                    </w:rPr>
+                    <w:t xml:space="default">run15</w:t>
+                  </w:r>
+                </w:p>
+              </w:tc>
+              <w:tc>
+                <w:tcPr>
+                  <w:tcBorders>
+                    <w:top w:val="single" w:space="0" w:color="D3D3D3"/>
+                    <w:bottom w:val="single" w:space="0" w:color="D3D3D3"/>
+                    <w:start w:val="single" w:space="0" w:color="D3D3D3"/>
+                    <w:end w:val="single" w:space="0" w:color="D3D3D3"/>
+                  </w:tcBorders>
+                </w:tcPr>
+                <w:p>
+                  <w:pPr>
+                    <w:spacing w:before="0" w:after="60"/>
+                    <w:keepNext/>
+                    <w:jc w:val="start"/>
+                  </w:pPr>
+                  <w:r>
+                    <w:rPr>
+                      <w:rFonts w:ascii="Calibri" w:hAnsi="Calibri"/>
+                      <w:sz w:val="20"/>
+                    </w:rPr>
+                    <w:t xml:space="default">Base Test</w:t>
+                  </w:r>
+                </w:p>
+              </w:tc>
+              <w:tc>
+                <w:tcPr>
+                  <w:tcBorders>
+                    <w:top w:val="single" w:space="0" w:color="D3D3D3"/>
+                    <w:bottom w:val="single" w:space="0" w:color="D3D3D3"/>
+                    <w:start w:val="single" w:space="0" w:color="D3D3D3"/>
+                    <w:end w:val="single" w:space="0" w:color="D3D3D3"/>
+                  </w:tcBorders>
+                </w:tcPr>
+                <w:p>
+                  <w:pPr>
+                    <w:spacing w:before="0" w:after="60"/>
+                    <w:keepNext/>
+                    <w:jc w:val="end"/>
+                  </w:pPr>
+                  <w:r>
+                    <w:rPr>
+                      <w:rFonts w:ascii="Calibri" w:hAnsi="Calibri"/>
+                      <w:sz w:val="20"/>
+                    </w:rPr>
+                    <w:t xml:space="default">0</w:t>
+                  </w:r>
+                </w:p>
+              </w:tc>
+              <w:tc>
+                <w:tcPr>
+                  <w:tcBorders>
+                    <w:top w:val="single" w:space="0" w:color="D3D3D3"/>
+                    <w:bottom w:val="single" w:space="0" w:color="D3D3D3"/>
+                    <w:start w:val="single" w:space="0" w:color="D3D3D3"/>
+                    <w:end w:val="single" w:space="0" w:color="D3D3D3"/>
+                  </w:tcBorders>
+                </w:tcPr>
+                <w:p>
+                  <w:pPr>
+                    <w:spacing w:before="0" w:after="60"/>
+                    <w:keepNext/>
+                    <w:jc w:val="end"/>
+                  </w:pPr>
+                  <w:r>
+                    <w:rPr>
+                      <w:rFonts w:ascii="Calibri" w:hAnsi="Calibri"/>
+                      <w:sz w:val="20"/>
+                    </w:rPr>
+                    <w:t xml:space="default">0</w:t>
+                  </w:r>
+                </w:p>
+              </w:tc>
+              <w:tc>
+                <w:tcPr>
+                  <w:tcBorders>
+                    <w:top w:val="single" w:space="0" w:color="D3D3D3"/>
+                    <w:bottom w:val="single" w:space="0" w:color="D3D3D3"/>
+                    <w:start w:val="single" w:space="0" w:color="D3D3D3"/>
+                    <w:end w:val="single" w:space="0" w:color="D3D3D3"/>
+                  </w:tcBorders>
+                </w:tcPr>
+                <w:p>
+                  <w:pPr>
+                    <w:spacing w:before="0" w:after="60"/>
+                    <w:keepNext/>
+                    <w:jc w:val="start"/>
+                  </w:pPr>
+                  <w:r>
+                    <w:rPr>
+                      <w:rFonts w:ascii="Calibri" w:hAnsi="Calibri"/>
+                      <w:sz w:val="20"/>
+                    </w:rPr>
+                    <w:t xml:space="default">2.25-3</w:t>
+                  </w:r>
+                </w:p>
+              </w:tc>
+              <w:tc>
+                <w:tcPr>
+                  <w:tcBorders>
+                    <w:top w:val="single" w:space="0" w:color="D3D3D3"/>
+                    <w:bottom w:val="single" w:space="0" w:color="D3D3D3"/>
+                    <w:start w:val="single" w:space="0" w:color="D3D3D3"/>
+                    <w:end w:val="single" w:space="0" w:color="D3D3D3"/>
+                  </w:tcBorders>
+                </w:tcPr>
+                <w:p>
+                  <w:pPr>
+                    <w:spacing w:before="0" w:after="60"/>
+                    <w:keepNext/>
+                    <w:jc w:val="end"/>
+                  </w:pPr>
+                  <w:r>
+                    <w:rPr>
+                      <w:rFonts w:ascii="Calibri" w:hAnsi="Calibri"/>
+                      <w:sz w:val="20"/>
+                    </w:rPr>
+                    <w:t xml:space="default">2,000</w:t>
+                  </w:r>
+                </w:p>
+              </w:tc>
+              <w:tc>
+                <w:tcPr>
+                  <w:tcBorders>
+                    <w:top w:val="single" w:space="0" w:color="D3D3D3"/>
+                    <w:bottom w:val="single" w:space="0" w:color="D3D3D3"/>
+                    <w:start w:val="single" w:space="0" w:color="D3D3D3"/>
+                    <w:end w:val="single" w:space="0" w:color="D3D3D3"/>
+                  </w:tcBorders>
+                </w:tcPr>
+                <w:p>
+                  <w:pPr>
+                    <w:spacing w:before="0" w:after="60"/>
+                    <w:keepNext/>
+                    <w:jc w:val="end"/>
+                  </w:pPr>
+                  <w:r>
+                    <w:rPr>
+                      <w:rFonts w:ascii="Calibri" w:hAnsi="Calibri"/>
+                      <w:sz w:val="20"/>
+                    </w:rPr>
+                    <w:t xml:space="default">0.85</w:t>
+                  </w:r>
+                </w:p>
+              </w:tc>
+              <w:tc>
+                <w:tcPr>
+                  <w:tcBorders>
+                    <w:top w:val="single" w:space="0" w:color="D3D3D3"/>
+                    <w:bottom w:val="single" w:space="0" w:color="D3D3D3"/>
+                    <w:start w:val="single" w:space="0" w:color="D3D3D3"/>
+                    <w:end w:val="single" w:space="0" w:color="D3D3D3"/>
+                  </w:tcBorders>
+                </w:tcPr>
+                <w:p>
+                  <w:pPr>
+                    <w:spacing w:before="0" w:after="60"/>
+                    <w:keepNext/>
+                    <w:jc w:val="end"/>
+                  </w:pPr>
+                  <w:r>
+                    <w:rPr>
+                      <w:rFonts w:ascii="Calibri" w:hAnsi="Calibri"/>
+                      <w:sz w:val="20"/>
+                    </w:rPr>
+                    <w:t xml:space="default">1.2</w:t>
+                  </w:r>
+                </w:p>
+              </w:tc>
+              <w:tc>
+                <w:tcPr>
+                  <w:tcBorders>
+                    <w:top w:val="single" w:space="0" w:color="D3D3D3"/>
+                    <w:bottom w:val="single" w:space="0" w:color="D3D3D3"/>
+                    <w:start w:val="single" w:space="0" w:color="D3D3D3"/>
+                    <w:end w:val="single" w:space="0" w:color="D3D3D3"/>
+                  </w:tcBorders>
+                </w:tcPr>
+                <w:p>
+                  <w:pPr>
+                    <w:spacing w:before="0" w:after="60"/>
+                    <w:keepNext/>
+                    <w:jc w:val="start"/>
+                  </w:pPr>
+                  <w:r>
+                    <w:rPr>
+                      <w:rFonts w:ascii="Calibri" w:hAnsi="Calibri"/>
+                      <w:sz w:val="20"/>
+                    </w:rPr>
+                    <w:t xml:space="default">3 yrs</w:t>
+                  </w:r>
+                </w:p>
+              </w:tc>
+              <w:tc>
+                <w:tcPr>
+                  <w:tcBorders>
+                    <w:top w:val="single" w:space="0" w:color="D3D3D3"/>
+                    <w:bottom w:val="single" w:space="0" w:color="D3D3D3"/>
+                    <w:start w:val="single" w:space="0" w:color="D3D3D3"/>
+                    <w:end w:val="single" w:space="0" w:color="D3D3D3"/>
+                  </w:tcBorders>
+                </w:tcPr>
+                <w:p>
+                  <w:pPr>
+                    <w:spacing w:before="0" w:after="60"/>
+                    <w:keepNext/>
+                    <w:jc w:val="start"/>
+                  </w:pPr>
+                  <w:r>
+                    <w:rPr>
+                      <w:rFonts w:ascii="Calibri" w:hAnsi="Calibri"/>
+                      <w:sz w:val="20"/>
+                    </w:rPr>
+                    <w:t xml:space="default">All</w:t>
+                  </w:r>
+                </w:p>
+              </w:tc>
+              <w:tc>
+                <w:tcPr>
+                  <w:tcBorders>
+                    <w:top w:val="single" w:space="0" w:color="D3D3D3"/>
+                    <w:bottom w:val="single" w:space="0" w:color="D3D3D3"/>
+                    <w:start w:val="single" w:space="0" w:color="D3D3D3"/>
+                    <w:end w:val="single" w:space="0" w:color="D3D3D3"/>
+                  </w:tcBorders>
+                </w:tcPr>
+                <w:p>
+                  <w:pPr>
+                    <w:spacing w:before="0" w:after="60"/>
+                    <w:keepNext/>
+                    <w:jc w:val="start"/>
+                  </w:pPr>
+                  <w:r>
+                    <w:rPr>
+                      <w:rFonts w:ascii="Calibri" w:hAnsi="Calibri"/>
+                      <w:sz w:val="20"/>
+                    </w:rPr>
+                    <w:t xml:space="default">No</w:t>
+                  </w:r>
+                </w:p>
+              </w:tc>
+            </w:tr>
+            <w:tr>
+              <w:trPr>
+                <w:cantSplit/>
+              </w:trPr>
+              <w:tc>
+                <w:tcPr>
+                  <w:tcBorders>
+                    <w:top w:val="single" w:space="0" w:color="D3D3D3"/>
+                    <w:bottom w:val="single" w:space="0" w:color="D3D3D3"/>
+                    <w:start w:val="single" w:space="0" w:color="D3D3D3"/>
+                    <w:end w:val="single" w:space="0" w:color="D3D3D3"/>
+                  </w:tcBorders>
+                </w:tcPr>
+                <w:p>
+                  <w:pPr>
+                    <w:spacing w:before="0" w:after="60"/>
+                    <w:keepNext/>
+                    <w:jc w:val="start"/>
+                  </w:pPr>
+                  <w:r>
+                    <w:rPr>
+                      <w:rFonts w:ascii="Calibri" w:hAnsi="Calibri"/>
+                      <w:sz w:val="20"/>
+                    </w:rPr>
+                    <w:t xml:space="default">run16</w:t>
+                  </w:r>
+                </w:p>
+              </w:tc>
+              <w:tc>
+                <w:tcPr>
+                  <w:tcBorders>
+                    <w:top w:val="single" w:space="0" w:color="D3D3D3"/>
+                    <w:bottom w:val="single" w:space="0" w:color="D3D3D3"/>
+                    <w:start w:val="single" w:space="0" w:color="D3D3D3"/>
+                    <w:end w:val="single" w:space="0" w:color="D3D3D3"/>
+                  </w:tcBorders>
+                </w:tcPr>
+                <w:p>
+                  <w:pPr>
+                    <w:spacing w:before="0" w:after="60"/>
+                    <w:keepNext/>
+                    <w:jc w:val="start"/>
+                  </w:pPr>
+                  <w:r>
+                    <w:rPr>
+                      <w:rFonts w:ascii="Calibri" w:hAnsi="Calibri"/>
+                      <w:sz w:val="20"/>
+                    </w:rPr>
+                    <w:t xml:space="default">Base</w:t>
+                  </w:r>
+                </w:p>
+              </w:tc>
+              <w:tc>
+                <w:tcPr>
+                  <w:tcBorders>
+                    <w:top w:val="single" w:space="0" w:color="D3D3D3"/>
+                    <w:bottom w:val="single" w:space="0" w:color="D3D3D3"/>
+                    <w:start w:val="single" w:space="0" w:color="D3D3D3"/>
+                    <w:end w:val="single" w:space="0" w:color="D3D3D3"/>
+                  </w:tcBorders>
+                </w:tcPr>
+                <w:p>
+                  <w:pPr>
+                    <w:spacing w:before="0" w:after="60"/>
+                    <w:keepNext/>
+                    <w:jc w:val="end"/>
+                  </w:pPr>
+                  <w:r>
+                    <w:rPr>
+                      <w:rFonts w:ascii="Calibri" w:hAnsi="Calibri"/>
+                      <w:sz w:val="20"/>
+                    </w:rPr>
+                    <w:t xml:space="default">0</w:t>
+                  </w:r>
+                </w:p>
+              </w:tc>
+              <w:tc>
+                <w:tcPr>
+                  <w:tcBorders>
+                    <w:top w:val="single" w:space="0" w:color="D3D3D3"/>
+                    <w:bottom w:val="single" w:space="0" w:color="D3D3D3"/>
+                    <w:start w:val="single" w:space="0" w:color="D3D3D3"/>
+                    <w:end w:val="single" w:space="0" w:color="D3D3D3"/>
+                  </w:tcBorders>
+                </w:tcPr>
+                <w:p>
+                  <w:pPr>
+                    <w:spacing w:before="0" w:after="60"/>
+                    <w:keepNext/>
+                    <w:jc w:val="end"/>
+                  </w:pPr>
+                  <w:r>
+                    <w:rPr>
+                      <w:rFonts w:ascii="Calibri" w:hAnsi="Calibri"/>
+                      <w:sz w:val="20"/>
+                    </w:rPr>
+                    <w:t xml:space="default">0</w:t>
+                  </w:r>
+                </w:p>
+              </w:tc>
+              <w:tc>
+                <w:tcPr>
+                  <w:tcBorders>
+                    <w:top w:val="single" w:space="0" w:color="D3D3D3"/>
+                    <w:bottom w:val="single" w:space="0" w:color="D3D3D3"/>
+                    <w:start w:val="single" w:space="0" w:color="D3D3D3"/>
+                    <w:end w:val="single" w:space="0" w:color="D3D3D3"/>
+                  </w:tcBorders>
+                </w:tcPr>
+                <w:p>
+                  <w:pPr>
+                    <w:spacing w:before="0" w:after="60"/>
+                    <w:keepNext/>
+                    <w:jc w:val="start"/>
+                  </w:pPr>
+                  <w:r>
+                    <w:rPr>
+                      <w:rFonts w:ascii="Calibri" w:hAnsi="Calibri"/>
+                      <w:sz w:val="20"/>
+                    </w:rPr>
+                    <w:t xml:space="default">Tuned</w:t>
+                  </w:r>
+                </w:p>
+              </w:tc>
+              <w:tc>
+                <w:tcPr>
+                  <w:tcBorders>
+                    <w:top w:val="single" w:space="0" w:color="D3D3D3"/>
+                    <w:bottom w:val="single" w:space="0" w:color="D3D3D3"/>
+                    <w:start w:val="single" w:space="0" w:color="D3D3D3"/>
+                    <w:end w:val="single" w:space="0" w:color="D3D3D3"/>
+                  </w:tcBorders>
+                </w:tcPr>
+                <w:p>
+                  <w:pPr>
+                    <w:spacing w:before="0" w:after="60"/>
+                    <w:keepNext/>
+                    <w:jc w:val="end"/>
+                  </w:pPr>
+                  <w:r>
+                    <w:rPr>
+                      <w:rFonts w:ascii="Calibri" w:hAnsi="Calibri"/>
+                      <w:sz w:val="20"/>
+                    </w:rPr>
+                    <w:t xml:space="default">2,000</w:t>
+                  </w:r>
+                </w:p>
+              </w:tc>
+              <w:tc>
+                <w:tcPr>
+                  <w:tcBorders>
+                    <w:top w:val="single" w:space="0" w:color="D3D3D3"/>
+                    <w:bottom w:val="single" w:space="0" w:color="D3D3D3"/>
+                    <w:start w:val="single" w:space="0" w:color="D3D3D3"/>
+                    <w:end w:val="single" w:space="0" w:color="D3D3D3"/>
+                  </w:tcBorders>
+                </w:tcPr>
+                <w:p>
+                  <w:pPr>
+                    <w:spacing w:before="0" w:after="60"/>
+                    <w:keepNext/>
+                    <w:jc w:val="end"/>
+                  </w:pPr>
+                  <w:r>
+                    <w:rPr>
+                      <w:rFonts w:ascii="Calibri" w:hAnsi="Calibri"/>
+                      <w:sz w:val="20"/>
+                    </w:rPr>
+                    <w:t xml:space="default">0.85</w:t>
+                  </w:r>
+                </w:p>
+              </w:tc>
+              <w:tc>
+                <w:tcPr>
+                  <w:tcBorders>
+                    <w:top w:val="single" w:space="0" w:color="D3D3D3"/>
+                    <w:bottom w:val="single" w:space="0" w:color="D3D3D3"/>
+                    <w:start w:val="single" w:space="0" w:color="D3D3D3"/>
+                    <w:end w:val="single" w:space="0" w:color="D3D3D3"/>
+                  </w:tcBorders>
+                </w:tcPr>
+                <w:p>
+                  <w:pPr>
+                    <w:spacing w:before="0" w:after="60"/>
+                    <w:keepNext/>
+                    <w:jc w:val="end"/>
+                  </w:pPr>
+                  <w:r>
+                    <w:rPr>
+                      <w:rFonts w:ascii="Calibri" w:hAnsi="Calibri"/>
+                      <w:sz w:val="20"/>
+                    </w:rPr>
+                    <w:t xml:space="default">1.15</w:t>
+                  </w:r>
+                </w:p>
+              </w:tc>
+              <w:tc>
+                <w:tcPr>
+                  <w:tcBorders>
+                    <w:top w:val="single" w:space="0" w:color="D3D3D3"/>
+                    <w:bottom w:val="single" w:space="0" w:color="D3D3D3"/>
+                    <w:start w:val="single" w:space="0" w:color="D3D3D3"/>
+                    <w:end w:val="single" w:space="0" w:color="D3D3D3"/>
+                  </w:tcBorders>
+                </w:tcPr>
+                <w:p>
+                  <w:pPr>
+                    <w:spacing w:before="0" w:after="60"/>
+                    <w:keepNext/>
+                    <w:jc w:val="start"/>
+                  </w:pPr>
+                  <w:r>
+                    <w:rPr>
+                      <w:rFonts w:ascii="Calibri" w:hAnsi="Calibri"/>
+                      <w:sz w:val="20"/>
+                    </w:rPr>
+                    <w:t xml:space="default">3 yrs</w:t>
+                  </w:r>
+                </w:p>
+              </w:tc>
+              <w:tc>
+                <w:tcPr>
+                  <w:tcBorders>
+                    <w:top w:val="single" w:space="0" w:color="D3D3D3"/>
+                    <w:bottom w:val="single" w:space="0" w:color="D3D3D3"/>
+                    <w:start w:val="single" w:space="0" w:color="D3D3D3"/>
+                    <w:end w:val="single" w:space="0" w:color="D3D3D3"/>
+                  </w:tcBorders>
+                </w:tcPr>
+                <w:p>
+                  <w:pPr>
+                    <w:spacing w:before="0" w:after="60"/>
+                    <w:keepNext/>
+                    <w:jc w:val="start"/>
+                  </w:pPr>
+                  <w:r>
+                    <w:rPr>
+                      <w:rFonts w:ascii="Calibri" w:hAnsi="Calibri"/>
+                      <w:sz w:val="20"/>
+                    </w:rPr>
+                    <w:t xml:space="default">All</w:t>
+                  </w:r>
+                </w:p>
+              </w:tc>
+              <w:tc>
+                <w:tcPr>
+                  <w:tcBorders>
+                    <w:top w:val="single" w:space="0" w:color="D3D3D3"/>
+                    <w:bottom w:val="single" w:space="0" w:color="D3D3D3"/>
+                    <w:start w:val="single" w:space="0" w:color="D3D3D3"/>
+                    <w:end w:val="single" w:space="0" w:color="D3D3D3"/>
+                  </w:tcBorders>
+                </w:tcPr>
+                <w:p>
+                  <w:pPr>
+                    <w:spacing w:before="0" w:after="60"/>
+                    <w:keepNext/>
+                    <w:jc w:val="start"/>
+                  </w:pPr>
+                  <w:r>
+                    <w:rPr>
+                      <w:rFonts w:ascii="Calibri" w:hAnsi="Calibri"/>
+                      <w:sz w:val="20"/>
+                    </w:rPr>
+                    <w:t xml:space="default">No</w:t>
+                  </w:r>
+                </w:p>
+              </w:tc>
+            </w:tr>
+            <w:tr>
+              <w:trPr>
+                <w:cantSplit/>
+              </w:trPr>
+              <w:tc>
+                <w:tcPr>
+                  <w:tcBorders>
+                    <w:top w:val="single" w:space="0" w:color="D3D3D3"/>
+                    <w:bottom w:val="single" w:space="0" w:color="D3D3D3"/>
+                    <w:start w:val="single" w:space="0" w:color="D3D3D3"/>
+                    <w:end w:val="single" w:space="0" w:color="D3D3D3"/>
+                  </w:tcBorders>
+                </w:tcPr>
+                <w:p>
+                  <w:pPr>
+                    <w:spacing w:before="0" w:after="60"/>
+                    <w:keepNext/>
+                    <w:jc w:val="start"/>
+                  </w:pPr>
+                  <w:r>
+                    <w:rPr>
+                      <w:rFonts w:ascii="Calibri" w:hAnsi="Calibri"/>
+                      <w:sz w:val="20"/>
+                    </w:rPr>
+                    <w:t xml:space="default">run17</w:t>
+                  </w:r>
+                </w:p>
+              </w:tc>
+              <w:tc>
+                <w:tcPr>
+                  <w:tcBorders>
+                    <w:top w:val="single" w:space="0" w:color="D3D3D3"/>
+                    <w:bottom w:val="single" w:space="0" w:color="D3D3D3"/>
+                    <w:start w:val="single" w:space="0" w:color="D3D3D3"/>
+                    <w:end w:val="single" w:space="0" w:color="D3D3D3"/>
+                  </w:tcBorders>
+                </w:tcPr>
+                <w:p>
+                  <w:pPr>
+                    <w:spacing w:before="0" w:after="60"/>
+                    <w:keepNext/>
+                    <w:jc w:val="start"/>
+                  </w:pPr>
+                  <w:r>
+                    <w:rPr>
+                      <w:rFonts w:ascii="Calibri" w:hAnsi="Calibri"/>
+                      <w:sz w:val="20"/>
+                    </w:rPr>
+                    <w:t xml:space="default">Base+</w:t>
+                  </w:r>
+                </w:p>
+              </w:tc>
+              <w:tc>
+                <w:tcPr>
+                  <w:tcBorders>
+                    <w:top w:val="single" w:space="0" w:color="D3D3D3"/>
+                    <w:bottom w:val="single" w:space="0" w:color="D3D3D3"/>
+                    <w:start w:val="single" w:space="0" w:color="D3D3D3"/>
+                    <w:end w:val="single" w:space="0" w:color="D3D3D3"/>
+                  </w:tcBorders>
+                </w:tcPr>
+                <w:p>
+                  <w:pPr>
+                    <w:spacing w:before="0" w:after="60"/>
+                    <w:keepNext/>
+                    <w:jc w:val="end"/>
+                  </w:pPr>
+                  <w:r>
+                    <w:rPr>
+                      <w:rFonts w:ascii="Calibri" w:hAnsi="Calibri"/>
+                      <w:sz w:val="20"/>
+                    </w:rPr>
+                    <w:t xml:space="default">0</w:t>
+                  </w:r>
+                </w:p>
+              </w:tc>
+              <w:tc>
+                <w:tcPr>
+                  <w:tcBorders>
+                    <w:top w:val="single" w:space="0" w:color="D3D3D3"/>
+                    <w:bottom w:val="single" w:space="0" w:color="D3D3D3"/>
+                    <w:start w:val="single" w:space="0" w:color="D3D3D3"/>
+                    <w:end w:val="single" w:space="0" w:color="D3D3D3"/>
+                  </w:tcBorders>
+                </w:tcPr>
+                <w:p>
+                  <w:pPr>
+                    <w:spacing w:before="0" w:after="60"/>
+                    <w:keepNext/>
+                    <w:jc w:val="end"/>
+                  </w:pPr>
+                  <w:r>
+                    <w:rPr>
+                      <w:rFonts w:ascii="Calibri" w:hAnsi="Calibri"/>
+                      <w:sz w:val="20"/>
+                    </w:rPr>
+                    <w:t xml:space="default">0</w:t>
+                  </w:r>
+                </w:p>
+              </w:tc>
+              <w:tc>
+                <w:tcPr>
+                  <w:tcBorders>
+                    <w:top w:val="single" w:space="0" w:color="D3D3D3"/>
+                    <w:bottom w:val="single" w:space="0" w:color="D3D3D3"/>
+                    <w:start w:val="single" w:space="0" w:color="D3D3D3"/>
+                    <w:end w:val="single" w:space="0" w:color="D3D3D3"/>
+                  </w:tcBorders>
+                </w:tcPr>
+                <w:p>
+                  <w:pPr>
+                    <w:spacing w:before="0" w:after="60"/>
+                    <w:keepNext/>
+                    <w:jc w:val="start"/>
+                  </w:pPr>
+                  <w:r>
+                    <w:rPr>
+                      <w:rFonts w:ascii="Calibri" w:hAnsi="Calibri"/>
+                      <w:sz w:val="20"/>
+                    </w:rPr>
+                    <w:t xml:space="default">Tuned</w:t>
+                  </w:r>
+                </w:p>
+              </w:tc>
+              <w:tc>
+                <w:tcPr>
+                  <w:tcBorders>
+                    <w:top w:val="single" w:space="0" w:color="D3D3D3"/>
+                    <w:bottom w:val="single" w:space="0" w:color="D3D3D3"/>
+                    <w:start w:val="single" w:space="0" w:color="D3D3D3"/>
+                    <w:end w:val="single" w:space="0" w:color="D3D3D3"/>
+                  </w:tcBorders>
+                </w:tcPr>
+                <w:p>
+                  <w:pPr>
+                    <w:spacing w:before="0" w:after="60"/>
+                    <w:keepNext/>
+                    <w:jc w:val="end"/>
+                  </w:pPr>
+                  <w:r>
+                    <w:rPr>
+                      <w:rFonts w:ascii="Calibri" w:hAnsi="Calibri"/>
+                      <w:sz w:val="20"/>
+                    </w:rPr>
+                    <w:t xml:space="default">3,500</w:t>
+                  </w:r>
+                </w:p>
+              </w:tc>
+              <w:tc>
+                <w:tcPr>
+                  <w:tcBorders>
+                    <w:top w:val="single" w:space="0" w:color="D3D3D3"/>
+                    <w:bottom w:val="single" w:space="0" w:color="D3D3D3"/>
+                    <w:start w:val="single" w:space="0" w:color="D3D3D3"/>
+                    <w:end w:val="single" w:space="0" w:color="D3D3D3"/>
+                  </w:tcBorders>
+                </w:tcPr>
+                <w:p>
+                  <w:pPr>
+                    <w:spacing w:before="0" w:after="60"/>
+                    <w:keepNext/>
+                    <w:jc w:val="end"/>
+                  </w:pPr>
+                  <w:r>
+                    <w:rPr>
+                      <w:rFonts w:ascii="Calibri" w:hAnsi="Calibri"/>
+                      <w:sz w:val="20"/>
+                    </w:rPr>
+                    <w:t xml:space="default">0.85</w:t>
+                  </w:r>
+                </w:p>
+              </w:tc>
+              <w:tc>
+                <w:tcPr>
+                  <w:tcBorders>
+                    <w:top w:val="single" w:space="0" w:color="D3D3D3"/>
+                    <w:bottom w:val="single" w:space="0" w:color="D3D3D3"/>
+                    <w:start w:val="single" w:space="0" w:color="D3D3D3"/>
+                    <w:end w:val="single" w:space="0" w:color="D3D3D3"/>
+                  </w:tcBorders>
+                </w:tcPr>
+                <w:p>
+                  <w:pPr>
+                    <w:spacing w:before="0" w:after="60"/>
+                    <w:keepNext/>
+                    <w:jc w:val="end"/>
+                  </w:pPr>
+                  <w:r>
+                    <w:rPr>
+                      <w:rFonts w:ascii="Calibri" w:hAnsi="Calibri"/>
+                      <w:sz w:val="20"/>
+                    </w:rPr>
+                    <w:t xml:space="default">1.15</w:t>
+                  </w:r>
+                </w:p>
+              </w:tc>
+              <w:tc>
+                <w:tcPr>
+                  <w:tcBorders>
+                    <w:top w:val="single" w:space="0" w:color="D3D3D3"/>
+                    <w:bottom w:val="single" w:space="0" w:color="D3D3D3"/>
+                    <w:start w:val="single" w:space="0" w:color="D3D3D3"/>
+                    <w:end w:val="single" w:space="0" w:color="D3D3D3"/>
+                  </w:tcBorders>
+                </w:tcPr>
+                <w:p>
+                  <w:pPr>
+                    <w:spacing w:before="0" w:after="60"/>
+                    <w:keepNext/>
+                    <w:jc w:val="start"/>
+                  </w:pPr>
+                  <w:r>
+                    <w:rPr>
+                      <w:rFonts w:ascii="Calibri" w:hAnsi="Calibri"/>
+                      <w:sz w:val="20"/>
+                    </w:rPr>
+                    <w:t xml:space="default">3 yrs</w:t>
+                  </w:r>
+                </w:p>
+              </w:tc>
+              <w:tc>
+                <w:tcPr>
+                  <w:tcBorders>
+                    <w:top w:val="single" w:space="0" w:color="D3D3D3"/>
+                    <w:bottom w:val="single" w:space="0" w:color="D3D3D3"/>
+                    <w:start w:val="single" w:space="0" w:color="D3D3D3"/>
+                    <w:end w:val="single" w:space="0" w:color="D3D3D3"/>
+                  </w:tcBorders>
+                </w:tcPr>
+                <w:p>
+                  <w:pPr>
+                    <w:spacing w:before="0" w:after="60"/>
+                    <w:keepNext/>
+                    <w:jc w:val="start"/>
+                  </w:pPr>
+                  <w:r>
+                    <w:rPr>
+                      <w:rFonts w:ascii="Calibri" w:hAnsi="Calibri"/>
+                      <w:sz w:val="20"/>
+                    </w:rPr>
+                    <w:t xml:space="default">All</w:t>
+                  </w:r>
+                </w:p>
+              </w:tc>
+              <w:tc>
+                <w:tcPr>
+                  <w:tcBorders>
+                    <w:top w:val="single" w:space="0" w:color="D3D3D3"/>
+                    <w:bottom w:val="single" w:space="0" w:color="D3D3D3"/>
+                    <w:start w:val="single" w:space="0" w:color="D3D3D3"/>
+                    <w:end w:val="single" w:space="0" w:color="D3D3D3"/>
+                  </w:tcBorders>
+                </w:tcPr>
+                <w:p>
+                  <w:pPr>
+                    <w:spacing w:before="0" w:after="60"/>
+                    <w:keepNext/>
+                    <w:jc w:val="start"/>
+                  </w:pPr>
+                  <w:r>
+                    <w:rPr>
+                      <w:rFonts w:ascii="Calibri" w:hAnsi="Calibri"/>
+                      <w:sz w:val="20"/>
+                    </w:rPr>
+                    <w:t xml:space="default">No</w:t>
+                  </w:r>
+                </w:p>
+              </w:tc>
+            </w:tr>
+            <w:tr>
+              <w:trPr>
+                <w:cantSplit/>
+              </w:trPr>
+              <w:tc>
+                <w:tcPr>
+                  <w:tcBorders>
+                    <w:top w:val="single" w:space="0" w:color="D3D3D3"/>
+                    <w:bottom w:val="single" w:space="0" w:color="D3D3D3"/>
+                    <w:start w:val="single" w:space="0" w:color="D3D3D3"/>
+                    <w:end w:val="single" w:space="0" w:color="D3D3D3"/>
+                  </w:tcBorders>
+                  <w:shd w:val="clear" w:color="auto" w:fill="F2F7EC"/>
+                </w:tcPr>
+                <w:p>
+                  <w:pPr>
+                    <w:spacing w:before="0" w:after="60"/>
+                    <w:keepNext/>
+                    <w:jc w:val="start"/>
+                  </w:pPr>
+                  <w:r>
+                    <w:rPr>
+                      <w:rFonts w:ascii="Calibri" w:hAnsi="Calibri"/>
+                      <w:sz w:val="20"/>
+                      <w:b w:val="true"/>
+                    </w:rPr>
+                    <w:t xml:space="default">run18</w:t>
+                  </w:r>
+                </w:p>
+              </w:tc>
+              <w:tc>
+                <w:tcPr>
+                  <w:tcBorders>
+                    <w:top w:val="single" w:space="0" w:color="D3D3D3"/>
+                    <w:bottom w:val="single" w:space="0" w:color="D3D3D3"/>
+                    <w:start w:val="single" w:space="0" w:color="D3D3D3"/>
+                    <w:end w:val="single" w:space="0" w:color="D3D3D3"/>
+                  </w:tcBorders>
+                  <w:shd w:val="clear" w:color="auto" w:fill="F2F7EC"/>
+                </w:tcPr>
+                <w:p>
+                  <w:pPr>
+                    <w:spacing w:before="0" w:after="60"/>
+                    <w:keepNext/>
+                    <w:jc w:val="start"/>
+                  </w:pPr>
+                  <w:r>
+                    <w:rPr>
+                      <w:rFonts w:ascii="Calibri" w:hAnsi="Calibri"/>
+                      <w:sz w:val="20"/>
+                      <w:b w:val="true"/>
+                    </w:rPr>
+                    <w:t xml:space="default">Base++</w:t>
+                  </w:r>
+                </w:p>
+              </w:tc>
+              <w:tc>
+                <w:tcPr>
+                  <w:tcBorders>
+                    <w:top w:val="single" w:space="0" w:color="D3D3D3"/>
+                    <w:bottom w:val="single" w:space="0" w:color="D3D3D3"/>
+                    <w:start w:val="single" w:space="0" w:color="D3D3D3"/>
+                    <w:end w:val="single" w:space="0" w:color="D3D3D3"/>
+                  </w:tcBorders>
+                  <w:shd w:val="clear" w:color="auto" w:fill="F2F7EC"/>
+                </w:tcPr>
+                <w:p>
+                  <w:pPr>
+                    <w:spacing w:before="0" w:after="60"/>
+                    <w:keepNext/>
+                    <w:jc w:val="end"/>
+                  </w:pPr>
+                  <w:r>
+                    <w:rPr>
+                      <w:rFonts w:ascii="Calibri" w:hAnsi="Calibri"/>
+                      <w:sz w:val="20"/>
+                      <w:b w:val="true"/>
+                    </w:rPr>
+                    <w:t xml:space="default">0</w:t>
+                  </w:r>
+                </w:p>
+              </w:tc>
+              <w:tc>
+                <w:tcPr>
+                  <w:tcBorders>
+                    <w:top w:val="single" w:space="0" w:color="D3D3D3"/>
+                    <w:bottom w:val="single" w:space="0" w:color="D3D3D3"/>
+                    <w:start w:val="single" w:space="0" w:color="D3D3D3"/>
+                    <w:end w:val="single" w:space="0" w:color="D3D3D3"/>
+                  </w:tcBorders>
+                  <w:shd w:val="clear" w:color="auto" w:fill="F2F7EC"/>
+                </w:tcPr>
+                <w:p>
+                  <w:pPr>
+                    <w:spacing w:before="0" w:after="60"/>
+                    <w:keepNext/>
+                    <w:jc w:val="end"/>
+                  </w:pPr>
+                  <w:r>
+                    <w:rPr>
+                      <w:rFonts w:ascii="Calibri" w:hAnsi="Calibri"/>
+                      <w:sz w:val="20"/>
+                      <w:b w:val="true"/>
+                    </w:rPr>
+                    <w:t xml:space="default">0</w:t>
+                  </w:r>
+                </w:p>
+              </w:tc>
+              <w:tc>
+                <w:tcPr>
+                  <w:tcBorders>
+                    <w:top w:val="single" w:space="0" w:color="D3D3D3"/>
+                    <w:bottom w:val="single" w:space="0" w:color="D3D3D3"/>
+                    <w:start w:val="single" w:space="0" w:color="D3D3D3"/>
+                    <w:end w:val="single" w:space="0" w:color="D3D3D3"/>
+                  </w:tcBorders>
+                  <w:shd w:val="clear" w:color="auto" w:fill="F2F7EC"/>
+                </w:tcPr>
+                <w:p>
+                  <w:pPr>
+                    <w:spacing w:before="0" w:after="60"/>
+                    <w:keepNext/>
+                    <w:jc w:val="start"/>
+                  </w:pPr>
+                  <w:r>
+                    <w:rPr>
+                      <w:rFonts w:ascii="Calibri" w:hAnsi="Calibri"/>
+                      <w:sz w:val="20"/>
+                      <w:b w:val="true"/>
+                    </w:rPr>
+                    <w:t xml:space="default">Tuned</w:t>
+                  </w:r>
+                </w:p>
+              </w:tc>
+              <w:tc>
+                <w:tcPr>
+                  <w:tcBorders>
+                    <w:top w:val="single" w:space="0" w:color="D3D3D3"/>
+                    <w:bottom w:val="single" w:space="0" w:color="D3D3D3"/>
+                    <w:start w:val="single" w:space="0" w:color="D3D3D3"/>
+                    <w:end w:val="single" w:space="0" w:color="D3D3D3"/>
+                  </w:tcBorders>
+                  <w:shd w:val="clear" w:color="auto" w:fill="F2F7EC"/>
+                </w:tcPr>
+                <w:p>
+                  <w:pPr>
+                    <w:spacing w:before="0" w:after="60"/>
+                    <w:keepNext/>
+                    <w:jc w:val="end"/>
+                  </w:pPr>
+                  <w:r>
+                    <w:rPr>
+                      <w:rFonts w:ascii="Calibri" w:hAnsi="Calibri"/>
+                      <w:sz w:val="20"/>
+                      <w:b w:val="true"/>
+                    </w:rPr>
+                    <w:t xml:space="default">5,000</w:t>
+                  </w:r>
+                </w:p>
+              </w:tc>
+              <w:tc>
+                <w:tcPr>
+                  <w:tcBorders>
+                    <w:top w:val="single" w:space="0" w:color="D3D3D3"/>
+                    <w:bottom w:val="single" w:space="0" w:color="D3D3D3"/>
+                    <w:start w:val="single" w:space="0" w:color="D3D3D3"/>
+                    <w:end w:val="single" w:space="0" w:color="D3D3D3"/>
+                  </w:tcBorders>
+                  <w:shd w:val="clear" w:color="auto" w:fill="F2F7EC"/>
+                </w:tcPr>
+                <w:p>
+                  <w:pPr>
+                    <w:spacing w:before="0" w:after="60"/>
+                    <w:keepNext/>
+                    <w:jc w:val="end"/>
+                  </w:pPr>
+                  <w:r>
+                    <w:rPr>
+                      <w:rFonts w:ascii="Calibri" w:hAnsi="Calibri"/>
+                      <w:sz w:val="20"/>
+                      <w:b w:val="true"/>
+                    </w:rPr>
+                    <w:t xml:space="default">0.85</w:t>
+                  </w:r>
+                </w:p>
+              </w:tc>
+              <w:tc>
+                <w:tcPr>
+                  <w:tcBorders>
+                    <w:top w:val="single" w:space="0" w:color="D3D3D3"/>
+                    <w:bottom w:val="single" w:space="0" w:color="D3D3D3"/>
+                    <w:start w:val="single" w:space="0" w:color="D3D3D3"/>
+                    <w:end w:val="single" w:space="0" w:color="D3D3D3"/>
+                  </w:tcBorders>
+                  <w:shd w:val="clear" w:color="auto" w:fill="F2F7EC"/>
+                </w:tcPr>
+                <w:p>
+                  <w:pPr>
+                    <w:spacing w:before="0" w:after="60"/>
+                    <w:keepNext/>
+                    <w:jc w:val="end"/>
+                  </w:pPr>
+                  <w:r>
+                    <w:rPr>
+                      <w:rFonts w:ascii="Calibri" w:hAnsi="Calibri"/>
+                      <w:sz w:val="20"/>
+                      <w:b w:val="true"/>
+                    </w:rPr>
+                    <w:t xml:space="default">1.15</w:t>
+                  </w:r>
+                </w:p>
+              </w:tc>
+              <w:tc>
+                <w:tcPr>
+                  <w:tcBorders>
+                    <w:top w:val="single" w:space="0" w:color="D3D3D3"/>
+                    <w:bottom w:val="single" w:space="0" w:color="D3D3D3"/>
+                    <w:start w:val="single" w:space="0" w:color="D3D3D3"/>
+                    <w:end w:val="single" w:space="0" w:color="D3D3D3"/>
+                  </w:tcBorders>
+                  <w:shd w:val="clear" w:color="auto" w:fill="F2F7EC"/>
+                </w:tcPr>
+                <w:p>
+                  <w:pPr>
+                    <w:spacing w:before="0" w:after="60"/>
+                    <w:keepNext/>
+                    <w:jc w:val="start"/>
+                  </w:pPr>
+                  <w:r>
+                    <w:rPr>
+                      <w:rFonts w:ascii="Calibri" w:hAnsi="Calibri"/>
+                      <w:sz w:val="20"/>
+                      <w:b w:val="true"/>
+                    </w:rPr>
+                    <w:t xml:space="default">3 yrs</w:t>
+                  </w:r>
+                </w:p>
+              </w:tc>
+              <w:tc>
+                <w:tcPr>
+                  <w:tcBorders>
+                    <w:top w:val="single" w:space="0" w:color="D3D3D3"/>
+                    <w:bottom w:val="single" w:space="0" w:color="D3D3D3"/>
+                    <w:start w:val="single" w:space="0" w:color="D3D3D3"/>
+                    <w:end w:val="single" w:space="0" w:color="D3D3D3"/>
+                  </w:tcBorders>
+                  <w:shd w:val="clear" w:color="auto" w:fill="F2F7EC"/>
+                </w:tcPr>
+                <w:p>
+                  <w:pPr>
+                    <w:spacing w:before="0" w:after="60"/>
+                    <w:keepNext/>
+                    <w:jc w:val="start"/>
+                  </w:pPr>
+                  <w:r>
+                    <w:rPr>
+                      <w:rFonts w:ascii="Calibri" w:hAnsi="Calibri"/>
+                      <w:sz w:val="20"/>
+                      <w:b w:val="true"/>
+                    </w:rPr>
+                    <w:t xml:space="default">All</w:t>
+                  </w:r>
+                </w:p>
+              </w:tc>
+              <w:tc>
+                <w:tcPr>
+                  <w:tcBorders>
+                    <w:top w:val="single" w:space="0" w:color="D3D3D3"/>
+                    <w:bottom w:val="single" w:space="0" w:color="D3D3D3"/>
+                    <w:start w:val="single" w:space="0" w:color="D3D3D3"/>
+                    <w:end w:val="single" w:space="0" w:color="D3D3D3"/>
+                  </w:tcBorders>
+                  <w:shd w:val="clear" w:color="auto" w:fill="F2F7EC"/>
+                </w:tcPr>
+                <w:p>
+                  <w:pPr>
+                    <w:spacing w:before="0" w:after="60"/>
+                    <w:keepNext/>
+                    <w:jc w:val="start"/>
+                  </w:pPr>
+                  <w:r>
+                    <w:rPr>
+                      <w:rFonts w:ascii="Calibri" w:hAnsi="Calibri"/>
+                      <w:sz w:val="20"/>
+                      <w:b w:val="true"/>
+                    </w:rPr>
+                    <w:t xml:space="default">Yes</w:t>
+                  </w:r>
+                </w:p>
+              </w:tc>
+            </w:tr>
+            <w:tr>
+              <w:trPr>
+                <w:cantSplit/>
+              </w:trPr>
+              <w:tc>
+                <w:tcPr>
+                  <w:tcBorders>
+                    <w:top w:val="single" w:space="0" w:color="D3D3D3"/>
+                    <w:bottom w:val="single" w:space="0" w:color="D3D3D3"/>
+                    <w:start w:val="single" w:space="0" w:color="D3D3D3"/>
+                    <w:end w:val="single" w:space="0" w:color="D3D3D3"/>
+                  </w:tcBorders>
+                </w:tcPr>
+                <w:p>
+                  <w:pPr>
+                    <w:spacing w:before="0" w:after="60"/>
+                    <w:keepNext/>
+                    <w:jc w:val="start"/>
+                  </w:pPr>
+                  <w:r>
+                    <w:rPr>
+                      <w:rFonts w:ascii="Calibri" w:hAnsi="Calibri"/>
+                      <w:sz w:val="20"/>
+                    </w:rPr>
+                    <w:t xml:space="default">run19</w:t>
+                  </w:r>
+                </w:p>
+              </w:tc>
+              <w:tc>
+                <w:tcPr>
+                  <w:tcBorders>
+                    <w:top w:val="single" w:space="0" w:color="D3D3D3"/>
+                    <w:bottom w:val="single" w:space="0" w:color="D3D3D3"/>
+                    <w:start w:val="single" w:space="0" w:color="D3D3D3"/>
+                    <w:end w:val="single" w:space="0" w:color="D3D3D3"/>
+                  </w:tcBorders>
+                </w:tcPr>
+                <w:p>
+                  <w:pPr>
+                    <w:spacing w:before="0" w:after="60"/>
+                    <w:keepNext/>
+                    <w:jc w:val="start"/>
+                  </w:pPr>
+                  <w:r>
+                    <w:rPr>
+                      <w:rFonts w:ascii="Calibri" w:hAnsi="Calibri"/>
+                      <w:sz w:val="20"/>
+                    </w:rPr>
+                    <w:t xml:space="default">Chile</w:t>
+                  </w:r>
+                </w:p>
+              </w:tc>
+              <w:tc>
+                <w:tcPr>
+                  <w:tcBorders>
+                    <w:top w:val="single" w:space="0" w:color="D3D3D3"/>
+                    <w:bottom w:val="single" w:space="0" w:color="D3D3D3"/>
+                    <w:start w:val="single" w:space="0" w:color="D3D3D3"/>
+                    <w:end w:val="single" w:space="0" w:color="D3D3D3"/>
+                  </w:tcBorders>
+                </w:tcPr>
+                <w:p>
+                  <w:pPr>
+                    <w:spacing w:before="0" w:after="60"/>
+                    <w:keepNext/>
+                    <w:jc w:val="end"/>
+                  </w:pPr>
+                  <w:r>
+                    <w:rPr>
+                      <w:rFonts w:ascii="Calibri" w:hAnsi="Calibri"/>
+                      <w:sz w:val="20"/>
+                    </w:rPr>
+                    <w:t xml:space="default">270</w:t>
+                  </w:r>
+                </w:p>
+              </w:tc>
+              <w:tc>
+                <w:tcPr>
+                  <w:tcBorders>
+                    <w:top w:val="single" w:space="0" w:color="D3D3D3"/>
+                    <w:bottom w:val="single" w:space="0" w:color="D3D3D3"/>
+                    <w:start w:val="single" w:space="0" w:color="D3D3D3"/>
+                    <w:end w:val="single" w:space="0" w:color="D3D3D3"/>
+                  </w:tcBorders>
+                </w:tcPr>
+                <w:p>
+                  <w:pPr>
+                    <w:spacing w:before="0" w:after="60"/>
+                    <w:keepNext/>
+                    <w:jc w:val="end"/>
+                  </w:pPr>
+                  <w:r>
+                    <w:rPr>
+                      <w:rFonts w:ascii="Calibri" w:hAnsi="Calibri"/>
+                      <w:sz w:val="20"/>
+                    </w:rPr>
+                    <w:t xml:space="default">0.1</w:t>
+                  </w:r>
+                </w:p>
+              </w:tc>
+              <w:tc>
+                <w:tcPr>
+                  <w:tcBorders>
+                    <w:top w:val="single" w:space="0" w:color="D3D3D3"/>
+                    <w:bottom w:val="single" w:space="0" w:color="D3D3D3"/>
+                    <w:start w:val="single" w:space="0" w:color="D3D3D3"/>
+                    <w:end w:val="single" w:space="0" w:color="D3D3D3"/>
+                  </w:tcBorders>
+                </w:tcPr>
+                <w:p>
+                  <w:pPr>
+                    <w:spacing w:before="0" w:after="60"/>
+                    <w:keepNext/>
+                    <w:jc w:val="start"/>
+                  </w:pPr>
+                  <w:r>
+                    <w:rPr>
+                      <w:rFonts w:ascii="Calibri" w:hAnsi="Calibri"/>
+                      <w:sz w:val="20"/>
+                    </w:rPr>
+                    <w:t xml:space="default">Tuned</w:t>
+                  </w:r>
+                </w:p>
+              </w:tc>
+              <w:tc>
+                <w:tcPr>
+                  <w:tcBorders>
+                    <w:top w:val="single" w:space="0" w:color="D3D3D3"/>
+                    <w:bottom w:val="single" w:space="0" w:color="D3D3D3"/>
+                    <w:start w:val="single" w:space="0" w:color="D3D3D3"/>
+                    <w:end w:val="single" w:space="0" w:color="D3D3D3"/>
+                  </w:tcBorders>
+                </w:tcPr>
+                <w:p>
+                  <w:pPr>
+                    <w:spacing w:before="0" w:after="60"/>
+                    <w:keepNext/>
+                    <w:jc w:val="end"/>
+                  </w:pPr>
+                  <w:r>
+                    <w:rPr>
+                      <w:rFonts w:ascii="Calibri" w:hAnsi="Calibri"/>
+                      <w:sz w:val="20"/>
+                    </w:rPr>
+                    <w:t xml:space="default">1,500</w:t>
+                  </w:r>
+                </w:p>
+              </w:tc>
+              <w:tc>
+                <w:tcPr>
+                  <w:tcBorders>
+                    <w:top w:val="single" w:space="0" w:color="D3D3D3"/>
+                    <w:bottom w:val="single" w:space="0" w:color="D3D3D3"/>
+                    <w:start w:val="single" w:space="0" w:color="D3D3D3"/>
+                    <w:end w:val="single" w:space="0" w:color="D3D3D3"/>
+                  </w:tcBorders>
+                </w:tcPr>
+                <w:p>
+                  <w:pPr>
+                    <w:spacing w:before="0" w:after="60"/>
+                    <w:keepNext/>
+                    <w:jc w:val="end"/>
+                  </w:pPr>
+                  <w:r>
+                    <w:rPr>
+                      <w:rFonts w:ascii="Calibri" w:hAnsi="Calibri"/>
+                      <w:sz w:val="20"/>
+                    </w:rPr>
+                    <w:t xml:space="default">0.85</w:t>
+                  </w:r>
+                </w:p>
+              </w:tc>
+              <w:tc>
+                <w:tcPr>
+                  <w:tcBorders>
+                    <w:top w:val="single" w:space="0" w:color="D3D3D3"/>
+                    <w:bottom w:val="single" w:space="0" w:color="D3D3D3"/>
+                    <w:start w:val="single" w:space="0" w:color="D3D3D3"/>
+                    <w:end w:val="single" w:space="0" w:color="D3D3D3"/>
+                  </w:tcBorders>
+                </w:tcPr>
+                <w:p>
+                  <w:pPr>
+                    <w:spacing w:before="0" w:after="60"/>
+                    <w:keepNext/>
+                    <w:jc w:val="end"/>
+                  </w:pPr>
+                  <w:r>
+                    <w:rPr>
+                      <w:rFonts w:ascii="Calibri" w:hAnsi="Calibri"/>
+                      <w:sz w:val="20"/>
+                    </w:rPr>
+                    <w:t xml:space="default">1.2</w:t>
+                  </w:r>
+                </w:p>
+              </w:tc>
+              <w:tc>
+                <w:tcPr>
+                  <w:tcBorders>
+                    <w:top w:val="single" w:space="0" w:color="D3D3D3"/>
+                    <w:bottom w:val="single" w:space="0" w:color="D3D3D3"/>
+                    <w:start w:val="single" w:space="0" w:color="D3D3D3"/>
+                    <w:end w:val="single" w:space="0" w:color="D3D3D3"/>
+                  </w:tcBorders>
+                </w:tcPr>
+                <w:p>
+                  <w:pPr>
+                    <w:spacing w:before="0" w:after="60"/>
+                    <w:keepNext/>
+                    <w:jc w:val="start"/>
+                  </w:pPr>
+                  <w:r>
+                    <w:rPr>
+                      <w:rFonts w:ascii="Calibri" w:hAnsi="Calibri"/>
+                      <w:sz w:val="20"/>
+                    </w:rPr>
+                    <w:t xml:space="default">3 yrs</w:t>
+                  </w:r>
+                </w:p>
+              </w:tc>
+              <w:tc>
+                <w:tcPr>
+                  <w:tcBorders>
+                    <w:top w:val="single" w:space="0" w:color="D3D3D3"/>
+                    <w:bottom w:val="single" w:space="0" w:color="D3D3D3"/>
+                    <w:start w:val="single" w:space="0" w:color="D3D3D3"/>
+                    <w:end w:val="single" w:space="0" w:color="D3D3D3"/>
+                  </w:tcBorders>
+                </w:tcPr>
+                <w:p>
+                  <w:pPr>
+                    <w:spacing w:before="0" w:after="60"/>
+                    <w:keepNext/>
+                    <w:jc w:val="start"/>
+                  </w:pPr>
+                  <w:r>
+                    <w:rPr>
+                      <w:rFonts w:ascii="Calibri" w:hAnsi="Calibri"/>
+                      <w:sz w:val="20"/>
+                    </w:rPr>
+                    <w:t xml:space="default">All</w:t>
+                  </w:r>
+                </w:p>
+              </w:tc>
+              <w:tc>
+                <w:tcPr>
+                  <w:tcBorders>
+                    <w:top w:val="single" w:space="0" w:color="D3D3D3"/>
+                    <w:bottom w:val="single" w:space="0" w:color="D3D3D3"/>
+                    <w:start w:val="single" w:space="0" w:color="D3D3D3"/>
+                    <w:end w:val="single" w:space="0" w:color="D3D3D3"/>
+                  </w:tcBorders>
+                </w:tcPr>
+                <w:p>
+                  <w:pPr>
+                    <w:spacing w:before="0" w:after="60"/>
+                    <w:keepNext/>
+                    <w:jc w:val="start"/>
+                  </w:pPr>
+                  <w:r>
+                    <w:rPr>
+                      <w:rFonts w:ascii="Calibri" w:hAnsi="Calibri"/>
+                      <w:sz w:val="20"/>
+                    </w:rPr>
+                    <w:t xml:space="default">No</w:t>
+                  </w:r>
+                </w:p>
+              </w:tc>
+            </w:tr>
+            <w:tr>
+              <w:trPr>
+                <w:cantSplit/>
+              </w:trPr>
+              <w:tc>
+                <w:tcPr>
+                  <w:tcBorders>
+                    <w:top w:val="single" w:space="0" w:color="D3D3D3"/>
+                    <w:bottom w:val="single" w:space="0" w:color="D3D3D3"/>
+                    <w:start w:val="single" w:space="0" w:color="D3D3D3"/>
+                    <w:end w:val="single" w:space="0" w:color="D3D3D3"/>
+                  </w:tcBorders>
+                  <w:shd w:val="clear" w:color="auto" w:fill="F2F7EC"/>
+                </w:tcPr>
+                <w:p>
+                  <w:pPr>
+                    <w:spacing w:before="0" w:after="60"/>
+                    <w:keepNext/>
+                    <w:jc w:val="start"/>
+                  </w:pPr>
+                  <w:r>
+                    <w:rPr>
+                      <w:rFonts w:ascii="Calibri" w:hAnsi="Calibri"/>
+                      <w:sz w:val="20"/>
+                      <w:b w:val="true"/>
+                    </w:rPr>
+                    <w:t xml:space="default">run20</w:t>
+                  </w:r>
+                </w:p>
+              </w:tc>
+              <w:tc>
+                <w:tcPr>
+                  <w:tcBorders>
+                    <w:top w:val="single" w:space="0" w:color="D3D3D3"/>
+                    <w:bottom w:val="single" w:space="0" w:color="D3D3D3"/>
+                    <w:start w:val="single" w:space="0" w:color="D3D3D3"/>
+                    <w:end w:val="single" w:space="0" w:color="D3D3D3"/>
+                  </w:tcBorders>
+                  <w:shd w:val="clear" w:color="auto" w:fill="F2F7EC"/>
+                </w:tcPr>
+                <w:p>
+                  <w:pPr>
+                    <w:spacing w:before="0" w:after="60"/>
+                    <w:keepNext/>
+                    <w:jc w:val="start"/>
+                  </w:pPr>
+                  <w:r>
+                    <w:rPr>
+                      <w:rFonts w:ascii="Calibri" w:hAnsi="Calibri"/>
+                      <w:sz w:val="20"/>
+                      <w:b w:val="true"/>
+                    </w:rPr>
+                    <w:t xml:space="default">Chile</w:t>
+                  </w:r>
+                </w:p>
+              </w:tc>
+              <w:tc>
+                <w:tcPr>
+                  <w:tcBorders>
+                    <w:top w:val="single" w:space="0" w:color="D3D3D3"/>
+                    <w:bottom w:val="single" w:space="0" w:color="D3D3D3"/>
+                    <w:start w:val="single" w:space="0" w:color="D3D3D3"/>
+                    <w:end w:val="single" w:space="0" w:color="D3D3D3"/>
+                  </w:tcBorders>
+                  <w:shd w:val="clear" w:color="auto" w:fill="F2F7EC"/>
+                </w:tcPr>
+                <w:p>
+                  <w:pPr>
+                    <w:spacing w:before="0" w:after="60"/>
+                    <w:keepNext/>
+                    <w:jc w:val="end"/>
+                  </w:pPr>
+                  <w:r>
+                    <w:rPr>
+                      <w:rFonts w:ascii="Calibri" w:hAnsi="Calibri"/>
+                      <w:sz w:val="20"/>
+                      <w:b w:val="true"/>
+                    </w:rPr>
+                    <w:t xml:space="default">270</w:t>
+                  </w:r>
+                </w:p>
+              </w:tc>
+              <w:tc>
+                <w:tcPr>
+                  <w:tcBorders>
+                    <w:top w:val="single" w:space="0" w:color="D3D3D3"/>
+                    <w:bottom w:val="single" w:space="0" w:color="D3D3D3"/>
+                    <w:start w:val="single" w:space="0" w:color="D3D3D3"/>
+                    <w:end w:val="single" w:space="0" w:color="D3D3D3"/>
+                  </w:tcBorders>
+                  <w:shd w:val="clear" w:color="auto" w:fill="F2F7EC"/>
+                </w:tcPr>
+                <w:p>
+                  <w:pPr>
+                    <w:spacing w:before="0" w:after="60"/>
+                    <w:keepNext/>
+                    <w:jc w:val="end"/>
+                  </w:pPr>
+                  <w:r>
+                    <w:rPr>
+                      <w:rFonts w:ascii="Calibri" w:hAnsi="Calibri"/>
+                      <w:sz w:val="20"/>
+                      <w:b w:val="true"/>
+                    </w:rPr>
+                    <w:t xml:space="default">0.2</w:t>
+                  </w:r>
+                </w:p>
+              </w:tc>
+              <w:tc>
+                <w:tcPr>
+                  <w:tcBorders>
+                    <w:top w:val="single" w:space="0" w:color="D3D3D3"/>
+                    <w:bottom w:val="single" w:space="0" w:color="D3D3D3"/>
+                    <w:start w:val="single" w:space="0" w:color="D3D3D3"/>
+                    <w:end w:val="single" w:space="0" w:color="D3D3D3"/>
+                  </w:tcBorders>
+                  <w:shd w:val="clear" w:color="auto" w:fill="F2F7EC"/>
+                </w:tcPr>
+                <w:p>
+                  <w:pPr>
+                    <w:spacing w:before="0" w:after="60"/>
+                    <w:keepNext/>
+                    <w:jc w:val="start"/>
+                  </w:pPr>
+                  <w:r>
+                    <w:rPr>
+                      <w:rFonts w:ascii="Calibri" w:hAnsi="Calibri"/>
+                      <w:sz w:val="20"/>
+                      <w:b w:val="true"/>
+                    </w:rPr>
+                    <w:t xml:space="default">Tuned</w:t>
+                  </w:r>
+                </w:p>
+              </w:tc>
+              <w:tc>
+                <w:tcPr>
+                  <w:tcBorders>
+                    <w:top w:val="single" w:space="0" w:color="D3D3D3"/>
+                    <w:bottom w:val="single" w:space="0" w:color="D3D3D3"/>
+                    <w:start w:val="single" w:space="0" w:color="D3D3D3"/>
+                    <w:end w:val="single" w:space="0" w:color="D3D3D3"/>
+                  </w:tcBorders>
+                  <w:shd w:val="clear" w:color="auto" w:fill="F2F7EC"/>
+                </w:tcPr>
+                <w:p>
+                  <w:pPr>
+                    <w:spacing w:before="0" w:after="60"/>
+                    <w:keepNext/>
+                    <w:jc w:val="end"/>
+                  </w:pPr>
+                  <w:r>
+                    <w:rPr>
+                      <w:rFonts w:ascii="Calibri" w:hAnsi="Calibri"/>
+                      <w:sz w:val="20"/>
+                      <w:b w:val="true"/>
+                    </w:rPr>
+                    <w:t xml:space="default">1,500</w:t>
+                  </w:r>
+                </w:p>
+              </w:tc>
+              <w:tc>
+                <w:tcPr>
+                  <w:tcBorders>
+                    <w:top w:val="single" w:space="0" w:color="D3D3D3"/>
+                    <w:bottom w:val="single" w:space="0" w:color="D3D3D3"/>
+                    <w:start w:val="single" w:space="0" w:color="D3D3D3"/>
+                    <w:end w:val="single" w:space="0" w:color="D3D3D3"/>
+                  </w:tcBorders>
+                  <w:shd w:val="clear" w:color="auto" w:fill="F2F7EC"/>
+                </w:tcPr>
+                <w:p>
+                  <w:pPr>
+                    <w:spacing w:before="0" w:after="60"/>
+                    <w:keepNext/>
+                    <w:jc w:val="end"/>
+                  </w:pPr>
+                  <w:r>
+                    <w:rPr>
+                      <w:rFonts w:ascii="Calibri" w:hAnsi="Calibri"/>
+                      <w:sz w:val="20"/>
+                      <w:b w:val="true"/>
+                    </w:rPr>
+                    <w:t xml:space="default">0.85</w:t>
+                  </w:r>
+                </w:p>
+              </w:tc>
+              <w:tc>
+                <w:tcPr>
+                  <w:tcBorders>
+                    <w:top w:val="single" w:space="0" w:color="D3D3D3"/>
+                    <w:bottom w:val="single" w:space="0" w:color="D3D3D3"/>
+                    <w:start w:val="single" w:space="0" w:color="D3D3D3"/>
+                    <w:end w:val="single" w:space="0" w:color="D3D3D3"/>
+                  </w:tcBorders>
+                  <w:shd w:val="clear" w:color="auto" w:fill="F2F7EC"/>
+                </w:tcPr>
+                <w:p>
+                  <w:pPr>
+                    <w:spacing w:before="0" w:after="60"/>
+                    <w:keepNext/>
+                    <w:jc w:val="end"/>
+                  </w:pPr>
+                  <w:r>
+                    <w:rPr>
+                      <w:rFonts w:ascii="Calibri" w:hAnsi="Calibri"/>
+                      <w:sz w:val="20"/>
+                      <w:b w:val="true"/>
+                    </w:rPr>
+                    <w:t xml:space="default">1.2</w:t>
+                  </w:r>
+                </w:p>
+              </w:tc>
+              <w:tc>
+                <w:tcPr>
+                  <w:tcBorders>
+                    <w:top w:val="single" w:space="0" w:color="D3D3D3"/>
+                    <w:bottom w:val="single" w:space="0" w:color="D3D3D3"/>
+                    <w:start w:val="single" w:space="0" w:color="D3D3D3"/>
+                    <w:end w:val="single" w:space="0" w:color="D3D3D3"/>
+                  </w:tcBorders>
+                  <w:shd w:val="clear" w:color="auto" w:fill="F2F7EC"/>
+                </w:tcPr>
+                <w:p>
+                  <w:pPr>
+                    <w:spacing w:before="0" w:after="60"/>
+                    <w:keepNext/>
+                    <w:jc w:val="start"/>
+                  </w:pPr>
+                  <w:r>
+                    <w:rPr>
+                      <w:rFonts w:ascii="Calibri" w:hAnsi="Calibri"/>
+                      <w:sz w:val="20"/>
+                      <w:b w:val="true"/>
+                    </w:rPr>
+                    <w:t xml:space="default">3 yrs</w:t>
+                  </w:r>
+                </w:p>
+              </w:tc>
+              <w:tc>
+                <w:tcPr>
+                  <w:tcBorders>
+                    <w:top w:val="single" w:space="0" w:color="D3D3D3"/>
+                    <w:bottom w:val="single" w:space="0" w:color="D3D3D3"/>
+                    <w:start w:val="single" w:space="0" w:color="D3D3D3"/>
+                    <w:end w:val="single" w:space="0" w:color="D3D3D3"/>
+                  </w:tcBorders>
+                  <w:shd w:val="clear" w:color="auto" w:fill="F2F7EC"/>
+                </w:tcPr>
+                <w:p>
+                  <w:pPr>
+                    <w:spacing w:before="0" w:after="60"/>
+                    <w:keepNext/>
+                    <w:jc w:val="start"/>
+                  </w:pPr>
+                  <w:r>
+                    <w:rPr>
+                      <w:rFonts w:ascii="Calibri" w:hAnsi="Calibri"/>
+                      <w:sz w:val="20"/>
+                      <w:b w:val="true"/>
+                    </w:rPr>
+                    <w:t xml:space="default">All</w:t>
+                  </w:r>
+                </w:p>
+              </w:tc>
+              <w:tc>
+                <w:tcPr>
+                  <w:tcBorders>
+                    <w:top w:val="single" w:space="0" w:color="D3D3D3"/>
+                    <w:bottom w:val="single" w:space="0" w:color="D3D3D3"/>
+                    <w:start w:val="single" w:space="0" w:color="D3D3D3"/>
+                    <w:end w:val="single" w:space="0" w:color="D3D3D3"/>
+                  </w:tcBorders>
+                  <w:shd w:val="clear" w:color="auto" w:fill="F2F7EC"/>
+                </w:tcPr>
+                <w:p>
+                  <w:pPr>
+                    <w:spacing w:before="0" w:after="60"/>
+                    <w:keepNext/>
+                    <w:jc w:val="start"/>
+                  </w:pPr>
+                  <w:r>
+                    <w:rPr>
+                      <w:rFonts w:ascii="Calibri" w:hAnsi="Calibri"/>
+                      <w:sz w:val="20"/>
+                      <w:b w:val="true"/>
+                    </w:rPr>
+                    <w:t xml:space="default">Yes</w:t>
+                  </w:r>
+                </w:p>
+              </w:tc>
+            </w:tr>
+            <w:tr>
+              <w:trPr>
+                <w:cantSplit/>
+              </w:trPr>
+              <w:tc>
+                <w:tcPr>
+                  <w:tcBorders>
+                    <w:top w:val="single" w:space="0" w:color="D3D3D3"/>
+                    <w:bottom w:val="single" w:space="0" w:color="D3D3D3"/>
+                    <w:start w:val="single" w:space="0" w:color="D3D3D3"/>
+                    <w:end w:val="single" w:space="0" w:color="D3D3D3"/>
+                  </w:tcBorders>
+                </w:tcPr>
+                <w:p>
+                  <w:pPr>
+                    <w:spacing w:before="0" w:after="60"/>
+                    <w:keepNext/>
+                    <w:jc w:val="start"/>
+                  </w:pPr>
+                  <w:r>
+                    <w:rPr>
+                      <w:rFonts w:ascii="Calibri" w:hAnsi="Calibri"/>
+                      <w:sz w:val="20"/>
+                    </w:rPr>
+                    <w:t xml:space="default">run21</w:t>
+                  </w:r>
+                </w:p>
+              </w:tc>
+              <w:tc>
+                <w:tcPr>
+                  <w:tcBorders>
+                    <w:top w:val="single" w:space="0" w:color="D3D3D3"/>
+                    <w:bottom w:val="single" w:space="0" w:color="D3D3D3"/>
+                    <w:start w:val="single" w:space="0" w:color="D3D3D3"/>
+                    <w:end w:val="single" w:space="0" w:color="D3D3D3"/>
+                  </w:tcBorders>
+                </w:tcPr>
+                <w:p>
+                  <w:pPr>
+                    <w:spacing w:before="0" w:after="60"/>
+                    <w:keepNext/>
+                    <w:jc w:val="start"/>
+                  </w:pPr>
+                  <w:r>
+                    <w:rPr>
+                      <w:rFonts w:ascii="Calibri" w:hAnsi="Calibri"/>
+                      <w:sz w:val="20"/>
+                    </w:rPr>
+                    <w:t xml:space="default">Base Asym+</w:t>
+                  </w:r>
+                </w:p>
+              </w:tc>
+              <w:tc>
+                <w:tcPr>
+                  <w:tcBorders>
+                    <w:top w:val="single" w:space="0" w:color="D3D3D3"/>
+                    <w:bottom w:val="single" w:space="0" w:color="D3D3D3"/>
+                    <w:start w:val="single" w:space="0" w:color="D3D3D3"/>
+                    <w:end w:val="single" w:space="0" w:color="D3D3D3"/>
+                  </w:tcBorders>
+                </w:tcPr>
+                <w:p>
+                  <w:pPr>
+                    <w:spacing w:before="0" w:after="60"/>
+                    <w:keepNext/>
+                    <w:jc w:val="end"/>
+                  </w:pPr>
+                  <w:r>
+                    <w:rPr>
+                      <w:rFonts w:ascii="Calibri" w:hAnsi="Calibri"/>
+                      <w:sz w:val="20"/>
+                    </w:rPr>
+                    <w:t xml:space="default">0</w:t>
+                  </w:r>
+                </w:p>
+              </w:tc>
+              <w:tc>
+                <w:tcPr>
+                  <w:tcBorders>
+                    <w:top w:val="single" w:space="0" w:color="D3D3D3"/>
+                    <w:bottom w:val="single" w:space="0" w:color="D3D3D3"/>
+                    <w:start w:val="single" w:space="0" w:color="D3D3D3"/>
+                    <w:end w:val="single" w:space="0" w:color="D3D3D3"/>
+                  </w:tcBorders>
+                </w:tcPr>
+                <w:p>
+                  <w:pPr>
+                    <w:spacing w:before="0" w:after="60"/>
+                    <w:keepNext/>
+                    <w:jc w:val="end"/>
+                  </w:pPr>
+                  <w:r>
+                    <w:rPr>
+                      <w:rFonts w:ascii="Calibri" w:hAnsi="Calibri"/>
+                      <w:sz w:val="20"/>
+                    </w:rPr>
+                    <w:t xml:space="default">0</w:t>
+                  </w:r>
+                </w:p>
+              </w:tc>
+              <w:tc>
+                <w:tcPr>
+                  <w:tcBorders>
+                    <w:top w:val="single" w:space="0" w:color="D3D3D3"/>
+                    <w:bottom w:val="single" w:space="0" w:color="D3D3D3"/>
+                    <w:start w:val="single" w:space="0" w:color="D3D3D3"/>
+                    <w:end w:val="single" w:space="0" w:color="D3D3D3"/>
+                  </w:tcBorders>
+                </w:tcPr>
+                <w:p>
+                  <w:pPr>
+                    <w:spacing w:before="0" w:after="60"/>
+                    <w:keepNext/>
+                    <w:jc w:val="start"/>
+                  </w:pPr>
+                  <w:r>
+                    <w:rPr>
+                      <w:rFonts w:ascii="Calibri" w:hAnsi="Calibri"/>
+                      <w:sz w:val="20"/>
+                    </w:rPr>
+                    <w:t xml:space="default">Tuned</w:t>
+                  </w:r>
+                </w:p>
+              </w:tc>
+              <w:tc>
+                <w:tcPr>
+                  <w:tcBorders>
+                    <w:top w:val="single" w:space="0" w:color="D3D3D3"/>
+                    <w:bottom w:val="single" w:space="0" w:color="D3D3D3"/>
+                    <w:start w:val="single" w:space="0" w:color="D3D3D3"/>
+                    <w:end w:val="single" w:space="0" w:color="D3D3D3"/>
+                  </w:tcBorders>
+                </w:tcPr>
+                <w:p>
+                  <w:pPr>
+                    <w:spacing w:before="0" w:after="60"/>
+                    <w:keepNext/>
+                    <w:jc w:val="end"/>
+                  </w:pPr>
+                  <w:r>
+                    <w:rPr>
+                      <w:rFonts w:ascii="Calibri" w:hAnsi="Calibri"/>
+                      <w:sz w:val="20"/>
+                    </w:rPr>
+                    <w:t xml:space="default">2,000</w:t>
+                  </w:r>
+                </w:p>
+              </w:tc>
+              <w:tc>
+                <w:tcPr>
+                  <w:tcBorders>
+                    <w:top w:val="single" w:space="0" w:color="D3D3D3"/>
+                    <w:bottom w:val="single" w:space="0" w:color="D3D3D3"/>
+                    <w:start w:val="single" w:space="0" w:color="D3D3D3"/>
+                    <w:end w:val="single" w:space="0" w:color="D3D3D3"/>
+                  </w:tcBorders>
+                </w:tcPr>
+                <w:p>
+                  <w:pPr>
+                    <w:spacing w:before="0" w:after="60"/>
+                    <w:keepNext/>
+                    <w:jc w:val="end"/>
+                  </w:pPr>
+                  <w:r>
+                    <w:rPr>
+                      <w:rFonts w:ascii="Calibri" w:hAnsi="Calibri"/>
+                      <w:sz w:val="20"/>
+                    </w:rPr>
+                    <w:t xml:space="default">0.8</w:t>
+                  </w:r>
+                </w:p>
+              </w:tc>
+              <w:tc>
+                <w:tcPr>
+                  <w:tcBorders>
+                    <w:top w:val="single" w:space="0" w:color="D3D3D3"/>
+                    <w:bottom w:val="single" w:space="0" w:color="D3D3D3"/>
+                    <w:start w:val="single" w:space="0" w:color="D3D3D3"/>
+                    <w:end w:val="single" w:space="0" w:color="D3D3D3"/>
+                  </w:tcBorders>
+                </w:tcPr>
+                <w:p>
+                  <w:pPr>
+                    <w:spacing w:before="0" w:after="60"/>
+                    <w:keepNext/>
+                    <w:jc w:val="end"/>
+                  </w:pPr>
+                  <w:r>
+                    <w:rPr>
+                      <w:rFonts w:ascii="Calibri" w:hAnsi="Calibri"/>
+                      <w:sz w:val="20"/>
+                    </w:rPr>
+                    <w:t xml:space="default">1.15</w:t>
+                  </w:r>
+                </w:p>
+              </w:tc>
+              <w:tc>
+                <w:tcPr>
+                  <w:tcBorders>
+                    <w:top w:val="single" w:space="0" w:color="D3D3D3"/>
+                    <w:bottom w:val="single" w:space="0" w:color="D3D3D3"/>
+                    <w:start w:val="single" w:space="0" w:color="D3D3D3"/>
+                    <w:end w:val="single" w:space="0" w:color="D3D3D3"/>
+                  </w:tcBorders>
+                </w:tcPr>
+                <w:p>
+                  <w:pPr>
+                    <w:spacing w:before="0" w:after="60"/>
+                    <w:keepNext/>
+                    <w:jc w:val="start"/>
+                  </w:pPr>
+                  <w:r>
+                    <w:rPr>
+                      <w:rFonts w:ascii="Calibri" w:hAnsi="Calibri"/>
+                      <w:sz w:val="20"/>
+                    </w:rPr>
+                    <w:t xml:space="default">3 yrs</w:t>
+                  </w:r>
+                </w:p>
+              </w:tc>
+              <w:tc>
+                <w:tcPr>
+                  <w:tcBorders>
+                    <w:top w:val="single" w:space="0" w:color="D3D3D3"/>
+                    <w:bottom w:val="single" w:space="0" w:color="D3D3D3"/>
+                    <w:start w:val="single" w:space="0" w:color="D3D3D3"/>
+                    <w:end w:val="single" w:space="0" w:color="D3D3D3"/>
+                  </w:tcBorders>
+                </w:tcPr>
+                <w:p>
+                  <w:pPr>
+                    <w:spacing w:before="0" w:after="60"/>
+                    <w:keepNext/>
+                    <w:jc w:val="start"/>
+                  </w:pPr>
+                  <w:r>
+                    <w:rPr>
+                      <w:rFonts w:ascii="Calibri" w:hAnsi="Calibri"/>
+                      <w:sz w:val="20"/>
+                    </w:rPr>
+                    <w:t xml:space="default">All</w:t>
+                  </w:r>
+                </w:p>
+              </w:tc>
+              <w:tc>
+                <w:tcPr>
+                  <w:tcBorders>
+                    <w:top w:val="single" w:space="0" w:color="D3D3D3"/>
+                    <w:bottom w:val="single" w:space="0" w:color="D3D3D3"/>
+                    <w:start w:val="single" w:space="0" w:color="D3D3D3"/>
+                    <w:end w:val="single" w:space="0" w:color="D3D3D3"/>
+                  </w:tcBorders>
+                </w:tcPr>
+                <w:p>
+                  <w:pPr>
+                    <w:spacing w:before="0" w:after="60"/>
+                    <w:keepNext/>
+                    <w:jc w:val="start"/>
+                  </w:pPr>
+                  <w:r>
+                    <w:rPr>
+                      <w:rFonts w:ascii="Calibri" w:hAnsi="Calibri"/>
+                      <w:sz w:val="20"/>
+                    </w:rPr>
+                    <w:t xml:space="default">No</w:t>
+                  </w:r>
+                </w:p>
+              </w:tc>
+            </w:tr>
+            <w:tr>
+              <w:trPr>
+                <w:cantSplit/>
+              </w:trPr>
+              <w:tc>
+                <w:tcPr>
+                  <w:tcBorders>
+                    <w:top w:val="single" w:space="0" w:color="D3D3D3"/>
+                    <w:bottom w:val="single" w:space="0" w:color="D3D3D3"/>
+                    <w:start w:val="single" w:space="0" w:color="D3D3D3"/>
+                    <w:end w:val="single" w:space="0" w:color="D3D3D3"/>
+                  </w:tcBorders>
+                  <w:shd w:val="clear" w:color="auto" w:fill="F2F7EC"/>
+                </w:tcPr>
+                <w:p>
+                  <w:pPr>
+                    <w:spacing w:before="0" w:after="60"/>
+                    <w:keepNext/>
+                    <w:jc w:val="start"/>
+                  </w:pPr>
+                  <w:r>
+                    <w:rPr>
+                      <w:rFonts w:ascii="Calibri" w:hAnsi="Calibri"/>
+                      <w:sz w:val="20"/>
+                      <w:b w:val="true"/>
+                    </w:rPr>
+                    <w:t xml:space="default">run22</w:t>
+                  </w:r>
+                </w:p>
+              </w:tc>
+              <w:tc>
+                <w:tcPr>
+                  <w:tcBorders>
+                    <w:top w:val="single" w:space="0" w:color="D3D3D3"/>
+                    <w:bottom w:val="single" w:space="0" w:color="D3D3D3"/>
+                    <w:start w:val="single" w:space="0" w:color="D3D3D3"/>
+                    <w:end w:val="single" w:space="0" w:color="D3D3D3"/>
+                  </w:tcBorders>
+                  <w:shd w:val="clear" w:color="auto" w:fill="F2F7EC"/>
+                </w:tcPr>
+                <w:p>
+                  <w:pPr>
+                    <w:spacing w:before="0" w:after="60"/>
+                    <w:keepNext/>
+                    <w:jc w:val="start"/>
+                  </w:pPr>
+                  <w:r>
+                    <w:rPr>
+                      <w:rFonts w:ascii="Calibri" w:hAnsi="Calibri"/>
+                      <w:sz w:val="20"/>
+                      <w:b w:val="true"/>
+                    </w:rPr>
+                    <w:t xml:space="default">ChileSpecialShape</w:t>
+                  </w:r>
+                </w:p>
+              </w:tc>
+              <w:tc>
+                <w:tcPr>
+                  <w:tcBorders>
+                    <w:top w:val="single" w:space="0" w:color="D3D3D3"/>
+                    <w:bottom w:val="single" w:space="0" w:color="D3D3D3"/>
+                    <w:start w:val="single" w:space="0" w:color="D3D3D3"/>
+                    <w:end w:val="single" w:space="0" w:color="D3D3D3"/>
+                  </w:tcBorders>
+                  <w:shd w:val="clear" w:color="auto" w:fill="F2F7EC"/>
+                </w:tcPr>
+                <w:p>
+                  <w:pPr>
+                    <w:spacing w:before="0" w:after="60"/>
+                    <w:keepNext/>
+                    <w:jc w:val="end"/>
+                  </w:pPr>
+                  <w:r>
+                    <w:rPr>
+                      <w:rFonts w:ascii="Calibri" w:hAnsi="Calibri"/>
+                      <w:sz w:val="20"/>
+                      <w:b w:val="true"/>
+                    </w:rPr>
+                    <w:t xml:space="default">270</w:t>
+                  </w:r>
+                </w:p>
+              </w:tc>
+              <w:tc>
+                <w:tcPr>
+                  <w:tcBorders>
+                    <w:top w:val="single" w:space="0" w:color="D3D3D3"/>
+                    <w:bottom w:val="single" w:space="0" w:color="D3D3D3"/>
+                    <w:start w:val="single" w:space="0" w:color="D3D3D3"/>
+                    <w:end w:val="single" w:space="0" w:color="D3D3D3"/>
+                  </w:tcBorders>
+                  <w:shd w:val="clear" w:color="auto" w:fill="F2F7EC"/>
+                </w:tcPr>
+                <w:p>
+                  <w:pPr>
+                    <w:spacing w:before="0" w:after="60"/>
+                    <w:keepNext/>
+                    <w:jc w:val="end"/>
+                  </w:pPr>
+                  <w:r>
+                    <w:rPr>
+                      <w:rFonts w:ascii="Calibri" w:hAnsi="Calibri"/>
+                      <w:sz w:val="20"/>
+                      <w:b w:val="true"/>
+                    </w:rPr>
+                    <w:t xml:space="default">0.2</w:t>
+                  </w:r>
+                </w:p>
+              </w:tc>
+              <w:tc>
+                <w:tcPr>
+                  <w:tcBorders>
+                    <w:top w:val="single" w:space="0" w:color="D3D3D3"/>
+                    <w:bottom w:val="single" w:space="0" w:color="D3D3D3"/>
+                    <w:start w:val="single" w:space="0" w:color="D3D3D3"/>
+                    <w:end w:val="single" w:space="0" w:color="D3D3D3"/>
+                  </w:tcBorders>
+                  <w:shd w:val="clear" w:color="auto" w:fill="F2F7EC"/>
+                </w:tcPr>
+                <w:p>
+                  <w:pPr>
+                    <w:spacing w:before="0" w:after="60"/>
+                    <w:keepNext/>
+                    <w:jc w:val="start"/>
+                  </w:pPr>
+                  <w:r>
+                    <w:rPr>
+                      <w:rFonts w:ascii="Calibri" w:hAnsi="Calibri"/>
+                      <w:sz w:val="20"/>
+                      <w:b w:val="true"/>
+                    </w:rPr>
+                    <w:t xml:space="default">Tuned</w:t>
+                  </w:r>
+                </w:p>
+              </w:tc>
+              <w:tc>
+                <w:tcPr>
+                  <w:tcBorders>
+                    <w:top w:val="single" w:space="0" w:color="D3D3D3"/>
+                    <w:bottom w:val="single" w:space="0" w:color="D3D3D3"/>
+                    <w:start w:val="single" w:space="0" w:color="D3D3D3"/>
+                    <w:end w:val="single" w:space="0" w:color="D3D3D3"/>
+                  </w:tcBorders>
+                  <w:shd w:val="clear" w:color="auto" w:fill="F2F7EC"/>
+                </w:tcPr>
+                <w:p>
+                  <w:pPr>
+                    <w:spacing w:before="0" w:after="60"/>
+                    <w:keepNext/>
+                    <w:jc w:val="end"/>
+                  </w:pPr>
+                  <w:r>
+                    <w:rPr>
+                      <w:rFonts w:ascii="Calibri" w:hAnsi="Calibri"/>
+                      <w:sz w:val="20"/>
+                      <w:b w:val="true"/>
+                    </w:rPr>
+                    <w:t xml:space="default">1,500</w:t>
+                  </w:r>
+                </w:p>
+              </w:tc>
+              <w:tc>
+                <w:tcPr>
+                  <w:tcBorders>
+                    <w:top w:val="single" w:space="0" w:color="D3D3D3"/>
+                    <w:bottom w:val="single" w:space="0" w:color="D3D3D3"/>
+                    <w:start w:val="single" w:space="0" w:color="D3D3D3"/>
+                    <w:end w:val="single" w:space="0" w:color="D3D3D3"/>
+                  </w:tcBorders>
+                  <w:shd w:val="clear" w:color="auto" w:fill="F2F7EC"/>
+                </w:tcPr>
+                <w:p>
+                  <w:pPr>
+                    <w:spacing w:before="0" w:after="60"/>
+                    <w:keepNext/>
+                    <w:jc w:val="end"/>
+                  </w:pPr>
+                  <w:r>
+                    <w:rPr>
+                      <w:rFonts w:ascii="Calibri" w:hAnsi="Calibri"/>
+                      <w:sz w:val="20"/>
+                      <w:b w:val="true"/>
+                    </w:rPr>
+                    <w:t xml:space="default">0.85</w:t>
+                  </w:r>
+                </w:p>
+              </w:tc>
+              <w:tc>
+                <w:tcPr>
+                  <w:tcBorders>
+                    <w:top w:val="single" w:space="0" w:color="D3D3D3"/>
+                    <w:bottom w:val="single" w:space="0" w:color="D3D3D3"/>
+                    <w:start w:val="single" w:space="0" w:color="D3D3D3"/>
+                    <w:end w:val="single" w:space="0" w:color="D3D3D3"/>
+                  </w:tcBorders>
+                  <w:shd w:val="clear" w:color="auto" w:fill="F2F7EC"/>
+                </w:tcPr>
+                <w:p>
+                  <w:pPr>
+                    <w:spacing w:before="0" w:after="60"/>
+                    <w:keepNext/>
+                    <w:jc w:val="end"/>
+                  </w:pPr>
+                  <w:r>
+                    <w:rPr>
+                      <w:rFonts w:ascii="Calibri" w:hAnsi="Calibri"/>
+                      <w:sz w:val="20"/>
+                      <w:b w:val="true"/>
+                    </w:rPr>
+                    <w:t xml:space="default">1.2</w:t>
+                  </w:r>
+                </w:p>
+              </w:tc>
+              <w:tc>
+                <w:tcPr>
+                  <w:tcBorders>
+                    <w:top w:val="single" w:space="0" w:color="D3D3D3"/>
+                    <w:bottom w:val="single" w:space="0" w:color="D3D3D3"/>
+                    <w:start w:val="single" w:space="0" w:color="D3D3D3"/>
+                    <w:end w:val="single" w:space="0" w:color="D3D3D3"/>
+                  </w:tcBorders>
+                  <w:shd w:val="clear" w:color="auto" w:fill="F2F7EC"/>
+                </w:tcPr>
+                <w:p>
+                  <w:pPr>
+                    <w:spacing w:before="0" w:after="60"/>
+                    <w:keepNext/>
+                    <w:jc w:val="start"/>
+                  </w:pPr>
+                  <w:r>
+                    <w:rPr>
+                      <w:rFonts w:ascii="Calibri" w:hAnsi="Calibri"/>
+                      <w:sz w:val="20"/>
+                      <w:b w:val="true"/>
+                    </w:rPr>
+                    <w:t xml:space="default">3 yrs</w:t>
+                  </w:r>
+                </w:p>
+              </w:tc>
+              <w:tc>
+                <w:tcPr>
+                  <w:tcBorders>
+                    <w:top w:val="single" w:space="0" w:color="D3D3D3"/>
+                    <w:bottom w:val="single" w:space="0" w:color="D3D3D3"/>
+                    <w:start w:val="single" w:space="0" w:color="D3D3D3"/>
+                    <w:end w:val="single" w:space="0" w:color="D3D3D3"/>
+                  </w:tcBorders>
+                  <w:shd w:val="clear" w:color="auto" w:fill="F2F7EC"/>
+                </w:tcPr>
+                <w:p>
+                  <w:pPr>
+                    <w:spacing w:before="0" w:after="60"/>
+                    <w:keepNext/>
+                    <w:jc w:val="start"/>
+                  </w:pPr>
+                  <w:r>
+                    <w:rPr>
+                      <w:rFonts w:ascii="Calibri" w:hAnsi="Calibri"/>
+                      <w:sz w:val="20"/>
+                      <w:b w:val="true"/>
+                    </w:rPr>
+                    <w:t xml:space="default">All</w:t>
+                  </w:r>
+                </w:p>
+              </w:tc>
+              <w:tc>
+                <w:tcPr>
+                  <w:tcBorders>
+                    <w:top w:val="single" w:space="0" w:color="D3D3D3"/>
+                    <w:bottom w:val="single" w:space="0" w:color="D3D3D3"/>
+                    <w:start w:val="single" w:space="0" w:color="D3D3D3"/>
+                    <w:end w:val="single" w:space="0" w:color="D3D3D3"/>
+                  </w:tcBorders>
+                  <w:shd w:val="clear" w:color="auto" w:fill="F2F7EC"/>
+                </w:tcPr>
+                <w:p>
+                  <w:pPr>
+                    <w:spacing w:before="0" w:after="60"/>
+                    <w:keepNext/>
+                    <w:jc w:val="start"/>
+                  </w:pPr>
+                  <w:r>
+                    <w:rPr>
+                      <w:rFonts w:ascii="Calibri" w:hAnsi="Calibri"/>
+                      <w:sz w:val="20"/>
+                      <w:b w:val="true"/>
+                    </w:rPr>
+                    <w:t xml:space="default">Yes</w:t>
+                  </w:r>
+                </w:p>
+              </w:tc>
+            </w:tr>
+          </w:tbl>
+          <w:bookmarkEnd w:id="50"/>
         </w:tc>
       </w:tr>
     </w:tbl>
-    <w:bookmarkEnd w:id="52"/>
-    <w:bookmarkStart w:id="60" w:name="references"/>
     <w:p>
       <w:pPr>
-        <w:pStyle w:val="Heading1"/>
+        <w:numPr>
+          <w:ilvl w:val="0"/>
+          <w:numId w:val="1020"/>
+        </w:numPr>
       </w:pPr>
       <w:r>
-        <w:t xml:space="preserve">References</w:t>
+        <w:t xml:space="preserve">The group recommended that a technical meeting take place before SC14, with 24 July 2026 identified as a preliminary proposed date. The meeting should review the added tasks specified for the full MSE report to SC14, including updated CMP performance summaries, robustness-test results for the subset in</w:t>
+      </w:r>
+      <w:r>
+        <w:t xml:space="preserve"> </w:t>
+      </w:r>
+      <w:hyperlink w:anchor="tbl-day4-cmp-robustness">
+        <w:r>
+          <w:rPr>
+            <w:rStyle w:val="Hyperlink"/>
+          </w:rPr>
+          <w:t xml:space="preserve">Table 4</w:t>
+        </w:r>
+      </w:hyperlink>
+      <w:r>
+        <w:t xml:space="preserve">, and any remaining implementation issues. The meeting should be a technical review of the narrowed CMP set, diagnostics, and suitability of the results rather than a reopening of the CMP design process.</w:t>
+      </w:r>
+    </w:p>
+    <w:p>
+      <w:pPr>
+        <w:numPr>
+          <w:ilvl w:val="0"/>
+          <w:numId w:val="1020"/>
+        </w:numPr>
+      </w:pPr>
+      <w:r>
+        <w:t xml:space="preserve">The full MSE report to SC14 is anticipated to contain the contractors’ report as an annex and a brief synthesis of the work completed at SCW17 and intersessionally. The synthesis should document how the workshop tasks were completed, how the CMP subset was selected, and how remaining analyses support Scientific Committee consideration of CMPs.</w:t>
+      </w:r>
+    </w:p>
+    <w:p>
+      <w:pPr>
+        <w:numPr>
+          <w:ilvl w:val="0"/>
+          <w:numId w:val="1020"/>
+        </w:numPr>
+      </w:pPr>
+      <w:r>
+        <w:t xml:space="preserve">Specific tasks identified for the full MSE report to SC14 included:</w:t>
       </w:r>
     </w:p>
     <w:p>
@@ -11117,16 +13413,173 @@
         <w:pStyle w:val="Compact"/>
         <w:numPr>
           <w:ilvl w:val="0"/>
-          <w:numId w:val="1024"/>
+          <w:numId w:val="1021"/>
         </w:numPr>
       </w:pPr>
       <w:r>
+        <w:t xml:space="preserve">Complete robustness testing for</w:t>
+      </w:r>
+      <w:r>
+        <w:t xml:space="preserve"> </w:t>
+      </w:r>
+      <w:r>
+        <w:rPr>
+          <w:rStyle w:val="VerbatimChar"/>
+        </w:rPr>
+        <w:t xml:space="preserve">run18</w:t>
+      </w:r>
+      <w:r>
+        <w:t xml:space="preserve">,</w:t>
+      </w:r>
+      <w:r>
+        <w:t xml:space="preserve"> </w:t>
+      </w:r>
+      <w:r>
+        <w:rPr>
+          <w:rStyle w:val="VerbatimChar"/>
+        </w:rPr>
+        <w:t xml:space="preserve">run20</w:t>
+      </w:r>
+      <w:r>
+        <w:t xml:space="preserve">, and</w:t>
+      </w:r>
+      <w:r>
+        <w:t xml:space="preserve"> </w:t>
+      </w:r>
+      <w:r>
+        <w:rPr>
+          <w:rStyle w:val="VerbatimChar"/>
+        </w:rPr>
+        <w:t xml:space="preserve">run22</w:t>
+      </w:r>
+      <w:r>
+        <w:t xml:space="preserve"> </w:t>
+      </w:r>
+      <w:r>
+        <w:t xml:space="preserve">across the agreed OM and projection scenarios.</w:t>
+      </w:r>
+    </w:p>
+    <w:p>
+      <w:pPr>
+        <w:pStyle w:val="Compact"/>
+        <w:numPr>
+          <w:ilvl w:val="0"/>
+          <w:numId w:val="1021"/>
+        </w:numPr>
+      </w:pPr>
+      <w:r>
+        <w:t xml:space="preserve">Provide updated CMP performance summaries, including primary and supporting performance metrics.</w:t>
+      </w:r>
+    </w:p>
+    <w:p>
+      <w:pPr>
+        <w:pStyle w:val="Compact"/>
+        <w:numPr>
+          <w:ilvl w:val="0"/>
+          <w:numId w:val="1021"/>
+        </w:numPr>
+      </w:pPr>
+      <w:r>
+        <w:t xml:space="preserve">Document recruitment-deviation simulation assumptions, including autocorrelation, and index-deviation simulation assumptions, including cross-correlation.</w:t>
+      </w:r>
+    </w:p>
+    <w:p>
+      <w:pPr>
+        <w:pStyle w:val="Compact"/>
+        <w:numPr>
+          <w:ilvl w:val="0"/>
+          <w:numId w:val="1021"/>
+        </w:numPr>
+      </w:pPr>
+      <w:r>
+        <w:t xml:space="preserve">Document reference-point calculations and Kobe-plot treatment, including dynamic B</w:t>
+      </w:r>
+      <w:r>
+        <w:rPr>
+          <w:vertAlign w:val="subscript"/>
+        </w:rPr>
+        <w:t xml:space="preserve">0</w:t>
+      </w:r>
+      <w:r>
+        <w:t xml:space="preserve"> </w:t>
+      </w:r>
+      <w:r>
+        <w:t xml:space="preserve">and dynamic B</w:t>
+      </w:r>
+      <w:r>
+        <w:rPr>
+          <w:vertAlign w:val="subscript"/>
+        </w:rPr>
+        <w:t xml:space="preserve">MSY</w:t>
+      </w:r>
+      <w:r>
+        <w:t xml:space="preserve"> </w:t>
+      </w:r>
+      <w:r>
+        <w:t xml:space="preserve">methods.</w:t>
+      </w:r>
+    </w:p>
+    <w:p>
+      <w:pPr>
+        <w:pStyle w:val="Compact"/>
+        <w:numPr>
+          <w:ilvl w:val="0"/>
+          <w:numId w:val="1021"/>
+        </w:numPr>
+      </w:pPr>
+      <w:r>
+        <w:t xml:space="preserve">Present the operating-model set, scenario naming conventions, and any final weighting or interpretation choices.</w:t>
+      </w:r>
+    </w:p>
+    <w:p>
+      <w:pPr>
+        <w:pStyle w:val="Compact"/>
+        <w:numPr>
+          <w:ilvl w:val="0"/>
+          <w:numId w:val="1021"/>
+        </w:numPr>
+      </w:pPr>
+      <w:r>
+        <w:t xml:space="preserve">Summarize treatment of minimum catch expectations, TAC-change constraints, banking and borrowing sensitivity, and fishery-feasibility diagnostics.</w:t>
+      </w:r>
+    </w:p>
+    <w:p>
+      <w:pPr>
+        <w:pStyle w:val="Compact"/>
+        <w:numPr>
+          <w:ilvl w:val="0"/>
+          <w:numId w:val="1021"/>
+        </w:numPr>
+      </w:pPr>
+      <w:r>
+        <w:t xml:space="preserve">Include the contractors’ report as an annex and provide a concise synthesis of SCW17 and intersessional work for Scientific Committee review.</w:t>
+      </w:r>
+    </w:p>
+    <w:bookmarkEnd w:id="51"/>
+    <w:bookmarkStart w:id="59" w:name="references"/>
+    <w:p>
+      <w:pPr>
+        <w:pStyle w:val="Heading1"/>
+      </w:pPr>
+      <w:r>
+        <w:t xml:space="preserve">References</w:t>
+      </w:r>
+    </w:p>
+    <w:p>
+      <w:pPr>
+        <w:pStyle w:val="Compact"/>
+        <w:numPr>
+          <w:ilvl w:val="0"/>
+          <w:numId w:val="1022"/>
+        </w:numPr>
+      </w:pPr>
+      <w:r>
         <w:t xml:space="preserve">SPRFMO. 2025. Report of the Management Strategy Evaluation Workshop (SCW15), 14-18 July 2025.</w:t>
       </w:r>
       <w:r>
         <w:t xml:space="preserve"> </w:t>
       </w:r>
-      <w:hyperlink r:id="rId53">
+      <w:hyperlink r:id="rId52">
         <w:r>
           <w:rPr>
             <w:rStyle w:val="Hyperlink"/>
@@ -11140,7 +13593,7 @@
         <w:pStyle w:val="Compact"/>
         <w:numPr>
           <w:ilvl w:val="0"/>
-          <w:numId w:val="1024"/>
+          <w:numId w:val="1022"/>
         </w:numPr>
       </w:pPr>
       <w:r>
@@ -11149,7 +13602,7 @@
       <w:r>
         <w:t xml:space="preserve"> </w:t>
       </w:r>
-      <w:hyperlink r:id="rId54">
+      <w:hyperlink r:id="rId53">
         <w:r>
           <w:rPr>
             <w:rStyle w:val="Hyperlink"/>
@@ -11163,7 +13616,7 @@
         <w:pStyle w:val="Compact"/>
         <w:numPr>
           <w:ilvl w:val="0"/>
-          <w:numId w:val="1024"/>
+          <w:numId w:val="1022"/>
         </w:numPr>
       </w:pPr>
       <w:r>
@@ -11172,7 +13625,7 @@
       <w:r>
         <w:t xml:space="preserve"> </w:t>
       </w:r>
-      <w:hyperlink r:id="rId55">
+      <w:hyperlink r:id="rId54">
         <w:r>
           <w:rPr>
             <w:rStyle w:val="Hyperlink"/>
@@ -11186,7 +13639,7 @@
         <w:pStyle w:val="Compact"/>
         <w:numPr>
           <w:ilvl w:val="0"/>
-          <w:numId w:val="1024"/>
+          <w:numId w:val="1022"/>
         </w:numPr>
       </w:pPr>
       <w:r>
@@ -11195,7 +13648,7 @@
       <w:r>
         <w:t xml:space="preserve"> </w:t>
       </w:r>
-      <w:hyperlink r:id="rId56">
+      <w:hyperlink r:id="rId55">
         <w:r>
           <w:rPr>
             <w:rStyle w:val="Hyperlink"/>
@@ -11209,7 +13662,7 @@
         <w:pStyle w:val="Compact"/>
         <w:numPr>
           <w:ilvl w:val="0"/>
-          <w:numId w:val="1024"/>
+          <w:numId w:val="1022"/>
         </w:numPr>
       </w:pPr>
       <w:r>
@@ -11218,7 +13671,7 @@
       <w:r>
         <w:t xml:space="preserve"> </w:t>
       </w:r>
-      <w:hyperlink r:id="rId57">
+      <w:hyperlink r:id="rId56">
         <w:r>
           <w:rPr>
             <w:rStyle w:val="Hyperlink"/>
@@ -11232,7 +13685,7 @@
         <w:pStyle w:val="Compact"/>
         <w:numPr>
           <w:ilvl w:val="0"/>
-          <w:numId w:val="1024"/>
+          <w:numId w:val="1022"/>
         </w:numPr>
       </w:pPr>
       <w:r>
@@ -11244,7 +13697,7 @@
         <w:pStyle w:val="Compact"/>
         <w:numPr>
           <w:ilvl w:val="0"/>
-          <w:numId w:val="1024"/>
+          <w:numId w:val="1022"/>
         </w:numPr>
       </w:pPr>
       <w:r>
@@ -11253,7 +13706,7 @@
       <w:r>
         <w:t xml:space="preserve"> </w:t>
       </w:r>
-      <w:hyperlink r:id="rId58">
+      <w:hyperlink r:id="rId57">
         <w:r>
           <w:rPr>
             <w:rStyle w:val="Hyperlink"/>
@@ -11267,7 +13720,7 @@
         <w:pStyle w:val="Compact"/>
         <w:numPr>
           <w:ilvl w:val="0"/>
-          <w:numId w:val="1024"/>
+          <w:numId w:val="1022"/>
         </w:numPr>
       </w:pPr>
       <w:r>
@@ -11276,7 +13729,7 @@
       <w:r>
         <w:t xml:space="preserve"> </w:t>
       </w:r>
-      <w:hyperlink r:id="rId59">
+      <w:hyperlink r:id="rId58">
         <w:r>
           <w:rPr>
             <w:rStyle w:val="Hyperlink"/>
@@ -11290,15 +13743,15 @@
         <w:pStyle w:val="Compact"/>
         <w:numPr>
           <w:ilvl w:val="0"/>
-          <w:numId w:val="1024"/>
+          <w:numId w:val="1022"/>
         </w:numPr>
       </w:pPr>
       <w:r>
         <w:t xml:space="preserve">Annex K. Original jack mackerel management procedure.</w:t>
       </w:r>
     </w:p>
-    <w:bookmarkEnd w:id="60"/>
-    <w:bookmarkStart w:id="64" w:name="appendix-a.-participants"/>
+    <w:bookmarkEnd w:id="59"/>
+    <w:bookmarkStart w:id="63" w:name="appendix-a.-participants"/>
     <w:p>
       <w:pPr>
         <w:pStyle w:val="Heading1"/>
@@ -11348,18 +13801,18 @@
                 <wp:inline>
                   <wp:extent cx="152400" cy="152400"/>
                   <wp:effectExtent b="0" l="0" r="0" t="0"/>
-                  <wp:docPr descr="" title="" id="62" name="Picture"/>
+                  <wp:docPr descr="" title="" id="61" name="Picture"/>
                   <a:graphic>
                     <a:graphicData uri="http://schemas.openxmlformats.org/drawingml/2006/picture">
                       <pic:pic>
                         <pic:nvPicPr>
-                          <pic:cNvPr descr="/Applications/quarto/share/formats/docx/warning.png" id="63" name="Picture"/>
+                          <pic:cNvPr descr="/Applications/quarto/share/formats/docx/warning.png" id="62" name="Picture"/>
                           <pic:cNvPicPr>
                             <a:picLocks noChangeArrowheads="1" noChangeAspect="1"/>
                           </pic:cNvPicPr>
                         </pic:nvPicPr>
                         <pic:blipFill>
-                          <a:blip r:embed="rId61"/>
+                          <a:blip r:embed="rId60"/>
                           <a:stretch>
                             <a:fillRect/>
                           </a:stretch>
@@ -11999,8 +14452,8 @@
         </w:tc>
       </w:tr>
     </w:tbl>
-    <w:bookmarkEnd w:id="64"/>
-    <w:bookmarkStart w:id="65" w:name="appendix-b.-workshop-schedule-and-agenda"/>
+    <w:bookmarkEnd w:id="63"/>
+    <w:bookmarkStart w:id="64" w:name="appendix-b.-workshop-schedule-and-agenda"/>
     <w:p>
       <w:pPr>
         <w:pStyle w:val="Heading1"/>
@@ -12022,7 +14475,7 @@
         <w:pStyle w:val="Compact"/>
         <w:numPr>
           <w:ilvl w:val="0"/>
-          <w:numId w:val="1025"/>
+          <w:numId w:val="1023"/>
         </w:numPr>
       </w:pPr>
       <w:r>
@@ -12034,7 +14487,7 @@
         <w:pStyle w:val="Compact"/>
         <w:numPr>
           <w:ilvl w:val="0"/>
-          <w:numId w:val="1025"/>
+          <w:numId w:val="1023"/>
         </w:numPr>
       </w:pPr>
       <w:r>
@@ -12046,7 +14499,7 @@
         <w:pStyle w:val="Compact"/>
         <w:numPr>
           <w:ilvl w:val="0"/>
-          <w:numId w:val="1025"/>
+          <w:numId w:val="1023"/>
         </w:numPr>
       </w:pPr>
       <w:r>
@@ -12058,7 +14511,7 @@
         <w:pStyle w:val="Compact"/>
         <w:numPr>
           <w:ilvl w:val="0"/>
-          <w:numId w:val="1025"/>
+          <w:numId w:val="1023"/>
         </w:numPr>
       </w:pPr>
       <w:r>
@@ -12070,7 +14523,7 @@
         <w:pStyle w:val="Compact"/>
         <w:numPr>
           <w:ilvl w:val="0"/>
-          <w:numId w:val="1025"/>
+          <w:numId w:val="1023"/>
         </w:numPr>
       </w:pPr>
       <w:r>
@@ -12303,8 +14756,8 @@
         </w:tc>
       </w:tr>
     </w:tbl>
-    <w:bookmarkEnd w:id="65"/>
-    <w:bookmarkStart w:id="75" w:name="appendix-c.-scw17-working-documents"/>
+    <w:bookmarkEnd w:id="64"/>
+    <w:bookmarkStart w:id="74" w:name="appendix-c.-scw17-working-documents"/>
     <w:p>
       <w:pPr>
         <w:pStyle w:val="Heading1"/>
@@ -12358,7 +14811,7 @@
             <w:pPr>
               <w:pStyle w:val="Compact"/>
             </w:pPr>
-            <w:hyperlink r:id="rId66">
+            <w:hyperlink r:id="rId65">
               <w:r>
                 <w:rPr>
                   <w:rStyle w:val="Hyperlink"/>
@@ -12387,7 +14840,7 @@
             <w:pPr>
               <w:pStyle w:val="Compact"/>
             </w:pPr>
-            <w:hyperlink r:id="rId67">
+            <w:hyperlink r:id="rId66">
               <w:r>
                 <w:rPr>
                   <w:rStyle w:val="Hyperlink"/>
@@ -12416,7 +14869,7 @@
             <w:pPr>
               <w:pStyle w:val="Compact"/>
             </w:pPr>
-            <w:hyperlink r:id="rId68">
+            <w:hyperlink r:id="rId67">
               <w:r>
                 <w:rPr>
                   <w:rStyle w:val="Hyperlink"/>
@@ -12445,7 +14898,7 @@
             <w:pPr>
               <w:pStyle w:val="Compact"/>
             </w:pPr>
-            <w:hyperlink r:id="rId69">
+            <w:hyperlink r:id="rId68">
               <w:r>
                 <w:rPr>
                   <w:rStyle w:val="Hyperlink"/>
@@ -12474,7 +14927,7 @@
             <w:pPr>
               <w:pStyle w:val="Compact"/>
             </w:pPr>
-            <w:hyperlink r:id="rId70">
+            <w:hyperlink r:id="rId69">
               <w:r>
                 <w:rPr>
                   <w:rStyle w:val="Hyperlink"/>
@@ -12503,7 +14956,7 @@
             <w:pPr>
               <w:pStyle w:val="Compact"/>
             </w:pPr>
-            <w:hyperlink r:id="rId71">
+            <w:hyperlink r:id="rId70">
               <w:r>
                 <w:rPr>
                   <w:rStyle w:val="Hyperlink"/>
@@ -12532,7 +14985,7 @@
             <w:pPr>
               <w:pStyle w:val="Compact"/>
             </w:pPr>
-            <w:hyperlink r:id="rId72">
+            <w:hyperlink r:id="rId71">
               <w:r>
                 <w:rPr>
                   <w:rStyle w:val="Hyperlink"/>
@@ -12561,7 +15014,7 @@
             <w:pPr>
               <w:pStyle w:val="Compact"/>
             </w:pPr>
-            <w:hyperlink r:id="rId73">
+            <w:hyperlink r:id="rId72">
               <w:r>
                 <w:rPr>
                   <w:rStyle w:val="Hyperlink"/>
@@ -12590,7 +15043,7 @@
             <w:pPr>
               <w:pStyle w:val="Compact"/>
             </w:pPr>
-            <w:hyperlink r:id="rId74">
+            <w:hyperlink r:id="rId73">
               <w:r>
                 <w:rPr>
                   <w:rStyle w:val="Hyperlink"/>
@@ -12613,8 +15066,8 @@
         </w:tc>
       </w:tr>
     </w:tbl>
-    <w:bookmarkEnd w:id="75"/>
-    <w:bookmarkStart w:id="77" w:name="Xb9aa851defa400ff4d28650dfe7d983101a6615"/>
+    <w:bookmarkEnd w:id="74"/>
+    <w:bookmarkStart w:id="76" w:name="Xb9aa851defa400ff4d28650dfe7d983101a6615"/>
     <w:p>
       <w:pPr>
         <w:pStyle w:val="Heading1"/>
@@ -12623,7 +15076,7 @@
         <w:t xml:space="preserve">Appendix D. Comments from External Experts</w:t>
       </w:r>
     </w:p>
-    <w:bookmarkStart w:id="76" w:name="tom-carruthers"/>
+    <w:bookmarkStart w:id="75" w:name="tom-carruthers"/>
     <w:p>
       <w:pPr>
         <w:pStyle w:val="Heading2"/>
@@ -12676,8 +15129,8 @@
         <w:t xml:space="preserve">Draft working report - Day 1 of the SCW17 MSE workshop, 15 June 2026. Prepared for review and correction by participants before submission to the SPRFMO Scientific Committee.</w:t>
       </w:r>
     </w:p>
+    <w:bookmarkEnd w:id="75"/>
     <w:bookmarkEnd w:id="76"/>
-    <w:bookmarkEnd w:id="77"/>
     <w:sectPr>
       <w:footnotePr>
         <w:numRestart w:val="eachSect"/>
@@ -13496,9 +15949,6 @@
     </w:lvlOverride>
   </w:num>
   <w:num w:numId="1020">
-    <w:abstractNumId w:val="991"/>
-  </w:num>
-  <w:num w:numId="1021">
     <w:abstractNumId w:val="99411"/>
     <w:lvlOverride w:ilvl="0">
       <w:startOverride w:val="1"/>
@@ -13528,43 +15978,13 @@
       <w:startOverride w:val="1"/>
     </w:lvlOverride>
   </w:num>
+  <w:num w:numId="1021">
+    <w:abstractNumId w:val="991"/>
+  </w:num>
   <w:num w:numId="1022">
     <w:abstractNumId w:val="991"/>
   </w:num>
   <w:num w:numId="1023">
-    <w:abstractNumId w:val="99411"/>
-    <w:lvlOverride w:ilvl="0">
-      <w:startOverride w:val="1"/>
-    </w:lvlOverride>
-    <w:lvlOverride w:ilvl="1">
-      <w:startOverride w:val="1"/>
-    </w:lvlOverride>
-    <w:lvlOverride w:ilvl="2">
-      <w:startOverride w:val="1"/>
-    </w:lvlOverride>
-    <w:lvlOverride w:ilvl="3">
-      <w:startOverride w:val="1"/>
-    </w:lvlOverride>
-    <w:lvlOverride w:ilvl="4">
-      <w:startOverride w:val="1"/>
-    </w:lvlOverride>
-    <w:lvlOverride w:ilvl="5">
-      <w:startOverride w:val="1"/>
-    </w:lvlOverride>
-    <w:lvlOverride w:ilvl="6">
-      <w:startOverride w:val="1"/>
-    </w:lvlOverride>
-    <w:lvlOverride w:ilvl="7">
-      <w:startOverride w:val="1"/>
-    </w:lvlOverride>
-    <w:lvlOverride w:ilvl="8">
-      <w:startOverride w:val="1"/>
-    </w:lvlOverride>
-  </w:num>
-  <w:num w:numId="1024">
-    <w:abstractNumId w:val="991"/>
-  </w:num>
-  <w:num w:numId="1025">
     <w:abstractNumId w:val="99411"/>
     <w:lvlOverride w:ilvl="0">
       <w:startOverride w:val="1"/>

</xml_diff>

<commit_message>
Update SCW17 report external comments
</commit_message>
<xml_diff>
--- a/docs/SCW17-MSE-Workshop-report.docx
+++ b/docs/SCW17-MSE-Workshop-report.docx
@@ -15,7 +15,7 @@
         <w:pStyle w:val="Date"/>
       </w:pPr>
       <w:r>
-        <w:t xml:space="preserve">2026-06-19</w:t>
+        <w:t xml:space="preserve">2026-06-21</w:t>
       </w:r>
     </w:p>
     <w:p>
@@ -145,7 +145,7 @@
         <w:t xml:space="preserve"> </w:t>
       </w:r>
       <w:r>
-        <w:t xml:space="preserve">19 June 2026 12:48 CEST</w:t>
+        <w:t xml:space="preserve">21 June 2026 23:04 PDT</w:t>
       </w:r>
     </w:p>
     <w:tbl>
@@ -15067,7 +15067,7 @@
       </w:tr>
     </w:tbl>
     <w:bookmarkEnd w:id="74"/>
-    <w:bookmarkStart w:id="76" w:name="Xb9aa851defa400ff4d28650dfe7d983101a6615"/>
+    <w:bookmarkStart w:id="81" w:name="Xb9aa851defa400ff4d28650dfe7d983101a6615"/>
     <w:p>
       <w:pPr>
         <w:pStyle w:val="Heading1"/>
@@ -15117,20 +15117,98 @@
         <w:t xml:space="preserve">In the context of MSE as an ongoing, iterative, scientific approach to adopting and refining robust management advice, the current stage of MSE development sufficiently supports the shortlisting of defensible CMPs for presentation to the Scientific Committee. As in all scientific processes, improvements can be identified. At this stage of jack mackerel MSE development, these are not sufficiently impactful to delay the process of adopting a robust management procedure. After an MP is adopted and in use, improvements can be considered for a later revision to the MSE framework.</w:t>
       </w:r>
     </w:p>
+    <w:bookmarkEnd w:id="75"/>
+    <w:bookmarkStart w:id="80" w:name="david-miller-and-rosana-ourens"/>
     <w:p>
       <w:pPr>
-        <w:pStyle w:val="BodyText"/>
-      </w:pPr>
-      <w:r>
-        <w:rPr>
-          <w:i/>
-          <w:iCs/>
-        </w:rPr>
-        <w:t xml:space="preserve">Draft working report - Day 1 of the SCW17 MSE workshop, 15 June 2026. Prepared for review and correction by participants before submission to the SPRFMO Scientific Committee.</w:t>
+        <w:pStyle w:val="Heading2"/>
+      </w:pPr>
+      <w:r>
+        <w:t xml:space="preserve">David Miller and Rosana Ourens</w:t>
       </w:r>
     </w:p>
-    <w:bookmarkEnd w:id="75"/>
+    <w:p>
+      <w:pPr>
+        <w:pStyle w:val="FirstParagraph"/>
+      </w:pPr>
+      <w:r>
+        <w:t xml:space="preserve">The meeting made solid progress in agreeing on operating models, performance indicators, and exploring management procedures. The process could have benefited from more stages where specific items were locked down to allow discussion to move forward with better focus. For example, upfront agreement on the baseline assessment and reference points in advance of the MSE workshop would have helped focus discussion on MSE development and avoid repeating discussions.</w:t>
+      </w:r>
+    </w:p>
+    <w:bookmarkStart w:id="76" w:name="operating-models"/>
+    <w:p>
+      <w:pPr>
+        <w:pStyle w:val="Heading3"/>
+      </w:pPr>
+      <w:r>
+        <w:t xml:space="preserve">Operating Models</w:t>
+      </w:r>
+    </w:p>
+    <w:p>
+      <w:pPr>
+        <w:pStyle w:val="FirstParagraph"/>
+      </w:pPr>
+      <w:r>
+        <w:t xml:space="preserve">The recent benchmark assessment provides a strong, now agreed-upon basis for conditioning the base-case OM for the MSE. The consensus to tune the management procedures primarily on this single base case, with potential tuning to the two-stock model OM, is a reasonable and practical simplification. The other alternative OMs provide a good range for robustness testing and cover the most important uncertainties around the stock, such as different stock-recruitment steepness, potential changes in fishing selectivity, and possible impacts of ENSO events. An approach for stress-testing MPs for inherent climate robustness was presented that could be considered in future.</w:t>
+      </w:r>
+    </w:p>
     <w:bookmarkEnd w:id="76"/>
+    <w:bookmarkStart w:id="77" w:name="performance-indicators"/>
+    <w:p>
+      <w:pPr>
+        <w:pStyle w:val="Heading3"/>
+      </w:pPr>
+      <w:r>
+        <w:t xml:space="preserve">Performance Indicators</w:t>
+      </w:r>
+    </w:p>
+    <w:p>
+      <w:pPr>
+        <w:pStyle w:val="FirstParagraph"/>
+      </w:pPr>
+      <w:r>
+        <w:t xml:space="preserve">The performance statistics were refined to ensure clear interpretation of the trade-offs between alternative MPs. Utilizing dynamic reference points is a sensible way to account for highly variable recruitment periods, ensuring that the probability of Kobe green metric remains meaningful during projections. Incorporating input from the stakeholder survey was useful, bridging the current gap between scientific preferences and actual industry objectives. The performance framework will place significant weight on both short- and long-term catch levels, biomass, catch stability, and related metrics. Other indicators, such as the proportion of simulated iterations that experience a stock crash and the number of times TAC-change limits are encountered, allow for a good examination of the behaviour and performance of MPs.</w:t>
+      </w:r>
+    </w:p>
+    <w:bookmarkEnd w:id="77"/>
+    <w:bookmarkStart w:id="78" w:name="management-procedures-1"/>
+    <w:p>
+      <w:pPr>
+        <w:pStyle w:val="Heading3"/>
+      </w:pPr>
+      <w:r>
+        <w:t xml:space="preserve">Management Procedures</w:t>
+      </w:r>
+    </w:p>
+    <w:p>
+      <w:pPr>
+        <w:pStyle w:val="FirstParagraph"/>
+      </w:pPr>
+      <w:r>
+        <w:t xml:space="preserve">The design of MPs to be tested could have benefited from stakeholder input. Nevertheless, the working group made a strong effort to test harvest-control rules with different shapes and trade-offs. For this exercise, it was very useful to have exploratory runs to compare outputs. Using a simple, empirical, index-based harvest rule is preferable to more complex assessment model-based approaches. Including SPiCT to combine multiple indices in the loop is probably an unnecessary addition. Because these empirical rules rely so heavily on field data, ensuring that the observation-error model accurately captures the historical cross-correlation among multiple indices is considered an essential technical priority. Exploring different combinations of indices for use in the MP will be useful. In initial testing, the simple constant-harvest-rate approach demonstrated favourable properties, including an ability to recover the stock effectively even under a recruitment-collapse scenario.</w:t>
+      </w:r>
+    </w:p>
+    <w:bookmarkEnd w:id="78"/>
+    <w:bookmarkStart w:id="79" w:name="exceptional-circumstances"/>
+    <w:p>
+      <w:pPr>
+        <w:pStyle w:val="Heading3"/>
+      </w:pPr>
+      <w:r>
+        <w:t xml:space="preserve">Exceptional Circumstances</w:t>
+      </w:r>
+    </w:p>
+    <w:p>
+      <w:pPr>
+        <w:pStyle w:val="FirstParagraph"/>
+      </w:pPr>
+      <w:r>
+        <w:t xml:space="preserve">With current indicators suggesting 2026 will likely be a year of low indices and difficult catches, establishing a formal, pre-agreed framework for exceptional circumstances should be a priority. As presented by Tom Carruthers, exceptional-circumstances triggers could be defined by analyzing MSE failure states and identifying the data bounds that lead to problematic outcomes.</w:t>
+      </w:r>
+    </w:p>
+    <w:bookmarkEnd w:id="79"/>
+    <w:bookmarkEnd w:id="80"/>
+    <w:bookmarkEnd w:id="81"/>
     <w:sectPr>
       <w:footnotePr>
         <w:numRestart w:val="eachSect"/>

</xml_diff>

<commit_message>
Render meeting report with Karolina's edits
</commit_message>
<xml_diff>
--- a/docs/SCW17-MSE-Workshop-report.docx
+++ b/docs/SCW17-MSE-Workshop-report.docx
@@ -15,7 +15,7 @@
         <w:pStyle w:val="Date"/>
       </w:pPr>
       <w:r>
-        <w:t xml:space="preserve">2026-06-21</w:t>
+        <w:t xml:space="preserve">2026-06-22</w:t>
       </w:r>
     </w:p>
     <w:p>
@@ -145,7 +145,7 @@
         <w:t xml:space="preserve"> </w:t>
       </w:r>
       <w:r>
-        <w:t xml:space="preserve">21 June 2026 23:04 PDT</w:t>
+        <w:t xml:space="preserve">22 June 2026 06:51 PDT</w:t>
       </w:r>
     </w:p>
     <w:tbl>
@@ -292,7 +292,7 @@
         </w:numPr>
       </w:pPr>
       <w:r>
-        <w:t xml:space="preserve">The group treated model 0.16 as the primary reference for OM conditioning during the workshop, while retaining model 0.00 and the SC13-era configuration as clearly labelled alternatives or robustness tests. The final OM reference set, OM naming conventions, projection-scenario definitions, and communication of alternative model outcomes remain important items for Scientific Committee review.</w:t>
+        <w:t xml:space="preserve">The group treated model 0.16 as the primary reference for OM conditioning during the workshop, while retaining model 0.00 and the SC13-era configuration as clearly labelled robustness tests. The final OM reference set, OM naming conventions, projection-scenario definitions, and communication of alternative model outcomes remain important items for Scientific Committee review.</w:t>
       </w:r>
     </w:p>
     <w:p>
@@ -432,7 +432,7 @@
         <w:t xml:space="preserve"> </w:t>
       </w:r>
       <w:r>
-        <w:t xml:space="preserve">The group used benchmark model h1_0.16 for all CMP testing. The benchmark h2_0.16 model was used to evaluate CMPs tuned on the h1_0.16 OM, with CMPs expected to perform acceptably under h2_0.16 in terms of Kobe-green probability. Model 1.14 from SC12 was retained as a robustness test. The 0.65 steepness OM and 0.8 steepness OM were weighted equally in the final performance statistics.</w:t>
+        <w:t xml:space="preserve">The group used benchmark model h1_0.16 for all CMP testing. The benchmark h2_0.16 model was used to evaluate CMPs tuned on the h1_0.16 OM, with CMPs expected to perform acceptably under h2_0.16 in terms of Kobe-green probability. Model 1.14 from SC13 was retained as a robustness test. The 0.65 steepness OM and 0.8 steepness OM were weighted equally in the final performance statistics.</w:t>
       </w:r>
     </w:p>
     <w:p>
@@ -519,7 +519,7 @@
         <w:t xml:space="preserve"> </w:t>
       </w:r>
       <w:r>
-        <w:t xml:space="preserve">The group recommended focusing on simple HCRs, starting with simple slope or piecewise-linear rules. More elaborate designs could be explored when time allowed. Minimum catch expectations were accounted for through performance statistics on catches below 270 thousand tonnes per year. TAC caps of -15% and +20% were tested, with mirrored scenarios also included. Banking and borrowing was identified as a sensitivity for the final CMP set rather than a feature that should feed back into the HCR itself.</w:t>
+        <w:t xml:space="preserve">The group recommended focusing on simple HCRs, starting with simple slope or piecewise-linear rules. More elaborate designs could be explored when time allowed. Minimum catch was specified at 270 kt per year for some CMPs but also monitored via performance statistics. TAC caps of -15% and +20% were tested, with mirrored scenarios also included. Banking and borrowing was identified as a sensitivity for the final CMP set rather than a feature that should feed back into the HCR itself.</w:t>
       </w:r>
     </w:p>
     <w:p>
@@ -1055,7 +1055,7 @@
         </w:numPr>
       </w:pPr>
       <w:r>
-        <w:t xml:space="preserve">The group reviewed differences between single-stock and two-stock estimates. Splitting the population into two stocks produced a lower combined biomass estimate than the single-stock model. Participants discussed how optimistic and pessimistic indices are redistributed between components and noted that naive merging of components should be avoided.</w:t>
+        <w:t xml:space="preserve">The group reviewed differences between single-stock and two-stock estimates. Splitting the population into two stocks produced a lower combined biomass estimate than the single-stock model. Participants discussed how optimistic and pessimistic indices are redistributed between components.</w:t>
       </w:r>
     </w:p>
     <w:p>
@@ -1140,7 +1140,7 @@
         </w:numPr>
       </w:pPr>
       <w:r>
-        <w:t xml:space="preserve">The composition of the OM reference set was debated, including the implications of model 0.00 as an optimistic high-biomass, low-exploitation outcome that could affect CMP tuning and communication. The practical approach was to focus immediate tuning work on model 0.16, while retaining model 0.00 and the SC13-era configuration as clearly labelled alternatives or robustness tests. The final reference-set decision was identified for further discussion and Scientific Committee review, alongside related work on future recruitment and index simulation, ENSO and broader climate effects, OM-set composition and naming, reference-point proxies, and projection-scenario definitions.</w:t>
+        <w:t xml:space="preserve">The composition of the OM reference set was debated, including the implications of model 0.00 as an optimistic high-biomass, low-exploitation outcome that could affect CMP tuning and communication. The practical approach was to focus immediate tuning work on model 0.16, while retaining model 0.00 and the SC13-era configuration as clearly labelled robustness tests. The final reference-set decision was identified for further discussion and Scientific Committee review, alongside related work on future recruitment and index simulation, ENSO and broader climate effects, OM-set composition and naming, reference-point proxies, and projection-scenario definitions.</w:t>
       </w:r>
     </w:p>
     <w:p>
@@ -3545,7 +3545,7 @@
         </w:numPr>
       </w:pPr>
       <w:r>
-        <w:t xml:space="preserve">CMP and HCR discussions emphasized starting with simple, interpretable rules. The group discussed index-based rules in which catch responds to changes in one or more abundance indices, rather than relying on constant catch. Several design handles were identified for testing: whether the rule passes through the origin, whether it includes a minimum catch or flat low-index segment, upper catch limits, trigger points, smoothing windows, polynomial smoothing, and TAC-change constraints. The group specifically discussed testing constraints such as 20% increases and 15% decreases, and evaluating whether these constraints still allow the CMP to respond quickly enough to low-recruitment events. The group favored piecewise-linear terminology for these rules, while retaining existing code labels where needed.</w:t>
+        <w:t xml:space="preserve">CMP and HCR discussions emphasized starting with simple, interpretable rules. The group discussed index-based rules in which catch responds to changes in one or more abundance indices, rather than relying on constant catch. Several design handles were identified for testing: whether the rule passes through the origin, whether it includes a minimum catch or flat low-index segment, upper catch limits, trigger points, smoothing windows, polynomial smoothing, and TAC-change constraints. The group specifically discussed testing constraints such as 20% increases and 15% decreases (relative to the symmetric 15% change), and evaluating whether these constraints still allow the CMP to respond quickly enough to low-recruitment events. The group favored piecewise-linear terminology for these rules, while retaining existing code labels where needed.</w:t>
       </w:r>
     </w:p>
     <w:p>
@@ -3556,7 +3556,7 @@
         </w:numPr>
       </w:pPr>
       <w:r>
-        <w:t xml:space="preserve">There was also discussion of which indices should feed CMPs. The initial rules used a small set of indices, but participants discussed adding or comparing additional indices, including acoustic and CPUE-related indices. The group noted that combined or weighted indices may simplify implementation, but the choice should reflect the simulated observation process and the relative reliability of each index.</w:t>
+        <w:t xml:space="preserve">There was also discussion of which indices should feed CMPs. The initial rules used all indices, but participants discussed comparing different subsetsof indices, including acoustic and CPUE-related indices. The group noted that combined or weighted indices may simplify implementation, but the choice should reflect the simulated observation process and the relative reliability of each index.</w:t>
       </w:r>
     </w:p>
     <w:p>
@@ -3689,7 +3689,7 @@
         <w:t xml:space="preserve"> </w:t>
       </w:r>
       <w:r>
-        <w:t xml:space="preserve">illustrates that, for the reference base model, tuning to P(kg) was straightforward. The tested runs showed a clear increase in P(Green) across tuning levels, with associated changes in catch, spawning biomass, inter-annual catch variability, shutdown probability, and F/F</w:t>
+        <w:t xml:space="preserve">illustrates that, for the reference base model, tuning to P(Kobe-green) was straightforward. The tested runs showed a clear increase in P(Green) across tuning levels, with associated changes in catch, spawning biomass, inter-annual catch variability, shutdown probability, and F/F</w:t>
       </w:r>
       <w:r>
         <w:rPr>
@@ -13879,8 +13879,7 @@
     <w:tbl>
       <w:tblPr>
         <w:tblStyle w:val="Table"/>
-        <w:tblW w:type="pct" w:w="5000"/>
-        <w:tblLayout w:type="fixed"/>
+        <w:tblW w:type="auto" w:w="0"/>
         <w:tblLook w:firstRow="1" w:lastRow="0" w:firstColumn="0" w:lastColumn="0" w:noHBand="0" w:noVBand="0" w:val="0020"/>
       </w:tblPr>
       <w:tblGrid>
@@ -13920,9 +13919,6 @@
             <w:pPr>
               <w:pStyle w:val="Compact"/>
             </w:pPr>
-            <w:r>
-              <w:t xml:space="preserve">Role</w:t>
-            </w:r>
           </w:p>
         </w:tc>
       </w:tr>
@@ -13955,9 +13951,6 @@
             <w:pPr>
               <w:pStyle w:val="Compact"/>
             </w:pPr>
-            <w:r>
-              <w:t xml:space="preserve">Chair / coordinator</w:t>
-            </w:r>
           </w:p>
         </w:tc>
       </w:tr>
@@ -13990,9 +13983,6 @@
             <w:pPr>
               <w:pStyle w:val="Compact"/>
             </w:pPr>
-            <w:r>
-              <w:t xml:space="preserve">Local organizer / rapporteur</w:t>
-            </w:r>
           </w:p>
         </w:tc>
       </w:tr>
@@ -14015,7 +14005,7 @@
               <w:pStyle w:val="Compact"/>
             </w:pPr>
             <w:r>
-              <w:t xml:space="preserve">European Union delegation</w:t>
+              <w:t xml:space="preserve">Wageningen Marine Research</w:t>
             </w:r>
           </w:p>
         </w:tc>
@@ -14025,9 +14015,6 @@
             <w:pPr>
               <w:pStyle w:val="Compact"/>
             </w:pPr>
-            <w:r>
-              <w:t xml:space="preserve">Member</w:t>
-            </w:r>
           </w:p>
         </w:tc>
       </w:tr>
@@ -14050,7 +14037,7 @@
               <w:pStyle w:val="Compact"/>
             </w:pPr>
             <w:r>
-              <w:t xml:space="preserve">MSE analyst (FLR / openMSE)</w:t>
+              <w:t xml:space="preserve">Wageningen Marine Research</w:t>
             </w:r>
           </w:p>
         </w:tc>
@@ -14060,9 +14047,6 @@
             <w:pPr>
               <w:pStyle w:val="Compact"/>
             </w:pPr>
-            <w:r>
-              <w:t xml:space="preserve">Analyst</w:t>
-            </w:r>
           </w:p>
         </w:tc>
       </w:tr>
@@ -14095,9 +14079,6 @@
             <w:pPr>
               <w:pStyle w:val="Compact"/>
             </w:pPr>
-            <w:r>
-              <w:t xml:space="preserve">Member</w:t>
-            </w:r>
           </w:p>
         </w:tc>
       </w:tr>
@@ -14130,9 +14111,6 @@
             <w:pPr>
               <w:pStyle w:val="Compact"/>
             </w:pPr>
-            <w:r>
-              <w:t xml:space="preserve">Member</w:t>
-            </w:r>
           </w:p>
         </w:tc>
       </w:tr>
@@ -14165,9 +14143,6 @@
             <w:pPr>
               <w:pStyle w:val="Compact"/>
             </w:pPr>
-            <w:r>
-              <w:t xml:space="preserve">Member</w:t>
-            </w:r>
           </w:p>
         </w:tc>
       </w:tr>
@@ -14200,9 +14175,6 @@
             <w:pPr>
               <w:pStyle w:val="Compact"/>
             </w:pPr>
-            <w:r>
-              <w:t xml:space="preserve">Member</w:t>
-            </w:r>
           </w:p>
         </w:tc>
       </w:tr>
@@ -14235,9 +14207,6 @@
             <w:pPr>
               <w:pStyle w:val="Compact"/>
             </w:pPr>
-            <w:r>
-              <w:t xml:space="preserve">Head of delegation</w:t>
-            </w:r>
           </w:p>
         </w:tc>
       </w:tr>
@@ -14270,9 +14239,6 @@
             <w:pPr>
               <w:pStyle w:val="Compact"/>
             </w:pPr>
-            <w:r>
-              <w:t xml:space="preserve">Member</w:t>
-            </w:r>
           </w:p>
         </w:tc>
       </w:tr>
@@ -14305,9 +14271,6 @@
             <w:pPr>
               <w:pStyle w:val="Compact"/>
             </w:pPr>
-            <w:r>
-              <w:t xml:space="preserve">Member</w:t>
-            </w:r>
           </w:p>
         </w:tc>
       </w:tr>
@@ -14330,7 +14293,7 @@
               <w:pStyle w:val="Compact"/>
             </w:pPr>
             <w:r>
-              <w:t xml:space="preserve">ICES Secretariat</w:t>
+              <w:t xml:space="preserve">ICES Secretariat (External reviewer)</w:t>
             </w:r>
           </w:p>
         </w:tc>
@@ -14340,9 +14303,6 @@
             <w:pPr>
               <w:pStyle w:val="Compact"/>
             </w:pPr>
-            <w:r>
-              <w:t xml:space="preserve">External reviewer</w:t>
-            </w:r>
           </w:p>
         </w:tc>
       </w:tr>
@@ -14365,7 +14325,7 @@
               <w:pStyle w:val="Compact"/>
             </w:pPr>
             <w:r>
-              <w:t xml:space="preserve">CEFAS (UK)</w:t>
+              <w:t xml:space="preserve">CEFAS (UK) (External reviewer)</w:t>
             </w:r>
           </w:p>
         </w:tc>
@@ -14375,9 +14335,6 @@
             <w:pPr>
               <w:pStyle w:val="Compact"/>
             </w:pPr>
-            <w:r>
-              <w:t xml:space="preserve">External reviewer</w:t>
-            </w:r>
           </w:p>
         </w:tc>
       </w:tr>
@@ -14400,7 +14357,7 @@
               <w:pStyle w:val="Compact"/>
             </w:pPr>
             <w:r>
-              <w:t xml:space="preserve">Blue Matter Science</w:t>
+              <w:t xml:space="preserve">Blue Matter Science (Invited expert)</w:t>
             </w:r>
           </w:p>
         </w:tc>
@@ -14410,9 +14367,6 @@
             <w:pPr>
               <w:pStyle w:val="Compact"/>
             </w:pPr>
-            <w:r>
-              <w:t xml:space="preserve">Invited expert</w:t>
-            </w:r>
           </w:p>
         </w:tc>
       </w:tr>
@@ -14435,7 +14389,7 @@
               <w:pStyle w:val="Compact"/>
             </w:pPr>
             <w:r>
-              <w:t xml:space="preserve">Pew Charitable Trusts</w:t>
+              <w:t xml:space="preserve">Pew Charitable Trusts (Observer)</w:t>
             </w:r>
           </w:p>
         </w:tc>
@@ -14445,9 +14399,6 @@
             <w:pPr>
               <w:pStyle w:val="Compact"/>
             </w:pPr>
-            <w:r>
-              <w:t xml:space="preserve">Observer</w:t>
-            </w:r>
           </w:p>
         </w:tc>
       </w:tr>

</xml_diff>

<commit_message>
Merge JZ and IP report edits
</commit_message>
<xml_diff>
--- a/docs/SCW17-MSE-Workshop-report.docx
+++ b/docs/SCW17-MSE-Workshop-report.docx
@@ -15,7 +15,7 @@
         <w:pStyle w:val="Date"/>
       </w:pPr>
       <w:r>
-        <w:t xml:space="preserve">2026-06-22</w:t>
+        <w:t xml:space="preserve">2026-06-24</w:t>
       </w:r>
     </w:p>
     <w:p>
@@ -145,7 +145,7 @@
         <w:t xml:space="preserve"> </w:t>
       </w:r>
       <w:r>
-        <w:t xml:space="preserve">22 June 2026 06:51 PDT</w:t>
+        <w:t xml:space="preserve">24 June 2026 13:05 PDT</w:t>
       </w:r>
     </w:p>
     <w:tbl>
@@ -281,7 +281,7 @@
         </w:numPr>
       </w:pPr>
       <w:r>
-        <w:t xml:space="preserve">This report summarizes the current state of the 2026 Jack Mackerel Working Group Management Strategy Evaluation (MSE) workshop report, held in Wageningen, the Netherlands. The workshop continued the MSE programme advanced at SCW15 and focused on preparing operating models (OMs), candidate management procedures (CMPs), performance metrics, robustness scenarios, and supporting documentation for SC14.</w:t>
+        <w:t xml:space="preserve">This report summarizes the work carried out during the 2026 Jack Mackerel Working Group Management Strategy Evaluation (MSE) workshop, held in Wageningen University, the Netherlands. The workshop continued the MSE programme advanced at SCW15 and focused on preparing a final set of operating models (OMs), a set of candidate management procedures (CMPs), complete performance statistics, as well as robustness scenarios and supporting documentation for SC14.</w:t>
       </w:r>
     </w:p>
     <w:p>
@@ -303,7 +303,7 @@
         </w:numPr>
       </w:pPr>
       <w:r>
-        <w:t xml:space="preserve">The group agreed to use 0.65 steepness as the base case, move 0.8 steepness to robustness testing, and treat regime/ENSO behaviour as a robustness issue rather than an integral component of the core simulations. Future recruitment and index simulation, including autocorrelation and cross-correlation, were identified as key technical issues because recruitment variability strongly affects projections, reference points, and CMP performance.</w:t>
+        <w:t xml:space="preserve">The group agreed to use 0.65 steepness as the base case, move 0.8 steepness to robustness testing, and treat regime/ENSO behaviour as a robustness issue rather than an integral component of the core simulations. Future recruitment and index simulation, including autocorrelation and cross-correlation, were identified as key technical issues because recruitment variability strongly affects projections, reference points, and CMP performance, while indices remain the sole input on stock status for any MP.</w:t>
       </w:r>
     </w:p>
     <w:p>
@@ -347,7 +347,7 @@
         <w:t xml:space="preserve"> </w:t>
       </w:r>
       <w:r>
-        <w:t xml:space="preserve">options, and constant-F yield-curve calculations. A strong recommendation was developed to use within-draw MCMC output to construct dynamic B</w:t>
+        <w:t xml:space="preserve">options, and constant-F yield-curve calculations. A strong recommendation was developed to keep using within-draw MCMC output to construct dynamic B</w:t>
       </w:r>
       <w:r>
         <w:rPr>
@@ -382,7 +382,7 @@
         </w:numPr>
       </w:pPr>
       <w:r>
-        <w:t xml:space="preserve">CMP discussions emphasized simple, interpretable index-based rules, including piecewise-linear harvest-control rules, TAC-change constraints, smoothing choices, and alternative index combinations. The CMPs examined during the workshop were trial designs used to learn about behavior, tuning, and trade-offs rather than final recommendations. The report records that Members and participants should nominate CMPs for Scientific Committee consideration, after which redundant or materially overlapping CMPs should be eliminated so that review can focus on a concise set of distinct alternatives.</w:t>
+        <w:t xml:space="preserve">CMP discussions emphasized simple, interpretable index-based rules, including piecewise-linear harvest-control rules, TAC-change constraints, smoothing choices, and alternative index combinations. The CMPs examined during the workshop were trial designs used to learn about behavior, tuning, and trade-offs rather than final recommendations. Members and participants should nominate CMPs for Scientific Committee consideration, after which redundant or materially overlapping CMPs should be eliminated so that review can focus on a concise set of distinct alternatives.</w:t>
       </w:r>
     </w:p>
     <w:p>
@@ -393,7 +393,7 @@
         </w:numPr>
       </w:pPr>
       <w:r>
-        <w:t xml:space="preserve">Exceptional circumstances were also discussed as a core implementation issue. The group considered the potential use of the ECP software framework to identify data patterns associated with poor CMP performance, compare type I and type II error rates, and support a transparent process for determining whether observations fall outside the range of conditions represented in the MSE.</w:t>
+        <w:t xml:space="preserve">Exceptional circumstances were also discussed as a core implementation issue. The group considered the potential use of the ECP software framework [Blue Matter Science 2026c] to identify data patterns associated with poor CMP performance, compare type I and type II error rates, and support a transparent process for determining whether observations fall outside the range of conditions represented in the MSE.</w:t>
       </w:r>
     </w:p>
     <w:bookmarkStart w:id="14" w:name="recommendations-and-conclusions"/>
@@ -410,7 +410,7 @@
         <w:pStyle w:val="FirstParagraph"/>
       </w:pPr>
       <w:r>
-        <w:t xml:space="preserve">The following recommendations and conclusions were identified for the summary of events:</w:t>
+        <w:t xml:space="preserve">The following recommendations and conclusions were agreed:</w:t>
       </w:r>
     </w:p>
     <w:p>
@@ -432,7 +432,7 @@
         <w:t xml:space="preserve"> </w:t>
       </w:r>
       <w:r>
-        <w:t xml:space="preserve">The group used benchmark model h1_0.16 for all CMP testing. The benchmark h2_0.16 model was used to evaluate CMPs tuned on the h1_0.16 OM, with CMPs expected to perform acceptably under h2_0.16 in terms of Kobe-green probability. Model 1.14 from SC13 was retained as a robustness test. The 0.65 steepness OM and 0.8 steepness OM were weighted equally in the final performance statistics.</w:t>
+        <w:t xml:space="preserve">The group used benchmark model h1_0.16 for all CMP testing. The benchmark h2_0.16 model was used to evaluate CMPs tuned on the h1_0.16 OM, with CMPs expected to perform acceptably under h2_0.16 in terms of Kobe-green probability. Model 1.14 from SC13 was retained as a robustness test.</w:t>
       </w:r>
     </w:p>
     <w:p>
@@ -454,7 +454,7 @@
         <w:t xml:space="preserve"> </w:t>
       </w:r>
       <w:r>
-        <w:t xml:space="preserve">The group included autocorrelation in recruitment deviations and cross-correlation between index deviations. A maximum effort of three times current effort levels was considered plausible.</w:t>
+        <w:t xml:space="preserve">The group agreed to include not only autocorrelation in recruitment deviations but also cross-correlation between index deviations. A limit on maximum effort of three times current effort levels was considered plausible.</w:t>
       </w:r>
     </w:p>
     <w:p>
@@ -497,7 +497,31 @@
         <w:t xml:space="preserve">0</w:t>
       </w:r>
       <w:r>
-        <w:t xml:space="preserve">.</w:t>
+        <w:t xml:space="preserve">. The group discussed whether the new SSB</w:t>
+      </w:r>
+      <w:r>
+        <w:rPr>
+          <w:vertAlign w:val="subscript"/>
+        </w:rPr>
+        <w:t xml:space="preserve">MSY</w:t>
+      </w:r>
+      <w:r>
+        <w:t xml:space="preserve"> </w:t>
+      </w:r>
+      <w:r>
+        <w:t xml:space="preserve">level should be set differently across OMs due to differences in steepness, and noted that the resulting SSB</w:t>
+      </w:r>
+      <w:r>
+        <w:rPr>
+          <w:vertAlign w:val="subscript"/>
+        </w:rPr>
+        <w:t xml:space="preserve">MSY</w:t>
+      </w:r>
+      <w:r>
+        <w:t xml:space="preserve"> </w:t>
+      </w:r>
+      <w:r>
+        <w:t xml:space="preserve">ratio will be applied directly to both OM tuning and the calculation of performance ratios.</w:t>
       </w:r>
     </w:p>
     <w:p>
@@ -519,7 +543,7 @@
         <w:t xml:space="preserve"> </w:t>
       </w:r>
       <w:r>
-        <w:t xml:space="preserve">The group recommended focusing on simple HCRs, starting with simple slope or piecewise-linear rules. More elaborate designs could be explored when time allowed. Minimum catch was specified at 270 kt per year for some CMPs but also monitored via performance statistics. TAC caps of -15% and +20% were tested, with mirrored scenarios also included. Banking and borrowing was identified as a sensitivity for the final CMP set rather than a feature that should feed back into the HCR itself.</w:t>
+        <w:t xml:space="preserve">The group recommended focusing on simple HCRs, starting with simple slope or piecewise-linear rules. More elaborate designs could be explored when time allowed. Minimum catch was specified at 270 kt per year for some CMPs but also monitored via performance statistics. TAC caps of -15% and +20% were tested, with both symmetric and asymmetric options. Banking and borrowing was identified as a sensitivity for the final CMP set rather than a feature that should feed back into the HCR itself.</w:t>
       </w:r>
     </w:p>
     <w:p>
@@ -541,7 +565,7 @@
         <w:t xml:space="preserve"> </w:t>
       </w:r>
       <w:r>
-        <w:t xml:space="preserve">The current robustness-simulation set includes scenarios with large recruitment impacts and was considered sufficient for addressing ENSO-related impacts on the stock at this stage.</w:t>
+        <w:t xml:space="preserve">The current robustness-simulation set includes scenarios with large and cyclical recruitment impacts, and was considered sufficient for addressing ENSO-related impacts on the stock at this stage. Changes in recruitment level and variability have already been constructed and could be applied if needed.</w:t>
       </w:r>
     </w:p>
     <w:p>
@@ -563,7 +587,7 @@
         <w:t xml:space="preserve"> </w:t>
       </w:r>
       <w:r>
-        <w:t xml:space="preserve">Exceptional-circumstances protocols were recognized as an important implementation issue, but the detailed specification was identified as further work once the CMP selection process is more advanced.</w:t>
+        <w:t xml:space="preserve">Exceptional-circumstances protocols were recognized as an important implementation issue, but the detailed specification was identified as to be carried out once the CMP selection process is more advanced.</w:t>
       </w:r>
     </w:p>
     <w:p>
@@ -585,7 +609,7 @@
         <w:t xml:space="preserve"> </w:t>
       </w:r>
       <w:r>
-        <w:t xml:space="preserve">A broad list of performance statistics was agreed, covering safety, yield, and stability across time periods. The group had not yet selected a smaller set of priority statistics.</w:t>
+        <w:t xml:space="preserve">A broad list of performance statistics was agreed, covering safety, yield, and stability across time periods. While all statistics will be computed, the group narrowed the table of performance indicators to prioritize a selection of six key metrics.</w:t>
       </w:r>
     </w:p>
     <w:tbl>
@@ -1119,7 +1143,18 @@
         </w:numPr>
       </w:pPr>
       <w:r>
-        <w:t xml:space="preserve">On combining multiple indices in empirical rules, the group agreed that weighting by representativity was more appropriate than weighting by catch.</w:t>
+        <w:t xml:space="preserve">The group discussed using cross-correlation among indices to simulate future index deviations. Participants noted that historical correlations are approximate because the series include changes in catchability and selectivity, whereas the projection settings use the more recent period. Autocorrelation in model index-fit residuals was identified as an appropriate approach for simulating future index deviations. Consequently, the generation of indices in projections was further developed to include autocorrelation, cross-correlation across indices, and added observation error. The group agreed on this approach. The practical check was to ensure that simulated deviations are consistent with the historical period and suitable for testing CMPs. Scrutiny of the deviations indicated that the generated deviations are appropriate for testing CMPs.</w:t>
+      </w:r>
+    </w:p>
+    <w:p>
+      <w:pPr>
+        <w:numPr>
+          <w:ilvl w:val="0"/>
+          <w:numId w:val="1008"/>
+        </w:numPr>
+      </w:pPr>
+      <w:r>
+        <w:t xml:space="preserve">On combining multiple indices in empirical rules, each index is standardized and all indices are combined through equal-weighted averaging. A weighted average based on index variance is available as an option and was discussed but not agreed. Smoothing of the indices was explored, but was not found to improve CMP performance.</w:t>
       </w:r>
     </w:p>
     <w:bookmarkEnd w:id="20"/>
@@ -1151,18 +1186,7 @@
         </w:numPr>
       </w:pPr>
       <w:r>
-        <w:t xml:space="preserve">The group discussed using cross-correlation among indices to simulate future recruitment deviations. Participants noted that historical correlations are approximate because the series include changes in catchability and selectivity, whereas the projection settings use the more recent period. Residual autocorrelation should also be represented where possible.</w:t>
-      </w:r>
-    </w:p>
-    <w:p>
-      <w:pPr>
-        <w:numPr>
-          <w:ilvl w:val="0"/>
-          <w:numId w:val="1009"/>
-        </w:numPr>
-      </w:pPr>
-      <w:r>
-        <w:t xml:space="preserve">The group agreed to implement an approximate treatment rather than attempting a fully specified multivariate autocorrelated time-series model. The practical check is whether simulated deviations are consistent with the historical period and suitable for testing CMPs.</w:t>
+        <w:t xml:space="preserve">The group agreed to implement an approximate treatment rather than attempting a fully specified multivariate autocorrelated time-series model.</w:t>
       </w:r>
     </w:p>
     <w:bookmarkEnd w:id="21"/>
@@ -1194,7 +1218,7 @@
         </w:numPr>
       </w:pPr>
       <w:r>
-        <w:t xml:space="preserve">The group discussed whether ENSO or regime behaviour should be represented in the core simulations. Earlier ENSO checks provided limited recruitment signal, and each El Nino event may differ in spatial and biological effect. The group agreed to treat regime/ENSO behaviour as a robustness issue, potentially through resampling high- and low-productivity historical periods, rather than as an integral component of the reference simulations.</w:t>
+        <w:t xml:space="preserve">The group discussed whether ENSO or regime behaviour should be represented in the core simulations. Earlier ENSO checks provided limited recruitment signal, and each El Nino event may differ in spatial and biological effect. The group agreed to treat regime/ENSO behaviour as a robustness issue through two scenarios: a seven-year cyclical decrease in recruitment and a one-year recruitment-collapse scenario.</w:t>
       </w:r>
     </w:p>
     <w:p>
@@ -3490,7 +3514,7 @@
         </w:numPr>
       </w:pPr>
       <w:r>
-        <w:t xml:space="preserve">Recruitment-deviation scenarios were discussed in detail. The group considered low-recruitment, recruitment-failure, and cyclical recruitment patterns, including whether recovery should be abrupt or gradual. There was concern that some future recruitment simulations may generate biomass variability that is broader than expected from the historical record, even under F = 0 projections. The group noted the need to compare historical and projected recruitment and biomass patterns to ensure the projection behavior is realistic and not overly precautionary because of excessive simulated environmental variability.</w:t>
+        <w:t xml:space="preserve">Recruitment-deviation scenarios were discussed in detail. The group considered low-recruitment, recruitment-failure, and cyclical recruitment patterns, including whether recovery should be abrupt or gradual. There was concern that some future recruitment simulations may generate biomass variability that is broader than expected from the historical record, even under F = 0 projections. The group noted the need to compare historical and projected recruitment and biomass patterns to ensure the projection behavior is realistic and not overly precautionary because of excessive simulated environmental variability. The group also reviewed consistency in recruitment projections, specifically the uncertainty levels arising from no-fishing scenarios, and agreed that the current configuration is adequate.</w:t>
       </w:r>
     </w:p>
     <w:p>
@@ -3556,7 +3580,7 @@
         </w:numPr>
       </w:pPr>
       <w:r>
-        <w:t xml:space="preserve">There was also discussion of which indices should feed CMPs. The initial rules used all indices, but participants discussed comparing different subsetsof indices, including acoustic and CPUE-related indices. The group noted that combined or weighted indices may simplify implementation, but the choice should reflect the simulated observation process and the relative reliability of each index.</w:t>
+        <w:t xml:space="preserve">There was also discussion of which indices should feed CMPs. The initial rules used all indices, but participants discussed comparing different subsets of indices, including North-Chile acoustic and Peruvian artisanal CPUE, and CPUE-related indices. The group noted that combined or weighted indices may simplify implementation, but the choice should reflect the simulated observation process and the relative reliability of each index.</w:t>
       </w:r>
     </w:p>
     <w:p>
@@ -3712,7 +3736,7 @@
         </w:numPr>
       </w:pPr>
       <w:r>
-        <w:t xml:space="preserve">The Thursday morning discussion used results from the initial fourteen-run exploratory CMP set to narrow the next round of tests. The group noted that the TAC-change constraints considered in the initial runs did not appear to be strongly limiting, while a low upper catch cap could make the CMP behave close to a constant-catch rule and reduce its usefulness for exploring trade-offs. Participants also discussed the need to separate effects of the catch level from effects of the HCR slope: a higher target catch can increase short-term catch, but if the slope is too steep it can reduce long-term performance or increase the probability of being outside the green zone. The group therefore focused the second set on a smaller number of interpretable changes, including tuned triggers for target catches of 2.0, 3.5, and 5.0 million tonnes, Chile-requested variants with a 270 thousand tonne minimum catch, an asymmetric TAC-change constraint, and a special Chile-shape variant (</w:t>
+        <w:t xml:space="preserve">The Thursday morning discussion used results from the initial fourteen-run exploratory CMP set to narrow the next round of tests. The group noted that the TAC-change constraints considered in the initial runs did not appear to be strongly limiting, while a low upper catch cap could make the CMP behave close to a constant-catch rule and reduce its usefulness for exploring trade-offs. Participants also discussed the need to separate effects of the catch level from effects of the HCR slope: a higher target catch can increase short-term catch, but if the slope is too steep it can reduce long-term performance or increase the probability of being outside the green zone. The group therefore focused the second set on a smaller number of interpretable changes, including tuned triggers for target catches of 2.0, 3.5, and 5.0 million tonnes, variants with a 270 thousand tonne minimum catch, an asymmetric TAC-change constraint, and a special shape variant (</w:t>
       </w:r>
       <w:hyperlink w:anchor="tbl-cmp-second-set">
         <w:r>
@@ -3723,7 +3747,7 @@
         </w:r>
       </w:hyperlink>
       <w:r>
-        <w:t xml:space="preserve">). This was intended as a stepwise screening process: remove options that provide little marginal information, retain variants that clarify trade-offs, and identify the smaller set of CMPs to carry into fuller performance and robustness summaries. The narrowed set was selected because it spanned useful trade-offs, not because each row represented a final recommended CMP.</w:t>
+        <w:t xml:space="preserve">). These last three MP features were requested by Chile, as they were tested and selected as part of a national jack mackerel MSE project completed this year. This iterative testing was intended as a stepwise screening process: remove options that provide little marginal information, retain variants that clarify trade-offs, and identify the smaller set of CMPs to carry into fuller performance and robustness summaries. The narrowed set was selected because it spanned useful trade-offs, not because each row represented a final recommended CMP.</w:t>
       </w:r>
     </w:p>
     <w:p>
@@ -13556,7 +13580,7 @@
       </w:r>
     </w:p>
     <w:bookmarkEnd w:id="51"/>
-    <w:bookmarkStart w:id="59" w:name="references"/>
+    <w:bookmarkStart w:id="60" w:name="references"/>
     <w:p>
       <w:pPr>
         <w:pStyle w:val="Heading1"/>
@@ -13747,11 +13771,34 @@
         </w:numPr>
       </w:pPr>
       <w:r>
+        <w:t xml:space="preserve">Blue Matter Science. 2026c. ECP: Exceptional Circumstances Protocols for Adopted Management Procedures. Source code repository.</w:t>
+      </w:r>
+      <w:r>
+        <w:t xml:space="preserve"> </w:t>
+      </w:r>
+      <w:hyperlink r:id="rId59">
+        <w:r>
+          <w:rPr>
+            <w:rStyle w:val="Hyperlink"/>
+          </w:rPr>
+          <w:t xml:space="preserve">https://github.com/Blue-Matter/ECP.git</w:t>
+        </w:r>
+      </w:hyperlink>
+    </w:p>
+    <w:p>
+      <w:pPr>
+        <w:pStyle w:val="Compact"/>
+        <w:numPr>
+          <w:ilvl w:val="0"/>
+          <w:numId w:val="1022"/>
+        </w:numPr>
+      </w:pPr>
+      <w:r>
         <w:t xml:space="preserve">Annex K. Original jack mackerel management procedure.</w:t>
       </w:r>
     </w:p>
-    <w:bookmarkEnd w:id="59"/>
-    <w:bookmarkStart w:id="63" w:name="appendix-a.-participants"/>
+    <w:bookmarkEnd w:id="60"/>
+    <w:bookmarkStart w:id="64" w:name="appendix-a.-participants"/>
     <w:p>
       <w:pPr>
         <w:pStyle w:val="Heading1"/>
@@ -13801,18 +13848,18 @@
                 <wp:inline>
                   <wp:extent cx="152400" cy="152400"/>
                   <wp:effectExtent b="0" l="0" r="0" t="0"/>
-                  <wp:docPr descr="" title="" id="61" name="Picture"/>
+                  <wp:docPr descr="" title="" id="62" name="Picture"/>
                   <a:graphic>
                     <a:graphicData uri="http://schemas.openxmlformats.org/drawingml/2006/picture">
                       <pic:pic>
                         <pic:nvPicPr>
-                          <pic:cNvPr descr="/Applications/quarto/share/formats/docx/warning.png" id="62" name="Picture"/>
+                          <pic:cNvPr descr="/Applications/quarto/share/formats/docx/warning.png" id="63" name="Picture"/>
                           <pic:cNvPicPr>
                             <a:picLocks noChangeArrowheads="1" noChangeAspect="1"/>
                           </pic:cNvPicPr>
                         </pic:nvPicPr>
                         <pic:blipFill>
-                          <a:blip r:embed="rId60"/>
+                          <a:blip r:embed="rId61"/>
                           <a:stretch>
                             <a:fillRect/>
                           </a:stretch>
@@ -14005,7 +14052,7 @@
               <w:pStyle w:val="Compact"/>
             </w:pPr>
             <w:r>
-              <w:t xml:space="preserve">Wageningen Marine Research</w:t>
+              <w:t xml:space="preserve">Wageningen Marine Research (EU delegation)</w:t>
             </w:r>
           </w:p>
         </w:tc>
@@ -14037,7 +14084,7 @@
               <w:pStyle w:val="Compact"/>
             </w:pPr>
             <w:r>
-              <w:t xml:space="preserve">Wageningen Marine Research</w:t>
+              <w:t xml:space="preserve">Wageningen Marine Research (Consultant)</w:t>
             </w:r>
           </w:p>
         </w:tc>
@@ -14069,7 +14116,7 @@
               <w:pStyle w:val="Compact"/>
             </w:pPr>
             <w:r>
-              <w:t xml:space="preserve">Wageningen Marine Research</w:t>
+              <w:t xml:space="preserve">Wageningen Marine Research (Consultant)</w:t>
             </w:r>
           </w:p>
         </w:tc>
@@ -14403,8 +14450,8 @@
         </w:tc>
       </w:tr>
     </w:tbl>
-    <w:bookmarkEnd w:id="63"/>
-    <w:bookmarkStart w:id="64" w:name="appendix-b.-workshop-schedule-and-agenda"/>
+    <w:bookmarkEnd w:id="64"/>
+    <w:bookmarkStart w:id="65" w:name="appendix-b.-workshop-schedule-and-agenda"/>
     <w:p>
       <w:pPr>
         <w:pStyle w:val="Heading1"/>
@@ -14707,8 +14754,8 @@
         </w:tc>
       </w:tr>
     </w:tbl>
-    <w:bookmarkEnd w:id="64"/>
-    <w:bookmarkStart w:id="74" w:name="appendix-c.-scw17-working-documents"/>
+    <w:bookmarkEnd w:id="65"/>
+    <w:bookmarkStart w:id="75" w:name="appendix-c.-scw17-working-documents"/>
     <w:p>
       <w:pPr>
         <w:pStyle w:val="Heading1"/>
@@ -14762,7 +14809,7 @@
             <w:pPr>
               <w:pStyle w:val="Compact"/>
             </w:pPr>
-            <w:hyperlink r:id="rId65">
+            <w:hyperlink r:id="rId66">
               <w:r>
                 <w:rPr>
                   <w:rStyle w:val="Hyperlink"/>
@@ -14791,7 +14838,7 @@
             <w:pPr>
               <w:pStyle w:val="Compact"/>
             </w:pPr>
-            <w:hyperlink r:id="rId66">
+            <w:hyperlink r:id="rId67">
               <w:r>
                 <w:rPr>
                   <w:rStyle w:val="Hyperlink"/>
@@ -14820,7 +14867,7 @@
             <w:pPr>
               <w:pStyle w:val="Compact"/>
             </w:pPr>
-            <w:hyperlink r:id="rId67">
+            <w:hyperlink r:id="rId68">
               <w:r>
                 <w:rPr>
                   <w:rStyle w:val="Hyperlink"/>
@@ -14849,7 +14896,7 @@
             <w:pPr>
               <w:pStyle w:val="Compact"/>
             </w:pPr>
-            <w:hyperlink r:id="rId68">
+            <w:hyperlink r:id="rId69">
               <w:r>
                 <w:rPr>
                   <w:rStyle w:val="Hyperlink"/>
@@ -14878,7 +14925,7 @@
             <w:pPr>
               <w:pStyle w:val="Compact"/>
             </w:pPr>
-            <w:hyperlink r:id="rId69">
+            <w:hyperlink r:id="rId70">
               <w:r>
                 <w:rPr>
                   <w:rStyle w:val="Hyperlink"/>
@@ -14907,7 +14954,7 @@
             <w:pPr>
               <w:pStyle w:val="Compact"/>
             </w:pPr>
-            <w:hyperlink r:id="rId70">
+            <w:hyperlink r:id="rId71">
               <w:r>
                 <w:rPr>
                   <w:rStyle w:val="Hyperlink"/>
@@ -14936,7 +14983,7 @@
             <w:pPr>
               <w:pStyle w:val="Compact"/>
             </w:pPr>
-            <w:hyperlink r:id="rId71">
+            <w:hyperlink r:id="rId72">
               <w:r>
                 <w:rPr>
                   <w:rStyle w:val="Hyperlink"/>
@@ -14965,7 +15012,7 @@
             <w:pPr>
               <w:pStyle w:val="Compact"/>
             </w:pPr>
-            <w:hyperlink r:id="rId72">
+            <w:hyperlink r:id="rId73">
               <w:r>
                 <w:rPr>
                   <w:rStyle w:val="Hyperlink"/>
@@ -14994,7 +15041,7 @@
             <w:pPr>
               <w:pStyle w:val="Compact"/>
             </w:pPr>
-            <w:hyperlink r:id="rId73">
+            <w:hyperlink r:id="rId74">
               <w:r>
                 <w:rPr>
                   <w:rStyle w:val="Hyperlink"/>
@@ -15017,8 +15064,8 @@
         </w:tc>
       </w:tr>
     </w:tbl>
-    <w:bookmarkEnd w:id="74"/>
-    <w:bookmarkStart w:id="81" w:name="Xb9aa851defa400ff4d28650dfe7d983101a6615"/>
+    <w:bookmarkEnd w:id="75"/>
+    <w:bookmarkStart w:id="82" w:name="Xb9aa851defa400ff4d28650dfe7d983101a6615"/>
     <w:p>
       <w:pPr>
         <w:pStyle w:val="Heading1"/>
@@ -15027,7 +15074,7 @@
         <w:t xml:space="preserve">Appendix D. Comments from External Experts</w:t>
       </w:r>
     </w:p>
-    <w:bookmarkStart w:id="75" w:name="tom-carruthers"/>
+    <w:bookmarkStart w:id="76" w:name="tom-carruthers"/>
     <w:p>
       <w:pPr>
         <w:pStyle w:val="Heading2"/>
@@ -15068,8 +15115,8 @@
         <w:t xml:space="preserve">In the context of MSE as an ongoing, iterative, scientific approach to adopting and refining robust management advice, the current stage of MSE development sufficiently supports the shortlisting of defensible CMPs for presentation to the Scientific Committee. As in all scientific processes, improvements can be identified. At this stage of jack mackerel MSE development, these are not sufficiently impactful to delay the process of adopting a robust management procedure. After an MP is adopted and in use, improvements can be considered for a later revision to the MSE framework.</w:t>
       </w:r>
     </w:p>
-    <w:bookmarkEnd w:id="75"/>
-    <w:bookmarkStart w:id="80" w:name="david-miller-and-rosana-ourens"/>
+    <w:bookmarkEnd w:id="76"/>
+    <w:bookmarkStart w:id="81" w:name="david-miller-and-rosana-ourens"/>
     <w:p>
       <w:pPr>
         <w:pStyle w:val="Heading2"/>
@@ -15086,7 +15133,7 @@
         <w:t xml:space="preserve">The meeting made solid progress in agreeing on operating models, performance indicators, and exploring management procedures. The process could have benefited from more stages where specific items were locked down to allow discussion to move forward with better focus. For example, upfront agreement on the baseline assessment and reference points in advance of the MSE workshop would have helped focus discussion on MSE development and avoid repeating discussions.</w:t>
       </w:r>
     </w:p>
-    <w:bookmarkStart w:id="76" w:name="operating-models"/>
+    <w:bookmarkStart w:id="77" w:name="operating-models"/>
     <w:p>
       <w:pPr>
         <w:pStyle w:val="Heading3"/>
@@ -15103,8 +15150,8 @@
         <w:t xml:space="preserve">The recent benchmark assessment provides a strong, now agreed-upon basis for conditioning the base-case OM for the MSE. The consensus to tune the management procedures primarily on this single base case, with potential tuning to the two-stock model OM, is a reasonable and practical simplification. The other alternative OMs provide a good range for robustness testing and cover the most important uncertainties around the stock, such as different stock-recruitment steepness, potential changes in fishing selectivity, and possible impacts of ENSO events. An approach for stress-testing MPs for inherent climate robustness was presented that could be considered in future.</w:t>
       </w:r>
     </w:p>
-    <w:bookmarkEnd w:id="76"/>
-    <w:bookmarkStart w:id="77" w:name="performance-indicators"/>
+    <w:bookmarkEnd w:id="77"/>
+    <w:bookmarkStart w:id="78" w:name="performance-indicators"/>
     <w:p>
       <w:pPr>
         <w:pStyle w:val="Heading3"/>
@@ -15121,8 +15168,8 @@
         <w:t xml:space="preserve">The performance statistics were refined to ensure clear interpretation of the trade-offs between alternative MPs. Utilizing dynamic reference points is a sensible way to account for highly variable recruitment periods, ensuring that the probability of Kobe green metric remains meaningful during projections. Incorporating input from the stakeholder survey was useful, bridging the current gap between scientific preferences and actual industry objectives. The performance framework will place significant weight on both short- and long-term catch levels, biomass, catch stability, and related metrics. Other indicators, such as the proportion of simulated iterations that experience a stock crash and the number of times TAC-change limits are encountered, allow for a good examination of the behaviour and performance of MPs.</w:t>
       </w:r>
     </w:p>
-    <w:bookmarkEnd w:id="77"/>
-    <w:bookmarkStart w:id="78" w:name="management-procedures-1"/>
+    <w:bookmarkEnd w:id="78"/>
+    <w:bookmarkStart w:id="79" w:name="management-procedures-1"/>
     <w:p>
       <w:pPr>
         <w:pStyle w:val="Heading3"/>
@@ -15139,8 +15186,8 @@
         <w:t xml:space="preserve">The design of MPs to be tested could have benefited from stakeholder input. Nevertheless, the working group made a strong effort to test harvest-control rules with different shapes and trade-offs. For this exercise, it was very useful to have exploratory runs to compare outputs. Using a simple, empirical, index-based harvest rule is preferable to more complex assessment model-based approaches. Including SPiCT to combine multiple indices in the loop is probably an unnecessary addition. Because these empirical rules rely so heavily on field data, ensuring that the observation-error model accurately captures the historical cross-correlation among multiple indices is considered an essential technical priority. Exploring different combinations of indices for use in the MP will be useful. In initial testing, the simple constant-harvest-rate approach demonstrated favourable properties, including an ability to recover the stock effectively even under a recruitment-collapse scenario.</w:t>
       </w:r>
     </w:p>
-    <w:bookmarkEnd w:id="78"/>
-    <w:bookmarkStart w:id="79" w:name="exceptional-circumstances"/>
+    <w:bookmarkEnd w:id="79"/>
+    <w:bookmarkStart w:id="80" w:name="exceptional-circumstances"/>
     <w:p>
       <w:pPr>
         <w:pStyle w:val="Heading3"/>
@@ -15157,9 +15204,9 @@
         <w:t xml:space="preserve">With current indicators suggesting 2026 will likely be a year of low indices and difficult catches, establishing a formal, pre-agreed framework for exceptional circumstances should be a priority. As presented by Tom Carruthers, exceptional-circumstances triggers could be defined by analyzing MSE failure states and identifying the data bounds that lead to problematic outcomes.</w:t>
       </w:r>
     </w:p>
-    <w:bookmarkEnd w:id="79"/>
     <w:bookmarkEnd w:id="80"/>
     <w:bookmarkEnd w:id="81"/>
+    <w:bookmarkEnd w:id="82"/>
     <w:sectPr>
       <w:footnotePr>
         <w:numRestart w:val="eachSect"/>

</xml_diff>

<commit_message>
Update workshop report photo and PDF
</commit_message>
<xml_diff>
--- a/docs/SCW17-MSE-Workshop-report.docx
+++ b/docs/SCW17-MSE-Workshop-report.docx
@@ -15,7 +15,7 @@
         <w:pStyle w:val="Date"/>
       </w:pPr>
       <w:r>
-        <w:t xml:space="preserve">2026-06-24</w:t>
+        <w:t xml:space="preserve">2026-07-07</w:t>
       </w:r>
     </w:p>
     <w:p>
@@ -145,7 +145,7 @@
         <w:t xml:space="preserve"> </w:t>
       </w:r>
       <w:r>
-        <w:t xml:space="preserve">24 June 2026 13:05 PDT</w:t>
+        <w:t xml:space="preserve">07 July 2026 20:49 PDT</w:t>
       </w:r>
     </w:p>
     <w:tbl>
@@ -264,7 +264,62 @@
         </w:tc>
       </w:tr>
     </w:tbl>
-    <w:bookmarkStart w:id="15" w:name="summary"/>
+    <w:p>
+      <w:pPr>
+        <w:pStyle w:val="CaptionedFigure"/>
+      </w:pPr>
+      <w:r>
+        <w:drawing>
+          <wp:inline>
+            <wp:extent cx="4107180" cy="2738120"/>
+            <wp:effectExtent b="0" l="0" r="0" t="0"/>
+            <wp:docPr descr="SCW17 workshop participants outside the Wageningen venue." title="" id="13" name="Picture"/>
+            <a:graphic>
+              <a:graphicData uri="http://schemas.openxmlformats.org/drawingml/2006/picture">
+                <pic:pic>
+                  <pic:nvPicPr>
+                    <pic:cNvPr descr="assets/scw17-workshop-group-photo.jpeg" id="14" name="Picture"/>
+                    <pic:cNvPicPr>
+                      <a:picLocks noChangeArrowheads="1" noChangeAspect="1"/>
+                    </pic:cNvPicPr>
+                  </pic:nvPicPr>
+                  <pic:blipFill>
+                    <a:blip r:embed="rId12"/>
+                    <a:stretch>
+                      <a:fillRect/>
+                    </a:stretch>
+                  </pic:blipFill>
+                  <pic:spPr bwMode="auto">
+                    <a:xfrm>
+                      <a:off x="0" y="0"/>
+                      <a:ext cx="4107180" cy="2738120"/>
+                    </a:xfrm>
+                    <a:prstGeom prst="rect">
+                      <a:avLst/>
+                    </a:prstGeom>
+                    <a:noFill/>
+                    <a:ln w="9525">
+                      <a:noFill/>
+                      <a:headEnd/>
+                      <a:tailEnd/>
+                    </a:ln>
+                  </pic:spPr>
+                </pic:pic>
+              </a:graphicData>
+            </a:graphic>
+          </wp:inline>
+        </w:drawing>
+      </w:r>
+    </w:p>
+    <w:p>
+      <w:pPr>
+        <w:pStyle w:val="ImageCaption"/>
+      </w:pPr>
+      <w:r>
+        <w:t xml:space="preserve">SCW17 workshop participants outside the Wageningen venue.</w:t>
+      </w:r>
+    </w:p>
+    <w:bookmarkStart w:id="18" w:name="summary"/>
     <w:p>
       <w:pPr>
         <w:pStyle w:val="Heading1"/>
@@ -396,7 +451,7 @@
         <w:t xml:space="preserve">Exceptional circumstances were also discussed as a core implementation issue. The group considered the potential use of the ECP software framework [Blue Matter Science 2026c] to identify data patterns associated with poor CMP performance, compare type I and type II error rates, and support a transparent process for determining whether observations fall outside the range of conditions represented in the MSE.</w:t>
       </w:r>
     </w:p>
-    <w:bookmarkStart w:id="14" w:name="recommendations-and-conclusions"/>
+    <w:bookmarkStart w:id="17" w:name="recommendations-and-conclusions"/>
     <w:p>
       <w:pPr>
         <w:pStyle w:val="Heading2"/>
@@ -432,7 +487,7 @@
         <w:t xml:space="preserve"> </w:t>
       </w:r>
       <w:r>
-        <w:t xml:space="preserve">The group used benchmark model h1_0.16 for all CMP testing. The benchmark h2_0.16 model was used to evaluate CMPs tuned on the h1_0.16 OM, with CMPs expected to perform acceptably under h2_0.16 in terms of Kobe-green probability. Model 1.14 from SC13 was retained as a robustness test.</w:t>
+        <w:t xml:space="preserve">The group used benchmark model h1_0.16 for all CMP testing. The benchmark h2_0.16 model was used to evaluate CMPs tuned on the h1_0.16 OM, with CMPs expected to perform acceptably under h2_0.16 in terms of Kobe-green probability. Model 1.14 from SC13 (labelled 0.00 for SCW17) was retained as a robustness test.</w:t>
       </w:r>
     </w:p>
     <w:p>
@@ -488,7 +543,7 @@
         <w:t xml:space="preserve"> </w:t>
       </w:r>
       <w:r>
-        <w:t xml:space="preserve">was defined on the basis of OM constant-F forecasts. Biomass status was defined as biomass relative to dynamic B</w:t>
+        <w:t xml:space="preserve">was defined based on OM constant-F forecasts. Biomass status was defined as biomass relative to dynamic B</w:t>
       </w:r>
       <w:r>
         <w:rPr>
@@ -653,12 +708,12 @@
                 <wp:inline>
                   <wp:extent cx="152400" cy="152400"/>
                   <wp:effectExtent b="0" l="0" r="0" t="0"/>
-                  <wp:docPr descr="" title="" id="12" name="Picture"/>
+                  <wp:docPr descr="" title="" id="15" name="Picture"/>
                   <a:graphic>
                     <a:graphicData uri="http://schemas.openxmlformats.org/drawingml/2006/picture">
                       <pic:pic>
                         <pic:nvPicPr>
-                          <pic:cNvPr descr="/Applications/quarto/share/formats/docx/note.png" id="13" name="Picture"/>
+                          <pic:cNvPr descr="/Applications/quarto/share/formats/docx/note.png" id="16" name="Picture"/>
                           <pic:cNvPicPr>
                             <a:picLocks noChangeArrowheads="1" noChangeAspect="1"/>
                           </pic:cNvPicPr>
@@ -752,9 +807,9 @@
         <w:t xml:space="preserve">evaluations. Projection tools and reporting scripts were expanded to support fixed-F and fixed-catch scenarios, selectivity sensitivity analyses, two-stock catch allocation checks, and improved visualization of performance trade-offs. Additional diagnostics were developed for survey and CPUE indices, including vulnerable biomass coverage, index correlations, ROC/AUC analyses, and updated reporting outputs to support review by the SPRFMO Jack Mackerel Working Group.</w:t>
       </w:r>
     </w:p>
-    <w:bookmarkEnd w:id="14"/>
-    <w:bookmarkEnd w:id="15"/>
-    <w:bookmarkStart w:id="16" w:name="introduction"/>
+    <w:bookmarkEnd w:id="17"/>
+    <w:bookmarkEnd w:id="18"/>
+    <w:bookmarkStart w:id="19" w:name="introduction"/>
     <w:p>
       <w:pPr>
         <w:pStyle w:val="Heading1"/>
@@ -943,8 +998,8 @@
         <w:t xml:space="preserve">Record decisions, issues requiring further work, and follow-up tasks for the workshop report to SC14.</w:t>
       </w:r>
     </w:p>
-    <w:bookmarkEnd w:id="16"/>
-    <w:bookmarkStart w:id="19" w:name="developments-since-the-benchmark"/>
+    <w:bookmarkEnd w:id="19"/>
+    <w:bookmarkStart w:id="22" w:name="developments-since-the-benchmark"/>
     <w:p>
       <w:pPr>
         <w:pStyle w:val="Heading1"/>
@@ -953,7 +1008,7 @@
         <w:t xml:space="preserve">Developments Since the Benchmark</w:t>
       </w:r>
     </w:p>
-    <w:bookmarkStart w:id="17" w:name="Xeeed3d519cc312d972037247414cb7d11e44166"/>
+    <w:bookmarkStart w:id="20" w:name="Xeeed3d519cc312d972037247414cb7d11e44166"/>
     <w:p>
       <w:pPr>
         <w:pStyle w:val="Heading2"/>
@@ -995,8 +1050,8 @@
         <w:t xml:space="preserve">Exceptional circumstances were introduced as a key design issue. The group noted that a full assessment is one possible response, while indicator-based monitoring could also be used. The Scientific Committee would use the best available information to judge whether exceptional circumstances should be declared, with the detailed response to be developed later in the week.</w:t>
       </w:r>
     </w:p>
-    <w:bookmarkEnd w:id="17"/>
-    <w:bookmarkStart w:id="18" w:name="model-developments-since-the-benchmark"/>
+    <w:bookmarkEnd w:id="20"/>
+    <w:bookmarkStart w:id="21" w:name="model-developments-since-the-benchmark"/>
     <w:p>
       <w:pPr>
         <w:pStyle w:val="Heading2"/>
@@ -1013,7 +1068,7 @@
         </w:numPr>
       </w:pPr>
       <w:r>
-        <w:t xml:space="preserve">Paper 01 summarized post-benchmark work, including corrections to the Peruvian industrial CPUE series and revised selectivity treatment. A CPUE scaling error was corrected: the effort-creep factor had been applied by multiplication rather than division. Correcting the error lowered the end of the industrial CPUE series, while the artisanal series was unchanged.</w:t>
+        <w:t xml:space="preserve">Paper 01 summarized post-benchmark work, including corrections to the Peruvian industrial CPUE series and revised selectivity treatment. A CPUE scaling error was corrected: the effort-creep factor had been applied by multiplication rather than division. Correcting the error lowered the end of the industrial CPUE series, while the artisanal series was unchanged because effort creep was considered unlikely for this fleet.</w:t>
       </w:r>
     </w:p>
     <w:p>
@@ -1090,12 +1145,12 @@
         </w:numPr>
       </w:pPr>
       <w:r>
-        <w:t xml:space="preserve">The two-stock configurations showed somewhat different MCMC behaviour but remained usable for comparison. The group noted that structurally divergent OMs are harder to tune jointly and require careful communication if they are included in the reference or robustness set.</w:t>
+        <w:t xml:space="preserve">The two-stock configurations showed somewhat different MCMC behaviour but remained usable for comparison. The group noted that structurally divergent OMs are harder to tune jointly. However, careful communication is required if they are included in either the reference set or robustness set.</w:t>
       </w:r>
     </w:p>
-    <w:bookmarkEnd w:id="18"/>
-    <w:bookmarkEnd w:id="19"/>
-    <w:bookmarkStart w:id="25" w:name="operating-model-specifications"/>
+    <w:bookmarkEnd w:id="21"/>
+    <w:bookmarkEnd w:id="22"/>
+    <w:bookmarkStart w:id="28" w:name="operating-model-specifications"/>
     <w:p>
       <w:pPr>
         <w:pStyle w:val="Heading1"/>
@@ -1104,7 +1159,7 @@
         <w:t xml:space="preserve">Operating-Model Specifications</w:t>
       </w:r>
     </w:p>
-    <w:bookmarkStart w:id="20" w:name="X36c329a4bda5f6739a3672fe8bf246085b683ee"/>
+    <w:bookmarkStart w:id="23" w:name="X36c329a4bda5f6739a3672fe8bf246085b683ee"/>
     <w:p>
       <w:pPr>
         <w:pStyle w:val="Heading2"/>
@@ -1154,11 +1209,11 @@
         </w:numPr>
       </w:pPr>
       <w:r>
-        <w:t xml:space="preserve">On combining multiple indices in empirical rules, each index is standardized and all indices are combined through equal-weighted averaging. A weighted average based on index variance is available as an option and was discussed but not agreed. Smoothing of the indices was explored, but was not found to improve CMP performance.</w:t>
+        <w:t xml:space="preserve">On combining multiple indices in empirical rules, each index is standardized and all indices are combined through equal-weighted averaging. A weighted average based on catch proportions or index variance is available as an option and was discussed but not agreed. Smoothing of the indices was explored, but was not found to improve CMP performance.</w:t>
       </w:r>
     </w:p>
-    <w:bookmarkEnd w:id="20"/>
-    <w:bookmarkStart w:id="21" w:name="operating-model-reference-set"/>
+    <w:bookmarkEnd w:id="23"/>
+    <w:bookmarkStart w:id="24" w:name="operating-model-reference-set"/>
     <w:p>
       <w:pPr>
         <w:pStyle w:val="Heading2"/>
@@ -1169,28 +1224,18 @@
     </w:p>
     <w:p>
       <w:pPr>
+        <w:pStyle w:val="Compact"/>
         <w:numPr>
           <w:ilvl w:val="0"/>
           <w:numId w:val="1009"/>
         </w:numPr>
       </w:pPr>
       <w:r>
-        <w:t xml:space="preserve">The composition of the OM reference set was debated, including the implications of model 0.00 as an optimistic high-biomass, low-exploitation outcome that could affect CMP tuning and communication. The practical approach was to focus immediate tuning work on model 0.16, while retaining model 0.00 and the SC13-era configuration as clearly labelled robustness tests. The final reference-set decision was identified for further discussion and Scientific Committee review, alongside related work on future recruitment and index simulation, ENSO and broader climate effects, OM-set composition and naming, reference-point proxies, and projection-scenario definitions.</w:t>
+        <w:t xml:space="preserve">The composition of the OM reference set was debated, including the implications of model 0.00 as an optimistic high-biomass, low-exploitation outcome that could affect CMP tuning and communication. The practical and agreed approach was to focus immediate tuning work on model 0.16, while retaining model 0.00 and the SC13-era configuration as clearly labelled robustness tests. The final reference-set decision was identified for further discussion and Scientific Committee review, alongside related work on future recruitment and index simulation, ENSO and broader climate effects, OM-set composition and naming, reference-point proxies, and projection-scenario definitions.</w:t>
       </w:r>
     </w:p>
-    <w:p>
-      <w:pPr>
-        <w:numPr>
-          <w:ilvl w:val="0"/>
-          <w:numId w:val="1009"/>
-        </w:numPr>
-      </w:pPr>
-      <w:r>
-        <w:t xml:space="preserve">The group agreed to implement an approximate treatment rather than attempting a fully specified multivariate autocorrelated time-series model.</w:t>
-      </w:r>
-    </w:p>
-    <w:bookmarkEnd w:id="21"/>
-    <w:bookmarkStart w:id="22" w:name="enso-regimes-and-climate-effects"/>
+    <w:bookmarkEnd w:id="24"/>
+    <w:bookmarkStart w:id="25" w:name="enso-regimes-and-climate-effects"/>
     <w:p>
       <w:pPr>
         <w:pStyle w:val="Heading2"/>
@@ -1254,8 +1299,8 @@
         <w:t xml:space="preserve">The demonstration used empirical CMPs and climate stress tests for natural mortality, recruitment, growth, and condition factor. It showed how different CMP archetypes can differ in climate robustness, and how the result can be expressed in practical terms for tactical advice. The Working Group expressed its gratitude to Dr. Carruthers for contributing this presentation and for helping frame climate robustness in a form that can support Scientific Committee and Commission discussion.</w:t>
       </w:r>
     </w:p>
-    <w:bookmarkEnd w:id="22"/>
-    <w:bookmarkStart w:id="24" w:name="operating-model-set-and-naming"/>
+    <w:bookmarkEnd w:id="25"/>
+    <w:bookmarkStart w:id="27" w:name="operating-model-set-and-naming"/>
     <w:p>
       <w:pPr>
         <w:pStyle w:val="Heading2"/>
@@ -1272,7 +1317,7 @@
         </w:numPr>
       </w:pPr>
       <w:r>
-        <w:t xml:space="preserve">The group worked through the OM list and naming conventions as a trial set for learning about model behaviour and the characteristics of alternative projection assumptions. The trial set included one-stock versus two-stock configurations, model 0.16 versus model 1.14, movement variants, and a selectivity-change variant. The purpose was to understand how these dimensions affected CMP tuning, robustness, and interpretation before finalizing the operating-model set for Scientific Committee review.</w:t>
+        <w:t xml:space="preserve">The group worked through the OM list and naming conventions as a trial set for learning about model behaviour and the characteristics of alternative projection assumptions. The trial set included one-stock versus two-stock configurations, model 0.16 versus model 0.00, movement variants, and a selectivity-change variant. The purpose was to understand how these dimensions affected CMP tuning, robustness, and interpretation before finalizing the operating-model set for Scientific Committee review.</w:t>
       </w:r>
     </w:p>
     <w:p>
@@ -1299,7 +1344,7 @@
       <w:tr>
         <w:tc>
           <w:tcPr/>
-          <w:bookmarkStart w:id="23" w:name="tbl-day2-om-set"/>
+          <w:bookmarkStart w:id="26" w:name="tbl-day2-om-set"/>
           <w:p>
             <w:pPr>
               <w:jc w:val="center"/>
@@ -3480,13 +3525,13 @@
               </w:tc>
             </w:tr>
           </w:tbl>
-          <w:bookmarkEnd w:id="23"/>
+          <w:bookmarkEnd w:id="26"/>
         </w:tc>
       </w:tr>
     </w:tbl>
-    <w:bookmarkEnd w:id="24"/>
-    <w:bookmarkEnd w:id="25"/>
-    <w:bookmarkStart w:id="37" w:name="management-procedures"/>
+    <w:bookmarkEnd w:id="27"/>
+    <w:bookmarkEnd w:id="28"/>
+    <w:bookmarkStart w:id="40" w:name="management-procedures"/>
     <w:p>
       <w:pPr>
         <w:pStyle w:val="Heading1"/>
@@ -3569,7 +3614,7 @@
         </w:numPr>
       </w:pPr>
       <w:r>
-        <w:t xml:space="preserve">CMP and HCR discussions emphasized starting with simple, interpretable rules. The group discussed index-based rules in which catch responds to changes in one or more abundance indices, rather than relying on constant catch. Several design handles were identified for testing: whether the rule passes through the origin, whether it includes a minimum catch or flat low-index segment, upper catch limits, trigger points, smoothing windows, polynomial smoothing, and TAC-change constraints. The group specifically discussed testing constraints such as 20% increases and 15% decreases (relative to the symmetric 15% change), and evaluating whether these constraints still allow the CMP to respond quickly enough to low-recruitment events. The group favored piecewise-linear terminology for these rules, while retaining existing code labels where needed.</w:t>
+        <w:t xml:space="preserve">CMP and HCR discussions emphasized starting with simple, interpretable rules. The group discussed index-based rules in which catch responds to changes in one or more abundance indices, rather than relying on constant catch. Several design handles were identified for testing: whether the rule passes through the origin, whether it includes a minimum catch or flat low-index segment, upper catch limits, trigger points, smoothing windows, polynomial smoothing, and TAC-change constraints. The group specifically discussed testing constraints such as 20% increases and 15% decreases (relative to the symmetric 15% change), and evaluating whether these constraints still allow the CMP to respond quickly enough to low-recruitment events. The group favored piecewise-linear terminology for these rules, while retaining existing code labels where needed. Banking and borrowing of TAC was also raised, but the group considered it a sensitivity to be examined for the final CMP set rather than a mechanism that should feed back into the harvest-control rule itself.</w:t>
       </w:r>
     </w:p>
     <w:p>
@@ -3616,7 +3661,7 @@
       <w:tr>
         <w:tc>
           <w:tcPr/>
-          <w:bookmarkStart w:id="29" w:name="fig-cmp-reference-base-tuning"/>
+          <w:bookmarkStart w:id="32" w:name="fig-cmp-reference-base-tuning"/>
           <w:p>
             <w:pPr>
               <w:pStyle w:val="Compact"/>
@@ -3627,18 +3672,18 @@
                 <wp:inline>
                   <wp:extent cx="5334000" cy="3048000"/>
                   <wp:effectExtent b="0" l="0" r="0" t="0"/>
-                  <wp:docPr descr="" title="" id="27" name="Picture"/>
+                  <wp:docPr descr="" title="" id="30" name="Picture"/>
                   <a:graphic>
                     <a:graphicData uri="http://schemas.openxmlformats.org/drawingml/2006/picture">
                       <pic:pic>
                         <pic:nvPicPr>
-                          <pic:cNvPr descr="figures/cmp-reference-base-tuning.png" id="28" name="Picture"/>
+                          <pic:cNvPr descr="figures/cmp-reference-base-tuning.png" id="31" name="Picture"/>
                           <pic:cNvPicPr>
                             <a:picLocks noChangeArrowheads="1" noChangeAspect="1"/>
                           </pic:cNvPicPr>
                         </pic:nvPicPr>
                         <pic:blipFill>
-                          <a:blip r:embed="rId26"/>
+                          <a:blip r:embed="rId29"/>
                           <a:stretch>
                             <a:fillRect/>
                           </a:stretch>
@@ -3690,7 +3735,7 @@
               <w:t xml:space="preserve">for runs 15a-15e.</w:t>
             </w:r>
           </w:p>
-          <w:bookmarkEnd w:id="29"/>
+          <w:bookmarkEnd w:id="32"/>
         </w:tc>
       </w:tr>
     </w:tbl>
@@ -3769,7 +3814,7 @@
         </w:numPr>
       </w:pPr>
       <w:r>
-        <w:t xml:space="preserve">A further point was that fishery behavior and effort constraints may matter. Participants noted that a TAC may be theoretically catchable in the model but not economically or operationally achievable if vessels cannot find fish or if fishing conditions deteriorate. There was interest in whether effort or fleet-behavior constraints could be represented in future scenarios or diagnostics, while recognizing that doing so would require additional assumptions and data. Catch outcomes below 270 thousand tonnes, catch-rate proxies, and effort limits such as a multiple of current effort were identified as useful supplementary diagnostics for interpreting fishery feasibility.</w:t>
+        <w:t xml:space="preserve">A further point was that fishery behavior and effort constraints may matter. Participants noted that a TAC may be theoretically catchable in the model but not economically or operationally achievable if vessels cannot find fish or if fishing conditions deteriorate. There was interest in whether effort or fleet-behavior constraints could be represented in future scenarios or diagnostics, while recognizing that doing so would require additional assumptions and data. Catch outcomes below 270 thousand tonnes, catch-rate proxies, and effort limits such as a multiple of current effort were identified as useful supplementary diagnostics for interpreting fishery feasibility. In this context the group considered a cap of roughly three times current effort to be a plausible upper bound on attainable fishing effort.</w:t>
       </w:r>
     </w:p>
     <w:p>
@@ -3847,7 +3892,7 @@
       <w:tr>
         <w:tc>
           <w:tcPr/>
-          <w:bookmarkStart w:id="30" w:name="tbl-hcr-candidates"/>
+          <w:bookmarkStart w:id="33" w:name="tbl-hcr-candidates"/>
           <w:p>
             <w:pPr>
               <w:jc w:val="center"/>
@@ -7777,7 +7822,7 @@
               </w:tc>
             </w:tr>
           </w:tbl>
-          <w:bookmarkEnd w:id="30"/>
+          <w:bookmarkEnd w:id="33"/>
         </w:tc>
       </w:tr>
     </w:tbl>
@@ -7802,7 +7847,7 @@
       <w:tr>
         <w:tc>
           <w:tcPr/>
-          <w:bookmarkStart w:id="31" w:name="tbl-cmp-second-set"/>
+          <w:bookmarkStart w:id="34" w:name="tbl-cmp-second-set"/>
           <w:p>
             <w:pPr>
               <w:jc w:val="center"/>
@@ -10017,7 +10062,7 @@
               </w:tc>
             </w:tr>
           </w:tbl>
-          <w:bookmarkEnd w:id="31"/>
+          <w:bookmarkEnd w:id="34"/>
         </w:tc>
       </w:tr>
     </w:tbl>
@@ -10034,7 +10079,7 @@
       <w:tr>
         <w:tc>
           <w:tcPr/>
-          <w:bookmarkStart w:id="35" w:name="fig-hcr-faceted"/>
+          <w:bookmarkStart w:id="38" w:name="fig-hcr-faceted"/>
           <w:p>
             <w:pPr>
               <w:pStyle w:val="Compact"/>
@@ -10045,18 +10090,18 @@
                 <wp:inline>
                   <wp:extent cx="5334000" cy="4267200"/>
                   <wp:effectExtent b="0" l="0" r="0" t="0"/>
-                  <wp:docPr descr="" title="" id="33" name="Picture"/>
+                  <wp:docPr descr="" title="" id="36" name="Picture"/>
                   <a:graphic>
                     <a:graphicData uri="http://schemas.openxmlformats.org/drawingml/2006/picture">
                       <pic:pic>
                         <pic:nvPicPr>
-                          <pic:cNvPr descr="SCW17-MSE-Workshop-report_files/figure-docx/fig-hcr-faceted-1.png" id="34" name="Picture"/>
+                          <pic:cNvPr descr="SCW17-MSE-Workshop-report_files/figure-docx/fig-hcr-faceted-1.png" id="37" name="Picture"/>
                           <pic:cNvPicPr>
                             <a:picLocks noChangeArrowheads="1" noChangeAspect="1"/>
                           </pic:cNvPicPr>
                         </pic:nvPicPr>
                         <pic:blipFill>
-                          <a:blip r:embed="rId32"/>
+                          <a:blip r:embed="rId35"/>
                           <a:stretch>
                             <a:fillRect/>
                           </a:stretch>
@@ -10105,7 +10150,7 @@
               <w:t xml:space="preserve">; dashed vertical lines show trigger values, dotted vertical lines show limits, and horizontal lines show minimum and target catch. Quadrant colors are used only to enhance visualization of HCR-shape differences and do not indicate stock-status concerns.</w:t>
             </w:r>
           </w:p>
-          <w:bookmarkEnd w:id="35"/>
+          <w:bookmarkEnd w:id="38"/>
         </w:tc>
       </w:tr>
     </w:tbl>
@@ -10138,7 +10183,7 @@
       <w:r>
         <w:t xml:space="preserve"> </w:t>
       </w:r>
-      <w:hyperlink r:id="rId36">
+      <w:hyperlink r:id="rId39">
         <w:r>
           <w:rPr>
             <w:rStyle w:val="Hyperlink"/>
@@ -10150,8 +10195,8 @@
         <w:t xml:space="preserve">.</w:t>
       </w:r>
     </w:p>
-    <w:bookmarkEnd w:id="37"/>
-    <w:bookmarkStart w:id="49" w:name="Xf14104c8b0128a6d0b4aafde13bfb9db0923d6b"/>
+    <w:bookmarkEnd w:id="40"/>
+    <w:bookmarkStart w:id="52" w:name="Xf14104c8b0128a6d0b4aafde13bfb9db0923d6b"/>
     <w:p>
       <w:pPr>
         <w:pStyle w:val="Heading1"/>
@@ -10160,7 +10205,7 @@
         <w:t xml:space="preserve">Trade-offs, Robustness, and Performance Metrics</w:t>
       </w:r>
     </w:p>
-    <w:bookmarkStart w:id="39" w:name="reference-points-and-kobe-plot-summaries"/>
+    <w:bookmarkStart w:id="42" w:name="reference-points-and-kobe-plot-summaries"/>
     <w:p>
       <w:pPr>
         <w:pStyle w:val="Heading2"/>
@@ -10250,7 +10295,7 @@
       <w:r>
         <w:t xml:space="preserve"> </w:t>
       </w:r>
-      <w:hyperlink r:id="rId38">
+      <w:hyperlink r:id="rId41">
         <w:r>
           <w:rPr>
             <w:rStyle w:val="Hyperlink"/>
@@ -10495,8 +10540,8 @@
         <w:t xml:space="preserve">as the Kobe-plot and reference-point trace. This approach better reflects autocorrelated environmental recruitment variability while focusing CMP evaluation on the management effect on fishing and stock status.</w:t>
       </w:r>
     </w:p>
-    <w:bookmarkEnd w:id="39"/>
-    <w:bookmarkStart w:id="40" w:name="tuning-and-robustness"/>
+    <w:bookmarkEnd w:id="42"/>
+    <w:bookmarkStart w:id="43" w:name="tuning-and-robustness"/>
     <w:p>
       <w:pPr>
         <w:pStyle w:val="Heading2"/>
@@ -10526,6 +10571,12 @@
       <w:r>
         <w:t xml:space="preserve">Joint tuning across structurally divergent OMs, such as one-stock and two-stock models, increases computational and communication challenges. Weighting schemes for combining OMs remain a substantive design choice and should be documented if used.</w:t>
       </w:r>
+      <w:r>
+        <w:t xml:space="preserve"> </w:t>
+      </w:r>
+      <w:r>
+        <w:t xml:space="preserve">For the present trials, CMPs were tuned on the h1_0.16 reference OM and then evaluated against h2_0.16, with the expectation that a CMP tuned on h1_0.16 should retain an acceptable probability of being in the Kobe-green zone under h2_0.16.</w:t>
+      </w:r>
     </w:p>
     <w:p>
       <w:pPr>
@@ -10557,9 +10608,15 @@
       <w:r>
         <w:t xml:space="preserve">, inter-annual catch variability, probabilities of low catch or shutdown-like outcomes, and diagnostics that separate biomass status from overfishing status.</w:t>
       </w:r>
+      <w:r>
+        <w:t xml:space="preserve"> </w:t>
+      </w:r>
+      <w:r>
+        <w:t xml:space="preserve">The group agreed on a broad list of performance statistics spanning safety, yield, and stability across short- and long-term periods. While all statistics will be computed and reported, the group narrowed the headline table to six key metrics to keep Scientific Committee review focused, with the remaining statistics retained as supporting diagnostics.</w:t>
+      </w:r>
     </w:p>
-    <w:bookmarkEnd w:id="40"/>
-    <w:bookmarkStart w:id="43" w:name="omcmp-display-software"/>
+    <w:bookmarkEnd w:id="43"/>
+    <w:bookmarkStart w:id="46" w:name="omcmp-display-software"/>
     <w:p>
       <w:pPr>
         <w:pStyle w:val="Heading2"/>
@@ -10582,7 +10639,7 @@
       <w:r>
         <w:t xml:space="preserve"> </w:t>
       </w:r>
-      <w:hyperlink r:id="rId41">
+      <w:hyperlink r:id="rId44">
         <w:r>
           <w:rPr>
             <w:rStyle w:val="VerbatimChar"/>
@@ -10596,7 +10653,7 @@
       <w:r>
         <w:t xml:space="preserve"> </w:t>
       </w:r>
-      <w:hyperlink r:id="rId42">
+      <w:hyperlink r:id="rId45">
         <w:r>
           <w:rPr>
             <w:rStyle w:val="Hyperlink"/>
@@ -10608,8 +10665,8 @@
         <w:t xml:space="preserve">; the preliminary jack mackerel Slick object can be uploaded there for interactive review.</w:t>
       </w:r>
     </w:p>
-    <w:bookmarkEnd w:id="43"/>
-    <w:bookmarkStart w:id="48" w:name="X5f137827b8bd88e9c3847b4fe2a0dde844646b2"/>
+    <w:bookmarkEnd w:id="46"/>
+    <w:bookmarkStart w:id="51" w:name="X5f137827b8bd88e9c3847b4fe2a0dde844646b2"/>
     <w:p>
       <w:pPr>
         <w:pStyle w:val="Heading2"/>
@@ -10682,7 +10739,7 @@
       <w:tr>
         <w:tc>
           <w:tcPr/>
-          <w:bookmarkStart w:id="47" w:name="fig-ecp-preliminary"/>
+          <w:bookmarkStart w:id="50" w:name="fig-ecp-preliminary"/>
           <w:p>
             <w:pPr>
               <w:pStyle w:val="Compact"/>
@@ -10693,18 +10750,18 @@
                 <wp:inline>
                   <wp:extent cx="5334000" cy="3012578"/>
                   <wp:effectExtent b="0" l="0" r="0" t="0"/>
-                  <wp:docPr descr="" title="" id="45" name="Picture"/>
+                  <wp:docPr descr="" title="" id="48" name="Picture"/>
                   <a:graphic>
                     <a:graphicData uri="http://schemas.openxmlformats.org/drawingml/2006/picture">
                       <pic:pic>
                         <pic:nvPicPr>
-                          <pic:cNvPr descr="figures/ecp-preliminary-screenshot.png" id="46" name="Picture"/>
+                          <pic:cNvPr descr="figures/ecp-preliminary-screenshot.png" id="49" name="Picture"/>
                           <pic:cNvPicPr>
                             <a:picLocks noChangeArrowheads="1" noChangeAspect="1"/>
                           </pic:cNvPicPr>
                         </pic:nvPicPr>
                         <pic:blipFill>
-                          <a:blip r:embed="rId44"/>
+                          <a:blip r:embed="rId47"/>
                           <a:stretch>
                             <a:fillRect/>
                           </a:stretch>
@@ -10744,13 +10801,13 @@
               <w:t xml:space="preserve">Figure 3: Partial screenshot of a preliminary application of the ECP application to SPRFMO jack mackerel MSE work.</w:t>
             </w:r>
           </w:p>
-          <w:bookmarkEnd w:id="47"/>
+          <w:bookmarkEnd w:id="50"/>
         </w:tc>
       </w:tr>
     </w:tbl>
-    <w:bookmarkEnd w:id="48"/>
-    <w:bookmarkEnd w:id="49"/>
-    <w:bookmarkStart w:id="51" w:name="planning-for-sc14-and-next-steps"/>
+    <w:bookmarkEnd w:id="51"/>
+    <w:bookmarkEnd w:id="52"/>
+    <w:bookmarkStart w:id="54" w:name="planning-for-sc14-and-next-steps"/>
     <w:p>
       <w:pPr>
         <w:pStyle w:val="Heading1"/>
@@ -10767,7 +10824,7 @@
         </w:numPr>
       </w:pPr>
       <w:r>
-        <w:t xml:space="preserve">The discussions produced several practical directions for the next round of work. Future recruitment deviations should be simulated with an approximate cross-correlation and autocorrelation treatment, followed by comparison with the historical period. ENSO and regime behaviour should be treated as robustness tests rather than integral core-simulation components, although the timing of that work remains to be confirmed. Climate treatment should be framed through robustness or stress testing and presented clearly to the Scientific Committee. The OM set should retain the one- versus two-stock contrast, model 0.16 versus 1.14, movement variants, and a selectivity-change variant, with the 2026 movement transition smoothed to the 10-year average. Reference-point work should continue to focus on proxies for poorly defined F</w:t>
+        <w:t xml:space="preserve">The discussions produced several practical directions for the next round of work. Future recruitment deviations should be simulated with an approximate cross-correlation and autocorrelation treatment, followed by comparison with the historical period. ENSO and regime behaviour should be treated as robustness tests rather than integral core-simulation components, although the timing of that work remains to be confirmed. Climate treatment should be framed through robustness or stress testing and presented clearly to the Scientific Committee. The OM set should retain the one- versus two-stock contrast, model 0.16 versus 0.00, movement variants, and a selectivity-change variant, with the 2026 movement transition smoothed to the 10-year average. Reference-point work should continue to focus on proxies for poorly defined F</w:t>
       </w:r>
       <w:r>
         <w:rPr>
@@ -10886,7 +10943,7 @@
       <w:tr>
         <w:tc>
           <w:tcPr/>
-          <w:bookmarkStart w:id="50" w:name="tbl-day4-cmp-robustness"/>
+          <w:bookmarkStart w:id="53" w:name="tbl-day4-cmp-robustness"/>
           <w:p>
             <w:pPr>
               <w:jc w:val="center"/>
@@ -13381,7 +13438,7 @@
               </w:tc>
             </w:tr>
           </w:tbl>
-          <w:bookmarkEnd w:id="50"/>
+          <w:bookmarkEnd w:id="53"/>
         </w:tc>
       </w:tr>
     </w:tbl>
@@ -13579,8 +13636,8 @@
         <w:t xml:space="preserve">Include the contractors’ report as an annex and provide a concise synthesis of SCW17 and intersessional work for Scientific Committee review.</w:t>
       </w:r>
     </w:p>
-    <w:bookmarkEnd w:id="51"/>
-    <w:bookmarkStart w:id="60" w:name="references"/>
+    <w:bookmarkEnd w:id="54"/>
+    <w:bookmarkStart w:id="63" w:name="references"/>
     <w:p>
       <w:pPr>
         <w:pStyle w:val="Heading1"/>
@@ -13603,7 +13660,7 @@
       <w:r>
         <w:t xml:space="preserve"> </w:t>
       </w:r>
-      <w:hyperlink r:id="rId52">
+      <w:hyperlink r:id="rId55">
         <w:r>
           <w:rPr>
             <w:rStyle w:val="Hyperlink"/>
@@ -13626,7 +13683,7 @@
       <w:r>
         <w:t xml:space="preserve"> </w:t>
       </w:r>
-      <w:hyperlink r:id="rId53">
+      <w:hyperlink r:id="rId56">
         <w:r>
           <w:rPr>
             <w:rStyle w:val="Hyperlink"/>
@@ -13649,7 +13706,7 @@
       <w:r>
         <w:t xml:space="preserve"> </w:t>
       </w:r>
-      <w:hyperlink r:id="rId54">
+      <w:hyperlink r:id="rId57">
         <w:r>
           <w:rPr>
             <w:rStyle w:val="Hyperlink"/>
@@ -13672,7 +13729,7 @@
       <w:r>
         <w:t xml:space="preserve"> </w:t>
       </w:r>
-      <w:hyperlink r:id="rId55">
+      <w:hyperlink r:id="rId58">
         <w:r>
           <w:rPr>
             <w:rStyle w:val="Hyperlink"/>
@@ -13695,7 +13752,7 @@
       <w:r>
         <w:t xml:space="preserve"> </w:t>
       </w:r>
-      <w:hyperlink r:id="rId56">
+      <w:hyperlink r:id="rId59">
         <w:r>
           <w:rPr>
             <w:rStyle w:val="Hyperlink"/>
@@ -13730,7 +13787,7 @@
       <w:r>
         <w:t xml:space="preserve"> </w:t>
       </w:r>
-      <w:hyperlink r:id="rId57">
+      <w:hyperlink r:id="rId60">
         <w:r>
           <w:rPr>
             <w:rStyle w:val="Hyperlink"/>
@@ -13753,7 +13810,7 @@
       <w:r>
         <w:t xml:space="preserve"> </w:t>
       </w:r>
-      <w:hyperlink r:id="rId58">
+      <w:hyperlink r:id="rId61">
         <w:r>
           <w:rPr>
             <w:rStyle w:val="Hyperlink"/>
@@ -13776,7 +13833,7 @@
       <w:r>
         <w:t xml:space="preserve"> </w:t>
       </w:r>
-      <w:hyperlink r:id="rId59">
+      <w:hyperlink r:id="rId62">
         <w:r>
           <w:rPr>
             <w:rStyle w:val="Hyperlink"/>
@@ -13797,8 +13854,8 @@
         <w:t xml:space="preserve">Annex K. Original jack mackerel management procedure.</w:t>
       </w:r>
     </w:p>
-    <w:bookmarkEnd w:id="60"/>
-    <w:bookmarkStart w:id="64" w:name="appendix-a.-participants"/>
+    <w:bookmarkEnd w:id="63"/>
+    <w:bookmarkStart w:id="67" w:name="appendix-a.-participants"/>
     <w:p>
       <w:pPr>
         <w:pStyle w:val="Heading1"/>
@@ -13848,18 +13905,18 @@
                 <wp:inline>
                   <wp:extent cx="152400" cy="152400"/>
                   <wp:effectExtent b="0" l="0" r="0" t="0"/>
-                  <wp:docPr descr="" title="" id="62" name="Picture"/>
+                  <wp:docPr descr="" title="" id="65" name="Picture"/>
                   <a:graphic>
                     <a:graphicData uri="http://schemas.openxmlformats.org/drawingml/2006/picture">
                       <pic:pic>
                         <pic:nvPicPr>
-                          <pic:cNvPr descr="/Applications/quarto/share/formats/docx/warning.png" id="63" name="Picture"/>
+                          <pic:cNvPr descr="/Applications/quarto/share/formats/docx/warning.png" id="66" name="Picture"/>
                           <pic:cNvPicPr>
                             <a:picLocks noChangeArrowheads="1" noChangeAspect="1"/>
                           </pic:cNvPicPr>
                         </pic:nvPicPr>
                         <pic:blipFill>
-                          <a:blip r:embed="rId61"/>
+                          <a:blip r:embed="rId64"/>
                           <a:stretch>
                             <a:fillRect/>
                           </a:stretch>
@@ -14450,8 +14507,8 @@
         </w:tc>
       </w:tr>
     </w:tbl>
-    <w:bookmarkEnd w:id="64"/>
-    <w:bookmarkStart w:id="65" w:name="appendix-b.-workshop-schedule-and-agenda"/>
+    <w:bookmarkEnd w:id="67"/>
+    <w:bookmarkStart w:id="68" w:name="appendix-b.-workshop-schedule-and-agenda"/>
     <w:p>
       <w:pPr>
         <w:pStyle w:val="Heading1"/>
@@ -14754,8 +14811,8 @@
         </w:tc>
       </w:tr>
     </w:tbl>
-    <w:bookmarkEnd w:id="65"/>
-    <w:bookmarkStart w:id="75" w:name="appendix-c.-scw17-working-documents"/>
+    <w:bookmarkEnd w:id="68"/>
+    <w:bookmarkStart w:id="78" w:name="appendix-c.-scw17-working-documents"/>
     <w:p>
       <w:pPr>
         <w:pStyle w:val="Heading1"/>
@@ -14809,7 +14866,7 @@
             <w:pPr>
               <w:pStyle w:val="Compact"/>
             </w:pPr>
-            <w:hyperlink r:id="rId66">
+            <w:hyperlink r:id="rId69">
               <w:r>
                 <w:rPr>
                   <w:rStyle w:val="Hyperlink"/>
@@ -14838,7 +14895,7 @@
             <w:pPr>
               <w:pStyle w:val="Compact"/>
             </w:pPr>
-            <w:hyperlink r:id="rId67">
+            <w:hyperlink r:id="rId70">
               <w:r>
                 <w:rPr>
                   <w:rStyle w:val="Hyperlink"/>
@@ -14867,7 +14924,7 @@
             <w:pPr>
               <w:pStyle w:val="Compact"/>
             </w:pPr>
-            <w:hyperlink r:id="rId68">
+            <w:hyperlink r:id="rId71">
               <w:r>
                 <w:rPr>
                   <w:rStyle w:val="Hyperlink"/>
@@ -14896,7 +14953,7 @@
             <w:pPr>
               <w:pStyle w:val="Compact"/>
             </w:pPr>
-            <w:hyperlink r:id="rId69">
+            <w:hyperlink r:id="rId72">
               <w:r>
                 <w:rPr>
                   <w:rStyle w:val="Hyperlink"/>
@@ -14925,7 +14982,7 @@
             <w:pPr>
               <w:pStyle w:val="Compact"/>
             </w:pPr>
-            <w:hyperlink r:id="rId70">
+            <w:hyperlink r:id="rId73">
               <w:r>
                 <w:rPr>
                   <w:rStyle w:val="Hyperlink"/>
@@ -14954,7 +15011,7 @@
             <w:pPr>
               <w:pStyle w:val="Compact"/>
             </w:pPr>
-            <w:hyperlink r:id="rId71">
+            <w:hyperlink r:id="rId74">
               <w:r>
                 <w:rPr>
                   <w:rStyle w:val="Hyperlink"/>
@@ -14983,7 +15040,7 @@
             <w:pPr>
               <w:pStyle w:val="Compact"/>
             </w:pPr>
-            <w:hyperlink r:id="rId72">
+            <w:hyperlink r:id="rId75">
               <w:r>
                 <w:rPr>
                   <w:rStyle w:val="Hyperlink"/>
@@ -15012,7 +15069,7 @@
             <w:pPr>
               <w:pStyle w:val="Compact"/>
             </w:pPr>
-            <w:hyperlink r:id="rId73">
+            <w:hyperlink r:id="rId76">
               <w:r>
                 <w:rPr>
                   <w:rStyle w:val="Hyperlink"/>
@@ -15041,7 +15098,7 @@
             <w:pPr>
               <w:pStyle w:val="Compact"/>
             </w:pPr>
-            <w:hyperlink r:id="rId74">
+            <w:hyperlink r:id="rId77">
               <w:r>
                 <w:rPr>
                   <w:rStyle w:val="Hyperlink"/>
@@ -15064,8 +15121,8 @@
         </w:tc>
       </w:tr>
     </w:tbl>
-    <w:bookmarkEnd w:id="75"/>
-    <w:bookmarkStart w:id="82" w:name="Xb9aa851defa400ff4d28650dfe7d983101a6615"/>
+    <w:bookmarkEnd w:id="78"/>
+    <w:bookmarkStart w:id="85" w:name="Xb9aa851defa400ff4d28650dfe7d983101a6615"/>
     <w:p>
       <w:pPr>
         <w:pStyle w:val="Heading1"/>
@@ -15074,7 +15131,7 @@
         <w:t xml:space="preserve">Appendix D. Comments from External Experts</w:t>
       </w:r>
     </w:p>
-    <w:bookmarkStart w:id="76" w:name="tom-carruthers"/>
+    <w:bookmarkStart w:id="79" w:name="tom-carruthers"/>
     <w:p>
       <w:pPr>
         <w:pStyle w:val="Heading2"/>
@@ -15115,8 +15172,8 @@
         <w:t xml:space="preserve">In the context of MSE as an ongoing, iterative, scientific approach to adopting and refining robust management advice, the current stage of MSE development sufficiently supports the shortlisting of defensible CMPs for presentation to the Scientific Committee. As in all scientific processes, improvements can be identified. At this stage of jack mackerel MSE development, these are not sufficiently impactful to delay the process of adopting a robust management procedure. After an MP is adopted and in use, improvements can be considered for a later revision to the MSE framework.</w:t>
       </w:r>
     </w:p>
-    <w:bookmarkEnd w:id="76"/>
-    <w:bookmarkStart w:id="81" w:name="david-miller-and-rosana-ourens"/>
+    <w:bookmarkEnd w:id="79"/>
+    <w:bookmarkStart w:id="84" w:name="david-miller-and-rosana-ourens"/>
     <w:p>
       <w:pPr>
         <w:pStyle w:val="Heading2"/>
@@ -15133,7 +15190,7 @@
         <w:t xml:space="preserve">The meeting made solid progress in agreeing on operating models, performance indicators, and exploring management procedures. The process could have benefited from more stages where specific items were locked down to allow discussion to move forward with better focus. For example, upfront agreement on the baseline assessment and reference points in advance of the MSE workshop would have helped focus discussion on MSE development and avoid repeating discussions.</w:t>
       </w:r>
     </w:p>
-    <w:bookmarkStart w:id="77" w:name="operating-models"/>
+    <w:bookmarkStart w:id="80" w:name="operating-models"/>
     <w:p>
       <w:pPr>
         <w:pStyle w:val="Heading3"/>
@@ -15150,8 +15207,8 @@
         <w:t xml:space="preserve">The recent benchmark assessment provides a strong, now agreed-upon basis for conditioning the base-case OM for the MSE. The consensus to tune the management procedures primarily on this single base case, with potential tuning to the two-stock model OM, is a reasonable and practical simplification. The other alternative OMs provide a good range for robustness testing and cover the most important uncertainties around the stock, such as different stock-recruitment steepness, potential changes in fishing selectivity, and possible impacts of ENSO events. An approach for stress-testing MPs for inherent climate robustness was presented that could be considered in future.</w:t>
       </w:r>
     </w:p>
-    <w:bookmarkEnd w:id="77"/>
-    <w:bookmarkStart w:id="78" w:name="performance-indicators"/>
+    <w:bookmarkEnd w:id="80"/>
+    <w:bookmarkStart w:id="81" w:name="performance-indicators"/>
     <w:p>
       <w:pPr>
         <w:pStyle w:val="Heading3"/>
@@ -15168,8 +15225,8 @@
         <w:t xml:space="preserve">The performance statistics were refined to ensure clear interpretation of the trade-offs between alternative MPs. Utilizing dynamic reference points is a sensible way to account for highly variable recruitment periods, ensuring that the probability of Kobe green metric remains meaningful during projections. Incorporating input from the stakeholder survey was useful, bridging the current gap between scientific preferences and actual industry objectives. The performance framework will place significant weight on both short- and long-term catch levels, biomass, catch stability, and related metrics. Other indicators, such as the proportion of simulated iterations that experience a stock crash and the number of times TAC-change limits are encountered, allow for a good examination of the behaviour and performance of MPs.</w:t>
       </w:r>
     </w:p>
-    <w:bookmarkEnd w:id="78"/>
-    <w:bookmarkStart w:id="79" w:name="management-procedures-1"/>
+    <w:bookmarkEnd w:id="81"/>
+    <w:bookmarkStart w:id="82" w:name="management-procedures-1"/>
     <w:p>
       <w:pPr>
         <w:pStyle w:val="Heading3"/>
@@ -15186,8 +15243,8 @@
         <w:t xml:space="preserve">The design of MPs to be tested could have benefited from stakeholder input. Nevertheless, the working group made a strong effort to test harvest-control rules with different shapes and trade-offs. For this exercise, it was very useful to have exploratory runs to compare outputs. Using a simple, empirical, index-based harvest rule is preferable to more complex assessment model-based approaches. Including SPiCT to combine multiple indices in the loop is probably an unnecessary addition. Because these empirical rules rely so heavily on field data, ensuring that the observation-error model accurately captures the historical cross-correlation among multiple indices is considered an essential technical priority. Exploring different combinations of indices for use in the MP will be useful. In initial testing, the simple constant-harvest-rate approach demonstrated favourable properties, including an ability to recover the stock effectively even under a recruitment-collapse scenario.</w:t>
       </w:r>
     </w:p>
-    <w:bookmarkEnd w:id="79"/>
-    <w:bookmarkStart w:id="80" w:name="exceptional-circumstances"/>
+    <w:bookmarkEnd w:id="82"/>
+    <w:bookmarkStart w:id="83" w:name="exceptional-circumstances"/>
     <w:p>
       <w:pPr>
         <w:pStyle w:val="Heading3"/>
@@ -15204,9 +15261,9 @@
         <w:t xml:space="preserve">With current indicators suggesting 2026 will likely be a year of low indices and difficult catches, establishing a formal, pre-agreed framework for exceptional circumstances should be a priority. As presented by Tom Carruthers, exceptional-circumstances triggers could be defined by analyzing MSE failure states and identifying the data bounds that lead to problematic outcomes.</w:t>
       </w:r>
     </w:p>
-    <w:bookmarkEnd w:id="80"/>
-    <w:bookmarkEnd w:id="81"/>
-    <w:bookmarkEnd w:id="82"/>
+    <w:bookmarkEnd w:id="83"/>
+    <w:bookmarkEnd w:id="84"/>
+    <w:bookmarkEnd w:id="85"/>
     <w:sectPr>
       <w:footnotePr>
         <w:numRestart w:val="eachSect"/>

</xml_diff>

<commit_message>
Keep report paragraph numbering continuous
</commit_message>
<xml_diff>
--- a/docs/SCW17-MSE-Workshop-report.docx
+++ b/docs/SCW17-MSE-Workshop-report.docx
@@ -145,7 +145,7 @@
         <w:t xml:space="preserve"> </w:t>
       </w:r>
       <w:r>
-        <w:t xml:space="preserve">07 July 2026 20:49 PDT</w:t>
+        <w:t xml:space="preserve">07 July 2026 20:55 PDT</w:t>
       </w:r>
     </w:p>
     <w:tbl>
@@ -13855,7 +13855,7 @@
       </w:r>
     </w:p>
     <w:bookmarkEnd w:id="63"/>
-    <w:bookmarkStart w:id="67" w:name="appendix-a.-participants"/>
+    <w:bookmarkStart w:id="64" w:name="appendix-a.-participants"/>
     <w:p>
       <w:pPr>
         <w:pStyle w:val="Heading1"/>
@@ -13864,122 +13864,6 @@
         <w:t xml:space="preserve">Appendix A. Participants</w:t>
       </w:r>
     </w:p>
-    <w:tbl>
-      <w:tblPr>
-        <w:tblStyle w:val="Table"/>
-        <w:tblLook w:firstRow="0" w:lastRow="0" w:firstColumn="0" w:lastColumn="0" w:noHBand="0" w:noVBand="0" w:val="0000"/>
-        <w:tblBorders>
-          <w:top w:val="single" w:sz="4" w:space="0" w:color="EB9113"/>
-          <w:left w:val="single" w:sz="24" w:space="0" w:color="EB9113"/>
-          <w:bottom w:val="single" w:sz="4" w:space="0" w:color="EB9113"/>
-          <w:right w:val="single" w:sz="4" w:space="0" w:color="EB9113"/>
-        </w:tblBorders>
-        <w:tblCellMar>
-          <w:left w:w="144" w:type="dxa"/>
-          <w:right w:w="144" w:type="dxa"/>
-        </w:tblCellMar>
-        <w:tblLook w:firstRow="0" w:lastRow="0" w:firstColumn="0" w:lastColumn="0" w:noHBand="0" w:noVBand="0" w:val="0000"/>
-      </w:tblPr>
-      <w:tr>
-        <w:trPr>
-          <w:cantSplit/>
-        </w:trPr>
-        <w:tc>
-          <w:tcPr>
-            <w:shd w:color="auto" w:fill="fcefdc" w:val="clear"/>
-            <w:tcMar>
-              <w:top w:w="92" w:type="dxa"/>
-              <w:bottom w:w="92" w:type="dxa"/>
-            </w:tcMar>
-          </w:tcPr>
-          <w:p>
-            <w:pPr>
-              <w:pStyle w:val="FirstParagraph"/>
-            </w:pPr>
-            <w:pPr>
-              <w:spacing w:before="0" w:after="0"/>
-              <w:textAlignment w:val="center"/>
-            </w:pPr>
-            <w:r>
-              <w:drawing>
-                <wp:inline>
-                  <wp:extent cx="152400" cy="152400"/>
-                  <wp:effectExtent b="0" l="0" r="0" t="0"/>
-                  <wp:docPr descr="" title="" id="65" name="Picture"/>
-                  <a:graphic>
-                    <a:graphicData uri="http://schemas.openxmlformats.org/drawingml/2006/picture">
-                      <pic:pic>
-                        <pic:nvPicPr>
-                          <pic:cNvPr descr="/Applications/quarto/share/formats/docx/warning.png" id="66" name="Picture"/>
-                          <pic:cNvPicPr>
-                            <a:picLocks noChangeArrowheads="1" noChangeAspect="1"/>
-                          </pic:cNvPicPr>
-                        </pic:nvPicPr>
-                        <pic:blipFill>
-                          <a:blip r:embed="rId64"/>
-                          <a:stretch>
-                            <a:fillRect/>
-                          </a:stretch>
-                        </pic:blipFill>
-                        <pic:spPr bwMode="auto">
-                          <a:xfrm>
-                            <a:off x="0" y="0"/>
-                            <a:ext cx="152400" cy="152400"/>
-                          </a:xfrm>
-                          <a:prstGeom prst="rect">
-                            <a:avLst/>
-                          </a:prstGeom>
-                          <a:noFill/>
-                          <a:ln w="9525">
-                            <a:noFill/>
-                            <a:headEnd/>
-                            <a:tailEnd/>
-                          </a:ln>
-                        </pic:spPr>
-                      </pic:pic>
-                    </a:graphicData>
-                  </a:graphic>
-                </wp:inline>
-              </w:drawing>
-            </w:r>
-            <w:r>
-              <w:t xml:space="preserve"> </w:t>
-            </w:r>
-            <w:r>
-              <w:t xml:space="preserve"> </w:t>
-            </w:r>
-            <w:r>
-              <w:t xml:space="preserve">Verification needed</w:t>
-            </w:r>
-          </w:p>
-        </w:tc>
-      </w:tr>
-      <w:tr>
-        <w:trPr>
-          <w:cantSplit/>
-        </w:trPr>
-        <w:tc>
-          <w:tcPr>
-            <w:tcMar>
-              <w:top w:w="108" w:type="dxa"/>
-              <w:bottom w:w="108" w:type="dxa"/>
-            </w:tcMar>
-          </w:tcPr>
-          <w:p>
-            <w:pPr>
-              <w:pStyle w:val="BodyText"/>
-            </w:pPr>
-            <w:pPr>
-              <w:spacing w:before="16" w:after="16"/>
-            </w:pPr>
-            <w:r>
-              <w:t xml:space="preserve">Names and affiliations below are reconstructed from the Day 1 summary and should be confirmed before submission.</w:t>
-            </w:r>
-          </w:p>
-          <w:p/>
-        </w:tc>
-      </w:tr>
-    </w:tbl>
     <w:tbl>
       <w:tblPr>
         <w:tblStyle w:val="Table"/>
@@ -14507,8 +14391,8 @@
         </w:tc>
       </w:tr>
     </w:tbl>
-    <w:bookmarkEnd w:id="67"/>
-    <w:bookmarkStart w:id="68" w:name="appendix-b.-workshop-schedule-and-agenda"/>
+    <w:bookmarkEnd w:id="64"/>
+    <w:bookmarkStart w:id="65" w:name="appendix-b.-workshop-schedule-and-agenda"/>
     <w:p>
       <w:pPr>
         <w:pStyle w:val="Heading1"/>
@@ -14527,62 +14411,34 @@
     </w:p>
     <w:p>
       <w:pPr>
-        <w:pStyle w:val="Compact"/>
-        <w:numPr>
-          <w:ilvl w:val="0"/>
-          <w:numId w:val="1023"/>
-        </w:numPr>
-      </w:pPr>
-      <w:r>
-        <w:t xml:space="preserve">Developments since the benchmark.</w:t>
-      </w:r>
-    </w:p>
-    <w:p>
-      <w:pPr>
-        <w:pStyle w:val="Compact"/>
-        <w:numPr>
-          <w:ilvl w:val="0"/>
-          <w:numId w:val="1023"/>
-        </w:numPr>
-      </w:pPr>
-      <w:r>
-        <w:t xml:space="preserve">Operating-model specifications.</w:t>
-      </w:r>
-    </w:p>
-    <w:p>
-      <w:pPr>
-        <w:pStyle w:val="Compact"/>
-        <w:numPr>
-          <w:ilvl w:val="0"/>
-          <w:numId w:val="1023"/>
-        </w:numPr>
-      </w:pPr>
-      <w:r>
-        <w:t xml:space="preserve">Candidate management procedures.</w:t>
-      </w:r>
-    </w:p>
-    <w:p>
-      <w:pPr>
-        <w:pStyle w:val="Compact"/>
-        <w:numPr>
-          <w:ilvl w:val="0"/>
-          <w:numId w:val="1023"/>
-        </w:numPr>
-      </w:pPr>
-      <w:r>
-        <w:t xml:space="preserve">Trade-offs, robustness, and performance metrics.</w:t>
-      </w:r>
-    </w:p>
-    <w:p>
-      <w:pPr>
-        <w:pStyle w:val="Compact"/>
-        <w:numPr>
-          <w:ilvl w:val="0"/>
-          <w:numId w:val="1023"/>
-        </w:numPr>
-      </w:pPr>
-      <w:r>
-        <w:t xml:space="preserve">Planning for SC14 and next steps.</w:t>
+        <w:pStyle w:val="BodyText"/>
+      </w:pPr>
+      <w:r>
+        <w:t xml:space="preserve">1. Developments since the benchmark.</w:t>
+      </w:r>
+      <w:r>
+        <w:br/>
+      </w:r>
+      <w:r>
+        <w:t xml:space="preserve">2. Operating-model specifications.</w:t>
+      </w:r>
+      <w:r>
+        <w:br/>
+      </w:r>
+      <w:r>
+        <w:t xml:space="preserve">3. Candidate management procedures.</w:t>
+      </w:r>
+      <w:r>
+        <w:br/>
+      </w:r>
+      <w:r>
+        <w:t xml:space="preserve">4. Trade-offs, robustness, and performance metrics.</w:t>
+      </w:r>
+      <w:r>
+        <w:br/>
+      </w:r>
+      <w:r>
+        <w:t xml:space="preserve">5. Planning for SC14 and next steps.</w:t>
       </w:r>
     </w:p>
     <w:tbl>
@@ -14811,8 +14667,8 @@
         </w:tc>
       </w:tr>
     </w:tbl>
-    <w:bookmarkEnd w:id="68"/>
-    <w:bookmarkStart w:id="78" w:name="appendix-c.-scw17-working-documents"/>
+    <w:bookmarkEnd w:id="65"/>
+    <w:bookmarkStart w:id="75" w:name="appendix-c.-scw17-working-documents"/>
     <w:p>
       <w:pPr>
         <w:pStyle w:val="Heading1"/>
@@ -14866,7 +14722,7 @@
             <w:pPr>
               <w:pStyle w:val="Compact"/>
             </w:pPr>
-            <w:hyperlink r:id="rId69">
+            <w:hyperlink r:id="rId66">
               <w:r>
                 <w:rPr>
                   <w:rStyle w:val="Hyperlink"/>
@@ -14895,7 +14751,7 @@
             <w:pPr>
               <w:pStyle w:val="Compact"/>
             </w:pPr>
-            <w:hyperlink r:id="rId70">
+            <w:hyperlink r:id="rId67">
               <w:r>
                 <w:rPr>
                   <w:rStyle w:val="Hyperlink"/>
@@ -14924,7 +14780,7 @@
             <w:pPr>
               <w:pStyle w:val="Compact"/>
             </w:pPr>
-            <w:hyperlink r:id="rId71">
+            <w:hyperlink r:id="rId68">
               <w:r>
                 <w:rPr>
                   <w:rStyle w:val="Hyperlink"/>
@@ -14953,7 +14809,7 @@
             <w:pPr>
               <w:pStyle w:val="Compact"/>
             </w:pPr>
-            <w:hyperlink r:id="rId72">
+            <w:hyperlink r:id="rId69">
               <w:r>
                 <w:rPr>
                   <w:rStyle w:val="Hyperlink"/>
@@ -14982,7 +14838,7 @@
             <w:pPr>
               <w:pStyle w:val="Compact"/>
             </w:pPr>
-            <w:hyperlink r:id="rId73">
+            <w:hyperlink r:id="rId70">
               <w:r>
                 <w:rPr>
                   <w:rStyle w:val="Hyperlink"/>
@@ -15011,7 +14867,7 @@
             <w:pPr>
               <w:pStyle w:val="Compact"/>
             </w:pPr>
-            <w:hyperlink r:id="rId74">
+            <w:hyperlink r:id="rId71">
               <w:r>
                 <w:rPr>
                   <w:rStyle w:val="Hyperlink"/>
@@ -15040,7 +14896,7 @@
             <w:pPr>
               <w:pStyle w:val="Compact"/>
             </w:pPr>
-            <w:hyperlink r:id="rId75">
+            <w:hyperlink r:id="rId72">
               <w:r>
                 <w:rPr>
                   <w:rStyle w:val="Hyperlink"/>
@@ -15069,7 +14925,7 @@
             <w:pPr>
               <w:pStyle w:val="Compact"/>
             </w:pPr>
-            <w:hyperlink r:id="rId76">
+            <w:hyperlink r:id="rId73">
               <w:r>
                 <w:rPr>
                   <w:rStyle w:val="Hyperlink"/>
@@ -15098,7 +14954,7 @@
             <w:pPr>
               <w:pStyle w:val="Compact"/>
             </w:pPr>
-            <w:hyperlink r:id="rId77">
+            <w:hyperlink r:id="rId74">
               <w:r>
                 <w:rPr>
                   <w:rStyle w:val="Hyperlink"/>
@@ -15121,8 +14977,8 @@
         </w:tc>
       </w:tr>
     </w:tbl>
-    <w:bookmarkEnd w:id="78"/>
-    <w:bookmarkStart w:id="85" w:name="Xb9aa851defa400ff4d28650dfe7d983101a6615"/>
+    <w:bookmarkEnd w:id="75"/>
+    <w:bookmarkStart w:id="82" w:name="Xb9aa851defa400ff4d28650dfe7d983101a6615"/>
     <w:p>
       <w:pPr>
         <w:pStyle w:val="Heading1"/>
@@ -15131,7 +14987,7 @@
         <w:t xml:space="preserve">Appendix D. Comments from External Experts</w:t>
       </w:r>
     </w:p>
-    <w:bookmarkStart w:id="79" w:name="tom-carruthers"/>
+    <w:bookmarkStart w:id="76" w:name="tom-carruthers"/>
     <w:p>
       <w:pPr>
         <w:pStyle w:val="Heading2"/>
@@ -15172,8 +15028,8 @@
         <w:t xml:space="preserve">In the context of MSE as an ongoing, iterative, scientific approach to adopting and refining robust management advice, the current stage of MSE development sufficiently supports the shortlisting of defensible CMPs for presentation to the Scientific Committee. As in all scientific processes, improvements can be identified. At this stage of jack mackerel MSE development, these are not sufficiently impactful to delay the process of adopting a robust management procedure. After an MP is adopted and in use, improvements can be considered for a later revision to the MSE framework.</w:t>
       </w:r>
     </w:p>
-    <w:bookmarkEnd w:id="79"/>
-    <w:bookmarkStart w:id="84" w:name="david-miller-and-rosana-ourens"/>
+    <w:bookmarkEnd w:id="76"/>
+    <w:bookmarkStart w:id="81" w:name="david-miller-and-rosana-ourens"/>
     <w:p>
       <w:pPr>
         <w:pStyle w:val="Heading2"/>
@@ -15190,7 +15046,7 @@
         <w:t xml:space="preserve">The meeting made solid progress in agreeing on operating models, performance indicators, and exploring management procedures. The process could have benefited from more stages where specific items were locked down to allow discussion to move forward with better focus. For example, upfront agreement on the baseline assessment and reference points in advance of the MSE workshop would have helped focus discussion on MSE development and avoid repeating discussions.</w:t>
       </w:r>
     </w:p>
-    <w:bookmarkStart w:id="80" w:name="operating-models"/>
+    <w:bookmarkStart w:id="77" w:name="operating-models"/>
     <w:p>
       <w:pPr>
         <w:pStyle w:val="Heading3"/>
@@ -15207,8 +15063,8 @@
         <w:t xml:space="preserve">The recent benchmark assessment provides a strong, now agreed-upon basis for conditioning the base-case OM for the MSE. The consensus to tune the management procedures primarily on this single base case, with potential tuning to the two-stock model OM, is a reasonable and practical simplification. The other alternative OMs provide a good range for robustness testing and cover the most important uncertainties around the stock, such as different stock-recruitment steepness, potential changes in fishing selectivity, and possible impacts of ENSO events. An approach for stress-testing MPs for inherent climate robustness was presented that could be considered in future.</w:t>
       </w:r>
     </w:p>
-    <w:bookmarkEnd w:id="80"/>
-    <w:bookmarkStart w:id="81" w:name="performance-indicators"/>
+    <w:bookmarkEnd w:id="77"/>
+    <w:bookmarkStart w:id="78" w:name="performance-indicators"/>
     <w:p>
       <w:pPr>
         <w:pStyle w:val="Heading3"/>
@@ -15225,8 +15081,8 @@
         <w:t xml:space="preserve">The performance statistics were refined to ensure clear interpretation of the trade-offs between alternative MPs. Utilizing dynamic reference points is a sensible way to account for highly variable recruitment periods, ensuring that the probability of Kobe green metric remains meaningful during projections. Incorporating input from the stakeholder survey was useful, bridging the current gap between scientific preferences and actual industry objectives. The performance framework will place significant weight on both short- and long-term catch levels, biomass, catch stability, and related metrics. Other indicators, such as the proportion of simulated iterations that experience a stock crash and the number of times TAC-change limits are encountered, allow for a good examination of the behaviour and performance of MPs.</w:t>
       </w:r>
     </w:p>
-    <w:bookmarkEnd w:id="81"/>
-    <w:bookmarkStart w:id="82" w:name="management-procedures-1"/>
+    <w:bookmarkEnd w:id="78"/>
+    <w:bookmarkStart w:id="79" w:name="management-procedures-1"/>
     <w:p>
       <w:pPr>
         <w:pStyle w:val="Heading3"/>
@@ -15243,8 +15099,8 @@
         <w:t xml:space="preserve">The design of MPs to be tested could have benefited from stakeholder input. Nevertheless, the working group made a strong effort to test harvest-control rules with different shapes and trade-offs. For this exercise, it was very useful to have exploratory runs to compare outputs. Using a simple, empirical, index-based harvest rule is preferable to more complex assessment model-based approaches. Including SPiCT to combine multiple indices in the loop is probably an unnecessary addition. Because these empirical rules rely so heavily on field data, ensuring that the observation-error model accurately captures the historical cross-correlation among multiple indices is considered an essential technical priority. Exploring different combinations of indices for use in the MP will be useful. In initial testing, the simple constant-harvest-rate approach demonstrated favourable properties, including an ability to recover the stock effectively even under a recruitment-collapse scenario.</w:t>
       </w:r>
     </w:p>
-    <w:bookmarkEnd w:id="82"/>
-    <w:bookmarkStart w:id="83" w:name="exceptional-circumstances"/>
+    <w:bookmarkEnd w:id="79"/>
+    <w:bookmarkStart w:id="80" w:name="exceptional-circumstances"/>
     <w:p>
       <w:pPr>
         <w:pStyle w:val="Heading3"/>
@@ -15261,9 +15117,9 @@
         <w:t xml:space="preserve">With current indicators suggesting 2026 will likely be a year of low indices and difficult catches, establishing a formal, pre-agreed framework for exceptional circumstances should be a priority. As presented by Tom Carruthers, exceptional-circumstances triggers could be defined by analyzing MSE failure states and identifying the data bounds that lead to problematic outcomes.</w:t>
       </w:r>
     </w:p>
-    <w:bookmarkEnd w:id="83"/>
-    <w:bookmarkEnd w:id="84"/>
-    <w:bookmarkEnd w:id="85"/>
+    <w:bookmarkEnd w:id="80"/>
+    <w:bookmarkEnd w:id="81"/>
+    <w:bookmarkEnd w:id="82"/>
     <w:sectPr>
       <w:footnotePr>
         <w:numRestart w:val="eachSect"/>
@@ -15560,6 +15416,1451 @@
       <w:rPr>
         <w:rFonts w:ascii="Wingdings" w:hAnsi="Wingdings" w:cs="Wingdings" w:hint="default"/>
       </w:rPr>
+    </w:lvl>
+  </w:abstractNum>
+  <w:abstractNum w:abstractNumId="99417">
+    <w:nsid w:val="00A99417"/>
+    <w:multiLevelType w:val="multilevel"/>
+    <w:lvl w:ilvl="0">
+      <w:start w:val="7"/>
+      <w:numFmt w:val="decimal"/>
+      <w:lvlText w:val="%1."/>
+      <w:lvlJc w:val="left"/>
+      <w:pPr>
+        <w:ind w:left="720" w:hanging="360"/>
+      </w:pPr>
+    </w:lvl>
+    <w:lvl w:ilvl="1">
+      <w:start w:val="7"/>
+      <w:numFmt w:val="decimal"/>
+      <w:lvlText w:val="%2."/>
+      <w:lvlJc w:val="left"/>
+      <w:pPr>
+        <w:ind w:left="1440" w:hanging="360"/>
+      </w:pPr>
+    </w:lvl>
+    <w:lvl w:ilvl="2">
+      <w:start w:val="7"/>
+      <w:numFmt w:val="decimal"/>
+      <w:lvlText w:val="%3."/>
+      <w:lvlJc w:val="left"/>
+      <w:pPr>
+        <w:ind w:left="2160" w:hanging="360"/>
+      </w:pPr>
+    </w:lvl>
+    <w:lvl w:ilvl="3">
+      <w:start w:val="7"/>
+      <w:numFmt w:val="decimal"/>
+      <w:lvlText w:val="%4."/>
+      <w:lvlJc w:val="left"/>
+      <w:pPr>
+        <w:ind w:left="2880" w:hanging="360"/>
+      </w:pPr>
+    </w:lvl>
+    <w:lvl w:ilvl="4">
+      <w:start w:val="7"/>
+      <w:numFmt w:val="decimal"/>
+      <w:lvlText w:val="%5."/>
+      <w:lvlJc w:val="left"/>
+      <w:pPr>
+        <w:ind w:left="3600" w:hanging="360"/>
+      </w:pPr>
+    </w:lvl>
+    <w:lvl w:ilvl="5">
+      <w:start w:val="7"/>
+      <w:numFmt w:val="decimal"/>
+      <w:lvlText w:val="%6."/>
+      <w:lvlJc w:val="left"/>
+      <w:pPr>
+        <w:ind w:left="4320" w:hanging="360"/>
+      </w:pPr>
+    </w:lvl>
+    <w:lvl w:ilvl="6">
+      <w:start w:val="7"/>
+      <w:numFmt w:val="decimal"/>
+      <w:lvlText w:val="%7."/>
+      <w:lvlJc w:val="left"/>
+      <w:pPr>
+        <w:ind w:left="5040" w:hanging="360"/>
+      </w:pPr>
+    </w:lvl>
+    <w:lvl w:ilvl="7">
+      <w:start w:val="7"/>
+      <w:numFmt w:val="decimal"/>
+      <w:lvlText w:val="%8."/>
+      <w:lvlJc w:val="left"/>
+      <w:pPr>
+        <w:ind w:left="5760" w:hanging="360"/>
+      </w:pPr>
+    </w:lvl>
+    <w:lvl w:ilvl="8">
+      <w:start w:val="7"/>
+      <w:numFmt w:val="decimal"/>
+      <w:lvlText w:val="%9."/>
+      <w:lvlJc w:val="left"/>
+      <w:pPr>
+        <w:ind w:left="6480" w:hanging="360"/>
+      </w:pPr>
+    </w:lvl>
+  </w:abstractNum>
+  <w:abstractNum w:abstractNumId="99418">
+    <w:nsid w:val="00A99418"/>
+    <w:multiLevelType w:val="multilevel"/>
+    <w:lvl w:ilvl="0">
+      <w:start w:val="8"/>
+      <w:numFmt w:val="decimal"/>
+      <w:lvlText w:val="%1."/>
+      <w:lvlJc w:val="left"/>
+      <w:pPr>
+        <w:ind w:left="720" w:hanging="360"/>
+      </w:pPr>
+    </w:lvl>
+    <w:lvl w:ilvl="1">
+      <w:start w:val="8"/>
+      <w:numFmt w:val="decimal"/>
+      <w:lvlText w:val="%2."/>
+      <w:lvlJc w:val="left"/>
+      <w:pPr>
+        <w:ind w:left="1440" w:hanging="360"/>
+      </w:pPr>
+    </w:lvl>
+    <w:lvl w:ilvl="2">
+      <w:start w:val="8"/>
+      <w:numFmt w:val="decimal"/>
+      <w:lvlText w:val="%3."/>
+      <w:lvlJc w:val="left"/>
+      <w:pPr>
+        <w:ind w:left="2160" w:hanging="360"/>
+      </w:pPr>
+    </w:lvl>
+    <w:lvl w:ilvl="3">
+      <w:start w:val="8"/>
+      <w:numFmt w:val="decimal"/>
+      <w:lvlText w:val="%4."/>
+      <w:lvlJc w:val="left"/>
+      <w:pPr>
+        <w:ind w:left="2880" w:hanging="360"/>
+      </w:pPr>
+    </w:lvl>
+    <w:lvl w:ilvl="4">
+      <w:start w:val="8"/>
+      <w:numFmt w:val="decimal"/>
+      <w:lvlText w:val="%5."/>
+      <w:lvlJc w:val="left"/>
+      <w:pPr>
+        <w:ind w:left="3600" w:hanging="360"/>
+      </w:pPr>
+    </w:lvl>
+    <w:lvl w:ilvl="5">
+      <w:start w:val="8"/>
+      <w:numFmt w:val="decimal"/>
+      <w:lvlText w:val="%6."/>
+      <w:lvlJc w:val="left"/>
+      <w:pPr>
+        <w:ind w:left="4320" w:hanging="360"/>
+      </w:pPr>
+    </w:lvl>
+    <w:lvl w:ilvl="6">
+      <w:start w:val="8"/>
+      <w:numFmt w:val="decimal"/>
+      <w:lvlText w:val="%7."/>
+      <w:lvlJc w:val="left"/>
+      <w:pPr>
+        <w:ind w:left="5040" w:hanging="360"/>
+      </w:pPr>
+    </w:lvl>
+    <w:lvl w:ilvl="7">
+      <w:start w:val="8"/>
+      <w:numFmt w:val="decimal"/>
+      <w:lvlText w:val="%8."/>
+      <w:lvlJc w:val="left"/>
+      <w:pPr>
+        <w:ind w:left="5760" w:hanging="360"/>
+      </w:pPr>
+    </w:lvl>
+    <w:lvl w:ilvl="8">
+      <w:start w:val="8"/>
+      <w:numFmt w:val="decimal"/>
+      <w:lvlText w:val="%9."/>
+      <w:lvlJc w:val="left"/>
+      <w:pPr>
+        <w:ind w:left="6480" w:hanging="360"/>
+      </w:pPr>
+    </w:lvl>
+  </w:abstractNum>
+  <w:abstractNum w:abstractNumId="994117">
+    <w:nsid w:val="0A994117"/>
+    <w:multiLevelType w:val="multilevel"/>
+    <w:lvl w:ilvl="0">
+      <w:start w:val="17"/>
+      <w:numFmt w:val="decimal"/>
+      <w:lvlText w:val="%1."/>
+      <w:lvlJc w:val="left"/>
+      <w:pPr>
+        <w:ind w:left="720" w:hanging="360"/>
+      </w:pPr>
+    </w:lvl>
+    <w:lvl w:ilvl="1">
+      <w:start w:val="17"/>
+      <w:numFmt w:val="decimal"/>
+      <w:lvlText w:val="%2."/>
+      <w:lvlJc w:val="left"/>
+      <w:pPr>
+        <w:ind w:left="1440" w:hanging="360"/>
+      </w:pPr>
+    </w:lvl>
+    <w:lvl w:ilvl="2">
+      <w:start w:val="17"/>
+      <w:numFmt w:val="decimal"/>
+      <w:lvlText w:val="%3."/>
+      <w:lvlJc w:val="left"/>
+      <w:pPr>
+        <w:ind w:left="2160" w:hanging="360"/>
+      </w:pPr>
+    </w:lvl>
+    <w:lvl w:ilvl="3">
+      <w:start w:val="17"/>
+      <w:numFmt w:val="decimal"/>
+      <w:lvlText w:val="%4."/>
+      <w:lvlJc w:val="left"/>
+      <w:pPr>
+        <w:ind w:left="2880" w:hanging="360"/>
+      </w:pPr>
+    </w:lvl>
+    <w:lvl w:ilvl="4">
+      <w:start w:val="17"/>
+      <w:numFmt w:val="decimal"/>
+      <w:lvlText w:val="%5."/>
+      <w:lvlJc w:val="left"/>
+      <w:pPr>
+        <w:ind w:left="3600" w:hanging="360"/>
+      </w:pPr>
+    </w:lvl>
+    <w:lvl w:ilvl="5">
+      <w:start w:val="17"/>
+      <w:numFmt w:val="decimal"/>
+      <w:lvlText w:val="%6."/>
+      <w:lvlJc w:val="left"/>
+      <w:pPr>
+        <w:ind w:left="4320" w:hanging="360"/>
+      </w:pPr>
+    </w:lvl>
+    <w:lvl w:ilvl="6">
+      <w:start w:val="17"/>
+      <w:numFmt w:val="decimal"/>
+      <w:lvlText w:val="%7."/>
+      <w:lvlJc w:val="left"/>
+      <w:pPr>
+        <w:ind w:left="5040" w:hanging="360"/>
+      </w:pPr>
+    </w:lvl>
+    <w:lvl w:ilvl="7">
+      <w:start w:val="17"/>
+      <w:numFmt w:val="decimal"/>
+      <w:lvlText w:val="%8."/>
+      <w:lvlJc w:val="left"/>
+      <w:pPr>
+        <w:ind w:left="5760" w:hanging="360"/>
+      </w:pPr>
+    </w:lvl>
+    <w:lvl w:ilvl="8">
+      <w:start w:val="17"/>
+      <w:numFmt w:val="decimal"/>
+      <w:lvlText w:val="%9."/>
+      <w:lvlJc w:val="left"/>
+      <w:pPr>
+        <w:ind w:left="6480" w:hanging="360"/>
+      </w:pPr>
+    </w:lvl>
+  </w:abstractNum>
+  <w:abstractNum w:abstractNumId="994120">
+    <w:nsid w:val="0A994120"/>
+    <w:multiLevelType w:val="multilevel"/>
+    <w:lvl w:ilvl="0">
+      <w:start w:val="20"/>
+      <w:numFmt w:val="decimal"/>
+      <w:lvlText w:val="%1."/>
+      <w:lvlJc w:val="left"/>
+      <w:pPr>
+        <w:ind w:left="720" w:hanging="360"/>
+      </w:pPr>
+    </w:lvl>
+    <w:lvl w:ilvl="1">
+      <w:start w:val="20"/>
+      <w:numFmt w:val="decimal"/>
+      <w:lvlText w:val="%2."/>
+      <w:lvlJc w:val="left"/>
+      <w:pPr>
+        <w:ind w:left="1440" w:hanging="360"/>
+      </w:pPr>
+    </w:lvl>
+    <w:lvl w:ilvl="2">
+      <w:start w:val="20"/>
+      <w:numFmt w:val="decimal"/>
+      <w:lvlText w:val="%3."/>
+      <w:lvlJc w:val="left"/>
+      <w:pPr>
+        <w:ind w:left="2160" w:hanging="360"/>
+      </w:pPr>
+    </w:lvl>
+    <w:lvl w:ilvl="3">
+      <w:start w:val="20"/>
+      <w:numFmt w:val="decimal"/>
+      <w:lvlText w:val="%4."/>
+      <w:lvlJc w:val="left"/>
+      <w:pPr>
+        <w:ind w:left="2880" w:hanging="360"/>
+      </w:pPr>
+    </w:lvl>
+    <w:lvl w:ilvl="4">
+      <w:start w:val="20"/>
+      <w:numFmt w:val="decimal"/>
+      <w:lvlText w:val="%5."/>
+      <w:lvlJc w:val="left"/>
+      <w:pPr>
+        <w:ind w:left="3600" w:hanging="360"/>
+      </w:pPr>
+    </w:lvl>
+    <w:lvl w:ilvl="5">
+      <w:start w:val="20"/>
+      <w:numFmt w:val="decimal"/>
+      <w:lvlText w:val="%6."/>
+      <w:lvlJc w:val="left"/>
+      <w:pPr>
+        <w:ind w:left="4320" w:hanging="360"/>
+      </w:pPr>
+    </w:lvl>
+    <w:lvl w:ilvl="6">
+      <w:start w:val="20"/>
+      <w:numFmt w:val="decimal"/>
+      <w:lvlText w:val="%7."/>
+      <w:lvlJc w:val="left"/>
+      <w:pPr>
+        <w:ind w:left="5040" w:hanging="360"/>
+      </w:pPr>
+    </w:lvl>
+    <w:lvl w:ilvl="7">
+      <w:start w:val="20"/>
+      <w:numFmt w:val="decimal"/>
+      <w:lvlText w:val="%8."/>
+      <w:lvlJc w:val="left"/>
+      <w:pPr>
+        <w:ind w:left="5760" w:hanging="360"/>
+      </w:pPr>
+    </w:lvl>
+    <w:lvl w:ilvl="8">
+      <w:start w:val="20"/>
+      <w:numFmt w:val="decimal"/>
+      <w:lvlText w:val="%9."/>
+      <w:lvlJc w:val="left"/>
+      <w:pPr>
+        <w:ind w:left="6480" w:hanging="360"/>
+      </w:pPr>
+    </w:lvl>
+  </w:abstractNum>
+  <w:abstractNum w:abstractNumId="994128">
+    <w:nsid w:val="0A994128"/>
+    <w:multiLevelType w:val="multilevel"/>
+    <w:lvl w:ilvl="0">
+      <w:start w:val="28"/>
+      <w:numFmt w:val="decimal"/>
+      <w:lvlText w:val="%1."/>
+      <w:lvlJc w:val="left"/>
+      <w:pPr>
+        <w:ind w:left="720" w:hanging="360"/>
+      </w:pPr>
+    </w:lvl>
+    <w:lvl w:ilvl="1">
+      <w:start w:val="28"/>
+      <w:numFmt w:val="decimal"/>
+      <w:lvlText w:val="%2."/>
+      <w:lvlJc w:val="left"/>
+      <w:pPr>
+        <w:ind w:left="1440" w:hanging="360"/>
+      </w:pPr>
+    </w:lvl>
+    <w:lvl w:ilvl="2">
+      <w:start w:val="28"/>
+      <w:numFmt w:val="decimal"/>
+      <w:lvlText w:val="%3."/>
+      <w:lvlJc w:val="left"/>
+      <w:pPr>
+        <w:ind w:left="2160" w:hanging="360"/>
+      </w:pPr>
+    </w:lvl>
+    <w:lvl w:ilvl="3">
+      <w:start w:val="28"/>
+      <w:numFmt w:val="decimal"/>
+      <w:lvlText w:val="%4."/>
+      <w:lvlJc w:val="left"/>
+      <w:pPr>
+        <w:ind w:left="2880" w:hanging="360"/>
+      </w:pPr>
+    </w:lvl>
+    <w:lvl w:ilvl="4">
+      <w:start w:val="28"/>
+      <w:numFmt w:val="decimal"/>
+      <w:lvlText w:val="%5."/>
+      <w:lvlJc w:val="left"/>
+      <w:pPr>
+        <w:ind w:left="3600" w:hanging="360"/>
+      </w:pPr>
+    </w:lvl>
+    <w:lvl w:ilvl="5">
+      <w:start w:val="28"/>
+      <w:numFmt w:val="decimal"/>
+      <w:lvlText w:val="%6."/>
+      <w:lvlJc w:val="left"/>
+      <w:pPr>
+        <w:ind w:left="4320" w:hanging="360"/>
+      </w:pPr>
+    </w:lvl>
+    <w:lvl w:ilvl="6">
+      <w:start w:val="28"/>
+      <w:numFmt w:val="decimal"/>
+      <w:lvlText w:val="%7."/>
+      <w:lvlJc w:val="left"/>
+      <w:pPr>
+        <w:ind w:left="5040" w:hanging="360"/>
+      </w:pPr>
+    </w:lvl>
+    <w:lvl w:ilvl="7">
+      <w:start w:val="28"/>
+      <w:numFmt w:val="decimal"/>
+      <w:lvlText w:val="%8."/>
+      <w:lvlJc w:val="left"/>
+      <w:pPr>
+        <w:ind w:left="5760" w:hanging="360"/>
+      </w:pPr>
+    </w:lvl>
+    <w:lvl w:ilvl="8">
+      <w:start w:val="28"/>
+      <w:numFmt w:val="decimal"/>
+      <w:lvlText w:val="%9."/>
+      <w:lvlJc w:val="left"/>
+      <w:pPr>
+        <w:ind w:left="6480" w:hanging="360"/>
+      </w:pPr>
+    </w:lvl>
+  </w:abstractNum>
+  <w:abstractNum w:abstractNumId="994132">
+    <w:nsid w:val="0A994132"/>
+    <w:multiLevelType w:val="multilevel"/>
+    <w:lvl w:ilvl="0">
+      <w:start w:val="32"/>
+      <w:numFmt w:val="decimal"/>
+      <w:lvlText w:val="%1."/>
+      <w:lvlJc w:val="left"/>
+      <w:pPr>
+        <w:ind w:left="720" w:hanging="360"/>
+      </w:pPr>
+    </w:lvl>
+    <w:lvl w:ilvl="1">
+      <w:start w:val="32"/>
+      <w:numFmt w:val="decimal"/>
+      <w:lvlText w:val="%2."/>
+      <w:lvlJc w:val="left"/>
+      <w:pPr>
+        <w:ind w:left="1440" w:hanging="360"/>
+      </w:pPr>
+    </w:lvl>
+    <w:lvl w:ilvl="2">
+      <w:start w:val="32"/>
+      <w:numFmt w:val="decimal"/>
+      <w:lvlText w:val="%3."/>
+      <w:lvlJc w:val="left"/>
+      <w:pPr>
+        <w:ind w:left="2160" w:hanging="360"/>
+      </w:pPr>
+    </w:lvl>
+    <w:lvl w:ilvl="3">
+      <w:start w:val="32"/>
+      <w:numFmt w:val="decimal"/>
+      <w:lvlText w:val="%4."/>
+      <w:lvlJc w:val="left"/>
+      <w:pPr>
+        <w:ind w:left="2880" w:hanging="360"/>
+      </w:pPr>
+    </w:lvl>
+    <w:lvl w:ilvl="4">
+      <w:start w:val="32"/>
+      <w:numFmt w:val="decimal"/>
+      <w:lvlText w:val="%5."/>
+      <w:lvlJc w:val="left"/>
+      <w:pPr>
+        <w:ind w:left="3600" w:hanging="360"/>
+      </w:pPr>
+    </w:lvl>
+    <w:lvl w:ilvl="5">
+      <w:start w:val="32"/>
+      <w:numFmt w:val="decimal"/>
+      <w:lvlText w:val="%6."/>
+      <w:lvlJc w:val="left"/>
+      <w:pPr>
+        <w:ind w:left="4320" w:hanging="360"/>
+      </w:pPr>
+    </w:lvl>
+    <w:lvl w:ilvl="6">
+      <w:start w:val="32"/>
+      <w:numFmt w:val="decimal"/>
+      <w:lvlText w:val="%7."/>
+      <w:lvlJc w:val="left"/>
+      <w:pPr>
+        <w:ind w:left="5040" w:hanging="360"/>
+      </w:pPr>
+    </w:lvl>
+    <w:lvl w:ilvl="7">
+      <w:start w:val="32"/>
+      <w:numFmt w:val="decimal"/>
+      <w:lvlText w:val="%8."/>
+      <w:lvlJc w:val="left"/>
+      <w:pPr>
+        <w:ind w:left="5760" w:hanging="360"/>
+      </w:pPr>
+    </w:lvl>
+    <w:lvl w:ilvl="8">
+      <w:start w:val="32"/>
+      <w:numFmt w:val="decimal"/>
+      <w:lvlText w:val="%9."/>
+      <w:lvlJc w:val="left"/>
+      <w:pPr>
+        <w:ind w:left="6480" w:hanging="360"/>
+      </w:pPr>
+    </w:lvl>
+  </w:abstractNum>
+  <w:abstractNum w:abstractNumId="994133">
+    <w:nsid w:val="0A994133"/>
+    <w:multiLevelType w:val="multilevel"/>
+    <w:lvl w:ilvl="0">
+      <w:start w:val="33"/>
+      <w:numFmt w:val="decimal"/>
+      <w:lvlText w:val="%1."/>
+      <w:lvlJc w:val="left"/>
+      <w:pPr>
+        <w:ind w:left="720" w:hanging="360"/>
+      </w:pPr>
+    </w:lvl>
+    <w:lvl w:ilvl="1">
+      <w:start w:val="33"/>
+      <w:numFmt w:val="decimal"/>
+      <w:lvlText w:val="%2."/>
+      <w:lvlJc w:val="left"/>
+      <w:pPr>
+        <w:ind w:left="1440" w:hanging="360"/>
+      </w:pPr>
+    </w:lvl>
+    <w:lvl w:ilvl="2">
+      <w:start w:val="33"/>
+      <w:numFmt w:val="decimal"/>
+      <w:lvlText w:val="%3."/>
+      <w:lvlJc w:val="left"/>
+      <w:pPr>
+        <w:ind w:left="2160" w:hanging="360"/>
+      </w:pPr>
+    </w:lvl>
+    <w:lvl w:ilvl="3">
+      <w:start w:val="33"/>
+      <w:numFmt w:val="decimal"/>
+      <w:lvlText w:val="%4."/>
+      <w:lvlJc w:val="left"/>
+      <w:pPr>
+        <w:ind w:left="2880" w:hanging="360"/>
+      </w:pPr>
+    </w:lvl>
+    <w:lvl w:ilvl="4">
+      <w:start w:val="33"/>
+      <w:numFmt w:val="decimal"/>
+      <w:lvlText w:val="%5."/>
+      <w:lvlJc w:val="left"/>
+      <w:pPr>
+        <w:ind w:left="3600" w:hanging="360"/>
+      </w:pPr>
+    </w:lvl>
+    <w:lvl w:ilvl="5">
+      <w:start w:val="33"/>
+      <w:numFmt w:val="decimal"/>
+      <w:lvlText w:val="%6."/>
+      <w:lvlJc w:val="left"/>
+      <w:pPr>
+        <w:ind w:left="4320" w:hanging="360"/>
+      </w:pPr>
+    </w:lvl>
+    <w:lvl w:ilvl="6">
+      <w:start w:val="33"/>
+      <w:numFmt w:val="decimal"/>
+      <w:lvlText w:val="%7."/>
+      <w:lvlJc w:val="left"/>
+      <w:pPr>
+        <w:ind w:left="5040" w:hanging="360"/>
+      </w:pPr>
+    </w:lvl>
+    <w:lvl w:ilvl="7">
+      <w:start w:val="33"/>
+      <w:numFmt w:val="decimal"/>
+      <w:lvlText w:val="%8."/>
+      <w:lvlJc w:val="left"/>
+      <w:pPr>
+        <w:ind w:left="5760" w:hanging="360"/>
+      </w:pPr>
+    </w:lvl>
+    <w:lvl w:ilvl="8">
+      <w:start w:val="33"/>
+      <w:numFmt w:val="decimal"/>
+      <w:lvlText w:val="%9."/>
+      <w:lvlJc w:val="left"/>
+      <w:pPr>
+        <w:ind w:left="6480" w:hanging="360"/>
+      </w:pPr>
+    </w:lvl>
+  </w:abstractNum>
+  <w:abstractNum w:abstractNumId="994138">
+    <w:nsid w:val="0A994138"/>
+    <w:multiLevelType w:val="multilevel"/>
+    <w:lvl w:ilvl="0">
+      <w:start w:val="38"/>
+      <w:numFmt w:val="decimal"/>
+      <w:lvlText w:val="%1."/>
+      <w:lvlJc w:val="left"/>
+      <w:pPr>
+        <w:ind w:left="720" w:hanging="360"/>
+      </w:pPr>
+    </w:lvl>
+    <w:lvl w:ilvl="1">
+      <w:start w:val="38"/>
+      <w:numFmt w:val="decimal"/>
+      <w:lvlText w:val="%2."/>
+      <w:lvlJc w:val="left"/>
+      <w:pPr>
+        <w:ind w:left="1440" w:hanging="360"/>
+      </w:pPr>
+    </w:lvl>
+    <w:lvl w:ilvl="2">
+      <w:start w:val="38"/>
+      <w:numFmt w:val="decimal"/>
+      <w:lvlText w:val="%3."/>
+      <w:lvlJc w:val="left"/>
+      <w:pPr>
+        <w:ind w:left="2160" w:hanging="360"/>
+      </w:pPr>
+    </w:lvl>
+    <w:lvl w:ilvl="3">
+      <w:start w:val="38"/>
+      <w:numFmt w:val="decimal"/>
+      <w:lvlText w:val="%4."/>
+      <w:lvlJc w:val="left"/>
+      <w:pPr>
+        <w:ind w:left="2880" w:hanging="360"/>
+      </w:pPr>
+    </w:lvl>
+    <w:lvl w:ilvl="4">
+      <w:start w:val="38"/>
+      <w:numFmt w:val="decimal"/>
+      <w:lvlText w:val="%5."/>
+      <w:lvlJc w:val="left"/>
+      <w:pPr>
+        <w:ind w:left="3600" w:hanging="360"/>
+      </w:pPr>
+    </w:lvl>
+    <w:lvl w:ilvl="5">
+      <w:start w:val="38"/>
+      <w:numFmt w:val="decimal"/>
+      <w:lvlText w:val="%6."/>
+      <w:lvlJc w:val="left"/>
+      <w:pPr>
+        <w:ind w:left="4320" w:hanging="360"/>
+      </w:pPr>
+    </w:lvl>
+    <w:lvl w:ilvl="6">
+      <w:start w:val="38"/>
+      <w:numFmt w:val="decimal"/>
+      <w:lvlText w:val="%7."/>
+      <w:lvlJc w:val="left"/>
+      <w:pPr>
+        <w:ind w:left="5040" w:hanging="360"/>
+      </w:pPr>
+    </w:lvl>
+    <w:lvl w:ilvl="7">
+      <w:start w:val="38"/>
+      <w:numFmt w:val="decimal"/>
+      <w:lvlText w:val="%8."/>
+      <w:lvlJc w:val="left"/>
+      <w:pPr>
+        <w:ind w:left="5760" w:hanging="360"/>
+      </w:pPr>
+    </w:lvl>
+    <w:lvl w:ilvl="8">
+      <w:start w:val="38"/>
+      <w:numFmt w:val="decimal"/>
+      <w:lvlText w:val="%9."/>
+      <w:lvlJc w:val="left"/>
+      <w:pPr>
+        <w:ind w:left="6480" w:hanging="360"/>
+      </w:pPr>
+    </w:lvl>
+  </w:abstractNum>
+  <w:abstractNum w:abstractNumId="994140">
+    <w:nsid w:val="0A994140"/>
+    <w:multiLevelType w:val="multilevel"/>
+    <w:lvl w:ilvl="0">
+      <w:start w:val="40"/>
+      <w:numFmt w:val="decimal"/>
+      <w:lvlText w:val="%1."/>
+      <w:lvlJc w:val="left"/>
+      <w:pPr>
+        <w:ind w:left="720" w:hanging="360"/>
+      </w:pPr>
+    </w:lvl>
+    <w:lvl w:ilvl="1">
+      <w:start w:val="40"/>
+      <w:numFmt w:val="decimal"/>
+      <w:lvlText w:val="%2."/>
+      <w:lvlJc w:val="left"/>
+      <w:pPr>
+        <w:ind w:left="1440" w:hanging="360"/>
+      </w:pPr>
+    </w:lvl>
+    <w:lvl w:ilvl="2">
+      <w:start w:val="40"/>
+      <w:numFmt w:val="decimal"/>
+      <w:lvlText w:val="%3."/>
+      <w:lvlJc w:val="left"/>
+      <w:pPr>
+        <w:ind w:left="2160" w:hanging="360"/>
+      </w:pPr>
+    </w:lvl>
+    <w:lvl w:ilvl="3">
+      <w:start w:val="40"/>
+      <w:numFmt w:val="decimal"/>
+      <w:lvlText w:val="%4."/>
+      <w:lvlJc w:val="left"/>
+      <w:pPr>
+        <w:ind w:left="2880" w:hanging="360"/>
+      </w:pPr>
+    </w:lvl>
+    <w:lvl w:ilvl="4">
+      <w:start w:val="40"/>
+      <w:numFmt w:val="decimal"/>
+      <w:lvlText w:val="%5."/>
+      <w:lvlJc w:val="left"/>
+      <w:pPr>
+        <w:ind w:left="3600" w:hanging="360"/>
+      </w:pPr>
+    </w:lvl>
+    <w:lvl w:ilvl="5">
+      <w:start w:val="40"/>
+      <w:numFmt w:val="decimal"/>
+      <w:lvlText w:val="%6."/>
+      <w:lvlJc w:val="left"/>
+      <w:pPr>
+        <w:ind w:left="4320" w:hanging="360"/>
+      </w:pPr>
+    </w:lvl>
+    <w:lvl w:ilvl="6">
+      <w:start w:val="40"/>
+      <w:numFmt w:val="decimal"/>
+      <w:lvlText w:val="%7."/>
+      <w:lvlJc w:val="left"/>
+      <w:pPr>
+        <w:ind w:left="5040" w:hanging="360"/>
+      </w:pPr>
+    </w:lvl>
+    <w:lvl w:ilvl="7">
+      <w:start w:val="40"/>
+      <w:numFmt w:val="decimal"/>
+      <w:lvlText w:val="%8."/>
+      <w:lvlJc w:val="left"/>
+      <w:pPr>
+        <w:ind w:left="5760" w:hanging="360"/>
+      </w:pPr>
+    </w:lvl>
+    <w:lvl w:ilvl="8">
+      <w:start w:val="40"/>
+      <w:numFmt w:val="decimal"/>
+      <w:lvlText w:val="%9."/>
+      <w:lvlJc w:val="left"/>
+      <w:pPr>
+        <w:ind w:left="6480" w:hanging="360"/>
+      </w:pPr>
+    </w:lvl>
+  </w:abstractNum>
+  <w:abstractNum w:abstractNumId="994146">
+    <w:nsid w:val="0A994146"/>
+    <w:multiLevelType w:val="multilevel"/>
+    <w:lvl w:ilvl="0">
+      <w:start w:val="46"/>
+      <w:numFmt w:val="decimal"/>
+      <w:lvlText w:val="%1."/>
+      <w:lvlJc w:val="left"/>
+      <w:pPr>
+        <w:ind w:left="720" w:hanging="360"/>
+      </w:pPr>
+    </w:lvl>
+    <w:lvl w:ilvl="1">
+      <w:start w:val="46"/>
+      <w:numFmt w:val="decimal"/>
+      <w:lvlText w:val="%2."/>
+      <w:lvlJc w:val="left"/>
+      <w:pPr>
+        <w:ind w:left="1440" w:hanging="360"/>
+      </w:pPr>
+    </w:lvl>
+    <w:lvl w:ilvl="2">
+      <w:start w:val="46"/>
+      <w:numFmt w:val="decimal"/>
+      <w:lvlText w:val="%3."/>
+      <w:lvlJc w:val="left"/>
+      <w:pPr>
+        <w:ind w:left="2160" w:hanging="360"/>
+      </w:pPr>
+    </w:lvl>
+    <w:lvl w:ilvl="3">
+      <w:start w:val="46"/>
+      <w:numFmt w:val="decimal"/>
+      <w:lvlText w:val="%4."/>
+      <w:lvlJc w:val="left"/>
+      <w:pPr>
+        <w:ind w:left="2880" w:hanging="360"/>
+      </w:pPr>
+    </w:lvl>
+    <w:lvl w:ilvl="4">
+      <w:start w:val="46"/>
+      <w:numFmt w:val="decimal"/>
+      <w:lvlText w:val="%5."/>
+      <w:lvlJc w:val="left"/>
+      <w:pPr>
+        <w:ind w:left="3600" w:hanging="360"/>
+      </w:pPr>
+    </w:lvl>
+    <w:lvl w:ilvl="5">
+      <w:start w:val="46"/>
+      <w:numFmt w:val="decimal"/>
+      <w:lvlText w:val="%6."/>
+      <w:lvlJc w:val="left"/>
+      <w:pPr>
+        <w:ind w:left="4320" w:hanging="360"/>
+      </w:pPr>
+    </w:lvl>
+    <w:lvl w:ilvl="6">
+      <w:start w:val="46"/>
+      <w:numFmt w:val="decimal"/>
+      <w:lvlText w:val="%7."/>
+      <w:lvlJc w:val="left"/>
+      <w:pPr>
+        <w:ind w:left="5040" w:hanging="360"/>
+      </w:pPr>
+    </w:lvl>
+    <w:lvl w:ilvl="7">
+      <w:start w:val="46"/>
+      <w:numFmt w:val="decimal"/>
+      <w:lvlText w:val="%8."/>
+      <w:lvlJc w:val="left"/>
+      <w:pPr>
+        <w:ind w:left="5760" w:hanging="360"/>
+      </w:pPr>
+    </w:lvl>
+    <w:lvl w:ilvl="8">
+      <w:start w:val="46"/>
+      <w:numFmt w:val="decimal"/>
+      <w:lvlText w:val="%9."/>
+      <w:lvlJc w:val="left"/>
+      <w:pPr>
+        <w:ind w:left="6480" w:hanging="360"/>
+      </w:pPr>
+    </w:lvl>
+  </w:abstractNum>
+  <w:abstractNum w:abstractNumId="994151">
+    <w:nsid w:val="0A994151"/>
+    <w:multiLevelType w:val="multilevel"/>
+    <w:lvl w:ilvl="0">
+      <w:start w:val="51"/>
+      <w:numFmt w:val="decimal"/>
+      <w:lvlText w:val="%1."/>
+      <w:lvlJc w:val="left"/>
+      <w:pPr>
+        <w:ind w:left="720" w:hanging="360"/>
+      </w:pPr>
+    </w:lvl>
+    <w:lvl w:ilvl="1">
+      <w:start w:val="51"/>
+      <w:numFmt w:val="decimal"/>
+      <w:lvlText w:val="%2."/>
+      <w:lvlJc w:val="left"/>
+      <w:pPr>
+        <w:ind w:left="1440" w:hanging="360"/>
+      </w:pPr>
+    </w:lvl>
+    <w:lvl w:ilvl="2">
+      <w:start w:val="51"/>
+      <w:numFmt w:val="decimal"/>
+      <w:lvlText w:val="%3."/>
+      <w:lvlJc w:val="left"/>
+      <w:pPr>
+        <w:ind w:left="2160" w:hanging="360"/>
+      </w:pPr>
+    </w:lvl>
+    <w:lvl w:ilvl="3">
+      <w:start w:val="51"/>
+      <w:numFmt w:val="decimal"/>
+      <w:lvlText w:val="%4."/>
+      <w:lvlJc w:val="left"/>
+      <w:pPr>
+        <w:ind w:left="2880" w:hanging="360"/>
+      </w:pPr>
+    </w:lvl>
+    <w:lvl w:ilvl="4">
+      <w:start w:val="51"/>
+      <w:numFmt w:val="decimal"/>
+      <w:lvlText w:val="%5."/>
+      <w:lvlJc w:val="left"/>
+      <w:pPr>
+        <w:ind w:left="3600" w:hanging="360"/>
+      </w:pPr>
+    </w:lvl>
+    <w:lvl w:ilvl="5">
+      <w:start w:val="51"/>
+      <w:numFmt w:val="decimal"/>
+      <w:lvlText w:val="%6."/>
+      <w:lvlJc w:val="left"/>
+      <w:pPr>
+        <w:ind w:left="4320" w:hanging="360"/>
+      </w:pPr>
+    </w:lvl>
+    <w:lvl w:ilvl="6">
+      <w:start w:val="51"/>
+      <w:numFmt w:val="decimal"/>
+      <w:lvlText w:val="%7."/>
+      <w:lvlJc w:val="left"/>
+      <w:pPr>
+        <w:ind w:left="5040" w:hanging="360"/>
+      </w:pPr>
+    </w:lvl>
+    <w:lvl w:ilvl="7">
+      <w:start w:val="51"/>
+      <w:numFmt w:val="decimal"/>
+      <w:lvlText w:val="%8."/>
+      <w:lvlJc w:val="left"/>
+      <w:pPr>
+        <w:ind w:left="5760" w:hanging="360"/>
+      </w:pPr>
+    </w:lvl>
+    <w:lvl w:ilvl="8">
+      <w:start w:val="51"/>
+      <w:numFmt w:val="decimal"/>
+      <w:lvlText w:val="%9."/>
+      <w:lvlJc w:val="left"/>
+      <w:pPr>
+        <w:ind w:left="6480" w:hanging="360"/>
+      </w:pPr>
+    </w:lvl>
+  </w:abstractNum>
+  <w:abstractNum w:abstractNumId="994152">
+    <w:nsid w:val="0A994152"/>
+    <w:multiLevelType w:val="multilevel"/>
+    <w:lvl w:ilvl="0">
+      <w:start w:val="52"/>
+      <w:numFmt w:val="decimal"/>
+      <w:lvlText w:val="%1."/>
+      <w:lvlJc w:val="left"/>
+      <w:pPr>
+        <w:ind w:left="720" w:hanging="360"/>
+      </w:pPr>
+    </w:lvl>
+    <w:lvl w:ilvl="1">
+      <w:start w:val="52"/>
+      <w:numFmt w:val="decimal"/>
+      <w:lvlText w:val="%2."/>
+      <w:lvlJc w:val="left"/>
+      <w:pPr>
+        <w:ind w:left="1440" w:hanging="360"/>
+      </w:pPr>
+    </w:lvl>
+    <w:lvl w:ilvl="2">
+      <w:start w:val="52"/>
+      <w:numFmt w:val="decimal"/>
+      <w:lvlText w:val="%3."/>
+      <w:lvlJc w:val="left"/>
+      <w:pPr>
+        <w:ind w:left="2160" w:hanging="360"/>
+      </w:pPr>
+    </w:lvl>
+    <w:lvl w:ilvl="3">
+      <w:start w:val="52"/>
+      <w:numFmt w:val="decimal"/>
+      <w:lvlText w:val="%4."/>
+      <w:lvlJc w:val="left"/>
+      <w:pPr>
+        <w:ind w:left="2880" w:hanging="360"/>
+      </w:pPr>
+    </w:lvl>
+    <w:lvl w:ilvl="4">
+      <w:start w:val="52"/>
+      <w:numFmt w:val="decimal"/>
+      <w:lvlText w:val="%5."/>
+      <w:lvlJc w:val="left"/>
+      <w:pPr>
+        <w:ind w:left="3600" w:hanging="360"/>
+      </w:pPr>
+    </w:lvl>
+    <w:lvl w:ilvl="5">
+      <w:start w:val="52"/>
+      <w:numFmt w:val="decimal"/>
+      <w:lvlText w:val="%6."/>
+      <w:lvlJc w:val="left"/>
+      <w:pPr>
+        <w:ind w:left="4320" w:hanging="360"/>
+      </w:pPr>
+    </w:lvl>
+    <w:lvl w:ilvl="6">
+      <w:start w:val="52"/>
+      <w:numFmt w:val="decimal"/>
+      <w:lvlText w:val="%7."/>
+      <w:lvlJc w:val="left"/>
+      <w:pPr>
+        <w:ind w:left="5040" w:hanging="360"/>
+      </w:pPr>
+    </w:lvl>
+    <w:lvl w:ilvl="7">
+      <w:start w:val="52"/>
+      <w:numFmt w:val="decimal"/>
+      <w:lvlText w:val="%8."/>
+      <w:lvlJc w:val="left"/>
+      <w:pPr>
+        <w:ind w:left="5760" w:hanging="360"/>
+      </w:pPr>
+    </w:lvl>
+    <w:lvl w:ilvl="8">
+      <w:start w:val="52"/>
+      <w:numFmt w:val="decimal"/>
+      <w:lvlText w:val="%9."/>
+      <w:lvlJc w:val="left"/>
+      <w:pPr>
+        <w:ind w:left="6480" w:hanging="360"/>
+      </w:pPr>
+    </w:lvl>
+  </w:abstractNum>
+  <w:abstractNum w:abstractNumId="994159">
+    <w:nsid w:val="0A994159"/>
+    <w:multiLevelType w:val="multilevel"/>
+    <w:lvl w:ilvl="0">
+      <w:start w:val="59"/>
+      <w:numFmt w:val="decimal"/>
+      <w:lvlText w:val="%1."/>
+      <w:lvlJc w:val="left"/>
+      <w:pPr>
+        <w:ind w:left="720" w:hanging="360"/>
+      </w:pPr>
+    </w:lvl>
+    <w:lvl w:ilvl="1">
+      <w:start w:val="59"/>
+      <w:numFmt w:val="decimal"/>
+      <w:lvlText w:val="%2."/>
+      <w:lvlJc w:val="left"/>
+      <w:pPr>
+        <w:ind w:left="1440" w:hanging="360"/>
+      </w:pPr>
+    </w:lvl>
+    <w:lvl w:ilvl="2">
+      <w:start w:val="59"/>
+      <w:numFmt w:val="decimal"/>
+      <w:lvlText w:val="%3."/>
+      <w:lvlJc w:val="left"/>
+      <w:pPr>
+        <w:ind w:left="2160" w:hanging="360"/>
+      </w:pPr>
+    </w:lvl>
+    <w:lvl w:ilvl="3">
+      <w:start w:val="59"/>
+      <w:numFmt w:val="decimal"/>
+      <w:lvlText w:val="%4."/>
+      <w:lvlJc w:val="left"/>
+      <w:pPr>
+        <w:ind w:left="2880" w:hanging="360"/>
+      </w:pPr>
+    </w:lvl>
+    <w:lvl w:ilvl="4">
+      <w:start w:val="59"/>
+      <w:numFmt w:val="decimal"/>
+      <w:lvlText w:val="%5."/>
+      <w:lvlJc w:val="left"/>
+      <w:pPr>
+        <w:ind w:left="3600" w:hanging="360"/>
+      </w:pPr>
+    </w:lvl>
+    <w:lvl w:ilvl="5">
+      <w:start w:val="59"/>
+      <w:numFmt w:val="decimal"/>
+      <w:lvlText w:val="%6."/>
+      <w:lvlJc w:val="left"/>
+      <w:pPr>
+        <w:ind w:left="4320" w:hanging="360"/>
+      </w:pPr>
+    </w:lvl>
+    <w:lvl w:ilvl="6">
+      <w:start w:val="59"/>
+      <w:numFmt w:val="decimal"/>
+      <w:lvlText w:val="%7."/>
+      <w:lvlJc w:val="left"/>
+      <w:pPr>
+        <w:ind w:left="5040" w:hanging="360"/>
+      </w:pPr>
+    </w:lvl>
+    <w:lvl w:ilvl="7">
+      <w:start w:val="59"/>
+      <w:numFmt w:val="decimal"/>
+      <w:lvlText w:val="%8."/>
+      <w:lvlJc w:val="left"/>
+      <w:pPr>
+        <w:ind w:left="5760" w:hanging="360"/>
+      </w:pPr>
+    </w:lvl>
+    <w:lvl w:ilvl="8">
+      <w:start w:val="59"/>
+      <w:numFmt w:val="decimal"/>
+      <w:lvlText w:val="%9."/>
+      <w:lvlJc w:val="left"/>
+      <w:pPr>
+        <w:ind w:left="6480" w:hanging="360"/>
+      </w:pPr>
+    </w:lvl>
+  </w:abstractNum>
+  <w:abstractNum w:abstractNumId="994163">
+    <w:nsid w:val="0A994163"/>
+    <w:multiLevelType w:val="multilevel"/>
+    <w:lvl w:ilvl="0">
+      <w:start w:val="63"/>
+      <w:numFmt w:val="decimal"/>
+      <w:lvlText w:val="%1."/>
+      <w:lvlJc w:val="left"/>
+      <w:pPr>
+        <w:ind w:left="720" w:hanging="360"/>
+      </w:pPr>
+    </w:lvl>
+    <w:lvl w:ilvl="1">
+      <w:start w:val="63"/>
+      <w:numFmt w:val="decimal"/>
+      <w:lvlText w:val="%2."/>
+      <w:lvlJc w:val="left"/>
+      <w:pPr>
+        <w:ind w:left="1440" w:hanging="360"/>
+      </w:pPr>
+    </w:lvl>
+    <w:lvl w:ilvl="2">
+      <w:start w:val="63"/>
+      <w:numFmt w:val="decimal"/>
+      <w:lvlText w:val="%3."/>
+      <w:lvlJc w:val="left"/>
+      <w:pPr>
+        <w:ind w:left="2160" w:hanging="360"/>
+      </w:pPr>
+    </w:lvl>
+    <w:lvl w:ilvl="3">
+      <w:start w:val="63"/>
+      <w:numFmt w:val="decimal"/>
+      <w:lvlText w:val="%4."/>
+      <w:lvlJc w:val="left"/>
+      <w:pPr>
+        <w:ind w:left="2880" w:hanging="360"/>
+      </w:pPr>
+    </w:lvl>
+    <w:lvl w:ilvl="4">
+      <w:start w:val="63"/>
+      <w:numFmt w:val="decimal"/>
+      <w:lvlText w:val="%5."/>
+      <w:lvlJc w:val="left"/>
+      <w:pPr>
+        <w:ind w:left="3600" w:hanging="360"/>
+      </w:pPr>
+    </w:lvl>
+    <w:lvl w:ilvl="5">
+      <w:start w:val="63"/>
+      <w:numFmt w:val="decimal"/>
+      <w:lvlText w:val="%6."/>
+      <w:lvlJc w:val="left"/>
+      <w:pPr>
+        <w:ind w:left="4320" w:hanging="360"/>
+      </w:pPr>
+    </w:lvl>
+    <w:lvl w:ilvl="6">
+      <w:start w:val="63"/>
+      <w:numFmt w:val="decimal"/>
+      <w:lvlText w:val="%7."/>
+      <w:lvlJc w:val="left"/>
+      <w:pPr>
+        <w:ind w:left="5040" w:hanging="360"/>
+      </w:pPr>
+    </w:lvl>
+    <w:lvl w:ilvl="7">
+      <w:start w:val="63"/>
+      <w:numFmt w:val="decimal"/>
+      <w:lvlText w:val="%8."/>
+      <w:lvlJc w:val="left"/>
+      <w:pPr>
+        <w:ind w:left="5760" w:hanging="360"/>
+      </w:pPr>
+    </w:lvl>
+    <w:lvl w:ilvl="8">
+      <w:start w:val="63"/>
+      <w:numFmt w:val="decimal"/>
+      <w:lvlText w:val="%9."/>
+      <w:lvlJc w:val="left"/>
+      <w:pPr>
+        <w:ind w:left="6480" w:hanging="360"/>
+      </w:pPr>
+    </w:lvl>
+  </w:abstractNum>
+  <w:abstractNum w:abstractNumId="994164">
+    <w:nsid w:val="0A994164"/>
+    <w:multiLevelType w:val="multilevel"/>
+    <w:lvl w:ilvl="0">
+      <w:start w:val="64"/>
+      <w:numFmt w:val="decimal"/>
+      <w:lvlText w:val="%1."/>
+      <w:lvlJc w:val="left"/>
+      <w:pPr>
+        <w:ind w:left="720" w:hanging="360"/>
+      </w:pPr>
+    </w:lvl>
+    <w:lvl w:ilvl="1">
+      <w:start w:val="64"/>
+      <w:numFmt w:val="decimal"/>
+      <w:lvlText w:val="%2."/>
+      <w:lvlJc w:val="left"/>
+      <w:pPr>
+        <w:ind w:left="1440" w:hanging="360"/>
+      </w:pPr>
+    </w:lvl>
+    <w:lvl w:ilvl="2">
+      <w:start w:val="64"/>
+      <w:numFmt w:val="decimal"/>
+      <w:lvlText w:val="%3."/>
+      <w:lvlJc w:val="left"/>
+      <w:pPr>
+        <w:ind w:left="2160" w:hanging="360"/>
+      </w:pPr>
+    </w:lvl>
+    <w:lvl w:ilvl="3">
+      <w:start w:val="64"/>
+      <w:numFmt w:val="decimal"/>
+      <w:lvlText w:val="%4."/>
+      <w:lvlJc w:val="left"/>
+      <w:pPr>
+        <w:ind w:left="2880" w:hanging="360"/>
+      </w:pPr>
+    </w:lvl>
+    <w:lvl w:ilvl="4">
+      <w:start w:val="64"/>
+      <w:numFmt w:val="decimal"/>
+      <w:lvlText w:val="%5."/>
+      <w:lvlJc w:val="left"/>
+      <w:pPr>
+        <w:ind w:left="3600" w:hanging="360"/>
+      </w:pPr>
+    </w:lvl>
+    <w:lvl w:ilvl="5">
+      <w:start w:val="64"/>
+      <w:numFmt w:val="decimal"/>
+      <w:lvlText w:val="%6."/>
+      <w:lvlJc w:val="left"/>
+      <w:pPr>
+        <w:ind w:left="4320" w:hanging="360"/>
+      </w:pPr>
+    </w:lvl>
+    <w:lvl w:ilvl="6">
+      <w:start w:val="64"/>
+      <w:numFmt w:val="decimal"/>
+      <w:lvlText w:val="%7."/>
+      <w:lvlJc w:val="left"/>
+      <w:pPr>
+        <w:ind w:left="5040" w:hanging="360"/>
+      </w:pPr>
+    </w:lvl>
+    <w:lvl w:ilvl="7">
+      <w:start w:val="64"/>
+      <w:numFmt w:val="decimal"/>
+      <w:lvlText w:val="%8."/>
+      <w:lvlJc w:val="left"/>
+      <w:pPr>
+        <w:ind w:left="5760" w:hanging="360"/>
+      </w:pPr>
+    </w:lvl>
+    <w:lvl w:ilvl="8">
+      <w:start w:val="64"/>
+      <w:numFmt w:val="decimal"/>
+      <w:lvlText w:val="%9."/>
+      <w:lvlJc w:val="left"/>
+      <w:pPr>
+        <w:ind w:left="6480" w:hanging="360"/>
+      </w:pPr>
+    </w:lvl>
+  </w:abstractNum>
+  <w:abstractNum w:abstractNumId="994166">
+    <w:nsid w:val="0A994166"/>
+    <w:multiLevelType w:val="multilevel"/>
+    <w:lvl w:ilvl="0">
+      <w:start w:val="66"/>
+      <w:numFmt w:val="decimal"/>
+      <w:lvlText w:val="%1."/>
+      <w:lvlJc w:val="left"/>
+      <w:pPr>
+        <w:ind w:left="720" w:hanging="360"/>
+      </w:pPr>
+    </w:lvl>
+    <w:lvl w:ilvl="1">
+      <w:start w:val="66"/>
+      <w:numFmt w:val="decimal"/>
+      <w:lvlText w:val="%2."/>
+      <w:lvlJc w:val="left"/>
+      <w:pPr>
+        <w:ind w:left="1440" w:hanging="360"/>
+      </w:pPr>
+    </w:lvl>
+    <w:lvl w:ilvl="2">
+      <w:start w:val="66"/>
+      <w:numFmt w:val="decimal"/>
+      <w:lvlText w:val="%3."/>
+      <w:lvlJc w:val="left"/>
+      <w:pPr>
+        <w:ind w:left="2160" w:hanging="360"/>
+      </w:pPr>
+    </w:lvl>
+    <w:lvl w:ilvl="3">
+      <w:start w:val="66"/>
+      <w:numFmt w:val="decimal"/>
+      <w:lvlText w:val="%4."/>
+      <w:lvlJc w:val="left"/>
+      <w:pPr>
+        <w:ind w:left="2880" w:hanging="360"/>
+      </w:pPr>
+    </w:lvl>
+    <w:lvl w:ilvl="4">
+      <w:start w:val="66"/>
+      <w:numFmt w:val="decimal"/>
+      <w:lvlText w:val="%5."/>
+      <w:lvlJc w:val="left"/>
+      <w:pPr>
+        <w:ind w:left="3600" w:hanging="360"/>
+      </w:pPr>
+    </w:lvl>
+    <w:lvl w:ilvl="5">
+      <w:start w:val="66"/>
+      <w:numFmt w:val="decimal"/>
+      <w:lvlText w:val="%6."/>
+      <w:lvlJc w:val="left"/>
+      <w:pPr>
+        <w:ind w:left="4320" w:hanging="360"/>
+      </w:pPr>
+    </w:lvl>
+    <w:lvl w:ilvl="6">
+      <w:start w:val="66"/>
+      <w:numFmt w:val="decimal"/>
+      <w:lvlText w:val="%7."/>
+      <w:lvlJc w:val="left"/>
+      <w:pPr>
+        <w:ind w:left="5040" w:hanging="360"/>
+      </w:pPr>
+    </w:lvl>
+    <w:lvl w:ilvl="7">
+      <w:start w:val="66"/>
+      <w:numFmt w:val="decimal"/>
+      <w:lvlText w:val="%8."/>
+      <w:lvlJc w:val="left"/>
+      <w:pPr>
+        <w:ind w:left="5760" w:hanging="360"/>
+      </w:pPr>
+    </w:lvl>
+    <w:lvl w:ilvl="8">
+      <w:start w:val="66"/>
+      <w:numFmt w:val="decimal"/>
+      <w:lvlText w:val="%9."/>
+      <w:lvlJc w:val="left"/>
+      <w:pPr>
+        <w:ind w:left="6480" w:hanging="360"/>
+      </w:pPr>
+    </w:lvl>
+  </w:abstractNum>
+  <w:abstractNum w:abstractNumId="994168">
+    <w:nsid w:val="0A994168"/>
+    <w:multiLevelType w:val="multilevel"/>
+    <w:lvl w:ilvl="0">
+      <w:start w:val="68"/>
+      <w:numFmt w:val="decimal"/>
+      <w:lvlText w:val="%1."/>
+      <w:lvlJc w:val="left"/>
+      <w:pPr>
+        <w:ind w:left="720" w:hanging="360"/>
+      </w:pPr>
+    </w:lvl>
+    <w:lvl w:ilvl="1">
+      <w:start w:val="68"/>
+      <w:numFmt w:val="decimal"/>
+      <w:lvlText w:val="%2."/>
+      <w:lvlJc w:val="left"/>
+      <w:pPr>
+        <w:ind w:left="1440" w:hanging="360"/>
+      </w:pPr>
+    </w:lvl>
+    <w:lvl w:ilvl="2">
+      <w:start w:val="68"/>
+      <w:numFmt w:val="decimal"/>
+      <w:lvlText w:val="%3."/>
+      <w:lvlJc w:val="left"/>
+      <w:pPr>
+        <w:ind w:left="2160" w:hanging="360"/>
+      </w:pPr>
+    </w:lvl>
+    <w:lvl w:ilvl="3">
+      <w:start w:val="68"/>
+      <w:numFmt w:val="decimal"/>
+      <w:lvlText w:val="%4."/>
+      <w:lvlJc w:val="left"/>
+      <w:pPr>
+        <w:ind w:left="2880" w:hanging="360"/>
+      </w:pPr>
+    </w:lvl>
+    <w:lvl w:ilvl="4">
+      <w:start w:val="68"/>
+      <w:numFmt w:val="decimal"/>
+      <w:lvlText w:val="%5."/>
+      <w:lvlJc w:val="left"/>
+      <w:pPr>
+        <w:ind w:left="3600" w:hanging="360"/>
+      </w:pPr>
+    </w:lvl>
+    <w:lvl w:ilvl="5">
+      <w:start w:val="68"/>
+      <w:numFmt w:val="decimal"/>
+      <w:lvlText w:val="%6."/>
+      <w:lvlJc w:val="left"/>
+      <w:pPr>
+        <w:ind w:left="4320" w:hanging="360"/>
+      </w:pPr>
+    </w:lvl>
+    <w:lvl w:ilvl="6">
+      <w:start w:val="68"/>
+      <w:numFmt w:val="decimal"/>
+      <w:lvlText w:val="%7."/>
+      <w:lvlJc w:val="left"/>
+      <w:pPr>
+        <w:ind w:left="5040" w:hanging="360"/>
+      </w:pPr>
+    </w:lvl>
+    <w:lvl w:ilvl="7">
+      <w:start w:val="68"/>
+      <w:numFmt w:val="decimal"/>
+      <w:lvlText w:val="%8."/>
+      <w:lvlJc w:val="left"/>
+      <w:pPr>
+        <w:ind w:left="5760" w:hanging="360"/>
+      </w:pPr>
+    </w:lvl>
+    <w:lvl w:ilvl="8">
+      <w:start w:val="68"/>
+      <w:numFmt w:val="decimal"/>
+      <w:lvlText w:val="%9."/>
+      <w:lvlJc w:val="left"/>
+      <w:pPr>
+        <w:ind w:left="6480" w:hanging="360"/>
+      </w:pPr>
     </w:lvl>
   </w:abstractNum>
   <w:num w:numId="1000">
@@ -15599,516 +16900,516 @@
     <w:abstractNumId w:val="991"/>
   </w:num>
   <w:num w:numId="1003">
-    <w:abstractNumId w:val="99411"/>
+    <w:abstractNumId w:val="99417"/>
     <w:lvlOverride w:ilvl="0">
-      <w:startOverride w:val="1"/>
+      <w:startOverride w:val="7"/>
     </w:lvlOverride>
     <w:lvlOverride w:ilvl="1">
-      <w:startOverride w:val="1"/>
+      <w:startOverride w:val="7"/>
     </w:lvlOverride>
     <w:lvlOverride w:ilvl="2">
-      <w:startOverride w:val="1"/>
+      <w:startOverride w:val="7"/>
     </w:lvlOverride>
     <w:lvlOverride w:ilvl="3">
-      <w:startOverride w:val="1"/>
+      <w:startOverride w:val="7"/>
     </w:lvlOverride>
     <w:lvlOverride w:ilvl="4">
-      <w:startOverride w:val="1"/>
+      <w:startOverride w:val="7"/>
     </w:lvlOverride>
     <w:lvlOverride w:ilvl="5">
-      <w:startOverride w:val="1"/>
+      <w:startOverride w:val="7"/>
     </w:lvlOverride>
     <w:lvlOverride w:ilvl="6">
-      <w:startOverride w:val="1"/>
+      <w:startOverride w:val="7"/>
     </w:lvlOverride>
     <w:lvlOverride w:ilvl="7">
-      <w:startOverride w:val="1"/>
+      <w:startOverride w:val="7"/>
     </w:lvlOverride>
     <w:lvlOverride w:ilvl="8">
-      <w:startOverride w:val="1"/>
+      <w:startOverride w:val="7"/>
     </w:lvlOverride>
   </w:num>
   <w:num w:numId="1004">
-    <w:abstractNumId w:val="99411"/>
+    <w:abstractNumId w:val="99418"/>
     <w:lvlOverride w:ilvl="0">
-      <w:startOverride w:val="1"/>
+      <w:startOverride w:val="8"/>
     </w:lvlOverride>
     <w:lvlOverride w:ilvl="1">
-      <w:startOverride w:val="1"/>
+      <w:startOverride w:val="8"/>
     </w:lvlOverride>
     <w:lvlOverride w:ilvl="2">
-      <w:startOverride w:val="1"/>
+      <w:startOverride w:val="8"/>
     </w:lvlOverride>
     <w:lvlOverride w:ilvl="3">
-      <w:startOverride w:val="1"/>
+      <w:startOverride w:val="8"/>
     </w:lvlOverride>
     <w:lvlOverride w:ilvl="4">
-      <w:startOverride w:val="1"/>
+      <w:startOverride w:val="8"/>
     </w:lvlOverride>
     <w:lvlOverride w:ilvl="5">
-      <w:startOverride w:val="1"/>
+      <w:startOverride w:val="8"/>
     </w:lvlOverride>
     <w:lvlOverride w:ilvl="6">
-      <w:startOverride w:val="1"/>
+      <w:startOverride w:val="8"/>
     </w:lvlOverride>
     <w:lvlOverride w:ilvl="7">
-      <w:startOverride w:val="1"/>
+      <w:startOverride w:val="8"/>
     </w:lvlOverride>
     <w:lvlOverride w:ilvl="8">
-      <w:startOverride w:val="1"/>
+      <w:startOverride w:val="8"/>
     </w:lvlOverride>
   </w:num>
   <w:num w:numId="1005">
     <w:abstractNumId w:val="991"/>
   </w:num>
   <w:num w:numId="1006">
-    <w:abstractNumId w:val="99411"/>
+    <w:abstractNumId w:val="994117"/>
     <w:lvlOverride w:ilvl="0">
-      <w:startOverride w:val="1"/>
+      <w:startOverride w:val="17"/>
     </w:lvlOverride>
     <w:lvlOverride w:ilvl="1">
-      <w:startOverride w:val="1"/>
+      <w:startOverride w:val="17"/>
     </w:lvlOverride>
     <w:lvlOverride w:ilvl="2">
-      <w:startOverride w:val="1"/>
+      <w:startOverride w:val="17"/>
     </w:lvlOverride>
     <w:lvlOverride w:ilvl="3">
-      <w:startOverride w:val="1"/>
+      <w:startOverride w:val="17"/>
     </w:lvlOverride>
     <w:lvlOverride w:ilvl="4">
-      <w:startOverride w:val="1"/>
+      <w:startOverride w:val="17"/>
     </w:lvlOverride>
     <w:lvlOverride w:ilvl="5">
-      <w:startOverride w:val="1"/>
+      <w:startOverride w:val="17"/>
     </w:lvlOverride>
     <w:lvlOverride w:ilvl="6">
-      <w:startOverride w:val="1"/>
+      <w:startOverride w:val="17"/>
     </w:lvlOverride>
     <w:lvlOverride w:ilvl="7">
-      <w:startOverride w:val="1"/>
+      <w:startOverride w:val="17"/>
     </w:lvlOverride>
     <w:lvlOverride w:ilvl="8">
-      <w:startOverride w:val="1"/>
+      <w:startOverride w:val="17"/>
     </w:lvlOverride>
   </w:num>
   <w:num w:numId="1007">
-    <w:abstractNumId w:val="99411"/>
+    <w:abstractNumId w:val="994120"/>
     <w:lvlOverride w:ilvl="0">
-      <w:startOverride w:val="1"/>
+      <w:startOverride w:val="20"/>
     </w:lvlOverride>
     <w:lvlOverride w:ilvl="1">
-      <w:startOverride w:val="1"/>
+      <w:startOverride w:val="20"/>
     </w:lvlOverride>
     <w:lvlOverride w:ilvl="2">
-      <w:startOverride w:val="1"/>
+      <w:startOverride w:val="20"/>
     </w:lvlOverride>
     <w:lvlOverride w:ilvl="3">
-      <w:startOverride w:val="1"/>
+      <w:startOverride w:val="20"/>
     </w:lvlOverride>
     <w:lvlOverride w:ilvl="4">
-      <w:startOverride w:val="1"/>
+      <w:startOverride w:val="20"/>
     </w:lvlOverride>
     <w:lvlOverride w:ilvl="5">
-      <w:startOverride w:val="1"/>
+      <w:startOverride w:val="20"/>
     </w:lvlOverride>
     <w:lvlOverride w:ilvl="6">
-      <w:startOverride w:val="1"/>
+      <w:startOverride w:val="20"/>
     </w:lvlOverride>
     <w:lvlOverride w:ilvl="7">
-      <w:startOverride w:val="1"/>
+      <w:startOverride w:val="20"/>
     </w:lvlOverride>
     <w:lvlOverride w:ilvl="8">
-      <w:startOverride w:val="1"/>
+      <w:startOverride w:val="20"/>
     </w:lvlOverride>
   </w:num>
   <w:num w:numId="1008">
-    <w:abstractNumId w:val="99411"/>
+    <w:abstractNumId w:val="994128"/>
     <w:lvlOverride w:ilvl="0">
-      <w:startOverride w:val="1"/>
+      <w:startOverride w:val="28"/>
     </w:lvlOverride>
     <w:lvlOverride w:ilvl="1">
-      <w:startOverride w:val="1"/>
+      <w:startOverride w:val="28"/>
     </w:lvlOverride>
     <w:lvlOverride w:ilvl="2">
-      <w:startOverride w:val="1"/>
+      <w:startOverride w:val="28"/>
     </w:lvlOverride>
     <w:lvlOverride w:ilvl="3">
-      <w:startOverride w:val="1"/>
+      <w:startOverride w:val="28"/>
     </w:lvlOverride>
     <w:lvlOverride w:ilvl="4">
-      <w:startOverride w:val="1"/>
+      <w:startOverride w:val="28"/>
     </w:lvlOverride>
     <w:lvlOverride w:ilvl="5">
-      <w:startOverride w:val="1"/>
+      <w:startOverride w:val="28"/>
     </w:lvlOverride>
     <w:lvlOverride w:ilvl="6">
-      <w:startOverride w:val="1"/>
+      <w:startOverride w:val="28"/>
     </w:lvlOverride>
     <w:lvlOverride w:ilvl="7">
-      <w:startOverride w:val="1"/>
+      <w:startOverride w:val="28"/>
     </w:lvlOverride>
     <w:lvlOverride w:ilvl="8">
-      <w:startOverride w:val="1"/>
+      <w:startOverride w:val="28"/>
     </w:lvlOverride>
   </w:num>
   <w:num w:numId="1009">
-    <w:abstractNumId w:val="99411"/>
+    <w:abstractNumId w:val="994132"/>
     <w:lvlOverride w:ilvl="0">
-      <w:startOverride w:val="1"/>
+      <w:startOverride w:val="32"/>
     </w:lvlOverride>
     <w:lvlOverride w:ilvl="1">
-      <w:startOverride w:val="1"/>
+      <w:startOverride w:val="32"/>
     </w:lvlOverride>
     <w:lvlOverride w:ilvl="2">
-      <w:startOverride w:val="1"/>
+      <w:startOverride w:val="32"/>
     </w:lvlOverride>
     <w:lvlOverride w:ilvl="3">
-      <w:startOverride w:val="1"/>
+      <w:startOverride w:val="32"/>
     </w:lvlOverride>
     <w:lvlOverride w:ilvl="4">
-      <w:startOverride w:val="1"/>
+      <w:startOverride w:val="32"/>
     </w:lvlOverride>
     <w:lvlOverride w:ilvl="5">
-      <w:startOverride w:val="1"/>
+      <w:startOverride w:val="32"/>
     </w:lvlOverride>
     <w:lvlOverride w:ilvl="6">
-      <w:startOverride w:val="1"/>
+      <w:startOverride w:val="32"/>
     </w:lvlOverride>
     <w:lvlOverride w:ilvl="7">
-      <w:startOverride w:val="1"/>
+      <w:startOverride w:val="32"/>
     </w:lvlOverride>
     <w:lvlOverride w:ilvl="8">
-      <w:startOverride w:val="1"/>
+      <w:startOverride w:val="32"/>
     </w:lvlOverride>
   </w:num>
   <w:num w:numId="1010">
-    <w:abstractNumId w:val="99411"/>
+    <w:abstractNumId w:val="994133"/>
     <w:lvlOverride w:ilvl="0">
-      <w:startOverride w:val="1"/>
+      <w:startOverride w:val="33"/>
     </w:lvlOverride>
     <w:lvlOverride w:ilvl="1">
-      <w:startOverride w:val="1"/>
+      <w:startOverride w:val="33"/>
     </w:lvlOverride>
     <w:lvlOverride w:ilvl="2">
-      <w:startOverride w:val="1"/>
+      <w:startOverride w:val="33"/>
     </w:lvlOverride>
     <w:lvlOverride w:ilvl="3">
-      <w:startOverride w:val="1"/>
+      <w:startOverride w:val="33"/>
     </w:lvlOverride>
     <w:lvlOverride w:ilvl="4">
-      <w:startOverride w:val="1"/>
+      <w:startOverride w:val="33"/>
     </w:lvlOverride>
     <w:lvlOverride w:ilvl="5">
-      <w:startOverride w:val="1"/>
+      <w:startOverride w:val="33"/>
     </w:lvlOverride>
     <w:lvlOverride w:ilvl="6">
-      <w:startOverride w:val="1"/>
+      <w:startOverride w:val="33"/>
     </w:lvlOverride>
     <w:lvlOverride w:ilvl="7">
-      <w:startOverride w:val="1"/>
+      <w:startOverride w:val="33"/>
     </w:lvlOverride>
     <w:lvlOverride w:ilvl="8">
-      <w:startOverride w:val="1"/>
+      <w:startOverride w:val="33"/>
     </w:lvlOverride>
   </w:num>
   <w:num w:numId="1011">
-    <w:abstractNumId w:val="99411"/>
+    <w:abstractNumId w:val="994138"/>
     <w:lvlOverride w:ilvl="0">
-      <w:startOverride w:val="1"/>
+      <w:startOverride w:val="38"/>
     </w:lvlOverride>
     <w:lvlOverride w:ilvl="1">
-      <w:startOverride w:val="1"/>
+      <w:startOverride w:val="38"/>
     </w:lvlOverride>
     <w:lvlOverride w:ilvl="2">
-      <w:startOverride w:val="1"/>
+      <w:startOverride w:val="38"/>
     </w:lvlOverride>
     <w:lvlOverride w:ilvl="3">
-      <w:startOverride w:val="1"/>
+      <w:startOverride w:val="38"/>
     </w:lvlOverride>
     <w:lvlOverride w:ilvl="4">
-      <w:startOverride w:val="1"/>
+      <w:startOverride w:val="38"/>
     </w:lvlOverride>
     <w:lvlOverride w:ilvl="5">
-      <w:startOverride w:val="1"/>
+      <w:startOverride w:val="38"/>
     </w:lvlOverride>
     <w:lvlOverride w:ilvl="6">
-      <w:startOverride w:val="1"/>
+      <w:startOverride w:val="38"/>
     </w:lvlOverride>
     <w:lvlOverride w:ilvl="7">
-      <w:startOverride w:val="1"/>
+      <w:startOverride w:val="38"/>
     </w:lvlOverride>
     <w:lvlOverride w:ilvl="8">
-      <w:startOverride w:val="1"/>
+      <w:startOverride w:val="38"/>
     </w:lvlOverride>
   </w:num>
   <w:num w:numId="1012">
-    <w:abstractNumId w:val="99411"/>
+    <w:abstractNumId w:val="994140"/>
     <w:lvlOverride w:ilvl="0">
-      <w:startOverride w:val="1"/>
+      <w:startOverride w:val="40"/>
     </w:lvlOverride>
     <w:lvlOverride w:ilvl="1">
-      <w:startOverride w:val="1"/>
+      <w:startOverride w:val="40"/>
     </w:lvlOverride>
     <w:lvlOverride w:ilvl="2">
-      <w:startOverride w:val="1"/>
+      <w:startOverride w:val="40"/>
     </w:lvlOverride>
     <w:lvlOverride w:ilvl="3">
-      <w:startOverride w:val="1"/>
+      <w:startOverride w:val="40"/>
     </w:lvlOverride>
     <w:lvlOverride w:ilvl="4">
-      <w:startOverride w:val="1"/>
+      <w:startOverride w:val="40"/>
     </w:lvlOverride>
     <w:lvlOverride w:ilvl="5">
-      <w:startOverride w:val="1"/>
+      <w:startOverride w:val="40"/>
     </w:lvlOverride>
     <w:lvlOverride w:ilvl="6">
-      <w:startOverride w:val="1"/>
+      <w:startOverride w:val="40"/>
     </w:lvlOverride>
     <w:lvlOverride w:ilvl="7">
-      <w:startOverride w:val="1"/>
+      <w:startOverride w:val="40"/>
     </w:lvlOverride>
     <w:lvlOverride w:ilvl="8">
-      <w:startOverride w:val="1"/>
+      <w:startOverride w:val="40"/>
     </w:lvlOverride>
   </w:num>
   <w:num w:numId="1013">
-    <w:abstractNumId w:val="99411"/>
+    <w:abstractNumId w:val="994146"/>
     <w:lvlOverride w:ilvl="0">
-      <w:startOverride w:val="1"/>
+      <w:startOverride w:val="46"/>
     </w:lvlOverride>
     <w:lvlOverride w:ilvl="1">
-      <w:startOverride w:val="1"/>
+      <w:startOverride w:val="46"/>
     </w:lvlOverride>
     <w:lvlOverride w:ilvl="2">
-      <w:startOverride w:val="1"/>
+      <w:startOverride w:val="46"/>
     </w:lvlOverride>
     <w:lvlOverride w:ilvl="3">
-      <w:startOverride w:val="1"/>
+      <w:startOverride w:val="46"/>
     </w:lvlOverride>
     <w:lvlOverride w:ilvl="4">
-      <w:startOverride w:val="1"/>
+      <w:startOverride w:val="46"/>
     </w:lvlOverride>
     <w:lvlOverride w:ilvl="5">
-      <w:startOverride w:val="1"/>
+      <w:startOverride w:val="46"/>
     </w:lvlOverride>
     <w:lvlOverride w:ilvl="6">
-      <w:startOverride w:val="1"/>
+      <w:startOverride w:val="46"/>
     </w:lvlOverride>
     <w:lvlOverride w:ilvl="7">
-      <w:startOverride w:val="1"/>
+      <w:startOverride w:val="46"/>
     </w:lvlOverride>
     <w:lvlOverride w:ilvl="8">
-      <w:startOverride w:val="1"/>
+      <w:startOverride w:val="46"/>
     </w:lvlOverride>
   </w:num>
   <w:num w:numId="1014">
-    <w:abstractNumId w:val="99411"/>
+    <w:abstractNumId w:val="994151"/>
     <w:lvlOverride w:ilvl="0">
-      <w:startOverride w:val="1"/>
+      <w:startOverride w:val="51"/>
     </w:lvlOverride>
     <w:lvlOverride w:ilvl="1">
-      <w:startOverride w:val="1"/>
+      <w:startOverride w:val="51"/>
     </w:lvlOverride>
     <w:lvlOverride w:ilvl="2">
-      <w:startOverride w:val="1"/>
+      <w:startOverride w:val="51"/>
     </w:lvlOverride>
     <w:lvlOverride w:ilvl="3">
-      <w:startOverride w:val="1"/>
+      <w:startOverride w:val="51"/>
     </w:lvlOverride>
     <w:lvlOverride w:ilvl="4">
-      <w:startOverride w:val="1"/>
+      <w:startOverride w:val="51"/>
     </w:lvlOverride>
     <w:lvlOverride w:ilvl="5">
-      <w:startOverride w:val="1"/>
+      <w:startOverride w:val="51"/>
     </w:lvlOverride>
     <w:lvlOverride w:ilvl="6">
-      <w:startOverride w:val="1"/>
+      <w:startOverride w:val="51"/>
     </w:lvlOverride>
     <w:lvlOverride w:ilvl="7">
-      <w:startOverride w:val="1"/>
+      <w:startOverride w:val="51"/>
     </w:lvlOverride>
     <w:lvlOverride w:ilvl="8">
-      <w:startOverride w:val="1"/>
+      <w:startOverride w:val="51"/>
     </w:lvlOverride>
   </w:num>
   <w:num w:numId="1015">
-    <w:abstractNumId w:val="99411"/>
+    <w:abstractNumId w:val="994152"/>
     <w:lvlOverride w:ilvl="0">
-      <w:startOverride w:val="1"/>
+      <w:startOverride w:val="52"/>
     </w:lvlOverride>
     <w:lvlOverride w:ilvl="1">
-      <w:startOverride w:val="1"/>
+      <w:startOverride w:val="52"/>
     </w:lvlOverride>
     <w:lvlOverride w:ilvl="2">
-      <w:startOverride w:val="1"/>
+      <w:startOverride w:val="52"/>
     </w:lvlOverride>
     <w:lvlOverride w:ilvl="3">
-      <w:startOverride w:val="1"/>
+      <w:startOverride w:val="52"/>
     </w:lvlOverride>
     <w:lvlOverride w:ilvl="4">
-      <w:startOverride w:val="1"/>
+      <w:startOverride w:val="52"/>
     </w:lvlOverride>
     <w:lvlOverride w:ilvl="5">
-      <w:startOverride w:val="1"/>
+      <w:startOverride w:val="52"/>
     </w:lvlOverride>
     <w:lvlOverride w:ilvl="6">
-      <w:startOverride w:val="1"/>
+      <w:startOverride w:val="52"/>
     </w:lvlOverride>
     <w:lvlOverride w:ilvl="7">
-      <w:startOverride w:val="1"/>
+      <w:startOverride w:val="52"/>
     </w:lvlOverride>
     <w:lvlOverride w:ilvl="8">
-      <w:startOverride w:val="1"/>
+      <w:startOverride w:val="52"/>
     </w:lvlOverride>
   </w:num>
   <w:num w:numId="1016">
-    <w:abstractNumId w:val="99411"/>
+    <w:abstractNumId w:val="994159"/>
     <w:lvlOverride w:ilvl="0">
-      <w:startOverride w:val="1"/>
+      <w:startOverride w:val="59"/>
     </w:lvlOverride>
     <w:lvlOverride w:ilvl="1">
-      <w:startOverride w:val="1"/>
+      <w:startOverride w:val="59"/>
     </w:lvlOverride>
     <w:lvlOverride w:ilvl="2">
-      <w:startOverride w:val="1"/>
+      <w:startOverride w:val="59"/>
     </w:lvlOverride>
     <w:lvlOverride w:ilvl="3">
-      <w:startOverride w:val="1"/>
+      <w:startOverride w:val="59"/>
     </w:lvlOverride>
     <w:lvlOverride w:ilvl="4">
-      <w:startOverride w:val="1"/>
+      <w:startOverride w:val="59"/>
     </w:lvlOverride>
     <w:lvlOverride w:ilvl="5">
-      <w:startOverride w:val="1"/>
+      <w:startOverride w:val="59"/>
     </w:lvlOverride>
     <w:lvlOverride w:ilvl="6">
-      <w:startOverride w:val="1"/>
+      <w:startOverride w:val="59"/>
     </w:lvlOverride>
     <w:lvlOverride w:ilvl="7">
-      <w:startOverride w:val="1"/>
+      <w:startOverride w:val="59"/>
     </w:lvlOverride>
     <w:lvlOverride w:ilvl="8">
-      <w:startOverride w:val="1"/>
+      <w:startOverride w:val="59"/>
     </w:lvlOverride>
   </w:num>
   <w:num w:numId="1017">
-    <w:abstractNumId w:val="99411"/>
+    <w:abstractNumId w:val="994163"/>
     <w:lvlOverride w:ilvl="0">
-      <w:startOverride w:val="1"/>
+      <w:startOverride w:val="63"/>
     </w:lvlOverride>
     <w:lvlOverride w:ilvl="1">
-      <w:startOverride w:val="1"/>
+      <w:startOverride w:val="63"/>
     </w:lvlOverride>
     <w:lvlOverride w:ilvl="2">
-      <w:startOverride w:val="1"/>
+      <w:startOverride w:val="63"/>
     </w:lvlOverride>
     <w:lvlOverride w:ilvl="3">
-      <w:startOverride w:val="1"/>
+      <w:startOverride w:val="63"/>
     </w:lvlOverride>
     <w:lvlOverride w:ilvl="4">
-      <w:startOverride w:val="1"/>
+      <w:startOverride w:val="63"/>
     </w:lvlOverride>
     <w:lvlOverride w:ilvl="5">
-      <w:startOverride w:val="1"/>
+      <w:startOverride w:val="63"/>
     </w:lvlOverride>
     <w:lvlOverride w:ilvl="6">
-      <w:startOverride w:val="1"/>
+      <w:startOverride w:val="63"/>
     </w:lvlOverride>
     <w:lvlOverride w:ilvl="7">
-      <w:startOverride w:val="1"/>
+      <w:startOverride w:val="63"/>
     </w:lvlOverride>
     <w:lvlOverride w:ilvl="8">
-      <w:startOverride w:val="1"/>
+      <w:startOverride w:val="63"/>
     </w:lvlOverride>
   </w:num>
   <w:num w:numId="1018">
-    <w:abstractNumId w:val="99411"/>
+    <w:abstractNumId w:val="994164"/>
     <w:lvlOverride w:ilvl="0">
-      <w:startOverride w:val="1"/>
+      <w:startOverride w:val="64"/>
     </w:lvlOverride>
     <w:lvlOverride w:ilvl="1">
-      <w:startOverride w:val="1"/>
+      <w:startOverride w:val="64"/>
     </w:lvlOverride>
     <w:lvlOverride w:ilvl="2">
-      <w:startOverride w:val="1"/>
+      <w:startOverride w:val="64"/>
     </w:lvlOverride>
     <w:lvlOverride w:ilvl="3">
-      <w:startOverride w:val="1"/>
+      <w:startOverride w:val="64"/>
     </w:lvlOverride>
     <w:lvlOverride w:ilvl="4">
-      <w:startOverride w:val="1"/>
+      <w:startOverride w:val="64"/>
     </w:lvlOverride>
     <w:lvlOverride w:ilvl="5">
-      <w:startOverride w:val="1"/>
+      <w:startOverride w:val="64"/>
     </w:lvlOverride>
     <w:lvlOverride w:ilvl="6">
-      <w:startOverride w:val="1"/>
+      <w:startOverride w:val="64"/>
     </w:lvlOverride>
     <w:lvlOverride w:ilvl="7">
-      <w:startOverride w:val="1"/>
+      <w:startOverride w:val="64"/>
     </w:lvlOverride>
     <w:lvlOverride w:ilvl="8">
-      <w:startOverride w:val="1"/>
+      <w:startOverride w:val="64"/>
     </w:lvlOverride>
   </w:num>
   <w:num w:numId="1019">
-    <w:abstractNumId w:val="99411"/>
+    <w:abstractNumId w:val="994166"/>
     <w:lvlOverride w:ilvl="0">
-      <w:startOverride w:val="1"/>
+      <w:startOverride w:val="66"/>
     </w:lvlOverride>
     <w:lvlOverride w:ilvl="1">
-      <w:startOverride w:val="1"/>
+      <w:startOverride w:val="66"/>
     </w:lvlOverride>
     <w:lvlOverride w:ilvl="2">
-      <w:startOverride w:val="1"/>
+      <w:startOverride w:val="66"/>
     </w:lvlOverride>
     <w:lvlOverride w:ilvl="3">
-      <w:startOverride w:val="1"/>
+      <w:startOverride w:val="66"/>
     </w:lvlOverride>
     <w:lvlOverride w:ilvl="4">
-      <w:startOverride w:val="1"/>
+      <w:startOverride w:val="66"/>
     </w:lvlOverride>
     <w:lvlOverride w:ilvl="5">
-      <w:startOverride w:val="1"/>
+      <w:startOverride w:val="66"/>
     </w:lvlOverride>
     <w:lvlOverride w:ilvl="6">
-      <w:startOverride w:val="1"/>
+      <w:startOverride w:val="66"/>
     </w:lvlOverride>
     <w:lvlOverride w:ilvl="7">
-      <w:startOverride w:val="1"/>
+      <w:startOverride w:val="66"/>
     </w:lvlOverride>
     <w:lvlOverride w:ilvl="8">
-      <w:startOverride w:val="1"/>
+      <w:startOverride w:val="66"/>
     </w:lvlOverride>
   </w:num>
   <w:num w:numId="1020">
-    <w:abstractNumId w:val="99411"/>
+    <w:abstractNumId w:val="994168"/>
     <w:lvlOverride w:ilvl="0">
-      <w:startOverride w:val="1"/>
+      <w:startOverride w:val="68"/>
     </w:lvlOverride>
     <w:lvlOverride w:ilvl="1">
-      <w:startOverride w:val="1"/>
+      <w:startOverride w:val="68"/>
     </w:lvlOverride>
     <w:lvlOverride w:ilvl="2">
-      <w:startOverride w:val="1"/>
+      <w:startOverride w:val="68"/>
     </w:lvlOverride>
     <w:lvlOverride w:ilvl="3">
-      <w:startOverride w:val="1"/>
+      <w:startOverride w:val="68"/>
     </w:lvlOverride>
     <w:lvlOverride w:ilvl="4">
-      <w:startOverride w:val="1"/>
+      <w:startOverride w:val="68"/>
     </w:lvlOverride>
     <w:lvlOverride w:ilvl="5">
-      <w:startOverride w:val="1"/>
+      <w:startOverride w:val="68"/>
     </w:lvlOverride>
     <w:lvlOverride w:ilvl="6">
-      <w:startOverride w:val="1"/>
+      <w:startOverride w:val="68"/>
     </w:lvlOverride>
     <w:lvlOverride w:ilvl="7">
-      <w:startOverride w:val="1"/>
+      <w:startOverride w:val="68"/>
     </w:lvlOverride>
     <w:lvlOverride w:ilvl="8">
-      <w:startOverride w:val="1"/>
+      <w:startOverride w:val="68"/>
     </w:lvlOverride>
   </w:num>
   <w:num w:numId="1021">
@@ -16116,36 +17417,6 @@
   </w:num>
   <w:num w:numId="1022">
     <w:abstractNumId w:val="991"/>
-  </w:num>
-  <w:num w:numId="1023">
-    <w:abstractNumId w:val="99411"/>
-    <w:lvlOverride w:ilvl="0">
-      <w:startOverride w:val="1"/>
-    </w:lvlOverride>
-    <w:lvlOverride w:ilvl="1">
-      <w:startOverride w:val="1"/>
-    </w:lvlOverride>
-    <w:lvlOverride w:ilvl="2">
-      <w:startOverride w:val="1"/>
-    </w:lvlOverride>
-    <w:lvlOverride w:ilvl="3">
-      <w:startOverride w:val="1"/>
-    </w:lvlOverride>
-    <w:lvlOverride w:ilvl="4">
-      <w:startOverride w:val="1"/>
-    </w:lvlOverride>
-    <w:lvlOverride w:ilvl="5">
-      <w:startOverride w:val="1"/>
-    </w:lvlOverride>
-    <w:lvlOverride w:ilvl="6">
-      <w:startOverride w:val="1"/>
-    </w:lvlOverride>
-    <w:lvlOverride w:ilvl="7">
-      <w:startOverride w:val="1"/>
-    </w:lvlOverride>
-    <w:lvlOverride w:ilvl="8">
-      <w:startOverride w:val="1"/>
-    </w:lvlOverride>
   </w:num>
 </w:numbering>
 </file>

</xml_diff>

<commit_message>
Sync workshop report renderings
</commit_message>
<xml_diff>
--- a/docs/SCW17-MSE-Workshop-report.docx
+++ b/docs/SCW17-MSE-Workshop-report.docx
@@ -145,7 +145,7 @@
         <w:t xml:space="preserve"> </w:t>
       </w:r>
       <w:r>
-        <w:t xml:space="preserve">07 July 2026 21:11 PDT</w:t>
+        <w:t xml:space="preserve">07 July 2026 21:25 PDT</w:t>
       </w:r>
     </w:p>
     <w:tbl>
@@ -14949,7 +14949,7 @@
       </w:tr>
     </w:tbl>
     <w:bookmarkEnd w:id="76"/>
-    <w:bookmarkStart w:id="83" w:name="Xb9aa851defa400ff4d28650dfe7d983101a6615"/>
+    <w:bookmarkStart w:id="79" w:name="Xb9aa851defa400ff4d28650dfe7d983101a6615"/>
     <w:p>
       <w:pPr>
         <w:pStyle w:val="Heading1"/>
@@ -15000,7 +15000,7 @@
       </w:r>
     </w:p>
     <w:bookmarkEnd w:id="77"/>
-    <w:bookmarkStart w:id="82" w:name="david-miller-and-rosana-ourens"/>
+    <w:bookmarkStart w:id="78" w:name="david-miller-and-rosana-ourens"/>
     <w:p>
       <w:pPr>
         <w:pStyle w:val="Heading2"/>
@@ -15017,80 +15017,92 @@
         <w:t xml:space="preserve">The meeting made solid progress in agreeing on operating models, performance indicators, and exploring management procedures. The process could have benefited from more stages where specific items were locked down to allow discussion to move forward with better focus. For example, upfront agreement on the baseline assessment and reference points in advance of the MSE workshop would have helped focus discussion on MSE development and avoid repeating discussions.</w:t>
       </w:r>
     </w:p>
-    <w:bookmarkStart w:id="78" w:name="operating-models"/>
     <w:p>
       <w:pPr>
-        <w:pStyle w:val="Heading3"/>
-      </w:pPr>
-      <w:r>
+        <w:pStyle w:val="BodyText"/>
+      </w:pPr>
+      <w:r>
+        <w:rPr>
+          <w:b/>
+          <w:bCs/>
+        </w:rPr>
         <w:t xml:space="preserve">Operating Models</w:t>
+      </w:r>
+      <w:r>
+        <w:t xml:space="preserve">:</w:t>
+      </w:r>
+      <w:r>
+        <w:t xml:space="preserve"> </w:t>
+      </w:r>
+      <w:r>
+        <w:t xml:space="preserve">The recent benchmark assessment provides a strong, now agreed-upon basis for conditioning the base-case OM for the MSE. The consensus to tune the management procedures primarily on this single base case, with potential tuning to the two-stock model OM, is a reasonable and practical simplification. The other alternative OMs provide a good range for robustness testing and cover the most important uncertainties around the stock, such as different stock-recruitment steepness, potential changes in fishing selectivity, and possible impacts of ENSO events. An approach for stress-testing MPs for inherent climate robustness was presented that could be considered in future.</w:t>
       </w:r>
     </w:p>
     <w:p>
       <w:pPr>
-        <w:pStyle w:val="FirstParagraph"/>
-      </w:pPr>
-      <w:r>
-        <w:t xml:space="preserve">The recent benchmark assessment provides a strong, now agreed-upon basis for conditioning the base-case OM for the MSE. The consensus to tune the management procedures primarily on this single base case, with potential tuning to the two-stock model OM, is a reasonable and practical simplification. The other alternative OMs provide a good range for robustness testing and cover the most important uncertainties around the stock, such as different stock-recruitment steepness, potential changes in fishing selectivity, and possible impacts of ENSO events. An approach for stress-testing MPs for inherent climate robustness was presented that could be considered in future.</w:t>
+        <w:pStyle w:val="BodyText"/>
+      </w:pPr>
+      <w:r>
+        <w:rPr>
+          <w:b/>
+          <w:bCs/>
+        </w:rPr>
+        <w:t xml:space="preserve">Performance Indicators</w:t>
+      </w:r>
+      <w:r>
+        <w:t xml:space="preserve">:</w:t>
+      </w:r>
+      <w:r>
+        <w:t xml:space="preserve"> </w:t>
+      </w:r>
+      <w:r>
+        <w:t xml:space="preserve">The performance statistics were refined to ensure clear interpretation of the trade-offs between alternative MPs. Utilizing dynamic reference points is a sensible way to account for highly variable recruitment periods, ensuring that the probability of Kobe green metric remains meaningful during projections. Incorporating input from the stakeholder survey was useful, bridging the current gap between scientific preferences and actual industry objectives. The performance framework will place significant weight on both short- and long-term catch levels, biomass, catch stability, and related metrics. Other indicators, such as the proportion of simulated iterations that experience a stock crash and the number of times TAC-change limits are encountered, allow for a good examination of the behaviour and performance of MPs.</w:t>
+      </w:r>
+    </w:p>
+    <w:p>
+      <w:pPr>
+        <w:pStyle w:val="BodyText"/>
+      </w:pPr>
+      <w:r>
+        <w:rPr>
+          <w:b/>
+          <w:bCs/>
+        </w:rPr>
+        <w:t xml:space="preserve">Management Procedures</w:t>
+      </w:r>
+      <w:r>
+        <w:t xml:space="preserve">:</w:t>
+      </w:r>
+      <w:r>
+        <w:t xml:space="preserve"> </w:t>
+      </w:r>
+      <w:r>
+        <w:t xml:space="preserve">The design of MPs to be tested could have benefited from stakeholder input. Nevertheless, the working group made a strong effort to test harvest-control rules with different shapes and trade-offs. For this exercise, it was very useful to have exploratory runs to compare outputs. Using a simple, empirical, index-based harvest rule is preferable to more complex assessment model-based approaches. Including SPiCT to combine multiple indices in the loop is probably an unnecessary addition. Because these empirical rules rely so heavily on field data, ensuring that the observation-error model accurately captures the historical cross-correlation among multiple indices is considered an essential technical priority. Exploring different combinations of indices for use in the MP will be useful. In initial testing, the simple constant-harvest-rate approach demonstrated favourable properties, including an ability to recover the stock effectively even under a recruitment-collapse scenario.</w:t>
+      </w:r>
+    </w:p>
+    <w:p>
+      <w:pPr>
+        <w:pStyle w:val="BodyText"/>
+      </w:pPr>
+      <w:r>
+        <w:rPr>
+          <w:b/>
+          <w:bCs/>
+        </w:rPr>
+        <w:t xml:space="preserve">Exceptional Circumstances</w:t>
+      </w:r>
+      <w:r>
+        <w:t xml:space="preserve">:</w:t>
+      </w:r>
+      <w:r>
+        <w:t xml:space="preserve"> </w:t>
+      </w:r>
+      <w:r>
+        <w:t xml:space="preserve">With current indicators suggesting 2026 will likely be a year of low indices and difficult catches, establishing a formal, pre-agreed framework for exceptional circumstances should be a priority. As presented by Tom Carruthers, exceptional-circumstances triggers could be defined by analyzing MSE failure states and identifying the data bounds that lead to problematic outcomes.</w:t>
       </w:r>
     </w:p>
     <w:bookmarkEnd w:id="78"/>
-    <w:bookmarkStart w:id="79" w:name="performance-indicators"/>
-    <w:p>
-      <w:pPr>
-        <w:pStyle w:val="Heading3"/>
-      </w:pPr>
-      <w:r>
-        <w:t xml:space="preserve">Performance Indicators</w:t>
-      </w:r>
-    </w:p>
-    <w:p>
-      <w:pPr>
-        <w:pStyle w:val="FirstParagraph"/>
-      </w:pPr>
-      <w:r>
-        <w:t xml:space="preserve">The performance statistics were refined to ensure clear interpretation of the trade-offs between alternative MPs. Utilizing dynamic reference points is a sensible way to account for highly variable recruitment periods, ensuring that the probability of Kobe green metric remains meaningful during projections. Incorporating input from the stakeholder survey was useful, bridging the current gap between scientific preferences and actual industry objectives. The performance framework will place significant weight on both short- and long-term catch levels, biomass, catch stability, and related metrics. Other indicators, such as the proportion of simulated iterations that experience a stock crash and the number of times TAC-change limits are encountered, allow for a good examination of the behaviour and performance of MPs.</w:t>
-      </w:r>
-    </w:p>
     <w:bookmarkEnd w:id="79"/>
-    <w:bookmarkStart w:id="80" w:name="management-procedures-1"/>
-    <w:p>
-      <w:pPr>
-        <w:pStyle w:val="Heading3"/>
-      </w:pPr>
-      <w:r>
-        <w:t xml:space="preserve">Management Procedures</w:t>
-      </w:r>
-    </w:p>
-    <w:p>
-      <w:pPr>
-        <w:pStyle w:val="FirstParagraph"/>
-      </w:pPr>
-      <w:r>
-        <w:t xml:space="preserve">The design of MPs to be tested could have benefited from stakeholder input. Nevertheless, the working group made a strong effort to test harvest-control rules with different shapes and trade-offs. For this exercise, it was very useful to have exploratory runs to compare outputs. Using a simple, empirical, index-based harvest rule is preferable to more complex assessment model-based approaches. Including SPiCT to combine multiple indices in the loop is probably an unnecessary addition. Because these empirical rules rely so heavily on field data, ensuring that the observation-error model accurately captures the historical cross-correlation among multiple indices is considered an essential technical priority. Exploring different combinations of indices for use in the MP will be useful. In initial testing, the simple constant-harvest-rate approach demonstrated favourable properties, including an ability to recover the stock effectively even under a recruitment-collapse scenario.</w:t>
-      </w:r>
-    </w:p>
-    <w:bookmarkEnd w:id="80"/>
-    <w:bookmarkStart w:id="81" w:name="exceptional-circumstances"/>
-    <w:p>
-      <w:pPr>
-        <w:pStyle w:val="Heading3"/>
-      </w:pPr>
-      <w:r>
-        <w:t xml:space="preserve">Exceptional Circumstances</w:t>
-      </w:r>
-    </w:p>
-    <w:p>
-      <w:pPr>
-        <w:pStyle w:val="FirstParagraph"/>
-      </w:pPr>
-      <w:r>
-        <w:t xml:space="preserve">With current indicators suggesting 2026 will likely be a year of low indices and difficult catches, establishing a formal, pre-agreed framework for exceptional circumstances should be a priority. As presented by Tom Carruthers, exceptional-circumstances triggers could be defined by analyzing MSE failure states and identifying the data bounds that lead to problematic outcomes.</w:t>
-      </w:r>
-    </w:p>
-    <w:bookmarkEnd w:id="81"/>
-    <w:bookmarkEnd w:id="82"/>
-    <w:bookmarkEnd w:id="83"/>
     <w:sectPr>
       <w:footnotePr>
         <w:numRestart w:val="eachSect"/>

</xml_diff>